<commit_message>
feat (admin - nhan vien): cap nhat giao dien va chuc nang nhan vien store
</commit_message>
<xml_diff>
--- a/CNM_ChucNangNguoiDung.docx
+++ b/CNM_ChucNangNguoiDung.docx
@@ -1270,15 +1270,17 @@
           <w:rFonts w:ascii="Times New Roman" w:eastAsia="Times New Roman" w:hAnsi="Times New Roman" w:cs="Times New Roman"/>
           <w:sz w:val="26"/>
           <w:szCs w:val="26"/>
-        </w:rPr>
-      </w:pPr>
-      <w:r>
-        <w:rPr>
-          <w:rFonts w:ascii="Times New Roman" w:eastAsia="Times New Roman" w:hAnsi="Times New Roman" w:cs="Times New Roman"/>
-          <w:b/>
-          <w:bCs/>
-          <w:sz w:val="26"/>
-          <w:szCs w:val="26"/>
+          <w:lang w:val="vi-VN"/>
+        </w:rPr>
+      </w:pPr>
+      <w:r>
+        <w:rPr>
+          <w:rFonts w:ascii="Times New Roman" w:eastAsia="Times New Roman" w:hAnsi="Times New Roman" w:cs="Times New Roman"/>
+          <w:b/>
+          <w:bCs/>
+          <w:sz w:val="26"/>
+          <w:szCs w:val="26"/>
+          <w:highlight w:val="yellow"/>
         </w:rPr>
         <w:t>- Tiếp nhận đơn hàng</w:t>
       </w:r>
@@ -1287,26 +1289,105 @@
           <w:rFonts w:ascii="Times New Roman" w:eastAsia="Times New Roman" w:hAnsi="Times New Roman" w:cs="Times New Roman"/>
           <w:sz w:val="26"/>
           <w:szCs w:val="26"/>
+          <w:highlight w:val="yellow"/>
         </w:rPr>
         <w:t>: Nhận và xác nhận đơn từ kênh online, chuyển sang trạng thái chuẩn bị.</w:t>
       </w:r>
-    </w:p>
-    <w:p>
-      <w:pPr>
-        <w:spacing w:before="240" w:after="240"/>
-        <w:rPr>
-          <w:rFonts w:ascii="Times New Roman" w:eastAsia="Times New Roman" w:hAnsi="Times New Roman" w:cs="Times New Roman"/>
-          <w:sz w:val="26"/>
-          <w:szCs w:val="26"/>
-        </w:rPr>
-      </w:pPr>
-      <w:r>
-        <w:rPr>
-          <w:rFonts w:ascii="Times New Roman" w:eastAsia="Times New Roman" w:hAnsi="Times New Roman" w:cs="Times New Roman"/>
-          <w:b/>
-          <w:bCs/>
-          <w:sz w:val="26"/>
-          <w:szCs w:val="26"/>
+      <w:r>
+        <w:rPr>
+          <w:rFonts w:ascii="Times New Roman" w:eastAsia="Times New Roman" w:hAnsi="Times New Roman" w:cs="Times New Roman"/>
+          <w:sz w:val="26"/>
+          <w:szCs w:val="26"/>
+          <w:lang w:val="vi-VN"/>
+        </w:rPr>
+        <w:t xml:space="preserve"> =&gt; </w:t>
+      </w:r>
+      <w:r>
+        <w:rPr>
+          <w:rFonts w:ascii="Times New Roman" w:eastAsia="Times New Roman" w:hAnsi="Times New Roman" w:cs="Times New Roman"/>
+          <w:sz w:val="26"/>
+          <w:szCs w:val="26"/>
+          <w:highlight w:val="yellow"/>
+          <w:lang w:val="vi-VN"/>
+        </w:rPr>
+        <w:t>đã</w:t>
+      </w:r>
+      <w:r>
+        <w:rPr>
+          <w:rFonts w:ascii="Times New Roman" w:eastAsia="Times New Roman" w:hAnsi="Times New Roman" w:cs="Times New Roman"/>
+          <w:sz w:val="26"/>
+          <w:szCs w:val="26"/>
+          <w:lang w:val="vi-VN"/>
+        </w:rPr>
+        <w:t xml:space="preserve"> </w:t>
+      </w:r>
+      <w:r>
+        <w:rPr>
+          <w:rFonts w:ascii="Times New Roman" w:eastAsia="Times New Roman" w:hAnsi="Times New Roman" w:cs="Times New Roman"/>
+          <w:sz w:val="26"/>
+          <w:szCs w:val="26"/>
+          <w:highlight w:val="yellow"/>
+          <w:lang w:val="vi-VN"/>
+        </w:rPr>
+        <w:t>làm</w:t>
+      </w:r>
+      <w:r>
+        <w:rPr>
+          <w:rFonts w:ascii="Times New Roman" w:eastAsia="Times New Roman" w:hAnsi="Times New Roman" w:cs="Times New Roman"/>
+          <w:sz w:val="26"/>
+          <w:szCs w:val="26"/>
+          <w:lang w:val="vi-VN"/>
+        </w:rPr>
+        <w:t xml:space="preserve"> </w:t>
+      </w:r>
+      <w:r>
+        <w:rPr>
+          <w:rFonts w:ascii="Times New Roman" w:eastAsia="Times New Roman" w:hAnsi="Times New Roman" w:cs="Times New Roman"/>
+          <w:sz w:val="26"/>
+          <w:szCs w:val="26"/>
+          <w:highlight w:val="yellow"/>
+          <w:lang w:val="vi-VN"/>
+        </w:rPr>
+        <w:t>cơ</w:t>
+      </w:r>
+      <w:r>
+        <w:rPr>
+          <w:rFonts w:ascii="Times New Roman" w:eastAsia="Times New Roman" w:hAnsi="Times New Roman" w:cs="Times New Roman"/>
+          <w:sz w:val="26"/>
+          <w:szCs w:val="26"/>
+          <w:lang w:val="vi-VN"/>
+        </w:rPr>
+        <w:t xml:space="preserve"> </w:t>
+      </w:r>
+      <w:r>
+        <w:rPr>
+          <w:rFonts w:ascii="Times New Roman" w:eastAsia="Times New Roman" w:hAnsi="Times New Roman" w:cs="Times New Roman"/>
+          <w:sz w:val="26"/>
+          <w:szCs w:val="26"/>
+          <w:highlight w:val="yellow"/>
+          <w:lang w:val="vi-VN"/>
+        </w:rPr>
+        <w:t>bản</w:t>
+      </w:r>
+    </w:p>
+    <w:p>
+      <w:pPr>
+        <w:spacing w:before="240" w:after="240"/>
+        <w:rPr>
+          <w:rFonts w:ascii="Times New Roman" w:eastAsia="Times New Roman" w:hAnsi="Times New Roman" w:cs="Times New Roman"/>
+          <w:sz w:val="26"/>
+          <w:szCs w:val="26"/>
+          <w:lang w:val="vi-VN"/>
+        </w:rPr>
+      </w:pPr>
+      <w:r>
+        <w:rPr>
+          <w:rFonts w:ascii="Times New Roman" w:eastAsia="Times New Roman" w:hAnsi="Times New Roman" w:cs="Times New Roman"/>
+          <w:b/>
+          <w:bCs/>
+          <w:sz w:val="26"/>
+          <w:szCs w:val="26"/>
+          <w:highlight w:val="yellow"/>
         </w:rPr>
         <w:t>- Tạo đơn hàng tại quầy</w:t>
       </w:r>
@@ -1315,26 +1396,105 @@
           <w:rFonts w:ascii="Times New Roman" w:eastAsia="Times New Roman" w:hAnsi="Times New Roman" w:cs="Times New Roman"/>
           <w:sz w:val="26"/>
           <w:szCs w:val="26"/>
+          <w:highlight w:val="yellow"/>
         </w:rPr>
         <w:t>: Nhập đơn trực tiếp cho khách tại chỗ hoặc takeaway trên POS.</w:t>
       </w:r>
-    </w:p>
-    <w:p>
-      <w:pPr>
-        <w:spacing w:before="240" w:after="240"/>
-        <w:rPr>
-          <w:rFonts w:ascii="Times New Roman" w:eastAsia="Times New Roman" w:hAnsi="Times New Roman" w:cs="Times New Roman"/>
-          <w:sz w:val="26"/>
-          <w:szCs w:val="26"/>
-        </w:rPr>
-      </w:pPr>
-      <w:r>
-        <w:rPr>
-          <w:rFonts w:ascii="Times New Roman" w:eastAsia="Times New Roman" w:hAnsi="Times New Roman" w:cs="Times New Roman"/>
-          <w:b/>
-          <w:bCs/>
-          <w:sz w:val="26"/>
-          <w:szCs w:val="26"/>
+      <w:r>
+        <w:rPr>
+          <w:rFonts w:ascii="Times New Roman" w:eastAsia="Times New Roman" w:hAnsi="Times New Roman" w:cs="Times New Roman"/>
+          <w:sz w:val="26"/>
+          <w:szCs w:val="26"/>
+          <w:lang w:val="vi-VN"/>
+        </w:rPr>
+        <w:t xml:space="preserve"> =&gt; </w:t>
+      </w:r>
+      <w:r>
+        <w:rPr>
+          <w:rFonts w:ascii="Times New Roman" w:eastAsia="Times New Roman" w:hAnsi="Times New Roman" w:cs="Times New Roman"/>
+          <w:sz w:val="26"/>
+          <w:szCs w:val="26"/>
+          <w:highlight w:val="yellow"/>
+          <w:lang w:val="vi-VN"/>
+        </w:rPr>
+        <w:t>đã</w:t>
+      </w:r>
+      <w:r>
+        <w:rPr>
+          <w:rFonts w:ascii="Times New Roman" w:eastAsia="Times New Roman" w:hAnsi="Times New Roman" w:cs="Times New Roman"/>
+          <w:sz w:val="26"/>
+          <w:szCs w:val="26"/>
+          <w:lang w:val="vi-VN"/>
+        </w:rPr>
+        <w:t xml:space="preserve"> </w:t>
+      </w:r>
+      <w:r>
+        <w:rPr>
+          <w:rFonts w:ascii="Times New Roman" w:eastAsia="Times New Roman" w:hAnsi="Times New Roman" w:cs="Times New Roman"/>
+          <w:sz w:val="26"/>
+          <w:szCs w:val="26"/>
+          <w:highlight w:val="yellow"/>
+          <w:lang w:val="vi-VN"/>
+        </w:rPr>
+        <w:t>làm</w:t>
+      </w:r>
+      <w:r>
+        <w:rPr>
+          <w:rFonts w:ascii="Times New Roman" w:eastAsia="Times New Roman" w:hAnsi="Times New Roman" w:cs="Times New Roman"/>
+          <w:sz w:val="26"/>
+          <w:szCs w:val="26"/>
+          <w:lang w:val="vi-VN"/>
+        </w:rPr>
+        <w:t xml:space="preserve"> </w:t>
+      </w:r>
+      <w:r>
+        <w:rPr>
+          <w:rFonts w:ascii="Times New Roman" w:eastAsia="Times New Roman" w:hAnsi="Times New Roman" w:cs="Times New Roman"/>
+          <w:sz w:val="26"/>
+          <w:szCs w:val="26"/>
+          <w:highlight w:val="yellow"/>
+          <w:lang w:val="vi-VN"/>
+        </w:rPr>
+        <w:t>cơ</w:t>
+      </w:r>
+      <w:r>
+        <w:rPr>
+          <w:rFonts w:ascii="Times New Roman" w:eastAsia="Times New Roman" w:hAnsi="Times New Roman" w:cs="Times New Roman"/>
+          <w:sz w:val="26"/>
+          <w:szCs w:val="26"/>
+          <w:lang w:val="vi-VN"/>
+        </w:rPr>
+        <w:t xml:space="preserve"> </w:t>
+      </w:r>
+      <w:r>
+        <w:rPr>
+          <w:rFonts w:ascii="Times New Roman" w:eastAsia="Times New Roman" w:hAnsi="Times New Roman" w:cs="Times New Roman"/>
+          <w:sz w:val="26"/>
+          <w:szCs w:val="26"/>
+          <w:highlight w:val="yellow"/>
+          <w:lang w:val="vi-VN"/>
+        </w:rPr>
+        <w:t>bản</w:t>
+      </w:r>
+    </w:p>
+    <w:p>
+      <w:pPr>
+        <w:spacing w:before="240" w:after="240"/>
+        <w:rPr>
+          <w:rFonts w:ascii="Times New Roman" w:eastAsia="Times New Roman" w:hAnsi="Times New Roman" w:cs="Times New Roman"/>
+          <w:sz w:val="26"/>
+          <w:szCs w:val="26"/>
+          <w:lang w:val="vi-VN"/>
+        </w:rPr>
+      </w:pPr>
+      <w:r>
+        <w:rPr>
+          <w:rFonts w:ascii="Times New Roman" w:eastAsia="Times New Roman" w:hAnsi="Times New Roman" w:cs="Times New Roman"/>
+          <w:b/>
+          <w:bCs/>
+          <w:sz w:val="26"/>
+          <w:szCs w:val="26"/>
+          <w:highlight w:val="yellow"/>
         </w:rPr>
         <w:t>- Cập nhật trạng thái đơn hàng</w:t>
       </w:r>
@@ -1343,26 +1503,105 @@
           <w:rFonts w:ascii="Times New Roman" w:eastAsia="Times New Roman" w:hAnsi="Times New Roman" w:cs="Times New Roman"/>
           <w:sz w:val="26"/>
           <w:szCs w:val="26"/>
+          <w:highlight w:val="yellow"/>
         </w:rPr>
         <w:t>: Thay đổi trạng thái (đang pha chế, sẵn sàng, đã giao...) để đồng bộ thông tin.</w:t>
       </w:r>
-    </w:p>
-    <w:p>
-      <w:pPr>
-        <w:spacing w:before="240" w:after="240"/>
-        <w:rPr>
-          <w:rFonts w:ascii="Times New Roman" w:eastAsia="Times New Roman" w:hAnsi="Times New Roman" w:cs="Times New Roman"/>
-          <w:sz w:val="26"/>
-          <w:szCs w:val="26"/>
-        </w:rPr>
-      </w:pPr>
-      <w:r>
-        <w:rPr>
-          <w:rFonts w:ascii="Times New Roman" w:eastAsia="Times New Roman" w:hAnsi="Times New Roman" w:cs="Times New Roman"/>
-          <w:b/>
-          <w:bCs/>
-          <w:sz w:val="26"/>
-          <w:szCs w:val="26"/>
+      <w:r>
+        <w:rPr>
+          <w:rFonts w:ascii="Times New Roman" w:eastAsia="Times New Roman" w:hAnsi="Times New Roman" w:cs="Times New Roman"/>
+          <w:sz w:val="26"/>
+          <w:szCs w:val="26"/>
+          <w:lang w:val="vi-VN"/>
+        </w:rPr>
+        <w:t xml:space="preserve"> =&gt; </w:t>
+      </w:r>
+      <w:r>
+        <w:rPr>
+          <w:rFonts w:ascii="Times New Roman" w:eastAsia="Times New Roman" w:hAnsi="Times New Roman" w:cs="Times New Roman"/>
+          <w:sz w:val="26"/>
+          <w:szCs w:val="26"/>
+          <w:highlight w:val="yellow"/>
+          <w:lang w:val="vi-VN"/>
+        </w:rPr>
+        <w:t>đã</w:t>
+      </w:r>
+      <w:r>
+        <w:rPr>
+          <w:rFonts w:ascii="Times New Roman" w:eastAsia="Times New Roman" w:hAnsi="Times New Roman" w:cs="Times New Roman"/>
+          <w:sz w:val="26"/>
+          <w:szCs w:val="26"/>
+          <w:lang w:val="vi-VN"/>
+        </w:rPr>
+        <w:t xml:space="preserve"> </w:t>
+      </w:r>
+      <w:r>
+        <w:rPr>
+          <w:rFonts w:ascii="Times New Roman" w:eastAsia="Times New Roman" w:hAnsi="Times New Roman" w:cs="Times New Roman"/>
+          <w:sz w:val="26"/>
+          <w:szCs w:val="26"/>
+          <w:highlight w:val="yellow"/>
+          <w:lang w:val="vi-VN"/>
+        </w:rPr>
+        <w:t>làm</w:t>
+      </w:r>
+      <w:r>
+        <w:rPr>
+          <w:rFonts w:ascii="Times New Roman" w:eastAsia="Times New Roman" w:hAnsi="Times New Roman" w:cs="Times New Roman"/>
+          <w:sz w:val="26"/>
+          <w:szCs w:val="26"/>
+          <w:lang w:val="vi-VN"/>
+        </w:rPr>
+        <w:t xml:space="preserve"> </w:t>
+      </w:r>
+      <w:r>
+        <w:rPr>
+          <w:rFonts w:ascii="Times New Roman" w:eastAsia="Times New Roman" w:hAnsi="Times New Roman" w:cs="Times New Roman"/>
+          <w:sz w:val="26"/>
+          <w:szCs w:val="26"/>
+          <w:highlight w:val="yellow"/>
+          <w:lang w:val="vi-VN"/>
+        </w:rPr>
+        <w:t>cơ</w:t>
+      </w:r>
+      <w:r>
+        <w:rPr>
+          <w:rFonts w:ascii="Times New Roman" w:eastAsia="Times New Roman" w:hAnsi="Times New Roman" w:cs="Times New Roman"/>
+          <w:sz w:val="26"/>
+          <w:szCs w:val="26"/>
+          <w:lang w:val="vi-VN"/>
+        </w:rPr>
+        <w:t xml:space="preserve"> </w:t>
+      </w:r>
+      <w:r>
+        <w:rPr>
+          <w:rFonts w:ascii="Times New Roman" w:eastAsia="Times New Roman" w:hAnsi="Times New Roman" w:cs="Times New Roman"/>
+          <w:sz w:val="26"/>
+          <w:szCs w:val="26"/>
+          <w:highlight w:val="yellow"/>
+          <w:lang w:val="vi-VN"/>
+        </w:rPr>
+        <w:t>bản</w:t>
+      </w:r>
+    </w:p>
+    <w:p>
+      <w:pPr>
+        <w:spacing w:before="240" w:after="240"/>
+        <w:rPr>
+          <w:rFonts w:ascii="Times New Roman" w:eastAsia="Times New Roman" w:hAnsi="Times New Roman" w:cs="Times New Roman"/>
+          <w:sz w:val="26"/>
+          <w:szCs w:val="26"/>
+          <w:lang w:val="vi-VN"/>
+        </w:rPr>
+      </w:pPr>
+      <w:r>
+        <w:rPr>
+          <w:rFonts w:ascii="Times New Roman" w:eastAsia="Times New Roman" w:hAnsi="Times New Roman" w:cs="Times New Roman"/>
+          <w:b/>
+          <w:bCs/>
+          <w:sz w:val="26"/>
+          <w:szCs w:val="26"/>
+          <w:highlight w:val="yellow"/>
         </w:rPr>
         <w:t>- Quản lý trạng thái bán món tại cửa hàng</w:t>
       </w:r>
@@ -1371,26 +1610,124 @@
           <w:rFonts w:ascii="Times New Roman" w:eastAsia="Times New Roman" w:hAnsi="Times New Roman" w:cs="Times New Roman"/>
           <w:sz w:val="26"/>
           <w:szCs w:val="26"/>
+          <w:highlight w:val="yellow"/>
         </w:rPr>
         <w:t>: Đánh dấu món hết tạm thời hoặc ngừng bán khi nguyên liệu thiếu.</w:t>
       </w:r>
-    </w:p>
-    <w:p>
-      <w:pPr>
-        <w:spacing w:before="240" w:after="240"/>
-        <w:rPr>
-          <w:rFonts w:ascii="Times New Roman" w:eastAsia="Times New Roman" w:hAnsi="Times New Roman" w:cs="Times New Roman"/>
-          <w:sz w:val="26"/>
-          <w:szCs w:val="26"/>
-        </w:rPr>
-      </w:pPr>
-      <w:r>
-        <w:rPr>
-          <w:rFonts w:ascii="Times New Roman" w:eastAsia="Times New Roman" w:hAnsi="Times New Roman" w:cs="Times New Roman"/>
-          <w:b/>
-          <w:bCs/>
-          <w:sz w:val="26"/>
-          <w:szCs w:val="26"/>
+      <w:r>
+        <w:rPr>
+          <w:rFonts w:ascii="Times New Roman" w:eastAsia="Times New Roman" w:hAnsi="Times New Roman" w:cs="Times New Roman"/>
+          <w:sz w:val="26"/>
+          <w:szCs w:val="26"/>
+          <w:lang w:val="vi-VN"/>
+        </w:rPr>
+        <w:t xml:space="preserve"> =&gt; </w:t>
+      </w:r>
+      <w:r>
+        <w:rPr>
+          <w:rFonts w:ascii="Times New Roman" w:eastAsia="Times New Roman" w:hAnsi="Times New Roman" w:cs="Times New Roman"/>
+          <w:sz w:val="26"/>
+          <w:szCs w:val="26"/>
+          <w:highlight w:val="yellow"/>
+          <w:lang w:val="vi-VN"/>
+        </w:rPr>
+        <w:t>đã</w:t>
+      </w:r>
+      <w:r>
+        <w:rPr>
+          <w:rFonts w:ascii="Times New Roman" w:eastAsia="Times New Roman" w:hAnsi="Times New Roman" w:cs="Times New Roman"/>
+          <w:sz w:val="26"/>
+          <w:szCs w:val="26"/>
+          <w:lang w:val="vi-VN"/>
+        </w:rPr>
+        <w:t xml:space="preserve"> </w:t>
+      </w:r>
+      <w:r>
+        <w:rPr>
+          <w:rFonts w:ascii="Times New Roman" w:eastAsia="Times New Roman" w:hAnsi="Times New Roman" w:cs="Times New Roman"/>
+          <w:sz w:val="26"/>
+          <w:szCs w:val="26"/>
+          <w:highlight w:val="yellow"/>
+          <w:lang w:val="vi-VN"/>
+        </w:rPr>
+        <w:t>làm</w:t>
+      </w:r>
+      <w:r>
+        <w:rPr>
+          <w:rFonts w:ascii="Times New Roman" w:eastAsia="Times New Roman" w:hAnsi="Times New Roman" w:cs="Times New Roman"/>
+          <w:sz w:val="26"/>
+          <w:szCs w:val="26"/>
+          <w:lang w:val="vi-VN"/>
+        </w:rPr>
+        <w:t xml:space="preserve"> </w:t>
+      </w:r>
+      <w:r>
+        <w:rPr>
+          <w:rFonts w:ascii="Times New Roman" w:eastAsia="Times New Roman" w:hAnsi="Times New Roman" w:cs="Times New Roman"/>
+          <w:sz w:val="26"/>
+          <w:szCs w:val="26"/>
+          <w:highlight w:val="yellow"/>
+          <w:lang w:val="vi-VN"/>
+        </w:rPr>
+        <w:t>tạm</w:t>
+      </w:r>
+      <w:r>
+        <w:rPr>
+          <w:rFonts w:ascii="Times New Roman" w:eastAsia="Times New Roman" w:hAnsi="Times New Roman" w:cs="Times New Roman"/>
+          <w:sz w:val="26"/>
+          <w:szCs w:val="26"/>
+          <w:lang w:val="vi-VN"/>
+        </w:rPr>
+        <w:t xml:space="preserve"> </w:t>
+      </w:r>
+      <w:r>
+        <w:rPr>
+          <w:rFonts w:ascii="Times New Roman" w:eastAsia="Times New Roman" w:hAnsi="Times New Roman" w:cs="Times New Roman"/>
+          <w:sz w:val="26"/>
+          <w:szCs w:val="26"/>
+          <w:highlight w:val="yellow"/>
+          <w:lang w:val="vi-VN"/>
+        </w:rPr>
+        <w:t>cơ</w:t>
+      </w:r>
+      <w:r>
+        <w:rPr>
+          <w:rFonts w:ascii="Times New Roman" w:eastAsia="Times New Roman" w:hAnsi="Times New Roman" w:cs="Times New Roman"/>
+          <w:sz w:val="26"/>
+          <w:szCs w:val="26"/>
+          <w:lang w:val="vi-VN"/>
+        </w:rPr>
+        <w:t xml:space="preserve"> </w:t>
+      </w:r>
+      <w:r>
+        <w:rPr>
+          <w:rFonts w:ascii="Times New Roman" w:eastAsia="Times New Roman" w:hAnsi="Times New Roman" w:cs="Times New Roman"/>
+          <w:sz w:val="26"/>
+          <w:szCs w:val="26"/>
+          <w:highlight w:val="yellow"/>
+          <w:lang w:val="vi-VN"/>
+        </w:rPr>
+        <w:t>bản</w:t>
+      </w:r>
+    </w:p>
+    <w:p>
+      <w:pPr>
+        <w:spacing w:before="240" w:after="240"/>
+        <w:rPr>
+          <w:rFonts w:ascii="Times New Roman" w:eastAsia="Times New Roman" w:hAnsi="Times New Roman" w:cs="Times New Roman"/>
+          <w:sz w:val="26"/>
+          <w:szCs w:val="26"/>
+          <w:lang w:val="vi-VN"/>
+        </w:rPr>
+      </w:pPr>
+      <w:r>
+        <w:rPr>
+          <w:rFonts w:ascii="Times New Roman" w:eastAsia="Times New Roman" w:hAnsi="Times New Roman" w:cs="Times New Roman"/>
+          <w:b/>
+          <w:bCs/>
+          <w:sz w:val="26"/>
+          <w:szCs w:val="26"/>
+          <w:highlight w:val="yellow"/>
         </w:rPr>
         <w:t>- Đối soát tiền mặt theo ca</w:t>
       </w:r>
@@ -1399,27 +1736,107 @@
           <w:rFonts w:ascii="Times New Roman" w:eastAsia="Times New Roman" w:hAnsi="Times New Roman" w:cs="Times New Roman"/>
           <w:sz w:val="26"/>
           <w:szCs w:val="26"/>
+          <w:highlight w:val="yellow"/>
         </w:rPr>
         <w:t>: Kiểm kê và đối chiếu tiền mặt thu được với doanh thu hệ thống cuối ca.</w:t>
       </w:r>
-    </w:p>
-    <w:p>
-      <w:pPr>
-        <w:spacing w:before="240" w:after="240"/>
-        <w:rPr>
-          <w:rFonts w:ascii="Times New Roman" w:eastAsia="Times New Roman" w:hAnsi="Times New Roman" w:cs="Times New Roman"/>
-          <w:sz w:val="26"/>
-          <w:szCs w:val="26"/>
-        </w:rPr>
-      </w:pPr>
-      <w:r>
-        <w:rPr>
-          <w:rFonts w:ascii="Times New Roman" w:eastAsia="Times New Roman" w:hAnsi="Times New Roman" w:cs="Times New Roman"/>
-          <w:b/>
-          <w:bCs/>
-          <w:sz w:val="26"/>
-          <w:szCs w:val="26"/>
-        </w:rPr>
+      <w:r>
+        <w:rPr>
+          <w:rFonts w:ascii="Times New Roman" w:eastAsia="Times New Roman" w:hAnsi="Times New Roman" w:cs="Times New Roman"/>
+          <w:sz w:val="26"/>
+          <w:szCs w:val="26"/>
+          <w:lang w:val="vi-VN"/>
+        </w:rPr>
+        <w:t xml:space="preserve"> =&gt; </w:t>
+      </w:r>
+      <w:r>
+        <w:rPr>
+          <w:rFonts w:ascii="Times New Roman" w:eastAsia="Times New Roman" w:hAnsi="Times New Roman" w:cs="Times New Roman"/>
+          <w:sz w:val="26"/>
+          <w:szCs w:val="26"/>
+          <w:highlight w:val="yellow"/>
+          <w:lang w:val="vi-VN"/>
+        </w:rPr>
+        <w:t>đã</w:t>
+      </w:r>
+      <w:r>
+        <w:rPr>
+          <w:rFonts w:ascii="Times New Roman" w:eastAsia="Times New Roman" w:hAnsi="Times New Roman" w:cs="Times New Roman"/>
+          <w:sz w:val="26"/>
+          <w:szCs w:val="26"/>
+          <w:lang w:val="vi-VN"/>
+        </w:rPr>
+        <w:t xml:space="preserve"> </w:t>
+      </w:r>
+      <w:r>
+        <w:rPr>
+          <w:rFonts w:ascii="Times New Roman" w:eastAsia="Times New Roman" w:hAnsi="Times New Roman" w:cs="Times New Roman"/>
+          <w:sz w:val="26"/>
+          <w:szCs w:val="26"/>
+          <w:highlight w:val="yellow"/>
+          <w:lang w:val="vi-VN"/>
+        </w:rPr>
+        <w:t>làm</w:t>
+      </w:r>
+      <w:r>
+        <w:rPr>
+          <w:rFonts w:ascii="Times New Roman" w:eastAsia="Times New Roman" w:hAnsi="Times New Roman" w:cs="Times New Roman"/>
+          <w:sz w:val="26"/>
+          <w:szCs w:val="26"/>
+          <w:lang w:val="vi-VN"/>
+        </w:rPr>
+        <w:t xml:space="preserve"> </w:t>
+      </w:r>
+      <w:r>
+        <w:rPr>
+          <w:rFonts w:ascii="Times New Roman" w:eastAsia="Times New Roman" w:hAnsi="Times New Roman" w:cs="Times New Roman"/>
+          <w:sz w:val="26"/>
+          <w:szCs w:val="26"/>
+          <w:highlight w:val="yellow"/>
+          <w:lang w:val="vi-VN"/>
+        </w:rPr>
+        <w:t>cơ</w:t>
+      </w:r>
+      <w:r>
+        <w:rPr>
+          <w:rFonts w:ascii="Times New Roman" w:eastAsia="Times New Roman" w:hAnsi="Times New Roman" w:cs="Times New Roman"/>
+          <w:sz w:val="26"/>
+          <w:szCs w:val="26"/>
+          <w:lang w:val="vi-VN"/>
+        </w:rPr>
+        <w:t xml:space="preserve"> </w:t>
+      </w:r>
+      <w:r>
+        <w:rPr>
+          <w:rFonts w:ascii="Times New Roman" w:eastAsia="Times New Roman" w:hAnsi="Times New Roman" w:cs="Times New Roman"/>
+          <w:sz w:val="26"/>
+          <w:szCs w:val="26"/>
+          <w:highlight w:val="yellow"/>
+          <w:lang w:val="vi-VN"/>
+        </w:rPr>
+        <w:t>bản</w:t>
+      </w:r>
+    </w:p>
+    <w:p>
+      <w:pPr>
+        <w:spacing w:before="240" w:after="240"/>
+        <w:rPr>
+          <w:rFonts w:ascii="Times New Roman" w:eastAsia="Times New Roman" w:hAnsi="Times New Roman" w:cs="Times New Roman"/>
+          <w:sz w:val="26"/>
+          <w:szCs w:val="26"/>
+          <w:lang w:val="vi-VN"/>
+        </w:rPr>
+      </w:pPr>
+      <w:r>
+        <w:rPr>
+          <w:rFonts w:ascii="Times New Roman" w:eastAsia="Times New Roman" w:hAnsi="Times New Roman" w:cs="Times New Roman"/>
+          <w:b/>
+          <w:bCs/>
+          <w:sz w:val="26"/>
+          <w:szCs w:val="26"/>
+          <w:highlight w:val="yellow"/>
+        </w:rPr>
+        <w:lastRenderedPageBreak/>
         <w:t>- In hóa đơn/Biên lai</w:t>
       </w:r>
       <w:r>
@@ -1427,28 +1844,277 @@
           <w:rFonts w:ascii="Times New Roman" w:eastAsia="Times New Roman" w:hAnsi="Times New Roman" w:cs="Times New Roman"/>
           <w:sz w:val="26"/>
           <w:szCs w:val="26"/>
+          <w:highlight w:val="yellow"/>
         </w:rPr>
         <w:t>: In hóa đơn giấy hoặc gửi hóa đơn điện tử cho khách sau thanh toán.</w:t>
       </w:r>
-    </w:p>
-    <w:p>
-      <w:pPr>
-        <w:spacing w:before="240" w:after="240"/>
-        <w:rPr>
-          <w:rFonts w:ascii="Times New Roman" w:eastAsia="Times New Roman" w:hAnsi="Times New Roman" w:cs="Times New Roman"/>
-          <w:sz w:val="26"/>
-          <w:szCs w:val="26"/>
-        </w:rPr>
-      </w:pPr>
-      <w:r>
-        <w:rPr>
-          <w:rFonts w:ascii="Times New Roman" w:eastAsia="Times New Roman" w:hAnsi="Times New Roman" w:cs="Times New Roman"/>
-          <w:b/>
-          <w:bCs/>
-          <w:sz w:val="26"/>
-          <w:szCs w:val="26"/>
-        </w:rPr>
-        <w:lastRenderedPageBreak/>
+      <w:r>
+        <w:rPr>
+          <w:rFonts w:ascii="Times New Roman" w:eastAsia="Times New Roman" w:hAnsi="Times New Roman" w:cs="Times New Roman"/>
+          <w:sz w:val="26"/>
+          <w:szCs w:val="26"/>
+          <w:lang w:val="vi-VN"/>
+        </w:rPr>
+        <w:t xml:space="preserve"> =&gt; </w:t>
+      </w:r>
+      <w:r>
+        <w:rPr>
+          <w:rFonts w:ascii="Times New Roman" w:eastAsia="Times New Roman" w:hAnsi="Times New Roman" w:cs="Times New Roman"/>
+          <w:sz w:val="26"/>
+          <w:szCs w:val="26"/>
+          <w:highlight w:val="yellow"/>
+          <w:lang w:val="vi-VN"/>
+        </w:rPr>
+        <w:t>đã</w:t>
+      </w:r>
+      <w:r>
+        <w:rPr>
+          <w:rFonts w:ascii="Times New Roman" w:eastAsia="Times New Roman" w:hAnsi="Times New Roman" w:cs="Times New Roman"/>
+          <w:sz w:val="26"/>
+          <w:szCs w:val="26"/>
+          <w:lang w:val="vi-VN"/>
+        </w:rPr>
+        <w:t xml:space="preserve"> </w:t>
+      </w:r>
+      <w:r>
+        <w:rPr>
+          <w:rFonts w:ascii="Times New Roman" w:eastAsia="Times New Roman" w:hAnsi="Times New Roman" w:cs="Times New Roman"/>
+          <w:sz w:val="26"/>
+          <w:szCs w:val="26"/>
+          <w:highlight w:val="yellow"/>
+          <w:lang w:val="vi-VN"/>
+        </w:rPr>
+        <w:t>làm</w:t>
+      </w:r>
+      <w:r>
+        <w:rPr>
+          <w:rFonts w:ascii="Times New Roman" w:eastAsia="Times New Roman" w:hAnsi="Times New Roman" w:cs="Times New Roman"/>
+          <w:sz w:val="26"/>
+          <w:szCs w:val="26"/>
+          <w:lang w:val="vi-VN"/>
+        </w:rPr>
+        <w:t xml:space="preserve"> </w:t>
+      </w:r>
+      <w:r>
+        <w:rPr>
+          <w:rFonts w:ascii="Times New Roman" w:eastAsia="Times New Roman" w:hAnsi="Times New Roman" w:cs="Times New Roman"/>
+          <w:sz w:val="26"/>
+          <w:szCs w:val="26"/>
+          <w:highlight w:val="yellow"/>
+          <w:lang w:val="vi-VN"/>
+        </w:rPr>
+        <w:t>nhưng</w:t>
+      </w:r>
+      <w:r>
+        <w:rPr>
+          <w:rFonts w:ascii="Times New Roman" w:eastAsia="Times New Roman" w:hAnsi="Times New Roman" w:cs="Times New Roman"/>
+          <w:sz w:val="26"/>
+          <w:szCs w:val="26"/>
+          <w:lang w:val="vi-VN"/>
+        </w:rPr>
+        <w:t xml:space="preserve"> </w:t>
+      </w:r>
+      <w:r>
+        <w:rPr>
+          <w:rFonts w:ascii="Times New Roman" w:eastAsia="Times New Roman" w:hAnsi="Times New Roman" w:cs="Times New Roman"/>
+          <w:sz w:val="26"/>
+          <w:szCs w:val="26"/>
+          <w:highlight w:val="yellow"/>
+          <w:lang w:val="vi-VN"/>
+        </w:rPr>
+        <w:t>chưa</w:t>
+      </w:r>
+      <w:r>
+        <w:rPr>
+          <w:rFonts w:ascii="Times New Roman" w:eastAsia="Times New Roman" w:hAnsi="Times New Roman" w:cs="Times New Roman"/>
+          <w:sz w:val="26"/>
+          <w:szCs w:val="26"/>
+          <w:lang w:val="vi-VN"/>
+        </w:rPr>
+        <w:t xml:space="preserve"> </w:t>
+      </w:r>
+      <w:r>
+        <w:rPr>
+          <w:rFonts w:ascii="Times New Roman" w:eastAsia="Times New Roman" w:hAnsi="Times New Roman" w:cs="Times New Roman"/>
+          <w:sz w:val="26"/>
+          <w:szCs w:val="26"/>
+          <w:highlight w:val="yellow"/>
+          <w:lang w:val="vi-VN"/>
+        </w:rPr>
+        <w:t>làm</w:t>
+      </w:r>
+      <w:r>
+        <w:rPr>
+          <w:rFonts w:ascii="Times New Roman" w:eastAsia="Times New Roman" w:hAnsi="Times New Roman" w:cs="Times New Roman"/>
+          <w:sz w:val="26"/>
+          <w:szCs w:val="26"/>
+          <w:lang w:val="vi-VN"/>
+        </w:rPr>
+        <w:t xml:space="preserve"> </w:t>
+      </w:r>
+      <w:r>
+        <w:rPr>
+          <w:rFonts w:ascii="Times New Roman" w:eastAsia="Times New Roman" w:hAnsi="Times New Roman" w:cs="Times New Roman"/>
+          <w:sz w:val="26"/>
+          <w:szCs w:val="26"/>
+          <w:highlight w:val="yellow"/>
+          <w:lang w:val="vi-VN"/>
+        </w:rPr>
+        <w:t>cái</w:t>
+      </w:r>
+      <w:r>
+        <w:rPr>
+          <w:rFonts w:ascii="Times New Roman" w:eastAsia="Times New Roman" w:hAnsi="Times New Roman" w:cs="Times New Roman"/>
+          <w:sz w:val="26"/>
+          <w:szCs w:val="26"/>
+          <w:lang w:val="vi-VN"/>
+        </w:rPr>
+        <w:t xml:space="preserve"> </w:t>
+      </w:r>
+      <w:r>
+        <w:rPr>
+          <w:rFonts w:ascii="Times New Roman" w:eastAsia="Times New Roman" w:hAnsi="Times New Roman" w:cs="Times New Roman"/>
+          <w:sz w:val="26"/>
+          <w:szCs w:val="26"/>
+          <w:highlight w:val="yellow"/>
+          <w:lang w:val="vi-VN"/>
+        </w:rPr>
+        <w:t>gửi</w:t>
+      </w:r>
+      <w:r>
+        <w:rPr>
+          <w:rFonts w:ascii="Times New Roman" w:eastAsia="Times New Roman" w:hAnsi="Times New Roman" w:cs="Times New Roman"/>
+          <w:sz w:val="26"/>
+          <w:szCs w:val="26"/>
+          <w:lang w:val="vi-VN"/>
+        </w:rPr>
+        <w:t xml:space="preserve"> </w:t>
+      </w:r>
+      <w:r>
+        <w:rPr>
+          <w:rFonts w:ascii="Times New Roman" w:eastAsia="Times New Roman" w:hAnsi="Times New Roman" w:cs="Times New Roman"/>
+          <w:sz w:val="26"/>
+          <w:szCs w:val="26"/>
+          <w:highlight w:val="yellow"/>
+          <w:lang w:val="vi-VN"/>
+        </w:rPr>
+        <w:t>hóa</w:t>
+      </w:r>
+      <w:r>
+        <w:rPr>
+          <w:rFonts w:ascii="Times New Roman" w:eastAsia="Times New Roman" w:hAnsi="Times New Roman" w:cs="Times New Roman"/>
+          <w:sz w:val="26"/>
+          <w:szCs w:val="26"/>
+          <w:lang w:val="vi-VN"/>
+        </w:rPr>
+        <w:t xml:space="preserve"> </w:t>
+      </w:r>
+      <w:r>
+        <w:rPr>
+          <w:rFonts w:ascii="Times New Roman" w:eastAsia="Times New Roman" w:hAnsi="Times New Roman" w:cs="Times New Roman"/>
+          <w:sz w:val="26"/>
+          <w:szCs w:val="26"/>
+          <w:highlight w:val="yellow"/>
+          <w:lang w:val="vi-VN"/>
+        </w:rPr>
+        <w:t>đơn</w:t>
+      </w:r>
+      <w:r>
+        <w:rPr>
+          <w:rFonts w:ascii="Times New Roman" w:eastAsia="Times New Roman" w:hAnsi="Times New Roman" w:cs="Times New Roman"/>
+          <w:sz w:val="26"/>
+          <w:szCs w:val="26"/>
+          <w:lang w:val="vi-VN"/>
+        </w:rPr>
+        <w:t xml:space="preserve"> </w:t>
+      </w:r>
+      <w:r>
+        <w:rPr>
+          <w:rFonts w:ascii="Times New Roman" w:eastAsia="Times New Roman" w:hAnsi="Times New Roman" w:cs="Times New Roman"/>
+          <w:sz w:val="26"/>
+          <w:szCs w:val="26"/>
+          <w:highlight w:val="yellow"/>
+          <w:lang w:val="vi-VN"/>
+        </w:rPr>
+        <w:t>điện</w:t>
+      </w:r>
+      <w:r>
+        <w:rPr>
+          <w:rFonts w:ascii="Times New Roman" w:eastAsia="Times New Roman" w:hAnsi="Times New Roman" w:cs="Times New Roman"/>
+          <w:sz w:val="26"/>
+          <w:szCs w:val="26"/>
+          <w:lang w:val="vi-VN"/>
+        </w:rPr>
+        <w:t xml:space="preserve"> </w:t>
+      </w:r>
+      <w:r>
+        <w:rPr>
+          <w:rFonts w:ascii="Times New Roman" w:eastAsia="Times New Roman" w:hAnsi="Times New Roman" w:cs="Times New Roman"/>
+          <w:sz w:val="26"/>
+          <w:szCs w:val="26"/>
+          <w:highlight w:val="yellow"/>
+          <w:lang w:val="vi-VN"/>
+        </w:rPr>
+        <w:t>tử</w:t>
+      </w:r>
+      <w:r>
+        <w:rPr>
+          <w:rFonts w:ascii="Times New Roman" w:eastAsia="Times New Roman" w:hAnsi="Times New Roman" w:cs="Times New Roman"/>
+          <w:sz w:val="26"/>
+          <w:szCs w:val="26"/>
+          <w:lang w:val="vi-VN"/>
+        </w:rPr>
+        <w:t xml:space="preserve"> </w:t>
+      </w:r>
+      <w:r>
+        <w:rPr>
+          <w:rFonts w:ascii="Times New Roman" w:eastAsia="Times New Roman" w:hAnsi="Times New Roman" w:cs="Times New Roman"/>
+          <w:sz w:val="26"/>
+          <w:szCs w:val="26"/>
+          <w:highlight w:val="yellow"/>
+          <w:lang w:val="vi-VN"/>
+        </w:rPr>
+        <w:t>đâu</w:t>
+      </w:r>
+      <w:r>
+        <w:rPr>
+          <w:rFonts w:ascii="Times New Roman" w:eastAsia="Times New Roman" w:hAnsi="Times New Roman" w:cs="Times New Roman"/>
+          <w:sz w:val="26"/>
+          <w:szCs w:val="26"/>
+          <w:lang w:val="vi-VN"/>
+        </w:rPr>
+        <w:t xml:space="preserve"> :</w:t>
+      </w:r>
+      <w:r>
+        <w:rPr>
+          <w:rFonts w:ascii="Times New Roman" w:eastAsia="Times New Roman" w:hAnsi="Times New Roman" w:cs="Times New Roman"/>
+          <w:sz w:val="26"/>
+          <w:szCs w:val="26"/>
+          <w:highlight w:val="yellow"/>
+          <w:lang w:val="vi-VN"/>
+        </w:rPr>
+        <w:t>v</w:t>
+      </w:r>
+    </w:p>
+    <w:p>
+      <w:pPr>
+        <w:spacing w:before="240" w:after="240"/>
+        <w:rPr>
+          <w:rFonts w:ascii="Times New Roman" w:eastAsia="Times New Roman" w:hAnsi="Times New Roman" w:cs="Times New Roman"/>
+          <w:sz w:val="26"/>
+          <w:szCs w:val="26"/>
+          <w:lang w:val="vi-VN"/>
+        </w:rPr>
+      </w:pPr>
+      <w:r>
+        <w:rPr>
+          <w:rFonts w:ascii="Times New Roman" w:eastAsia="Times New Roman" w:hAnsi="Times New Roman" w:cs="Times New Roman"/>
+          <w:b/>
+          <w:bCs/>
+          <w:sz w:val="26"/>
+          <w:szCs w:val="26"/>
+          <w:highlight w:val="yellow"/>
+        </w:rPr>
         <w:t>- Xử lý thanh toán tại quầy</w:t>
       </w:r>
       <w:r>
@@ -1456,8 +2122,56 @@
           <w:rFonts w:ascii="Times New Roman" w:eastAsia="Times New Roman" w:hAnsi="Times New Roman" w:cs="Times New Roman"/>
           <w:sz w:val="26"/>
           <w:szCs w:val="26"/>
+          <w:highlight w:val="yellow"/>
         </w:rPr>
         <w:t>: Thu tiền bằng tiền mặt, thẻ, ví điện tử hoặc QR code qua POS.</w:t>
+      </w:r>
+      <w:r>
+        <w:rPr>
+          <w:rFonts w:ascii="Times New Roman" w:eastAsia="Times New Roman" w:hAnsi="Times New Roman" w:cs="Times New Roman"/>
+          <w:sz w:val="26"/>
+          <w:szCs w:val="26"/>
+          <w:lang w:val="vi-VN"/>
+        </w:rPr>
+        <w:t xml:space="preserve"> =&gt; </w:t>
+      </w:r>
+      <w:r>
+        <w:rPr>
+          <w:rFonts w:ascii="Times New Roman" w:eastAsia="Times New Roman" w:hAnsi="Times New Roman" w:cs="Times New Roman"/>
+          <w:sz w:val="26"/>
+          <w:szCs w:val="26"/>
+          <w:highlight w:val="yellow"/>
+          <w:lang w:val="vi-VN"/>
+        </w:rPr>
+        <w:t>đã</w:t>
+      </w:r>
+      <w:r>
+        <w:rPr>
+          <w:rFonts w:ascii="Times New Roman" w:eastAsia="Times New Roman" w:hAnsi="Times New Roman" w:cs="Times New Roman"/>
+          <w:sz w:val="26"/>
+          <w:szCs w:val="26"/>
+          <w:lang w:val="vi-VN"/>
+        </w:rPr>
+        <w:t xml:space="preserve"> </w:t>
+      </w:r>
+      <w:r>
+        <w:rPr>
+          <w:rFonts w:ascii="Times New Roman" w:eastAsia="Times New Roman" w:hAnsi="Times New Roman" w:cs="Times New Roman"/>
+          <w:sz w:val="26"/>
+          <w:szCs w:val="26"/>
+          <w:highlight w:val="yellow"/>
+          <w:lang w:val="vi-VN"/>
+        </w:rPr>
+        <w:t>làm</w:t>
+      </w:r>
+      <w:r>
+        <w:rPr>
+          <w:rFonts w:ascii="Times New Roman" w:eastAsia="Times New Roman" w:hAnsi="Times New Roman" w:cs="Times New Roman"/>
+          <w:sz w:val="26"/>
+          <w:szCs w:val="26"/>
+          <w:lang w:val="vi-VN"/>
+        </w:rPr>
+        <w:t xml:space="preserve"> </w:t>
       </w:r>
     </w:p>
     <w:p>
@@ -1904,7 +2618,6 @@
           <w:szCs w:val="26"/>
           <w:highlight w:val="yellow"/>
         </w:rPr>
-        <w:lastRenderedPageBreak/>
         <w:t>6. Actor: Quản lý kho hàng (Warehouse Manager)</w:t>
       </w:r>
     </w:p>

</xml_diff>

<commit_message>
feat (tin nhan + manager): cap nhat chuc nang nhan tin + 1 vai chuc nang manager
</commit_message>
<xml_diff>
--- a/CNM_ChucNangNguoiDung.docx
+++ b/CNM_ChucNangNguoiDung.docx
@@ -240,9 +240,181 @@
           <w:rFonts w:ascii="Times New Roman" w:eastAsia="Times New Roman" w:hAnsi="Times New Roman" w:cs="Times New Roman"/>
           <w:sz w:val="26"/>
           <w:szCs w:val="26"/>
+          <w:highlight w:val="yellow"/>
           <w:lang w:val="vi-VN"/>
         </w:rPr>
         <w:t>- Thêm chức năng nhắn tin =&gt; dùng websocket chưa làm</w:t>
+      </w:r>
+      <w:r>
+        <w:rPr>
+          <w:rFonts w:ascii="Times New Roman" w:eastAsia="Times New Roman" w:hAnsi="Times New Roman" w:cs="Times New Roman"/>
+          <w:sz w:val="26"/>
+          <w:szCs w:val="26"/>
+          <w:lang w:val="vi-VN"/>
+        </w:rPr>
+        <w:t xml:space="preserve"> =&gt; </w:t>
+      </w:r>
+      <w:r>
+        <w:rPr>
+          <w:rFonts w:ascii="Times New Roman" w:eastAsia="Times New Roman" w:hAnsi="Times New Roman" w:cs="Times New Roman"/>
+          <w:sz w:val="26"/>
+          <w:szCs w:val="26"/>
+          <w:highlight w:val="yellow"/>
+          <w:lang w:val="vi-VN"/>
+        </w:rPr>
+        <w:t>đã</w:t>
+      </w:r>
+      <w:r>
+        <w:rPr>
+          <w:rFonts w:ascii="Times New Roman" w:eastAsia="Times New Roman" w:hAnsi="Times New Roman" w:cs="Times New Roman"/>
+          <w:sz w:val="26"/>
+          <w:szCs w:val="26"/>
+          <w:lang w:val="vi-VN"/>
+        </w:rPr>
+        <w:t xml:space="preserve"> </w:t>
+      </w:r>
+      <w:r>
+        <w:rPr>
+          <w:rFonts w:ascii="Times New Roman" w:eastAsia="Times New Roman" w:hAnsi="Times New Roman" w:cs="Times New Roman"/>
+          <w:sz w:val="26"/>
+          <w:szCs w:val="26"/>
+          <w:highlight w:val="yellow"/>
+          <w:lang w:val="vi-VN"/>
+        </w:rPr>
+        <w:t>làm</w:t>
+      </w:r>
+      <w:r>
+        <w:rPr>
+          <w:rFonts w:ascii="Times New Roman" w:eastAsia="Times New Roman" w:hAnsi="Times New Roman" w:cs="Times New Roman"/>
+          <w:sz w:val="26"/>
+          <w:szCs w:val="26"/>
+          <w:lang w:val="vi-VN"/>
+        </w:rPr>
+        <w:t xml:space="preserve"> </w:t>
+      </w:r>
+      <w:r>
+        <w:rPr>
+          <w:rFonts w:ascii="Times New Roman" w:eastAsia="Times New Roman" w:hAnsi="Times New Roman" w:cs="Times New Roman"/>
+          <w:sz w:val="26"/>
+          <w:szCs w:val="26"/>
+          <w:highlight w:val="yellow"/>
+          <w:lang w:val="vi-VN"/>
+        </w:rPr>
+        <w:t>cơ</w:t>
+      </w:r>
+      <w:r>
+        <w:rPr>
+          <w:rFonts w:ascii="Times New Roman" w:eastAsia="Times New Roman" w:hAnsi="Times New Roman" w:cs="Times New Roman"/>
+          <w:sz w:val="26"/>
+          <w:szCs w:val="26"/>
+          <w:lang w:val="vi-VN"/>
+        </w:rPr>
+        <w:t xml:space="preserve"> </w:t>
+      </w:r>
+      <w:r>
+        <w:rPr>
+          <w:rFonts w:ascii="Times New Roman" w:eastAsia="Times New Roman" w:hAnsi="Times New Roman" w:cs="Times New Roman"/>
+          <w:sz w:val="26"/>
+          <w:szCs w:val="26"/>
+          <w:highlight w:val="yellow"/>
+          <w:lang w:val="vi-VN"/>
+        </w:rPr>
+        <w:t>bản</w:t>
+      </w:r>
+      <w:r>
+        <w:rPr>
+          <w:rFonts w:ascii="Times New Roman" w:eastAsia="Times New Roman" w:hAnsi="Times New Roman" w:cs="Times New Roman"/>
+          <w:sz w:val="26"/>
+          <w:szCs w:val="26"/>
+          <w:lang w:val="vi-VN"/>
+        </w:rPr>
+        <w:t xml:space="preserve"> </w:t>
+      </w:r>
+      <w:r>
+        <w:rPr>
+          <w:rFonts w:ascii="Times New Roman" w:eastAsia="Times New Roman" w:hAnsi="Times New Roman" w:cs="Times New Roman"/>
+          <w:sz w:val="26"/>
+          <w:szCs w:val="26"/>
+          <w:highlight w:val="yellow"/>
+          <w:lang w:val="vi-VN"/>
+        </w:rPr>
+        <w:t>chưa</w:t>
+      </w:r>
+      <w:r>
+        <w:rPr>
+          <w:rFonts w:ascii="Times New Roman" w:eastAsia="Times New Roman" w:hAnsi="Times New Roman" w:cs="Times New Roman"/>
+          <w:sz w:val="26"/>
+          <w:szCs w:val="26"/>
+          <w:lang w:val="vi-VN"/>
+        </w:rPr>
+        <w:t xml:space="preserve"> </w:t>
+      </w:r>
+      <w:r>
+        <w:rPr>
+          <w:rFonts w:ascii="Times New Roman" w:eastAsia="Times New Roman" w:hAnsi="Times New Roman" w:cs="Times New Roman"/>
+          <w:sz w:val="26"/>
+          <w:szCs w:val="26"/>
+          <w:highlight w:val="yellow"/>
+          <w:lang w:val="vi-VN"/>
+        </w:rPr>
+        <w:t>add</w:t>
+      </w:r>
+      <w:r>
+        <w:rPr>
+          <w:rFonts w:ascii="Times New Roman" w:eastAsia="Times New Roman" w:hAnsi="Times New Roman" w:cs="Times New Roman"/>
+          <w:sz w:val="26"/>
+          <w:szCs w:val="26"/>
+          <w:lang w:val="vi-VN"/>
+        </w:rPr>
+        <w:t xml:space="preserve"> </w:t>
+      </w:r>
+      <w:r>
+        <w:rPr>
+          <w:rFonts w:ascii="Times New Roman" w:eastAsia="Times New Roman" w:hAnsi="Times New Roman" w:cs="Times New Roman"/>
+          <w:sz w:val="26"/>
+          <w:szCs w:val="26"/>
+          <w:highlight w:val="yellow"/>
+          <w:lang w:val="vi-VN"/>
+        </w:rPr>
+        <w:t>AI</w:t>
+      </w:r>
+      <w:r>
+        <w:rPr>
+          <w:rFonts w:ascii="Times New Roman" w:eastAsia="Times New Roman" w:hAnsi="Times New Roman" w:cs="Times New Roman"/>
+          <w:sz w:val="26"/>
+          <w:szCs w:val="26"/>
+          <w:lang w:val="vi-VN"/>
+        </w:rPr>
+        <w:t xml:space="preserve"> </w:t>
+      </w:r>
+      <w:r>
+        <w:rPr>
+          <w:rFonts w:ascii="Times New Roman" w:eastAsia="Times New Roman" w:hAnsi="Times New Roman" w:cs="Times New Roman"/>
+          <w:sz w:val="26"/>
+          <w:szCs w:val="26"/>
+          <w:highlight w:val="yellow"/>
+          <w:lang w:val="vi-VN"/>
+        </w:rPr>
+        <w:t>các</w:t>
+      </w:r>
+      <w:r>
+        <w:rPr>
+          <w:rFonts w:ascii="Times New Roman" w:eastAsia="Times New Roman" w:hAnsi="Times New Roman" w:cs="Times New Roman"/>
+          <w:sz w:val="26"/>
+          <w:szCs w:val="26"/>
+          <w:lang w:val="vi-VN"/>
+        </w:rPr>
+        <w:t xml:space="preserve"> </w:t>
+      </w:r>
+      <w:r>
+        <w:rPr>
+          <w:rFonts w:ascii="Times New Roman" w:eastAsia="Times New Roman" w:hAnsi="Times New Roman" w:cs="Times New Roman"/>
+          <w:sz w:val="26"/>
+          <w:szCs w:val="26"/>
+          <w:highlight w:val="yellow"/>
+          <w:lang w:val="vi-VN"/>
+        </w:rPr>
+        <w:t>thứ</w:t>
       </w:r>
     </w:p>
     <w:p>
@@ -2176,6 +2348,77 @@
     </w:p>
     <w:p>
       <w:pPr>
+        <w:spacing w:before="240" w:after="240"/>
+        <w:rPr>
+          <w:rFonts w:ascii="Times New Roman" w:eastAsia="Times New Roman" w:hAnsi="Times New Roman" w:cs="Times New Roman"/>
+          <w:sz w:val="26"/>
+          <w:szCs w:val="26"/>
+          <w:lang w:val="vi-VN"/>
+        </w:rPr>
+      </w:pPr>
+      <w:r>
+        <w:rPr>
+          <w:rFonts w:ascii="Times New Roman" w:eastAsia="Times New Roman" w:hAnsi="Times New Roman" w:cs="Times New Roman"/>
+          <w:sz w:val="26"/>
+          <w:szCs w:val="26"/>
+          <w:highlight w:val="yellow"/>
+          <w:lang w:val="vi-VN"/>
+        </w:rPr>
+        <w:t xml:space="preserve">- Update thêm chức năng =&gt; </w:t>
+      </w:r>
+      <w:r>
+        <w:rPr>
+          <w:rFonts w:ascii="Times New Roman" w:eastAsia="Times New Roman" w:hAnsi="Times New Roman" w:cs="Times New Roman"/>
+          <w:sz w:val="26"/>
+          <w:szCs w:val="26"/>
+          <w:highlight w:val="yellow"/>
+          <w:lang w:val="vi-VN"/>
+        </w:rPr>
+        <w:t>xem ca</w:t>
+      </w:r>
+      <w:r>
+        <w:rPr>
+          <w:rFonts w:ascii="Times New Roman" w:eastAsia="Times New Roman" w:hAnsi="Times New Roman" w:cs="Times New Roman"/>
+          <w:sz w:val="26"/>
+          <w:szCs w:val="26"/>
+          <w:highlight w:val="yellow"/>
+          <w:lang w:val="vi-VN"/>
+        </w:rPr>
+        <w:t xml:space="preserve"> lịch</w:t>
+      </w:r>
+      <w:r>
+        <w:rPr>
+          <w:rFonts w:ascii="Times New Roman" w:eastAsia="Times New Roman" w:hAnsi="Times New Roman" w:cs="Times New Roman"/>
+          <w:sz w:val="26"/>
+          <w:szCs w:val="26"/>
+          <w:highlight w:val="yellow"/>
+          <w:lang w:val="vi-VN"/>
+        </w:rPr>
+        <w:t xml:space="preserve"> </w:t>
+      </w:r>
+      <w:r>
+        <w:rPr>
+          <w:rFonts w:ascii="Times New Roman" w:eastAsia="Times New Roman" w:hAnsi="Times New Roman" w:cs="Times New Roman"/>
+          <w:sz w:val="26"/>
+          <w:szCs w:val="26"/>
+          <w:highlight w:val="yellow"/>
+          <w:lang w:val="vi-VN"/>
+        </w:rPr>
+        <w:t>l</w:t>
+      </w:r>
+      <w:r>
+        <w:rPr>
+          <w:rFonts w:ascii="Times New Roman" w:eastAsia="Times New Roman" w:hAnsi="Times New Roman" w:cs="Times New Roman"/>
+          <w:sz w:val="26"/>
+          <w:szCs w:val="26"/>
+          <w:highlight w:val="yellow"/>
+          <w:lang w:val="vi-VN"/>
+        </w:rPr>
+        <w:t>àm các kiểu</w:t>
+      </w:r>
+    </w:p>
+    <w:p>
+      <w:pPr>
         <w:pStyle w:val="Heading3"/>
         <w:keepNext w:val="0"/>
         <w:keepLines w:val="0"/>
@@ -2212,6 +2455,7 @@
           <w:rFonts w:ascii="Times New Roman" w:eastAsia="Times New Roman" w:hAnsi="Times New Roman" w:cs="Times New Roman"/>
           <w:sz w:val="26"/>
           <w:szCs w:val="26"/>
+          <w:lang w:val="vi-VN"/>
         </w:rPr>
       </w:pPr>
       <w:r>
@@ -2234,23 +2478,101 @@
         </w:rPr>
         <w:t>: Tạo yêu cầu bổ sung nguyên liệu từ kho dựa trên nhu cầu chi nhánh.</w:t>
       </w:r>
-    </w:p>
-    <w:p>
-      <w:pPr>
-        <w:spacing w:before="240" w:after="240"/>
-        <w:rPr>
-          <w:rFonts w:ascii="Times New Roman" w:eastAsia="Times New Roman" w:hAnsi="Times New Roman" w:cs="Times New Roman"/>
-          <w:sz w:val="26"/>
-          <w:szCs w:val="26"/>
-        </w:rPr>
-      </w:pPr>
-      <w:r>
-        <w:rPr>
-          <w:rFonts w:ascii="Times New Roman" w:eastAsia="Times New Roman" w:hAnsi="Times New Roman" w:cs="Times New Roman"/>
-          <w:b/>
-          <w:bCs/>
-          <w:sz w:val="26"/>
-          <w:szCs w:val="26"/>
+      <w:r>
+        <w:rPr>
+          <w:rFonts w:ascii="Times New Roman" w:eastAsia="Times New Roman" w:hAnsi="Times New Roman" w:cs="Times New Roman"/>
+          <w:sz w:val="26"/>
+          <w:szCs w:val="26"/>
+          <w:lang w:val="vi-VN"/>
+        </w:rPr>
+        <w:t xml:space="preserve"> =&gt; </w:t>
+      </w:r>
+      <w:r>
+        <w:rPr>
+          <w:rFonts w:ascii="Times New Roman" w:eastAsia="Times New Roman" w:hAnsi="Times New Roman" w:cs="Times New Roman"/>
+          <w:sz w:val="26"/>
+          <w:szCs w:val="26"/>
+          <w:highlight w:val="yellow"/>
+          <w:lang w:val="vi-VN"/>
+        </w:rPr>
+        <w:t>chưa</w:t>
+      </w:r>
+      <w:r>
+        <w:rPr>
+          <w:rFonts w:ascii="Times New Roman" w:eastAsia="Times New Roman" w:hAnsi="Times New Roman" w:cs="Times New Roman"/>
+          <w:sz w:val="26"/>
+          <w:szCs w:val="26"/>
+          <w:lang w:val="vi-VN"/>
+        </w:rPr>
+        <w:t xml:space="preserve"> </w:t>
+      </w:r>
+      <w:r>
+        <w:rPr>
+          <w:rFonts w:ascii="Times New Roman" w:eastAsia="Times New Roman" w:hAnsi="Times New Roman" w:cs="Times New Roman"/>
+          <w:sz w:val="26"/>
+          <w:szCs w:val="26"/>
+          <w:highlight w:val="yellow"/>
+          <w:lang w:val="vi-VN"/>
+        </w:rPr>
+        <w:t>làm</w:t>
+      </w:r>
+      <w:r>
+        <w:rPr>
+          <w:rFonts w:ascii="Times New Roman" w:eastAsia="Times New Roman" w:hAnsi="Times New Roman" w:cs="Times New Roman"/>
+          <w:sz w:val="26"/>
+          <w:szCs w:val="26"/>
+          <w:lang w:val="vi-VN"/>
+        </w:rPr>
+        <w:t xml:space="preserve"> </w:t>
+      </w:r>
+      <w:r>
+        <w:rPr>
+          <w:rFonts w:ascii="Times New Roman" w:eastAsia="Times New Roman" w:hAnsi="Times New Roman" w:cs="Times New Roman"/>
+          <w:sz w:val="26"/>
+          <w:szCs w:val="26"/>
+          <w:highlight w:val="yellow"/>
+          <w:lang w:val="vi-VN"/>
+        </w:rPr>
+        <w:t>về</w:t>
+      </w:r>
+      <w:r>
+        <w:rPr>
+          <w:rFonts w:ascii="Times New Roman" w:eastAsia="Times New Roman" w:hAnsi="Times New Roman" w:cs="Times New Roman"/>
+          <w:sz w:val="26"/>
+          <w:szCs w:val="26"/>
+          <w:lang w:val="vi-VN"/>
+        </w:rPr>
+        <w:t xml:space="preserve"> </w:t>
+      </w:r>
+      <w:r>
+        <w:rPr>
+          <w:rFonts w:ascii="Times New Roman" w:eastAsia="Times New Roman" w:hAnsi="Times New Roman" w:cs="Times New Roman"/>
+          <w:sz w:val="26"/>
+          <w:szCs w:val="26"/>
+          <w:highlight w:val="yellow"/>
+          <w:lang w:val="vi-VN"/>
+        </w:rPr>
+        <w:t>fkho</w:t>
+      </w:r>
+    </w:p>
+    <w:p>
+      <w:pPr>
+        <w:spacing w:before="240" w:after="240"/>
+        <w:rPr>
+          <w:rFonts w:ascii="Times New Roman" w:eastAsia="Times New Roman" w:hAnsi="Times New Roman" w:cs="Times New Roman"/>
+          <w:sz w:val="26"/>
+          <w:szCs w:val="26"/>
+          <w:lang w:val="vi-VN"/>
+        </w:rPr>
+      </w:pPr>
+      <w:r>
+        <w:rPr>
+          <w:rFonts w:ascii="Times New Roman" w:eastAsia="Times New Roman" w:hAnsi="Times New Roman" w:cs="Times New Roman"/>
+          <w:b/>
+          <w:bCs/>
+          <w:sz w:val="26"/>
+          <w:szCs w:val="26"/>
+          <w:highlight w:val="yellow"/>
         </w:rPr>
         <w:t>- Quản lý ca làm việc nhân viên</w:t>
       </w:r>
@@ -2259,9 +2581,86 @@
           <w:rFonts w:ascii="Times New Roman" w:eastAsia="Times New Roman" w:hAnsi="Times New Roman" w:cs="Times New Roman"/>
           <w:sz w:val="26"/>
           <w:szCs w:val="26"/>
+          <w:highlight w:val="yellow"/>
         </w:rPr>
         <w:t>: Sắp xếp lịch ca, chấm công và theo dõi giờ làm của nhân viên.</w:t>
       </w:r>
+      <w:r>
+        <w:rPr>
+          <w:rFonts w:ascii="Times New Roman" w:eastAsia="Times New Roman" w:hAnsi="Times New Roman" w:cs="Times New Roman"/>
+          <w:sz w:val="26"/>
+          <w:szCs w:val="26"/>
+          <w:lang w:val="vi-VN"/>
+        </w:rPr>
+        <w:t xml:space="preserve"> =&gt; </w:t>
+      </w:r>
+      <w:r>
+        <w:rPr>
+          <w:rFonts w:ascii="Times New Roman" w:eastAsia="Times New Roman" w:hAnsi="Times New Roman" w:cs="Times New Roman"/>
+          <w:sz w:val="26"/>
+          <w:szCs w:val="26"/>
+          <w:highlight w:val="yellow"/>
+          <w:lang w:val="vi-VN"/>
+        </w:rPr>
+        <w:t>đã</w:t>
+      </w:r>
+      <w:r>
+        <w:rPr>
+          <w:rFonts w:ascii="Times New Roman" w:eastAsia="Times New Roman" w:hAnsi="Times New Roman" w:cs="Times New Roman"/>
+          <w:sz w:val="26"/>
+          <w:szCs w:val="26"/>
+          <w:lang w:val="vi-VN"/>
+        </w:rPr>
+        <w:t xml:space="preserve"> </w:t>
+      </w:r>
+      <w:r>
+        <w:rPr>
+          <w:rFonts w:ascii="Times New Roman" w:eastAsia="Times New Roman" w:hAnsi="Times New Roman" w:cs="Times New Roman"/>
+          <w:sz w:val="26"/>
+          <w:szCs w:val="26"/>
+          <w:highlight w:val="yellow"/>
+          <w:lang w:val="vi-VN"/>
+        </w:rPr>
+        <w:t>làm</w:t>
+      </w:r>
+      <w:r>
+        <w:rPr>
+          <w:rFonts w:ascii="Times New Roman" w:eastAsia="Times New Roman" w:hAnsi="Times New Roman" w:cs="Times New Roman"/>
+          <w:sz w:val="26"/>
+          <w:szCs w:val="26"/>
+          <w:lang w:val="vi-VN"/>
+        </w:rPr>
+        <w:t xml:space="preserve"> </w:t>
+      </w:r>
+      <w:r>
+        <w:rPr>
+          <w:rFonts w:ascii="Times New Roman" w:eastAsia="Times New Roman" w:hAnsi="Times New Roman" w:cs="Times New Roman"/>
+          <w:sz w:val="26"/>
+          <w:szCs w:val="26"/>
+          <w:highlight w:val="yellow"/>
+          <w:lang w:val="vi-VN"/>
+        </w:rPr>
+        <w:t>cơ</w:t>
+      </w:r>
+      <w:r>
+        <w:rPr>
+          <w:rFonts w:ascii="Times New Roman" w:eastAsia="Times New Roman" w:hAnsi="Times New Roman" w:cs="Times New Roman"/>
+          <w:sz w:val="26"/>
+          <w:szCs w:val="26"/>
+          <w:lang w:val="vi-VN"/>
+        </w:rPr>
+        <w:t xml:space="preserve"> </w:t>
+      </w:r>
+      <w:r>
+        <w:rPr>
+          <w:rFonts w:ascii="Times New Roman" w:eastAsia="Times New Roman" w:hAnsi="Times New Roman" w:cs="Times New Roman"/>
+          <w:sz w:val="26"/>
+          <w:szCs w:val="26"/>
+          <w:highlight w:val="yellow"/>
+          <w:lang w:val="vi-VN"/>
+        </w:rPr>
+        <w:t>bản</w:t>
+      </w:r>
     </w:p>
     <w:p>
       <w:pPr>
@@ -2298,15 +2697,17 @@
           <w:rFonts w:ascii="Times New Roman" w:eastAsia="Times New Roman" w:hAnsi="Times New Roman" w:cs="Times New Roman"/>
           <w:sz w:val="26"/>
           <w:szCs w:val="26"/>
-        </w:rPr>
-      </w:pPr>
-      <w:r>
-        <w:rPr>
-          <w:rFonts w:ascii="Times New Roman" w:eastAsia="Times New Roman" w:hAnsi="Times New Roman" w:cs="Times New Roman"/>
-          <w:b/>
-          <w:bCs/>
-          <w:sz w:val="26"/>
-          <w:szCs w:val="26"/>
+          <w:lang w:val="vi-VN"/>
+        </w:rPr>
+      </w:pPr>
+      <w:r>
+        <w:rPr>
+          <w:rFonts w:ascii="Times New Roman" w:eastAsia="Times New Roman" w:hAnsi="Times New Roman" w:cs="Times New Roman"/>
+          <w:b/>
+          <w:bCs/>
+          <w:sz w:val="26"/>
+          <w:szCs w:val="26"/>
+          <w:highlight w:val="yellow"/>
         </w:rPr>
         <w:t>- Đối soát tiền mặt cuối ca</w:t>
       </w:r>
@@ -2315,17 +2716,114 @@
           <w:rFonts w:ascii="Times New Roman" w:eastAsia="Times New Roman" w:hAnsi="Times New Roman" w:cs="Times New Roman"/>
           <w:sz w:val="26"/>
           <w:szCs w:val="26"/>
+          <w:highlight w:val="yellow"/>
         </w:rPr>
         <w:t>: Kiểm tra và phê duyệt báo cáo đối soát tiền mặt của các ca.</w:t>
       </w:r>
-    </w:p>
-    <w:p>
-      <w:pPr>
-        <w:spacing w:before="240" w:after="240"/>
-        <w:rPr>
-          <w:rFonts w:ascii="Times New Roman" w:eastAsia="Times New Roman" w:hAnsi="Times New Roman" w:cs="Times New Roman"/>
-          <w:sz w:val="26"/>
-          <w:szCs w:val="26"/>
+      <w:r>
+        <w:rPr>
+          <w:rFonts w:ascii="Times New Roman" w:eastAsia="Times New Roman" w:hAnsi="Times New Roman" w:cs="Times New Roman"/>
+          <w:sz w:val="26"/>
+          <w:szCs w:val="26"/>
+          <w:lang w:val="vi-VN"/>
+        </w:rPr>
+        <w:t xml:space="preserve"> =&gt; </w:t>
+      </w:r>
+      <w:r>
+        <w:rPr>
+          <w:rFonts w:ascii="Times New Roman" w:eastAsia="Times New Roman" w:hAnsi="Times New Roman" w:cs="Times New Roman"/>
+          <w:sz w:val="26"/>
+          <w:szCs w:val="26"/>
+          <w:highlight w:val="yellow"/>
+          <w:lang w:val="vi-VN"/>
+        </w:rPr>
+        <w:t>đã</w:t>
+      </w:r>
+      <w:r>
+        <w:rPr>
+          <w:rFonts w:ascii="Times New Roman" w:eastAsia="Times New Roman" w:hAnsi="Times New Roman" w:cs="Times New Roman"/>
+          <w:sz w:val="26"/>
+          <w:szCs w:val="26"/>
+          <w:lang w:val="vi-VN"/>
+        </w:rPr>
+        <w:t xml:space="preserve"> </w:t>
+      </w:r>
+      <w:r>
+        <w:rPr>
+          <w:rFonts w:ascii="Times New Roman" w:eastAsia="Times New Roman" w:hAnsi="Times New Roman" w:cs="Times New Roman"/>
+          <w:sz w:val="26"/>
+          <w:szCs w:val="26"/>
+          <w:highlight w:val="yellow"/>
+          <w:lang w:val="vi-VN"/>
+        </w:rPr>
+        <w:t>làm</w:t>
+      </w:r>
+      <w:r>
+        <w:rPr>
+          <w:rFonts w:ascii="Times New Roman" w:eastAsia="Times New Roman" w:hAnsi="Times New Roman" w:cs="Times New Roman"/>
+          <w:sz w:val="26"/>
+          <w:szCs w:val="26"/>
+          <w:lang w:val="vi-VN"/>
+        </w:rPr>
+        <w:t xml:space="preserve"> </w:t>
+      </w:r>
+      <w:r>
+        <w:rPr>
+          <w:rFonts w:ascii="Times New Roman" w:eastAsia="Times New Roman" w:hAnsi="Times New Roman" w:cs="Times New Roman"/>
+          <w:sz w:val="26"/>
+          <w:szCs w:val="26"/>
+          <w:highlight w:val="yellow"/>
+          <w:lang w:val="vi-VN"/>
+        </w:rPr>
+        <w:t>duyệt</w:t>
+      </w:r>
+      <w:r>
+        <w:rPr>
+          <w:rFonts w:ascii="Times New Roman" w:eastAsia="Times New Roman" w:hAnsi="Times New Roman" w:cs="Times New Roman"/>
+          <w:sz w:val="26"/>
+          <w:szCs w:val="26"/>
+          <w:lang w:val="vi-VN"/>
+        </w:rPr>
+        <w:t xml:space="preserve"> </w:t>
+      </w:r>
+      <w:r>
+        <w:rPr>
+          <w:rFonts w:ascii="Times New Roman" w:eastAsia="Times New Roman" w:hAnsi="Times New Roman" w:cs="Times New Roman"/>
+          <w:sz w:val="26"/>
+          <w:szCs w:val="26"/>
+          <w:highlight w:val="yellow"/>
+          <w:lang w:val="vi-VN"/>
+        </w:rPr>
+        <w:t>cơ</w:t>
+      </w:r>
+      <w:r>
+        <w:rPr>
+          <w:rFonts w:ascii="Times New Roman" w:eastAsia="Times New Roman" w:hAnsi="Times New Roman" w:cs="Times New Roman"/>
+          <w:sz w:val="26"/>
+          <w:szCs w:val="26"/>
+          <w:lang w:val="vi-VN"/>
+        </w:rPr>
+        <w:t xml:space="preserve"> </w:t>
+      </w:r>
+      <w:r>
+        <w:rPr>
+          <w:rFonts w:ascii="Times New Roman" w:eastAsia="Times New Roman" w:hAnsi="Times New Roman" w:cs="Times New Roman"/>
+          <w:sz w:val="26"/>
+          <w:szCs w:val="26"/>
+          <w:highlight w:val="yellow"/>
+          <w:lang w:val="vi-VN"/>
+        </w:rPr>
+        <w:t>bản</w:t>
+      </w:r>
+    </w:p>
+    <w:p>
+      <w:pPr>
+        <w:spacing w:before="240" w:after="240"/>
+        <w:rPr>
+          <w:rFonts w:ascii="Times New Roman" w:eastAsia="Times New Roman" w:hAnsi="Times New Roman" w:cs="Times New Roman"/>
+          <w:sz w:val="26"/>
+          <w:szCs w:val="26"/>
+          <w:lang w:val="vi-VN"/>
         </w:rPr>
       </w:pPr>
       <w:r>
@@ -2345,6 +2843,15 @@
           <w:szCs w:val="26"/>
         </w:rPr>
         <w:t>: Theo dõi doanh thu, số đơn, món bán chạy và hiệu suất chi nhánh.</w:t>
+      </w:r>
+      <w:r>
+        <w:rPr>
+          <w:rFonts w:ascii="Times New Roman" w:eastAsia="Times New Roman" w:hAnsi="Times New Roman" w:cs="Times New Roman"/>
+          <w:sz w:val="26"/>
+          <w:szCs w:val="26"/>
+          <w:lang w:val="vi-VN"/>
+        </w:rPr>
+        <w:t xml:space="preserve"> =&gt; này từ từ tại chưa chia chi nhánh</w:t>
       </w:r>
     </w:p>
     <w:p>
@@ -2563,6 +3070,7 @@
           <w:sz w:val="26"/>
           <w:szCs w:val="26"/>
         </w:rPr>
+        <w:lastRenderedPageBreak/>
         <w:t>- Cấu hình và giám sát hệ thống</w:t>
       </w:r>
       <w:r>
@@ -2591,6 +3099,19 @@
           <w:lang w:val="vi-VN"/>
         </w:rPr>
       </w:pPr>
+      <w:r>
+        <w:rPr>
+          <w:rFonts w:ascii="Times New Roman" w:eastAsia="Times New Roman" w:hAnsi="Times New Roman" w:cs="Times New Roman"/>
+          <w:b/>
+          <w:bCs/>
+          <w:color w:val="000000"/>
+          <w:sz w:val="26"/>
+          <w:szCs w:val="26"/>
+          <w:highlight w:val="yellow"/>
+          <w:lang w:val="vi-VN"/>
+        </w:rPr>
+        <w:t>=&gt; Những actor và chức năng này chưa đụng</w:t>
+      </w:r>
     </w:p>
     <w:p>
       <w:pPr>

</xml_diff>

<commit_message>
feat + fix (admin): sua va update cac chuc nang ben gd admin
</commit_message>
<xml_diff>
--- a/CNM_ChucNangNguoiDung.docx
+++ b/CNM_ChucNangNguoiDung.docx
@@ -763,6 +763,26 @@
         </w:rPr>
         <w:t>đã làm</w:t>
       </w:r>
+      <w:r>
+        <w:rPr>
+          <w:rFonts w:ascii="Times New Roman" w:eastAsia="Times New Roman" w:hAnsi="Times New Roman" w:cs="Times New Roman"/>
+          <w:sz w:val="26"/>
+          <w:szCs w:val="26"/>
+          <w:highlight w:val="yellow"/>
+          <w:lang w:val="vi-VN"/>
+        </w:rPr>
+        <w:t xml:space="preserve"> =&gt; này chưa </w:t>
+      </w:r>
+      <w:r>
+        <w:rPr>
+          <w:rFonts w:ascii="Times New Roman" w:eastAsia="Times New Roman" w:hAnsi="Times New Roman" w:cs="Times New Roman"/>
+          <w:sz w:val="26"/>
+          <w:szCs w:val="26"/>
+          <w:highlight w:val="yellow"/>
+          <w:lang w:val="vi-VN"/>
+        </w:rPr>
+        <w:t>làm rõ về cái địa chỉ nha bác</w:t>
+      </w:r>
     </w:p>
     <w:p>
       <w:pPr>
@@ -1541,6 +1561,72 @@
         </w:rPr>
         <w:t>bản</w:t>
       </w:r>
+      <w:r>
+        <w:rPr>
+          <w:rFonts w:ascii="Times New Roman" w:eastAsia="Times New Roman" w:hAnsi="Times New Roman" w:cs="Times New Roman"/>
+          <w:sz w:val="26"/>
+          <w:szCs w:val="26"/>
+          <w:lang w:val="vi-VN"/>
+        </w:rPr>
+        <w:t xml:space="preserve"> </w:t>
+      </w:r>
+      <w:r>
+        <w:rPr>
+          <w:rFonts w:ascii="Times New Roman" w:eastAsia="Times New Roman" w:hAnsi="Times New Roman" w:cs="Times New Roman"/>
+          <w:sz w:val="26"/>
+          <w:szCs w:val="26"/>
+          <w:highlight w:val="yellow"/>
+          <w:lang w:val="vi-VN"/>
+        </w:rPr>
+        <w:t>tạm</w:t>
+      </w:r>
+      <w:r>
+        <w:rPr>
+          <w:rFonts w:ascii="Times New Roman" w:eastAsia="Times New Roman" w:hAnsi="Times New Roman" w:cs="Times New Roman"/>
+          <w:sz w:val="26"/>
+          <w:szCs w:val="26"/>
+          <w:lang w:val="vi-VN"/>
+        </w:rPr>
+        <w:t xml:space="preserve"> </w:t>
+      </w:r>
+      <w:r>
+        <w:rPr>
+          <w:rFonts w:ascii="Times New Roman" w:eastAsia="Times New Roman" w:hAnsi="Times New Roman" w:cs="Times New Roman"/>
+          <w:sz w:val="26"/>
+          <w:szCs w:val="26"/>
+          <w:highlight w:val="yellow"/>
+          <w:lang w:val="vi-VN"/>
+        </w:rPr>
+        <w:t>tạm</w:t>
+      </w:r>
+      <w:r>
+        <w:rPr>
+          <w:rFonts w:ascii="Times New Roman" w:eastAsia="Times New Roman" w:hAnsi="Times New Roman" w:cs="Times New Roman"/>
+          <w:sz w:val="26"/>
+          <w:szCs w:val="26"/>
+          <w:lang w:val="vi-VN"/>
+        </w:rPr>
+        <w:t xml:space="preserve"> </w:t>
+      </w:r>
+      <w:r>
+        <w:rPr>
+          <w:rFonts w:ascii="Times New Roman" w:eastAsia="Times New Roman" w:hAnsi="Times New Roman" w:cs="Times New Roman"/>
+          <w:sz w:val="26"/>
+          <w:szCs w:val="26"/>
+          <w:highlight w:val="yellow"/>
+          <w:lang w:val="vi-VN"/>
+        </w:rPr>
+        <w:t>ok</w:t>
+      </w:r>
+      <w:r>
+        <w:rPr>
+          <w:rFonts w:ascii="Times New Roman" w:eastAsia="Times New Roman" w:hAnsi="Times New Roman" w:cs="Times New Roman"/>
+          <w:sz w:val="26"/>
+          <w:szCs w:val="26"/>
+          <w:lang w:val="vi-VN"/>
+        </w:rPr>
+        <w:t xml:space="preserve"> (làm thêm xóa đơn hàng và sửa đơn hàng nữa)</w:t>
+      </w:r>
     </w:p>
     <w:p>
       <w:pPr>
@@ -2669,6 +2755,7 @@
           <w:rFonts w:ascii="Times New Roman" w:eastAsia="Times New Roman" w:hAnsi="Times New Roman" w:cs="Times New Roman"/>
           <w:sz w:val="26"/>
           <w:szCs w:val="26"/>
+          <w:lang w:val="vi-VN"/>
         </w:rPr>
       </w:pPr>
       <w:r>
@@ -2703,6 +2790,26 @@
       <w:r>
         <w:rPr>
           <w:rFonts w:ascii="Times New Roman" w:eastAsia="Times New Roman" w:hAnsi="Times New Roman" w:cs="Times New Roman"/>
+          <w:sz w:val="26"/>
+          <w:szCs w:val="26"/>
+          <w:lang w:val="vi-VN"/>
+        </w:rPr>
+        <w:t>=&gt; mai làm</w:t>
+      </w:r>
+    </w:p>
+    <w:p>
+      <w:pPr>
+        <w:spacing w:before="240" w:after="240"/>
+        <w:rPr>
+          <w:rFonts w:ascii="Times New Roman" w:eastAsia="Times New Roman" w:hAnsi="Times New Roman" w:cs="Times New Roman"/>
+          <w:sz w:val="26"/>
+          <w:szCs w:val="26"/>
+          <w:lang w:val="vi-VN"/>
+        </w:rPr>
+      </w:pPr>
+      <w:r>
+        <w:rPr>
+          <w:rFonts w:ascii="Times New Roman" w:eastAsia="Times New Roman" w:hAnsi="Times New Roman" w:cs="Times New Roman"/>
           <w:b/>
           <w:bCs/>
           <w:sz w:val="26"/>
@@ -2833,6 +2940,7 @@
           <w:bCs/>
           <w:sz w:val="26"/>
           <w:szCs w:val="26"/>
+          <w:highlight w:val="yellow"/>
         </w:rPr>
         <w:t>- Xem báo cáo hoạt động chi nhánh</w:t>
       </w:r>
@@ -2841,6 +2949,7 @@
           <w:rFonts w:ascii="Times New Roman" w:eastAsia="Times New Roman" w:hAnsi="Times New Roman" w:cs="Times New Roman"/>
           <w:sz w:val="26"/>
           <w:szCs w:val="26"/>
+          <w:highlight w:val="yellow"/>
         </w:rPr>
         <w:t>: Theo dõi doanh thu, số đơn, món bán chạy và hiệu suất chi nhánh.</w:t>
       </w:r>
@@ -2849,18 +2958,48 @@
           <w:rFonts w:ascii="Times New Roman" w:eastAsia="Times New Roman" w:hAnsi="Times New Roman" w:cs="Times New Roman"/>
           <w:sz w:val="26"/>
           <w:szCs w:val="26"/>
+          <w:highlight w:val="yellow"/>
           <w:lang w:val="vi-VN"/>
         </w:rPr>
         <w:t xml:space="preserve"> =&gt; này từ từ tại chưa chia chi nhánh</w:t>
       </w:r>
-    </w:p>
-    <w:p>
-      <w:pPr>
-        <w:spacing w:before="240" w:after="240"/>
-        <w:rPr>
-          <w:rFonts w:ascii="Times New Roman" w:eastAsia="Times New Roman" w:hAnsi="Times New Roman" w:cs="Times New Roman"/>
-          <w:sz w:val="26"/>
-          <w:szCs w:val="26"/>
+      <w:r>
+        <w:rPr>
+          <w:rFonts w:ascii="Times New Roman" w:eastAsia="Times New Roman" w:hAnsi="Times New Roman" w:cs="Times New Roman"/>
+          <w:sz w:val="26"/>
+          <w:szCs w:val="26"/>
+          <w:lang w:val="vi-VN"/>
+        </w:rPr>
+        <w:t xml:space="preserve"> =&gt; </w:t>
+      </w:r>
+      <w:r>
+        <w:rPr>
+          <w:rFonts w:ascii="Times New Roman" w:eastAsia="Times New Roman" w:hAnsi="Times New Roman" w:cs="Times New Roman"/>
+          <w:sz w:val="26"/>
+          <w:szCs w:val="26"/>
+          <w:highlight w:val="yellow"/>
+          <w:lang w:val="vi-VN"/>
+        </w:rPr>
+        <w:t>đã</w:t>
+      </w:r>
+      <w:r>
+        <w:rPr>
+          <w:rFonts w:ascii="Times New Roman" w:eastAsia="Times New Roman" w:hAnsi="Times New Roman" w:cs="Times New Roman"/>
+          <w:sz w:val="26"/>
+          <w:szCs w:val="26"/>
+          <w:lang w:val="vi-VN"/>
+        </w:rPr>
+        <w:t xml:space="preserve"> làm cơ bản </w:t>
+      </w:r>
+    </w:p>
+    <w:p>
+      <w:pPr>
+        <w:spacing w:before="240" w:after="240"/>
+        <w:rPr>
+          <w:rFonts w:ascii="Times New Roman" w:eastAsia="Times New Roman" w:hAnsi="Times New Roman" w:cs="Times New Roman"/>
+          <w:sz w:val="26"/>
+          <w:szCs w:val="26"/>
+          <w:lang w:val="vi-VN"/>
         </w:rPr>
       </w:pPr>
       <w:r>
@@ -2880,6 +3019,77 @@
           <w:szCs w:val="26"/>
         </w:rPr>
         <w:t>: Xử lý và phản hồi khiếu nại, yêu cầu hỗ trợ từ khách hàng.</w:t>
+      </w:r>
+    </w:p>
+    <w:p>
+      <w:pPr>
+        <w:spacing w:before="240" w:after="240"/>
+        <w:rPr>
+          <w:rFonts w:ascii="Times New Roman" w:eastAsia="Times New Roman" w:hAnsi="Times New Roman" w:cs="Times New Roman"/>
+          <w:sz w:val="26"/>
+          <w:szCs w:val="26"/>
+          <w:lang w:val="vi-VN"/>
+        </w:rPr>
+      </w:pPr>
+      <w:r>
+        <w:rPr>
+          <w:rFonts w:ascii="Times New Roman" w:eastAsia="Times New Roman" w:hAnsi="Times New Roman" w:cs="Times New Roman"/>
+          <w:sz w:val="26"/>
+          <w:szCs w:val="26"/>
+          <w:lang w:val="vi-VN"/>
+        </w:rPr>
+        <w:t>=&gt; mai làm</w:t>
+      </w:r>
+    </w:p>
+    <w:p>
+      <w:pPr>
+        <w:spacing w:before="240" w:after="240"/>
+        <w:rPr>
+          <w:rFonts w:ascii="Times New Roman" w:eastAsia="Times New Roman" w:hAnsi="Times New Roman" w:cs="Times New Roman"/>
+          <w:sz w:val="26"/>
+          <w:szCs w:val="26"/>
+          <w:lang w:val="vi-VN"/>
+        </w:rPr>
+      </w:pPr>
+      <w:r>
+        <w:rPr>
+          <w:rFonts w:ascii="Times New Roman" w:eastAsia="Times New Roman" w:hAnsi="Times New Roman" w:cs="Times New Roman"/>
+          <w:b/>
+          <w:bCs/>
+          <w:sz w:val="26"/>
+          <w:szCs w:val="26"/>
+          <w:highlight w:val="yellow"/>
+          <w:lang w:val="vi-VN"/>
+        </w:rPr>
+        <w:t>- Quản lý nhân viên:</w:t>
+      </w:r>
+      <w:r>
+        <w:rPr>
+          <w:rFonts w:ascii="Times New Roman" w:eastAsia="Times New Roman" w:hAnsi="Times New Roman" w:cs="Times New Roman"/>
+          <w:sz w:val="26"/>
+          <w:szCs w:val="26"/>
+          <w:highlight w:val="yellow"/>
+          <w:lang w:val="vi-VN"/>
+        </w:rPr>
+        <w:t xml:space="preserve"> xem thông tin nhân viên các kiểu,...</w:t>
+      </w:r>
+      <w:r>
+        <w:rPr>
+          <w:rFonts w:ascii="Times New Roman" w:eastAsia="Times New Roman" w:hAnsi="Times New Roman" w:cs="Times New Roman"/>
+          <w:sz w:val="26"/>
+          <w:szCs w:val="26"/>
+          <w:lang w:val="vi-VN"/>
+        </w:rPr>
+        <w:t xml:space="preserve"> </w:t>
+      </w:r>
+      <w:r>
+        <w:rPr>
+          <w:rFonts w:ascii="Times New Roman" w:eastAsia="Times New Roman" w:hAnsi="Times New Roman" w:cs="Times New Roman"/>
+          <w:sz w:val="26"/>
+          <w:szCs w:val="26"/>
+          <w:lang w:val="vi-VN"/>
+        </w:rPr>
+        <w:t xml:space="preserve"> =&gt; đã làm cơ bản</w:t>
       </w:r>
     </w:p>
     <w:p>
@@ -2920,15 +3130,17 @@
           <w:rFonts w:ascii="Times New Roman" w:eastAsia="Times New Roman" w:hAnsi="Times New Roman" w:cs="Times New Roman"/>
           <w:sz w:val="26"/>
           <w:szCs w:val="26"/>
-        </w:rPr>
-      </w:pPr>
-      <w:r>
-        <w:rPr>
-          <w:rFonts w:ascii="Times New Roman" w:eastAsia="Times New Roman" w:hAnsi="Times New Roman" w:cs="Times New Roman"/>
-          <w:b/>
-          <w:bCs/>
-          <w:sz w:val="26"/>
-          <w:szCs w:val="26"/>
+          <w:highlight w:val="yellow"/>
+        </w:rPr>
+      </w:pPr>
+      <w:r>
+        <w:rPr>
+          <w:rFonts w:ascii="Times New Roman" w:eastAsia="Times New Roman" w:hAnsi="Times New Roman" w:cs="Times New Roman"/>
+          <w:b/>
+          <w:bCs/>
+          <w:sz w:val="26"/>
+          <w:szCs w:val="26"/>
+          <w:highlight w:val="yellow"/>
         </w:rPr>
         <w:t>- Quản lý người dùng và phân quyền (CRUD)</w:t>
       </w:r>
@@ -2937,6 +3149,7 @@
           <w:rFonts w:ascii="Times New Roman" w:eastAsia="Times New Roman" w:hAnsi="Times New Roman" w:cs="Times New Roman"/>
           <w:sz w:val="26"/>
           <w:szCs w:val="26"/>
+          <w:highlight w:val="yellow"/>
         </w:rPr>
         <w:t>: Tạo, sửa, xóa tài khoản người dùng và gán quyền truy cập.</w:t>
       </w:r>
@@ -2948,15 +3161,17 @@
           <w:rFonts w:ascii="Times New Roman" w:eastAsia="Times New Roman" w:hAnsi="Times New Roman" w:cs="Times New Roman"/>
           <w:sz w:val="26"/>
           <w:szCs w:val="26"/>
-        </w:rPr>
-      </w:pPr>
-      <w:r>
-        <w:rPr>
-          <w:rFonts w:ascii="Times New Roman" w:eastAsia="Times New Roman" w:hAnsi="Times New Roman" w:cs="Times New Roman"/>
-          <w:b/>
-          <w:bCs/>
-          <w:sz w:val="26"/>
-          <w:szCs w:val="26"/>
+          <w:lang w:val="vi-VN"/>
+        </w:rPr>
+      </w:pPr>
+      <w:r>
+        <w:rPr>
+          <w:rFonts w:ascii="Times New Roman" w:eastAsia="Times New Roman" w:hAnsi="Times New Roman" w:cs="Times New Roman"/>
+          <w:b/>
+          <w:bCs/>
+          <w:sz w:val="26"/>
+          <w:szCs w:val="26"/>
+          <w:highlight w:val="yellow"/>
         </w:rPr>
         <w:t>- Quản lý menu tổng (CRUD)</w:t>
       </w:r>
@@ -2965,9 +3180,38 @@
           <w:rFonts w:ascii="Times New Roman" w:eastAsia="Times New Roman" w:hAnsi="Times New Roman" w:cs="Times New Roman"/>
           <w:sz w:val="26"/>
           <w:szCs w:val="26"/>
+          <w:highlight w:val="yellow"/>
         </w:rPr>
         <w:t>: Thêm, sửa, xóa món ăn/thức uống trên thực đơn toàn chuỗi.</w:t>
       </w:r>
+      <w:r>
+        <w:rPr>
+          <w:rFonts w:ascii="Times New Roman" w:eastAsia="Times New Roman" w:hAnsi="Times New Roman" w:cs="Times New Roman"/>
+          <w:sz w:val="26"/>
+          <w:szCs w:val="26"/>
+          <w:lang w:val="vi-VN"/>
+        </w:rPr>
+        <w:t xml:space="preserve"> =&gt; </w:t>
+      </w:r>
+      <w:r>
+        <w:rPr>
+          <w:rFonts w:ascii="Times New Roman" w:eastAsia="Times New Roman" w:hAnsi="Times New Roman" w:cs="Times New Roman"/>
+          <w:sz w:val="26"/>
+          <w:szCs w:val="26"/>
+          <w:highlight w:val="yellow"/>
+          <w:lang w:val="vi-VN"/>
+        </w:rPr>
+        <w:t>đang</w:t>
+      </w:r>
+      <w:r>
+        <w:rPr>
+          <w:rFonts w:ascii="Times New Roman" w:eastAsia="Times New Roman" w:hAnsi="Times New Roman" w:cs="Times New Roman"/>
+          <w:sz w:val="26"/>
+          <w:szCs w:val="26"/>
+          <w:lang w:val="vi-VN"/>
+        </w:rPr>
+        <w:t xml:space="preserve"> tạm chưa làm phần danh mục</w:t>
+      </w:r>
     </w:p>
     <w:p>
       <w:pPr>
@@ -3014,6 +3258,7 @@
           <w:sz w:val="26"/>
           <w:szCs w:val="26"/>
         </w:rPr>
+        <w:lastRenderedPageBreak/>
         <w:t>- Quản lý chương trình khuyến mãi</w:t>
       </w:r>
       <w:r>
@@ -3041,6 +3286,7 @@
           <w:bCs/>
           <w:sz w:val="26"/>
           <w:szCs w:val="26"/>
+          <w:highlight w:val="yellow"/>
         </w:rPr>
         <w:t>- Xem báo cáo tổng hợp hệ thống</w:t>
       </w:r>
@@ -3049,6 +3295,7 @@
           <w:rFonts w:ascii="Times New Roman" w:eastAsia="Times New Roman" w:hAnsi="Times New Roman" w:cs="Times New Roman"/>
           <w:sz w:val="26"/>
           <w:szCs w:val="26"/>
+          <w:highlight w:val="yellow"/>
         </w:rPr>
         <w:t>: Theo dõi báo cáo doanh thu, tồn kho, hoạt động toàn chuỗi.</w:t>
       </w:r>
@@ -3070,7 +3317,6 @@
           <w:sz w:val="26"/>
           <w:szCs w:val="26"/>
         </w:rPr>
-        <w:lastRenderedPageBreak/>
         <w:t>- Cấu hình và giám sát hệ thống</w:t>
       </w:r>
       <w:r>

</xml_diff>

<commit_message>
feat (admin + manager + staff): update giao dien va chuc nang cua 3 actor
</commit_message>
<xml_diff>
--- a/CNM_ChucNangNguoiDung.docx
+++ b/CNM_ChucNangNguoiDung.docx
@@ -3201,35 +3201,86 @@
           <w:highlight w:val="yellow"/>
           <w:lang w:val="vi-VN"/>
         </w:rPr>
-        <w:t>đang</w:t>
-      </w:r>
-      <w:r>
-        <w:rPr>
-          <w:rFonts w:ascii="Times New Roman" w:eastAsia="Times New Roman" w:hAnsi="Times New Roman" w:cs="Times New Roman"/>
-          <w:sz w:val="26"/>
-          <w:szCs w:val="26"/>
-          <w:lang w:val="vi-VN"/>
-        </w:rPr>
-        <w:t xml:space="preserve"> tạm chưa làm phần danh mục</w:t>
-      </w:r>
-    </w:p>
-    <w:p>
-      <w:pPr>
-        <w:spacing w:before="240" w:after="240"/>
-        <w:rPr>
-          <w:rFonts w:ascii="Times New Roman" w:eastAsia="Times New Roman" w:hAnsi="Times New Roman" w:cs="Times New Roman"/>
-          <w:sz w:val="26"/>
-          <w:szCs w:val="26"/>
-        </w:rPr>
-      </w:pPr>
-      <w:r>
-        <w:rPr>
-          <w:rFonts w:ascii="Times New Roman" w:eastAsia="Times New Roman" w:hAnsi="Times New Roman" w:cs="Times New Roman"/>
-          <w:b/>
-          <w:bCs/>
-          <w:sz w:val="26"/>
-          <w:szCs w:val="26"/>
-        </w:rPr>
+        <w:t>đã</w:t>
+      </w:r>
+      <w:r>
+        <w:rPr>
+          <w:rFonts w:ascii="Times New Roman" w:eastAsia="Times New Roman" w:hAnsi="Times New Roman" w:cs="Times New Roman"/>
+          <w:sz w:val="26"/>
+          <w:szCs w:val="26"/>
+          <w:lang w:val="vi-VN"/>
+        </w:rPr>
+        <w:t xml:space="preserve"> </w:t>
+      </w:r>
+      <w:r>
+        <w:rPr>
+          <w:rFonts w:ascii="Times New Roman" w:eastAsia="Times New Roman" w:hAnsi="Times New Roman" w:cs="Times New Roman"/>
+          <w:sz w:val="26"/>
+          <w:szCs w:val="26"/>
+          <w:highlight w:val="yellow"/>
+          <w:lang w:val="vi-VN"/>
+        </w:rPr>
+        <w:t>làm</w:t>
+      </w:r>
+      <w:r>
+        <w:rPr>
+          <w:rFonts w:ascii="Times New Roman" w:eastAsia="Times New Roman" w:hAnsi="Times New Roman" w:cs="Times New Roman"/>
+          <w:sz w:val="26"/>
+          <w:szCs w:val="26"/>
+          <w:lang w:val="vi-VN"/>
+        </w:rPr>
+        <w:t xml:space="preserve"> </w:t>
+      </w:r>
+      <w:r>
+        <w:rPr>
+          <w:rFonts w:ascii="Times New Roman" w:eastAsia="Times New Roman" w:hAnsi="Times New Roman" w:cs="Times New Roman"/>
+          <w:sz w:val="26"/>
+          <w:szCs w:val="26"/>
+          <w:highlight w:val="yellow"/>
+          <w:lang w:val="vi-VN"/>
+        </w:rPr>
+        <w:t>cơ</w:t>
+      </w:r>
+      <w:r>
+        <w:rPr>
+          <w:rFonts w:ascii="Times New Roman" w:eastAsia="Times New Roman" w:hAnsi="Times New Roman" w:cs="Times New Roman"/>
+          <w:sz w:val="26"/>
+          <w:szCs w:val="26"/>
+          <w:lang w:val="vi-VN"/>
+        </w:rPr>
+        <w:t xml:space="preserve"> </w:t>
+      </w:r>
+      <w:r>
+        <w:rPr>
+          <w:rFonts w:ascii="Times New Roman" w:eastAsia="Times New Roman" w:hAnsi="Times New Roman" w:cs="Times New Roman"/>
+          <w:sz w:val="26"/>
+          <w:szCs w:val="26"/>
+          <w:highlight w:val="yellow"/>
+          <w:lang w:val="vi-VN"/>
+        </w:rPr>
+        <w:t>bản</w:t>
+      </w:r>
+    </w:p>
+    <w:p>
+      <w:pPr>
+        <w:spacing w:before="240" w:after="240"/>
+        <w:rPr>
+          <w:rFonts w:ascii="Times New Roman" w:eastAsia="Times New Roman" w:hAnsi="Times New Roman" w:cs="Times New Roman"/>
+          <w:sz w:val="26"/>
+          <w:szCs w:val="26"/>
+          <w:lang w:val="vi-VN"/>
+        </w:rPr>
+      </w:pPr>
+      <w:r>
+        <w:rPr>
+          <w:rFonts w:ascii="Times New Roman" w:eastAsia="Times New Roman" w:hAnsi="Times New Roman" w:cs="Times New Roman"/>
+          <w:b/>
+          <w:bCs/>
+          <w:sz w:val="26"/>
+          <w:szCs w:val="26"/>
+          <w:highlight w:val="yellow"/>
+        </w:rPr>
+        <w:lastRenderedPageBreak/>
         <w:t>- Quản lý chi nhánh cửa hàng và kho hàng (CRUD)</w:t>
       </w:r>
       <w:r>
@@ -3237,28 +3288,124 @@
           <w:rFonts w:ascii="Times New Roman" w:eastAsia="Times New Roman" w:hAnsi="Times New Roman" w:cs="Times New Roman"/>
           <w:sz w:val="26"/>
           <w:szCs w:val="26"/>
+          <w:highlight w:val="yellow"/>
         </w:rPr>
         <w:t>: Tạo, chỉnh sửa, xóa thông tin chi nhánh và kho.</w:t>
       </w:r>
-    </w:p>
-    <w:p>
-      <w:pPr>
-        <w:spacing w:before="240" w:after="240"/>
-        <w:rPr>
-          <w:rFonts w:ascii="Times New Roman" w:eastAsia="Times New Roman" w:hAnsi="Times New Roman" w:cs="Times New Roman"/>
-          <w:sz w:val="26"/>
-          <w:szCs w:val="26"/>
-        </w:rPr>
-      </w:pPr>
-      <w:r>
-        <w:rPr>
-          <w:rFonts w:ascii="Times New Roman" w:eastAsia="Times New Roman" w:hAnsi="Times New Roman" w:cs="Times New Roman"/>
-          <w:b/>
-          <w:bCs/>
-          <w:sz w:val="26"/>
-          <w:szCs w:val="26"/>
-        </w:rPr>
-        <w:lastRenderedPageBreak/>
+      <w:r>
+        <w:rPr>
+          <w:rFonts w:ascii="Times New Roman" w:eastAsia="Times New Roman" w:hAnsi="Times New Roman" w:cs="Times New Roman"/>
+          <w:sz w:val="26"/>
+          <w:szCs w:val="26"/>
+          <w:lang w:val="vi-VN"/>
+        </w:rPr>
+        <w:t xml:space="preserve"> =&gt; </w:t>
+      </w:r>
+      <w:r>
+        <w:rPr>
+          <w:rFonts w:ascii="Times New Roman" w:eastAsia="Times New Roman" w:hAnsi="Times New Roman" w:cs="Times New Roman"/>
+          <w:sz w:val="26"/>
+          <w:szCs w:val="26"/>
+          <w:highlight w:val="yellow"/>
+          <w:lang w:val="vi-VN"/>
+        </w:rPr>
+        <w:t>đã</w:t>
+      </w:r>
+      <w:r>
+        <w:rPr>
+          <w:rFonts w:ascii="Times New Roman" w:eastAsia="Times New Roman" w:hAnsi="Times New Roman" w:cs="Times New Roman"/>
+          <w:sz w:val="26"/>
+          <w:szCs w:val="26"/>
+          <w:lang w:val="vi-VN"/>
+        </w:rPr>
+        <w:t xml:space="preserve"> </w:t>
+      </w:r>
+      <w:r>
+        <w:rPr>
+          <w:rFonts w:ascii="Times New Roman" w:eastAsia="Times New Roman" w:hAnsi="Times New Roman" w:cs="Times New Roman"/>
+          <w:sz w:val="26"/>
+          <w:szCs w:val="26"/>
+          <w:highlight w:val="yellow"/>
+          <w:lang w:val="vi-VN"/>
+        </w:rPr>
+        <w:t>làm</w:t>
+      </w:r>
+      <w:r>
+        <w:rPr>
+          <w:rFonts w:ascii="Times New Roman" w:eastAsia="Times New Roman" w:hAnsi="Times New Roman" w:cs="Times New Roman"/>
+          <w:sz w:val="26"/>
+          <w:szCs w:val="26"/>
+          <w:lang w:val="vi-VN"/>
+        </w:rPr>
+        <w:t xml:space="preserve"> </w:t>
+      </w:r>
+      <w:r>
+        <w:rPr>
+          <w:rFonts w:ascii="Times New Roman" w:eastAsia="Times New Roman" w:hAnsi="Times New Roman" w:cs="Times New Roman"/>
+          <w:sz w:val="26"/>
+          <w:szCs w:val="26"/>
+          <w:highlight w:val="yellow"/>
+          <w:lang w:val="vi-VN"/>
+        </w:rPr>
+        <w:t>nhưng</w:t>
+      </w:r>
+      <w:r>
+        <w:rPr>
+          <w:rFonts w:ascii="Times New Roman" w:eastAsia="Times New Roman" w:hAnsi="Times New Roman" w:cs="Times New Roman"/>
+          <w:sz w:val="26"/>
+          <w:szCs w:val="26"/>
+          <w:lang w:val="vi-VN"/>
+        </w:rPr>
+        <w:t xml:space="preserve"> </w:t>
+      </w:r>
+      <w:r>
+        <w:rPr>
+          <w:rFonts w:ascii="Times New Roman" w:eastAsia="Times New Roman" w:hAnsi="Times New Roman" w:cs="Times New Roman"/>
+          <w:sz w:val="26"/>
+          <w:szCs w:val="26"/>
+          <w:highlight w:val="yellow"/>
+          <w:lang w:val="vi-VN"/>
+        </w:rPr>
+        <w:t>chưa</w:t>
+      </w:r>
+      <w:r>
+        <w:rPr>
+          <w:rFonts w:ascii="Times New Roman" w:eastAsia="Times New Roman" w:hAnsi="Times New Roman" w:cs="Times New Roman"/>
+          <w:sz w:val="26"/>
+          <w:szCs w:val="26"/>
+          <w:lang w:val="vi-VN"/>
+        </w:rPr>
+        <w:t xml:space="preserve"> làm mấy logic về kho</w:t>
+      </w:r>
+      <w:r>
+        <w:rPr>
+          <w:rFonts w:ascii="Times New Roman" w:eastAsia="Times New Roman" w:hAnsi="Times New Roman" w:cs="Times New Roman"/>
+          <w:sz w:val="26"/>
+          <w:szCs w:val="26"/>
+          <w:lang w:val="vi-VN"/>
+        </w:rPr>
+        <w:t xml:space="preserve"> =&gt; đã làm cơ bản cần update thêm</w:t>
+      </w:r>
+    </w:p>
+    <w:p>
+      <w:pPr>
+        <w:spacing w:before="240" w:after="240"/>
+        <w:rPr>
+          <w:rFonts w:ascii="Times New Roman" w:eastAsia="Times New Roman" w:hAnsi="Times New Roman" w:cs="Times New Roman"/>
+          <w:sz w:val="26"/>
+          <w:szCs w:val="26"/>
+          <w:lang w:val="vi-VN"/>
+        </w:rPr>
+      </w:pPr>
+      <w:r>
+        <w:rPr>
+          <w:rFonts w:ascii="Times New Roman" w:eastAsia="Times New Roman" w:hAnsi="Times New Roman" w:cs="Times New Roman"/>
+          <w:b/>
+          <w:bCs/>
+          <w:sz w:val="26"/>
+          <w:szCs w:val="26"/>
+          <w:highlight w:val="yellow"/>
+        </w:rPr>
         <w:t>- Quản lý chương trình khuyến mãi</w:t>
       </w:r>
       <w:r>
@@ -3266,17 +3413,95 @@
           <w:rFonts w:ascii="Times New Roman" w:eastAsia="Times New Roman" w:hAnsi="Times New Roman" w:cs="Times New Roman"/>
           <w:sz w:val="26"/>
           <w:szCs w:val="26"/>
+          <w:highlight w:val="yellow"/>
         </w:rPr>
         <w:t>: Thiết lập, chỉnh sửa và kích hoạt các chương trình giảm giá/voucher.</w:t>
       </w:r>
-    </w:p>
-    <w:p>
-      <w:pPr>
-        <w:spacing w:before="240" w:after="240"/>
-        <w:rPr>
-          <w:rFonts w:ascii="Times New Roman" w:eastAsia="Times New Roman" w:hAnsi="Times New Roman" w:cs="Times New Roman"/>
-          <w:sz w:val="26"/>
-          <w:szCs w:val="26"/>
+      <w:r>
+        <w:rPr>
+          <w:rFonts w:ascii="Times New Roman" w:eastAsia="Times New Roman" w:hAnsi="Times New Roman" w:cs="Times New Roman"/>
+          <w:sz w:val="26"/>
+          <w:szCs w:val="26"/>
+          <w:lang w:val="vi-VN"/>
+        </w:rPr>
+        <w:t xml:space="preserve"> =&gt; </w:t>
+      </w:r>
+      <w:r>
+        <w:rPr>
+          <w:rFonts w:ascii="Times New Roman" w:eastAsia="Times New Roman" w:hAnsi="Times New Roman" w:cs="Times New Roman"/>
+          <w:sz w:val="26"/>
+          <w:szCs w:val="26"/>
+          <w:highlight w:val="yellow"/>
+          <w:lang w:val="vi-VN"/>
+        </w:rPr>
+        <w:t>đã</w:t>
+      </w:r>
+      <w:r>
+        <w:rPr>
+          <w:rFonts w:ascii="Times New Roman" w:eastAsia="Times New Roman" w:hAnsi="Times New Roman" w:cs="Times New Roman"/>
+          <w:sz w:val="26"/>
+          <w:szCs w:val="26"/>
+          <w:lang w:val="vi-VN"/>
+        </w:rPr>
+        <w:t xml:space="preserve"> </w:t>
+      </w:r>
+      <w:r>
+        <w:rPr>
+          <w:rFonts w:ascii="Times New Roman" w:eastAsia="Times New Roman" w:hAnsi="Times New Roman" w:cs="Times New Roman"/>
+          <w:sz w:val="26"/>
+          <w:szCs w:val="26"/>
+          <w:highlight w:val="yellow"/>
+          <w:lang w:val="vi-VN"/>
+        </w:rPr>
+        <w:t>làm</w:t>
+      </w:r>
+      <w:r>
+        <w:rPr>
+          <w:rFonts w:ascii="Times New Roman" w:eastAsia="Times New Roman" w:hAnsi="Times New Roman" w:cs="Times New Roman"/>
+          <w:sz w:val="26"/>
+          <w:szCs w:val="26"/>
+          <w:lang w:val="vi-VN"/>
+        </w:rPr>
+        <w:t xml:space="preserve"> </w:t>
+      </w:r>
+      <w:r>
+        <w:rPr>
+          <w:rFonts w:ascii="Times New Roman" w:eastAsia="Times New Roman" w:hAnsi="Times New Roman" w:cs="Times New Roman"/>
+          <w:sz w:val="26"/>
+          <w:szCs w:val="26"/>
+          <w:highlight w:val="yellow"/>
+          <w:lang w:val="vi-VN"/>
+        </w:rPr>
+        <w:t>ổn</w:t>
+      </w:r>
+      <w:r>
+        <w:rPr>
+          <w:rFonts w:ascii="Times New Roman" w:eastAsia="Times New Roman" w:hAnsi="Times New Roman" w:cs="Times New Roman"/>
+          <w:sz w:val="26"/>
+          <w:szCs w:val="26"/>
+          <w:lang w:val="vi-VN"/>
+        </w:rPr>
+        <w:t xml:space="preserve"> </w:t>
+      </w:r>
+      <w:r>
+        <w:rPr>
+          <w:rFonts w:ascii="Times New Roman" w:eastAsia="Times New Roman" w:hAnsi="Times New Roman" w:cs="Times New Roman"/>
+          <w:sz w:val="26"/>
+          <w:szCs w:val="26"/>
+          <w:highlight w:val="yellow"/>
+          <w:lang w:val="vi-VN"/>
+        </w:rPr>
+        <w:t>ổn</w:t>
+      </w:r>
+    </w:p>
+    <w:p>
+      <w:pPr>
+        <w:spacing w:before="240" w:after="240"/>
+        <w:rPr>
+          <w:rFonts w:ascii="Times New Roman" w:eastAsia="Times New Roman" w:hAnsi="Times New Roman" w:cs="Times New Roman"/>
+          <w:sz w:val="26"/>
+          <w:szCs w:val="26"/>
+          <w:lang w:val="vi-VN"/>
         </w:rPr>
       </w:pPr>
       <w:r>
@@ -3299,14 +3524,43 @@
         </w:rPr>
         <w:t>: Theo dõi báo cáo doanh thu, tồn kho, hoạt động toàn chuỗi.</w:t>
       </w:r>
-    </w:p>
-    <w:p>
-      <w:pPr>
-        <w:spacing w:before="240" w:after="240"/>
-        <w:rPr>
-          <w:rFonts w:ascii="Times New Roman" w:eastAsia="Times New Roman" w:hAnsi="Times New Roman" w:cs="Times New Roman"/>
-          <w:sz w:val="26"/>
-          <w:szCs w:val="26"/>
+      <w:r>
+        <w:rPr>
+          <w:rFonts w:ascii="Times New Roman" w:eastAsia="Times New Roman" w:hAnsi="Times New Roman" w:cs="Times New Roman"/>
+          <w:sz w:val="26"/>
+          <w:szCs w:val="26"/>
+          <w:lang w:val="vi-VN"/>
+        </w:rPr>
+        <w:t xml:space="preserve"> =&gt; </w:t>
+      </w:r>
+      <w:r>
+        <w:rPr>
+          <w:rFonts w:ascii="Times New Roman" w:eastAsia="Times New Roman" w:hAnsi="Times New Roman" w:cs="Times New Roman"/>
+          <w:sz w:val="26"/>
+          <w:szCs w:val="26"/>
+          <w:highlight w:val="yellow"/>
+          <w:lang w:val="vi-VN"/>
+        </w:rPr>
+        <w:t>này</w:t>
+      </w:r>
+      <w:r>
+        <w:rPr>
+          <w:rFonts w:ascii="Times New Roman" w:eastAsia="Times New Roman" w:hAnsi="Times New Roman" w:cs="Times New Roman"/>
+          <w:sz w:val="26"/>
+          <w:szCs w:val="26"/>
+          <w:lang w:val="vi-VN"/>
+        </w:rPr>
+        <w:t xml:space="preserve"> đã làm cơ bản</w:t>
+      </w:r>
+    </w:p>
+    <w:p>
+      <w:pPr>
+        <w:spacing w:before="240" w:after="240"/>
+        <w:rPr>
+          <w:rFonts w:ascii="Times New Roman" w:eastAsia="Times New Roman" w:hAnsi="Times New Roman" w:cs="Times New Roman"/>
+          <w:sz w:val="26"/>
+          <w:szCs w:val="26"/>
+          <w:lang w:val="vi-VN"/>
         </w:rPr>
       </w:pPr>
       <w:r>
@@ -3326,6 +3580,15 @@
           <w:szCs w:val="26"/>
         </w:rPr>
         <w:t>: Thiết lập thông số hệ thống, theo dõi log và hiệu suất server.</w:t>
+      </w:r>
+      <w:r>
+        <w:rPr>
+          <w:rFonts w:ascii="Times New Roman" w:eastAsia="Times New Roman" w:hAnsi="Times New Roman" w:cs="Times New Roman"/>
+          <w:sz w:val="26"/>
+          <w:szCs w:val="26"/>
+          <w:lang w:val="vi-VN"/>
+        </w:rPr>
+        <w:t xml:space="preserve"> =&gt; này chưa cần làm</w:t>
       </w:r>
     </w:p>
     <w:p>

</xml_diff>

<commit_message>
fix (chatbox voi AI): chuc nang nay chua hoan thien
</commit_message>
<xml_diff>
--- a/CNM_ChucNangNguoiDung.docx
+++ b/CNM_ChucNangNguoiDung.docx
@@ -1202,6 +1202,7 @@
           <w:bCs/>
           <w:sz w:val="26"/>
           <w:szCs w:val="26"/>
+          <w:highlight w:val="yellow"/>
         </w:rPr>
         <w:t>- Xem gợi ý món ăn/thức uống</w:t>
       </w:r>
@@ -1210,6 +1211,7 @@
           <w:rFonts w:ascii="Times New Roman" w:eastAsia="Times New Roman" w:hAnsi="Times New Roman" w:cs="Times New Roman"/>
           <w:sz w:val="26"/>
           <w:szCs w:val="26"/>
+          <w:highlight w:val="yellow"/>
         </w:rPr>
         <w:t>: Nhận đề xuất món dựa trên lịch sử đặt hàng hoặc khuyến mãi.</w:t>
       </w:r>
@@ -1218,9 +1220,86 @@
           <w:rFonts w:ascii="Times New Roman" w:eastAsia="Times New Roman" w:hAnsi="Times New Roman" w:cs="Times New Roman"/>
           <w:sz w:val="26"/>
           <w:szCs w:val="26"/>
+          <w:highlight w:val="yellow"/>
           <w:lang w:val="vi-VN"/>
         </w:rPr>
         <w:t xml:space="preserve"> =&gt; chưa làm vì phần này liên quan đến AI</w:t>
+      </w:r>
+      <w:r>
+        <w:rPr>
+          <w:rFonts w:ascii="Times New Roman" w:eastAsia="Times New Roman" w:hAnsi="Times New Roman" w:cs="Times New Roman"/>
+          <w:sz w:val="26"/>
+          <w:szCs w:val="26"/>
+          <w:lang w:val="vi-VN"/>
+        </w:rPr>
+        <w:t xml:space="preserve"> =&gt; </w:t>
+      </w:r>
+      <w:r>
+        <w:rPr>
+          <w:rFonts w:ascii="Times New Roman" w:eastAsia="Times New Roman" w:hAnsi="Times New Roman" w:cs="Times New Roman"/>
+          <w:sz w:val="26"/>
+          <w:szCs w:val="26"/>
+          <w:highlight w:val="yellow"/>
+          <w:lang w:val="vi-VN"/>
+        </w:rPr>
+        <w:t>đã</w:t>
+      </w:r>
+      <w:r>
+        <w:rPr>
+          <w:rFonts w:ascii="Times New Roman" w:eastAsia="Times New Roman" w:hAnsi="Times New Roman" w:cs="Times New Roman"/>
+          <w:sz w:val="26"/>
+          <w:szCs w:val="26"/>
+          <w:lang w:val="vi-VN"/>
+        </w:rPr>
+        <w:t xml:space="preserve"> </w:t>
+      </w:r>
+      <w:r>
+        <w:rPr>
+          <w:rFonts w:ascii="Times New Roman" w:eastAsia="Times New Roman" w:hAnsi="Times New Roman" w:cs="Times New Roman"/>
+          <w:sz w:val="26"/>
+          <w:szCs w:val="26"/>
+          <w:highlight w:val="yellow"/>
+          <w:lang w:val="vi-VN"/>
+        </w:rPr>
+        <w:t>làm</w:t>
+      </w:r>
+      <w:r>
+        <w:rPr>
+          <w:rFonts w:ascii="Times New Roman" w:eastAsia="Times New Roman" w:hAnsi="Times New Roman" w:cs="Times New Roman"/>
+          <w:sz w:val="26"/>
+          <w:szCs w:val="26"/>
+          <w:lang w:val="vi-VN"/>
+        </w:rPr>
+        <w:t xml:space="preserve"> </w:t>
+      </w:r>
+      <w:r>
+        <w:rPr>
+          <w:rFonts w:ascii="Times New Roman" w:eastAsia="Times New Roman" w:hAnsi="Times New Roman" w:cs="Times New Roman"/>
+          <w:sz w:val="26"/>
+          <w:szCs w:val="26"/>
+          <w:highlight w:val="yellow"/>
+          <w:lang w:val="vi-VN"/>
+        </w:rPr>
+        <w:t>cơ</w:t>
+      </w:r>
+      <w:r>
+        <w:rPr>
+          <w:rFonts w:ascii="Times New Roman" w:eastAsia="Times New Roman" w:hAnsi="Times New Roman" w:cs="Times New Roman"/>
+          <w:sz w:val="26"/>
+          <w:szCs w:val="26"/>
+          <w:lang w:val="vi-VN"/>
+        </w:rPr>
+        <w:t xml:space="preserve"> </w:t>
+      </w:r>
+      <w:r>
+        <w:rPr>
+          <w:rFonts w:ascii="Times New Roman" w:eastAsia="Times New Roman" w:hAnsi="Times New Roman" w:cs="Times New Roman"/>
+          <w:sz w:val="26"/>
+          <w:szCs w:val="26"/>
+          <w:highlight w:val="yellow"/>
+          <w:lang w:val="vi-VN"/>
+        </w:rPr>
+        <w:t>bản</w:t>
       </w:r>
     </w:p>
     <w:p>

</xml_diff>

<commit_message>
feat (AI chat + recommend): cap nhat 2 AI ve chat va goi y sp
</commit_message>
<xml_diff>
--- a/CNM_ChucNangNguoiDung.docx
+++ b/CNM_ChucNangNguoiDung.docx
@@ -1024,7 +1024,7 @@
           <w:rFonts w:ascii="Times New Roman" w:eastAsia="Times New Roman" w:hAnsi="Times New Roman" w:cs="Times New Roman"/>
           <w:sz w:val="26"/>
           <w:szCs w:val="26"/>
-          <w:lang w:val="vi-VN"/>
+          <w:lang w:val="en-GB"/>
         </w:rPr>
       </w:pPr>
       <w:r>
@@ -1088,83 +1088,6 @@
           <w:lang w:val="vi-VN"/>
         </w:rPr>
       </w:pPr>
-      <w:r>
-        <w:rPr>
-          <w:rFonts w:ascii="Times New Roman" w:eastAsia="Times New Roman" w:hAnsi="Times New Roman" w:cs="Times New Roman"/>
-          <w:b/>
-          <w:bCs/>
-          <w:sz w:val="26"/>
-          <w:szCs w:val="26"/>
-          <w:highlight w:val="yellow"/>
-        </w:rPr>
-        <w:t>- Xem thực đơn</w:t>
-      </w:r>
-      <w:r>
-        <w:rPr>
-          <w:rFonts w:ascii="Times New Roman" w:eastAsia="Times New Roman" w:hAnsi="Times New Roman" w:cs="Times New Roman"/>
-          <w:sz w:val="26"/>
-          <w:szCs w:val="26"/>
-          <w:highlight w:val="yellow"/>
-        </w:rPr>
-        <w:t>: Duyệt danh sách món ăn/thức uống hiện có tại chi nhánh hoặc toàn chuỗi.</w:t>
-      </w:r>
-      <w:r>
-        <w:rPr>
-          <w:rFonts w:ascii="Times New Roman" w:eastAsia="Times New Roman" w:hAnsi="Times New Roman" w:cs="Times New Roman"/>
-          <w:sz w:val="26"/>
-          <w:szCs w:val="26"/>
-          <w:highlight w:val="yellow"/>
-          <w:lang w:val="vi-VN"/>
-        </w:rPr>
-        <w:t xml:space="preserve"> =&gt; đã làm</w:t>
-      </w:r>
-      <w:r>
-        <w:rPr>
-          <w:rFonts w:ascii="Times New Roman" w:eastAsia="Times New Roman" w:hAnsi="Times New Roman" w:cs="Times New Roman"/>
-          <w:sz w:val="26"/>
-          <w:szCs w:val="26"/>
-          <w:lang w:val="vi-VN"/>
-        </w:rPr>
-        <w:t xml:space="preserve"> </w:t>
-      </w:r>
-      <w:r>
-        <w:rPr>
-          <w:rFonts w:ascii="Times New Roman" w:eastAsia="Times New Roman" w:hAnsi="Times New Roman" w:cs="Times New Roman"/>
-          <w:sz w:val="26"/>
-          <w:szCs w:val="26"/>
-          <w:highlight w:val="yellow"/>
-          <w:lang w:val="vi-VN"/>
-        </w:rPr>
-        <w:t>cơ</w:t>
-      </w:r>
-      <w:r>
-        <w:rPr>
-          <w:rFonts w:ascii="Times New Roman" w:eastAsia="Times New Roman" w:hAnsi="Times New Roman" w:cs="Times New Roman"/>
-          <w:sz w:val="26"/>
-          <w:szCs w:val="26"/>
-          <w:lang w:val="vi-VN"/>
-        </w:rPr>
-        <w:t xml:space="preserve"> </w:t>
-      </w:r>
-      <w:r>
-        <w:rPr>
-          <w:rFonts w:ascii="Times New Roman" w:eastAsia="Times New Roman" w:hAnsi="Times New Roman" w:cs="Times New Roman"/>
-          <w:sz w:val="26"/>
-          <w:szCs w:val="26"/>
-          <w:highlight w:val="yellow"/>
-          <w:lang w:val="vi-VN"/>
-        </w:rPr>
-        <w:t>bản</w:t>
-      </w:r>
-      <w:r>
-        <w:rPr>
-          <w:rFonts w:ascii="Times New Roman" w:eastAsia="Times New Roman" w:hAnsi="Times New Roman" w:cs="Times New Roman"/>
-          <w:sz w:val="26"/>
-          <w:szCs w:val="26"/>
-          <w:lang w:val="vi-VN"/>
-        </w:rPr>
-        <w:t xml:space="preserve"> =&gt; </w:t>
-      </w:r>
       <w:r>
         <w:rPr>
           <w:rFonts w:ascii="Times New Roman" w:eastAsia="Times New Roman" w:hAnsi="Times New Roman" w:cs="Times New Roman"/>
@@ -2173,285 +2096,285 @@
           <w:szCs w:val="26"/>
           <w:highlight w:val="yellow"/>
         </w:rPr>
+        <w:t>- In hóa đơn/Biên lai</w:t>
+      </w:r>
+      <w:r>
+        <w:rPr>
+          <w:rFonts w:ascii="Times New Roman" w:eastAsia="Times New Roman" w:hAnsi="Times New Roman" w:cs="Times New Roman"/>
+          <w:sz w:val="26"/>
+          <w:szCs w:val="26"/>
+          <w:highlight w:val="yellow"/>
+        </w:rPr>
+        <w:t>: In hóa đơn giấy hoặc gửi hóa đơn điện tử cho khách sau thanh toán.</w:t>
+      </w:r>
+      <w:r>
+        <w:rPr>
+          <w:rFonts w:ascii="Times New Roman" w:eastAsia="Times New Roman" w:hAnsi="Times New Roman" w:cs="Times New Roman"/>
+          <w:sz w:val="26"/>
+          <w:szCs w:val="26"/>
+          <w:lang w:val="vi-VN"/>
+        </w:rPr>
+        <w:t xml:space="preserve"> =&gt; </w:t>
+      </w:r>
+      <w:r>
+        <w:rPr>
+          <w:rFonts w:ascii="Times New Roman" w:eastAsia="Times New Roman" w:hAnsi="Times New Roman" w:cs="Times New Roman"/>
+          <w:sz w:val="26"/>
+          <w:szCs w:val="26"/>
+          <w:highlight w:val="yellow"/>
+          <w:lang w:val="vi-VN"/>
+        </w:rPr>
+        <w:t>đã</w:t>
+      </w:r>
+      <w:r>
+        <w:rPr>
+          <w:rFonts w:ascii="Times New Roman" w:eastAsia="Times New Roman" w:hAnsi="Times New Roman" w:cs="Times New Roman"/>
+          <w:sz w:val="26"/>
+          <w:szCs w:val="26"/>
+          <w:lang w:val="vi-VN"/>
+        </w:rPr>
+        <w:t xml:space="preserve"> </w:t>
+      </w:r>
+      <w:r>
+        <w:rPr>
+          <w:rFonts w:ascii="Times New Roman" w:eastAsia="Times New Roman" w:hAnsi="Times New Roman" w:cs="Times New Roman"/>
+          <w:sz w:val="26"/>
+          <w:szCs w:val="26"/>
+          <w:highlight w:val="yellow"/>
+          <w:lang w:val="vi-VN"/>
+        </w:rPr>
+        <w:t>làm</w:t>
+      </w:r>
+      <w:r>
+        <w:rPr>
+          <w:rFonts w:ascii="Times New Roman" w:eastAsia="Times New Roman" w:hAnsi="Times New Roman" w:cs="Times New Roman"/>
+          <w:sz w:val="26"/>
+          <w:szCs w:val="26"/>
+          <w:lang w:val="vi-VN"/>
+        </w:rPr>
+        <w:t xml:space="preserve"> </w:t>
+      </w:r>
+      <w:r>
+        <w:rPr>
+          <w:rFonts w:ascii="Times New Roman" w:eastAsia="Times New Roman" w:hAnsi="Times New Roman" w:cs="Times New Roman"/>
+          <w:sz w:val="26"/>
+          <w:szCs w:val="26"/>
+          <w:highlight w:val="yellow"/>
+          <w:lang w:val="vi-VN"/>
+        </w:rPr>
+        <w:t>nhưng</w:t>
+      </w:r>
+      <w:r>
+        <w:rPr>
+          <w:rFonts w:ascii="Times New Roman" w:eastAsia="Times New Roman" w:hAnsi="Times New Roman" w:cs="Times New Roman"/>
+          <w:sz w:val="26"/>
+          <w:szCs w:val="26"/>
+          <w:lang w:val="vi-VN"/>
+        </w:rPr>
+        <w:t xml:space="preserve"> </w:t>
+      </w:r>
+      <w:r>
+        <w:rPr>
+          <w:rFonts w:ascii="Times New Roman" w:eastAsia="Times New Roman" w:hAnsi="Times New Roman" w:cs="Times New Roman"/>
+          <w:sz w:val="26"/>
+          <w:szCs w:val="26"/>
+          <w:highlight w:val="yellow"/>
+          <w:lang w:val="vi-VN"/>
+        </w:rPr>
+        <w:t>chưa</w:t>
+      </w:r>
+      <w:r>
+        <w:rPr>
+          <w:rFonts w:ascii="Times New Roman" w:eastAsia="Times New Roman" w:hAnsi="Times New Roman" w:cs="Times New Roman"/>
+          <w:sz w:val="26"/>
+          <w:szCs w:val="26"/>
+          <w:lang w:val="vi-VN"/>
+        </w:rPr>
+        <w:t xml:space="preserve"> </w:t>
+      </w:r>
+      <w:r>
+        <w:rPr>
+          <w:rFonts w:ascii="Times New Roman" w:eastAsia="Times New Roman" w:hAnsi="Times New Roman" w:cs="Times New Roman"/>
+          <w:sz w:val="26"/>
+          <w:szCs w:val="26"/>
+          <w:highlight w:val="yellow"/>
+          <w:lang w:val="vi-VN"/>
+        </w:rPr>
+        <w:t>làm</w:t>
+      </w:r>
+      <w:r>
+        <w:rPr>
+          <w:rFonts w:ascii="Times New Roman" w:eastAsia="Times New Roman" w:hAnsi="Times New Roman" w:cs="Times New Roman"/>
+          <w:sz w:val="26"/>
+          <w:szCs w:val="26"/>
+          <w:lang w:val="vi-VN"/>
+        </w:rPr>
+        <w:t xml:space="preserve"> </w:t>
+      </w:r>
+      <w:r>
+        <w:rPr>
+          <w:rFonts w:ascii="Times New Roman" w:eastAsia="Times New Roman" w:hAnsi="Times New Roman" w:cs="Times New Roman"/>
+          <w:sz w:val="26"/>
+          <w:szCs w:val="26"/>
+          <w:highlight w:val="yellow"/>
+          <w:lang w:val="vi-VN"/>
+        </w:rPr>
+        <w:t>cái</w:t>
+      </w:r>
+      <w:r>
+        <w:rPr>
+          <w:rFonts w:ascii="Times New Roman" w:eastAsia="Times New Roman" w:hAnsi="Times New Roman" w:cs="Times New Roman"/>
+          <w:sz w:val="26"/>
+          <w:szCs w:val="26"/>
+          <w:lang w:val="vi-VN"/>
+        </w:rPr>
+        <w:t xml:space="preserve"> </w:t>
+      </w:r>
+      <w:r>
+        <w:rPr>
+          <w:rFonts w:ascii="Times New Roman" w:eastAsia="Times New Roman" w:hAnsi="Times New Roman" w:cs="Times New Roman"/>
+          <w:sz w:val="26"/>
+          <w:szCs w:val="26"/>
+          <w:highlight w:val="yellow"/>
+          <w:lang w:val="vi-VN"/>
+        </w:rPr>
+        <w:t>gửi</w:t>
+      </w:r>
+      <w:r>
+        <w:rPr>
+          <w:rFonts w:ascii="Times New Roman" w:eastAsia="Times New Roman" w:hAnsi="Times New Roman" w:cs="Times New Roman"/>
+          <w:sz w:val="26"/>
+          <w:szCs w:val="26"/>
+          <w:lang w:val="vi-VN"/>
+        </w:rPr>
+        <w:t xml:space="preserve"> </w:t>
+      </w:r>
+      <w:r>
+        <w:rPr>
+          <w:rFonts w:ascii="Times New Roman" w:eastAsia="Times New Roman" w:hAnsi="Times New Roman" w:cs="Times New Roman"/>
+          <w:sz w:val="26"/>
+          <w:szCs w:val="26"/>
+          <w:highlight w:val="yellow"/>
+          <w:lang w:val="vi-VN"/>
+        </w:rPr>
+        <w:t>hóa</w:t>
+      </w:r>
+      <w:r>
+        <w:rPr>
+          <w:rFonts w:ascii="Times New Roman" w:eastAsia="Times New Roman" w:hAnsi="Times New Roman" w:cs="Times New Roman"/>
+          <w:sz w:val="26"/>
+          <w:szCs w:val="26"/>
+          <w:lang w:val="vi-VN"/>
+        </w:rPr>
+        <w:t xml:space="preserve"> </w:t>
+      </w:r>
+      <w:r>
+        <w:rPr>
+          <w:rFonts w:ascii="Times New Roman" w:eastAsia="Times New Roman" w:hAnsi="Times New Roman" w:cs="Times New Roman"/>
+          <w:sz w:val="26"/>
+          <w:szCs w:val="26"/>
+          <w:highlight w:val="yellow"/>
+          <w:lang w:val="vi-VN"/>
+        </w:rPr>
+        <w:t>đơn</w:t>
+      </w:r>
+      <w:r>
+        <w:rPr>
+          <w:rFonts w:ascii="Times New Roman" w:eastAsia="Times New Roman" w:hAnsi="Times New Roman" w:cs="Times New Roman"/>
+          <w:sz w:val="26"/>
+          <w:szCs w:val="26"/>
+          <w:lang w:val="vi-VN"/>
+        </w:rPr>
+        <w:t xml:space="preserve"> </w:t>
+      </w:r>
+      <w:r>
+        <w:rPr>
+          <w:rFonts w:ascii="Times New Roman" w:eastAsia="Times New Roman" w:hAnsi="Times New Roman" w:cs="Times New Roman"/>
+          <w:sz w:val="26"/>
+          <w:szCs w:val="26"/>
+          <w:highlight w:val="yellow"/>
+          <w:lang w:val="vi-VN"/>
+        </w:rPr>
+        <w:t>điện</w:t>
+      </w:r>
+      <w:r>
+        <w:rPr>
+          <w:rFonts w:ascii="Times New Roman" w:eastAsia="Times New Roman" w:hAnsi="Times New Roman" w:cs="Times New Roman"/>
+          <w:sz w:val="26"/>
+          <w:szCs w:val="26"/>
+          <w:lang w:val="vi-VN"/>
+        </w:rPr>
+        <w:t xml:space="preserve"> </w:t>
+      </w:r>
+      <w:r>
+        <w:rPr>
+          <w:rFonts w:ascii="Times New Roman" w:eastAsia="Times New Roman" w:hAnsi="Times New Roman" w:cs="Times New Roman"/>
+          <w:sz w:val="26"/>
+          <w:szCs w:val="26"/>
+          <w:highlight w:val="yellow"/>
+          <w:lang w:val="vi-VN"/>
+        </w:rPr>
+        <w:t>tử</w:t>
+      </w:r>
+      <w:r>
+        <w:rPr>
+          <w:rFonts w:ascii="Times New Roman" w:eastAsia="Times New Roman" w:hAnsi="Times New Roman" w:cs="Times New Roman"/>
+          <w:sz w:val="26"/>
+          <w:szCs w:val="26"/>
+          <w:lang w:val="vi-VN"/>
+        </w:rPr>
+        <w:t xml:space="preserve"> </w:t>
+      </w:r>
+      <w:r>
+        <w:rPr>
+          <w:rFonts w:ascii="Times New Roman" w:eastAsia="Times New Roman" w:hAnsi="Times New Roman" w:cs="Times New Roman"/>
+          <w:sz w:val="26"/>
+          <w:szCs w:val="26"/>
+          <w:highlight w:val="yellow"/>
+          <w:lang w:val="vi-VN"/>
+        </w:rPr>
+        <w:t>đâu</w:t>
+      </w:r>
+      <w:r>
+        <w:rPr>
+          <w:rFonts w:ascii="Times New Roman" w:eastAsia="Times New Roman" w:hAnsi="Times New Roman" w:cs="Times New Roman"/>
+          <w:sz w:val="26"/>
+          <w:szCs w:val="26"/>
+          <w:lang w:val="vi-VN"/>
+        </w:rPr>
+        <w:t xml:space="preserve"> :</w:t>
+      </w:r>
+      <w:r>
+        <w:rPr>
+          <w:rFonts w:ascii="Times New Roman" w:eastAsia="Times New Roman" w:hAnsi="Times New Roman" w:cs="Times New Roman"/>
+          <w:sz w:val="26"/>
+          <w:szCs w:val="26"/>
+          <w:highlight w:val="yellow"/>
+          <w:lang w:val="vi-VN"/>
+        </w:rPr>
+        <w:t>v</w:t>
+      </w:r>
+    </w:p>
+    <w:p>
+      <w:pPr>
+        <w:spacing w:before="240" w:after="240"/>
+        <w:rPr>
+          <w:rFonts w:ascii="Times New Roman" w:eastAsia="Times New Roman" w:hAnsi="Times New Roman" w:cs="Times New Roman"/>
+          <w:sz w:val="26"/>
+          <w:szCs w:val="26"/>
+          <w:lang w:val="vi-VN"/>
+        </w:rPr>
+      </w:pPr>
+      <w:r>
+        <w:rPr>
+          <w:rFonts w:ascii="Times New Roman" w:eastAsia="Times New Roman" w:hAnsi="Times New Roman" w:cs="Times New Roman"/>
+          <w:b/>
+          <w:bCs/>
+          <w:sz w:val="26"/>
+          <w:szCs w:val="26"/>
+          <w:highlight w:val="yellow"/>
+        </w:rPr>
         <w:lastRenderedPageBreak/>
-        <w:t>- In hóa đơn/Biên lai</w:t>
-      </w:r>
-      <w:r>
-        <w:rPr>
-          <w:rFonts w:ascii="Times New Roman" w:eastAsia="Times New Roman" w:hAnsi="Times New Roman" w:cs="Times New Roman"/>
-          <w:sz w:val="26"/>
-          <w:szCs w:val="26"/>
-          <w:highlight w:val="yellow"/>
-        </w:rPr>
-        <w:t>: In hóa đơn giấy hoặc gửi hóa đơn điện tử cho khách sau thanh toán.</w:t>
-      </w:r>
-      <w:r>
-        <w:rPr>
-          <w:rFonts w:ascii="Times New Roman" w:eastAsia="Times New Roman" w:hAnsi="Times New Roman" w:cs="Times New Roman"/>
-          <w:sz w:val="26"/>
-          <w:szCs w:val="26"/>
-          <w:lang w:val="vi-VN"/>
-        </w:rPr>
-        <w:t xml:space="preserve"> =&gt; </w:t>
-      </w:r>
-      <w:r>
-        <w:rPr>
-          <w:rFonts w:ascii="Times New Roman" w:eastAsia="Times New Roman" w:hAnsi="Times New Roman" w:cs="Times New Roman"/>
-          <w:sz w:val="26"/>
-          <w:szCs w:val="26"/>
-          <w:highlight w:val="yellow"/>
-          <w:lang w:val="vi-VN"/>
-        </w:rPr>
-        <w:t>đã</w:t>
-      </w:r>
-      <w:r>
-        <w:rPr>
-          <w:rFonts w:ascii="Times New Roman" w:eastAsia="Times New Roman" w:hAnsi="Times New Roman" w:cs="Times New Roman"/>
-          <w:sz w:val="26"/>
-          <w:szCs w:val="26"/>
-          <w:lang w:val="vi-VN"/>
-        </w:rPr>
-        <w:t xml:space="preserve"> </w:t>
-      </w:r>
-      <w:r>
-        <w:rPr>
-          <w:rFonts w:ascii="Times New Roman" w:eastAsia="Times New Roman" w:hAnsi="Times New Roman" w:cs="Times New Roman"/>
-          <w:sz w:val="26"/>
-          <w:szCs w:val="26"/>
-          <w:highlight w:val="yellow"/>
-          <w:lang w:val="vi-VN"/>
-        </w:rPr>
-        <w:t>làm</w:t>
-      </w:r>
-      <w:r>
-        <w:rPr>
-          <w:rFonts w:ascii="Times New Roman" w:eastAsia="Times New Roman" w:hAnsi="Times New Roman" w:cs="Times New Roman"/>
-          <w:sz w:val="26"/>
-          <w:szCs w:val="26"/>
-          <w:lang w:val="vi-VN"/>
-        </w:rPr>
-        <w:t xml:space="preserve"> </w:t>
-      </w:r>
-      <w:r>
-        <w:rPr>
-          <w:rFonts w:ascii="Times New Roman" w:eastAsia="Times New Roman" w:hAnsi="Times New Roman" w:cs="Times New Roman"/>
-          <w:sz w:val="26"/>
-          <w:szCs w:val="26"/>
-          <w:highlight w:val="yellow"/>
-          <w:lang w:val="vi-VN"/>
-        </w:rPr>
-        <w:t>nhưng</w:t>
-      </w:r>
-      <w:r>
-        <w:rPr>
-          <w:rFonts w:ascii="Times New Roman" w:eastAsia="Times New Roman" w:hAnsi="Times New Roman" w:cs="Times New Roman"/>
-          <w:sz w:val="26"/>
-          <w:szCs w:val="26"/>
-          <w:lang w:val="vi-VN"/>
-        </w:rPr>
-        <w:t xml:space="preserve"> </w:t>
-      </w:r>
-      <w:r>
-        <w:rPr>
-          <w:rFonts w:ascii="Times New Roman" w:eastAsia="Times New Roman" w:hAnsi="Times New Roman" w:cs="Times New Roman"/>
-          <w:sz w:val="26"/>
-          <w:szCs w:val="26"/>
-          <w:highlight w:val="yellow"/>
-          <w:lang w:val="vi-VN"/>
-        </w:rPr>
-        <w:t>chưa</w:t>
-      </w:r>
-      <w:r>
-        <w:rPr>
-          <w:rFonts w:ascii="Times New Roman" w:eastAsia="Times New Roman" w:hAnsi="Times New Roman" w:cs="Times New Roman"/>
-          <w:sz w:val="26"/>
-          <w:szCs w:val="26"/>
-          <w:lang w:val="vi-VN"/>
-        </w:rPr>
-        <w:t xml:space="preserve"> </w:t>
-      </w:r>
-      <w:r>
-        <w:rPr>
-          <w:rFonts w:ascii="Times New Roman" w:eastAsia="Times New Roman" w:hAnsi="Times New Roman" w:cs="Times New Roman"/>
-          <w:sz w:val="26"/>
-          <w:szCs w:val="26"/>
-          <w:highlight w:val="yellow"/>
-          <w:lang w:val="vi-VN"/>
-        </w:rPr>
-        <w:t>làm</w:t>
-      </w:r>
-      <w:r>
-        <w:rPr>
-          <w:rFonts w:ascii="Times New Roman" w:eastAsia="Times New Roman" w:hAnsi="Times New Roman" w:cs="Times New Roman"/>
-          <w:sz w:val="26"/>
-          <w:szCs w:val="26"/>
-          <w:lang w:val="vi-VN"/>
-        </w:rPr>
-        <w:t xml:space="preserve"> </w:t>
-      </w:r>
-      <w:r>
-        <w:rPr>
-          <w:rFonts w:ascii="Times New Roman" w:eastAsia="Times New Roman" w:hAnsi="Times New Roman" w:cs="Times New Roman"/>
-          <w:sz w:val="26"/>
-          <w:szCs w:val="26"/>
-          <w:highlight w:val="yellow"/>
-          <w:lang w:val="vi-VN"/>
-        </w:rPr>
-        <w:t>cái</w:t>
-      </w:r>
-      <w:r>
-        <w:rPr>
-          <w:rFonts w:ascii="Times New Roman" w:eastAsia="Times New Roman" w:hAnsi="Times New Roman" w:cs="Times New Roman"/>
-          <w:sz w:val="26"/>
-          <w:szCs w:val="26"/>
-          <w:lang w:val="vi-VN"/>
-        </w:rPr>
-        <w:t xml:space="preserve"> </w:t>
-      </w:r>
-      <w:r>
-        <w:rPr>
-          <w:rFonts w:ascii="Times New Roman" w:eastAsia="Times New Roman" w:hAnsi="Times New Roman" w:cs="Times New Roman"/>
-          <w:sz w:val="26"/>
-          <w:szCs w:val="26"/>
-          <w:highlight w:val="yellow"/>
-          <w:lang w:val="vi-VN"/>
-        </w:rPr>
-        <w:t>gửi</w:t>
-      </w:r>
-      <w:r>
-        <w:rPr>
-          <w:rFonts w:ascii="Times New Roman" w:eastAsia="Times New Roman" w:hAnsi="Times New Roman" w:cs="Times New Roman"/>
-          <w:sz w:val="26"/>
-          <w:szCs w:val="26"/>
-          <w:lang w:val="vi-VN"/>
-        </w:rPr>
-        <w:t xml:space="preserve"> </w:t>
-      </w:r>
-      <w:r>
-        <w:rPr>
-          <w:rFonts w:ascii="Times New Roman" w:eastAsia="Times New Roman" w:hAnsi="Times New Roman" w:cs="Times New Roman"/>
-          <w:sz w:val="26"/>
-          <w:szCs w:val="26"/>
-          <w:highlight w:val="yellow"/>
-          <w:lang w:val="vi-VN"/>
-        </w:rPr>
-        <w:t>hóa</w:t>
-      </w:r>
-      <w:r>
-        <w:rPr>
-          <w:rFonts w:ascii="Times New Roman" w:eastAsia="Times New Roman" w:hAnsi="Times New Roman" w:cs="Times New Roman"/>
-          <w:sz w:val="26"/>
-          <w:szCs w:val="26"/>
-          <w:lang w:val="vi-VN"/>
-        </w:rPr>
-        <w:t xml:space="preserve"> </w:t>
-      </w:r>
-      <w:r>
-        <w:rPr>
-          <w:rFonts w:ascii="Times New Roman" w:eastAsia="Times New Roman" w:hAnsi="Times New Roman" w:cs="Times New Roman"/>
-          <w:sz w:val="26"/>
-          <w:szCs w:val="26"/>
-          <w:highlight w:val="yellow"/>
-          <w:lang w:val="vi-VN"/>
-        </w:rPr>
-        <w:t>đơn</w:t>
-      </w:r>
-      <w:r>
-        <w:rPr>
-          <w:rFonts w:ascii="Times New Roman" w:eastAsia="Times New Roman" w:hAnsi="Times New Roman" w:cs="Times New Roman"/>
-          <w:sz w:val="26"/>
-          <w:szCs w:val="26"/>
-          <w:lang w:val="vi-VN"/>
-        </w:rPr>
-        <w:t xml:space="preserve"> </w:t>
-      </w:r>
-      <w:r>
-        <w:rPr>
-          <w:rFonts w:ascii="Times New Roman" w:eastAsia="Times New Roman" w:hAnsi="Times New Roman" w:cs="Times New Roman"/>
-          <w:sz w:val="26"/>
-          <w:szCs w:val="26"/>
-          <w:highlight w:val="yellow"/>
-          <w:lang w:val="vi-VN"/>
-        </w:rPr>
-        <w:t>điện</w:t>
-      </w:r>
-      <w:r>
-        <w:rPr>
-          <w:rFonts w:ascii="Times New Roman" w:eastAsia="Times New Roman" w:hAnsi="Times New Roman" w:cs="Times New Roman"/>
-          <w:sz w:val="26"/>
-          <w:szCs w:val="26"/>
-          <w:lang w:val="vi-VN"/>
-        </w:rPr>
-        <w:t xml:space="preserve"> </w:t>
-      </w:r>
-      <w:r>
-        <w:rPr>
-          <w:rFonts w:ascii="Times New Roman" w:eastAsia="Times New Roman" w:hAnsi="Times New Roman" w:cs="Times New Roman"/>
-          <w:sz w:val="26"/>
-          <w:szCs w:val="26"/>
-          <w:highlight w:val="yellow"/>
-          <w:lang w:val="vi-VN"/>
-        </w:rPr>
-        <w:t>tử</w:t>
-      </w:r>
-      <w:r>
-        <w:rPr>
-          <w:rFonts w:ascii="Times New Roman" w:eastAsia="Times New Roman" w:hAnsi="Times New Roman" w:cs="Times New Roman"/>
-          <w:sz w:val="26"/>
-          <w:szCs w:val="26"/>
-          <w:lang w:val="vi-VN"/>
-        </w:rPr>
-        <w:t xml:space="preserve"> </w:t>
-      </w:r>
-      <w:r>
-        <w:rPr>
-          <w:rFonts w:ascii="Times New Roman" w:eastAsia="Times New Roman" w:hAnsi="Times New Roman" w:cs="Times New Roman"/>
-          <w:sz w:val="26"/>
-          <w:szCs w:val="26"/>
-          <w:highlight w:val="yellow"/>
-          <w:lang w:val="vi-VN"/>
-        </w:rPr>
-        <w:t>đâu</w:t>
-      </w:r>
-      <w:r>
-        <w:rPr>
-          <w:rFonts w:ascii="Times New Roman" w:eastAsia="Times New Roman" w:hAnsi="Times New Roman" w:cs="Times New Roman"/>
-          <w:sz w:val="26"/>
-          <w:szCs w:val="26"/>
-          <w:lang w:val="vi-VN"/>
-        </w:rPr>
-        <w:t xml:space="preserve"> :</w:t>
-      </w:r>
-      <w:r>
-        <w:rPr>
-          <w:rFonts w:ascii="Times New Roman" w:eastAsia="Times New Roman" w:hAnsi="Times New Roman" w:cs="Times New Roman"/>
-          <w:sz w:val="26"/>
-          <w:szCs w:val="26"/>
-          <w:highlight w:val="yellow"/>
-          <w:lang w:val="vi-VN"/>
-        </w:rPr>
-        <w:t>v</w:t>
-      </w:r>
-    </w:p>
-    <w:p>
-      <w:pPr>
-        <w:spacing w:before="240" w:after="240"/>
-        <w:rPr>
-          <w:rFonts w:ascii="Times New Roman" w:eastAsia="Times New Roman" w:hAnsi="Times New Roman" w:cs="Times New Roman"/>
-          <w:sz w:val="26"/>
-          <w:szCs w:val="26"/>
-          <w:lang w:val="vi-VN"/>
-        </w:rPr>
-      </w:pPr>
-      <w:r>
-        <w:rPr>
-          <w:rFonts w:ascii="Times New Roman" w:eastAsia="Times New Roman" w:hAnsi="Times New Roman" w:cs="Times New Roman"/>
-          <w:b/>
-          <w:bCs/>
-          <w:sz w:val="26"/>
-          <w:szCs w:val="26"/>
-          <w:highlight w:val="yellow"/>
-        </w:rPr>
         <w:t>- Xử lý thanh toán tại quầy</w:t>
       </w:r>
       <w:r>
@@ -3359,132 +3282,132 @@
           <w:szCs w:val="26"/>
           <w:highlight w:val="yellow"/>
         </w:rPr>
+        <w:t>- Quản lý chi nhánh cửa hàng và kho hàng (CRUD)</w:t>
+      </w:r>
+      <w:r>
+        <w:rPr>
+          <w:rFonts w:ascii="Times New Roman" w:eastAsia="Times New Roman" w:hAnsi="Times New Roman" w:cs="Times New Roman"/>
+          <w:sz w:val="26"/>
+          <w:szCs w:val="26"/>
+          <w:highlight w:val="yellow"/>
+        </w:rPr>
+        <w:t>: Tạo, chỉnh sửa, xóa thông tin chi nhánh và kho.</w:t>
+      </w:r>
+      <w:r>
+        <w:rPr>
+          <w:rFonts w:ascii="Times New Roman" w:eastAsia="Times New Roman" w:hAnsi="Times New Roman" w:cs="Times New Roman"/>
+          <w:sz w:val="26"/>
+          <w:szCs w:val="26"/>
+          <w:lang w:val="vi-VN"/>
+        </w:rPr>
+        <w:t xml:space="preserve"> =&gt; </w:t>
+      </w:r>
+      <w:r>
+        <w:rPr>
+          <w:rFonts w:ascii="Times New Roman" w:eastAsia="Times New Roman" w:hAnsi="Times New Roman" w:cs="Times New Roman"/>
+          <w:sz w:val="26"/>
+          <w:szCs w:val="26"/>
+          <w:highlight w:val="yellow"/>
+          <w:lang w:val="vi-VN"/>
+        </w:rPr>
+        <w:t>đã</w:t>
+      </w:r>
+      <w:r>
+        <w:rPr>
+          <w:rFonts w:ascii="Times New Roman" w:eastAsia="Times New Roman" w:hAnsi="Times New Roman" w:cs="Times New Roman"/>
+          <w:sz w:val="26"/>
+          <w:szCs w:val="26"/>
+          <w:lang w:val="vi-VN"/>
+        </w:rPr>
+        <w:t xml:space="preserve"> </w:t>
+      </w:r>
+      <w:r>
+        <w:rPr>
+          <w:rFonts w:ascii="Times New Roman" w:eastAsia="Times New Roman" w:hAnsi="Times New Roman" w:cs="Times New Roman"/>
+          <w:sz w:val="26"/>
+          <w:szCs w:val="26"/>
+          <w:highlight w:val="yellow"/>
+          <w:lang w:val="vi-VN"/>
+        </w:rPr>
+        <w:t>làm</w:t>
+      </w:r>
+      <w:r>
+        <w:rPr>
+          <w:rFonts w:ascii="Times New Roman" w:eastAsia="Times New Roman" w:hAnsi="Times New Roman" w:cs="Times New Roman"/>
+          <w:sz w:val="26"/>
+          <w:szCs w:val="26"/>
+          <w:lang w:val="vi-VN"/>
+        </w:rPr>
+        <w:t xml:space="preserve"> </w:t>
+      </w:r>
+      <w:r>
+        <w:rPr>
+          <w:rFonts w:ascii="Times New Roman" w:eastAsia="Times New Roman" w:hAnsi="Times New Roman" w:cs="Times New Roman"/>
+          <w:sz w:val="26"/>
+          <w:szCs w:val="26"/>
+          <w:highlight w:val="yellow"/>
+          <w:lang w:val="vi-VN"/>
+        </w:rPr>
+        <w:t>nhưng</w:t>
+      </w:r>
+      <w:r>
+        <w:rPr>
+          <w:rFonts w:ascii="Times New Roman" w:eastAsia="Times New Roman" w:hAnsi="Times New Roman" w:cs="Times New Roman"/>
+          <w:sz w:val="26"/>
+          <w:szCs w:val="26"/>
+          <w:lang w:val="vi-VN"/>
+        </w:rPr>
+        <w:t xml:space="preserve"> </w:t>
+      </w:r>
+      <w:r>
+        <w:rPr>
+          <w:rFonts w:ascii="Times New Roman" w:eastAsia="Times New Roman" w:hAnsi="Times New Roman" w:cs="Times New Roman"/>
+          <w:sz w:val="26"/>
+          <w:szCs w:val="26"/>
+          <w:highlight w:val="yellow"/>
+          <w:lang w:val="vi-VN"/>
+        </w:rPr>
+        <w:t>chưa</w:t>
+      </w:r>
+      <w:r>
+        <w:rPr>
+          <w:rFonts w:ascii="Times New Roman" w:eastAsia="Times New Roman" w:hAnsi="Times New Roman" w:cs="Times New Roman"/>
+          <w:sz w:val="26"/>
+          <w:szCs w:val="26"/>
+          <w:lang w:val="vi-VN"/>
+        </w:rPr>
+        <w:t xml:space="preserve"> làm mấy logic về kho</w:t>
+      </w:r>
+      <w:r>
+        <w:rPr>
+          <w:rFonts w:ascii="Times New Roman" w:eastAsia="Times New Roman" w:hAnsi="Times New Roman" w:cs="Times New Roman"/>
+          <w:sz w:val="26"/>
+          <w:szCs w:val="26"/>
+          <w:lang w:val="vi-VN"/>
+        </w:rPr>
+        <w:t xml:space="preserve"> =&gt; đã làm cơ bản cần update thêm</w:t>
+      </w:r>
+    </w:p>
+    <w:p>
+      <w:pPr>
+        <w:spacing w:before="240" w:after="240"/>
+        <w:rPr>
+          <w:rFonts w:ascii="Times New Roman" w:eastAsia="Times New Roman" w:hAnsi="Times New Roman" w:cs="Times New Roman"/>
+          <w:sz w:val="26"/>
+          <w:szCs w:val="26"/>
+          <w:lang w:val="vi-VN"/>
+        </w:rPr>
+      </w:pPr>
+      <w:r>
+        <w:rPr>
+          <w:rFonts w:ascii="Times New Roman" w:eastAsia="Times New Roman" w:hAnsi="Times New Roman" w:cs="Times New Roman"/>
+          <w:b/>
+          <w:bCs/>
+          <w:sz w:val="26"/>
+          <w:szCs w:val="26"/>
+          <w:highlight w:val="yellow"/>
+        </w:rPr>
         <w:lastRenderedPageBreak/>
-        <w:t>- Quản lý chi nhánh cửa hàng và kho hàng (CRUD)</w:t>
-      </w:r>
-      <w:r>
-        <w:rPr>
-          <w:rFonts w:ascii="Times New Roman" w:eastAsia="Times New Roman" w:hAnsi="Times New Roman" w:cs="Times New Roman"/>
-          <w:sz w:val="26"/>
-          <w:szCs w:val="26"/>
-          <w:highlight w:val="yellow"/>
-        </w:rPr>
-        <w:t>: Tạo, chỉnh sửa, xóa thông tin chi nhánh và kho.</w:t>
-      </w:r>
-      <w:r>
-        <w:rPr>
-          <w:rFonts w:ascii="Times New Roman" w:eastAsia="Times New Roman" w:hAnsi="Times New Roman" w:cs="Times New Roman"/>
-          <w:sz w:val="26"/>
-          <w:szCs w:val="26"/>
-          <w:lang w:val="vi-VN"/>
-        </w:rPr>
-        <w:t xml:space="preserve"> =&gt; </w:t>
-      </w:r>
-      <w:r>
-        <w:rPr>
-          <w:rFonts w:ascii="Times New Roman" w:eastAsia="Times New Roman" w:hAnsi="Times New Roman" w:cs="Times New Roman"/>
-          <w:sz w:val="26"/>
-          <w:szCs w:val="26"/>
-          <w:highlight w:val="yellow"/>
-          <w:lang w:val="vi-VN"/>
-        </w:rPr>
-        <w:t>đã</w:t>
-      </w:r>
-      <w:r>
-        <w:rPr>
-          <w:rFonts w:ascii="Times New Roman" w:eastAsia="Times New Roman" w:hAnsi="Times New Roman" w:cs="Times New Roman"/>
-          <w:sz w:val="26"/>
-          <w:szCs w:val="26"/>
-          <w:lang w:val="vi-VN"/>
-        </w:rPr>
-        <w:t xml:space="preserve"> </w:t>
-      </w:r>
-      <w:r>
-        <w:rPr>
-          <w:rFonts w:ascii="Times New Roman" w:eastAsia="Times New Roman" w:hAnsi="Times New Roman" w:cs="Times New Roman"/>
-          <w:sz w:val="26"/>
-          <w:szCs w:val="26"/>
-          <w:highlight w:val="yellow"/>
-          <w:lang w:val="vi-VN"/>
-        </w:rPr>
-        <w:t>làm</w:t>
-      </w:r>
-      <w:r>
-        <w:rPr>
-          <w:rFonts w:ascii="Times New Roman" w:eastAsia="Times New Roman" w:hAnsi="Times New Roman" w:cs="Times New Roman"/>
-          <w:sz w:val="26"/>
-          <w:szCs w:val="26"/>
-          <w:lang w:val="vi-VN"/>
-        </w:rPr>
-        <w:t xml:space="preserve"> </w:t>
-      </w:r>
-      <w:r>
-        <w:rPr>
-          <w:rFonts w:ascii="Times New Roman" w:eastAsia="Times New Roman" w:hAnsi="Times New Roman" w:cs="Times New Roman"/>
-          <w:sz w:val="26"/>
-          <w:szCs w:val="26"/>
-          <w:highlight w:val="yellow"/>
-          <w:lang w:val="vi-VN"/>
-        </w:rPr>
-        <w:t>nhưng</w:t>
-      </w:r>
-      <w:r>
-        <w:rPr>
-          <w:rFonts w:ascii="Times New Roman" w:eastAsia="Times New Roman" w:hAnsi="Times New Roman" w:cs="Times New Roman"/>
-          <w:sz w:val="26"/>
-          <w:szCs w:val="26"/>
-          <w:lang w:val="vi-VN"/>
-        </w:rPr>
-        <w:t xml:space="preserve"> </w:t>
-      </w:r>
-      <w:r>
-        <w:rPr>
-          <w:rFonts w:ascii="Times New Roman" w:eastAsia="Times New Roman" w:hAnsi="Times New Roman" w:cs="Times New Roman"/>
-          <w:sz w:val="26"/>
-          <w:szCs w:val="26"/>
-          <w:highlight w:val="yellow"/>
-          <w:lang w:val="vi-VN"/>
-        </w:rPr>
-        <w:t>chưa</w:t>
-      </w:r>
-      <w:r>
-        <w:rPr>
-          <w:rFonts w:ascii="Times New Roman" w:eastAsia="Times New Roman" w:hAnsi="Times New Roman" w:cs="Times New Roman"/>
-          <w:sz w:val="26"/>
-          <w:szCs w:val="26"/>
-          <w:lang w:val="vi-VN"/>
-        </w:rPr>
-        <w:t xml:space="preserve"> làm mấy logic về kho</w:t>
-      </w:r>
-      <w:r>
-        <w:rPr>
-          <w:rFonts w:ascii="Times New Roman" w:eastAsia="Times New Roman" w:hAnsi="Times New Roman" w:cs="Times New Roman"/>
-          <w:sz w:val="26"/>
-          <w:szCs w:val="26"/>
-          <w:lang w:val="vi-VN"/>
-        </w:rPr>
-        <w:t xml:space="preserve"> =&gt; đã làm cơ bản cần update thêm</w:t>
-      </w:r>
-    </w:p>
-    <w:p>
-      <w:pPr>
-        <w:spacing w:before="240" w:after="240"/>
-        <w:rPr>
-          <w:rFonts w:ascii="Times New Roman" w:eastAsia="Times New Roman" w:hAnsi="Times New Roman" w:cs="Times New Roman"/>
-          <w:sz w:val="26"/>
-          <w:szCs w:val="26"/>
-          <w:lang w:val="vi-VN"/>
-        </w:rPr>
-      </w:pPr>
-      <w:r>
-        <w:rPr>
-          <w:rFonts w:ascii="Times New Roman" w:eastAsia="Times New Roman" w:hAnsi="Times New Roman" w:cs="Times New Roman"/>
-          <w:b/>
-          <w:bCs/>
-          <w:sz w:val="26"/>
-          <w:szCs w:val="26"/>
-          <w:highlight w:val="yellow"/>
-        </w:rPr>
         <w:t>- Quản lý chương trình khuyến mãi</w:t>
       </w:r>
       <w:r>
@@ -3684,22 +3607,9 @@
           <w:sz w:val="26"/>
           <w:szCs w:val="26"/>
           <w:highlight w:val="yellow"/>
-          <w:lang w:val="vi-VN"/>
-        </w:rPr>
-      </w:pPr>
-      <w:r>
-        <w:rPr>
-          <w:rFonts w:ascii="Times New Roman" w:eastAsia="Times New Roman" w:hAnsi="Times New Roman" w:cs="Times New Roman"/>
-          <w:b/>
-          <w:bCs/>
-          <w:color w:val="000000"/>
-          <w:sz w:val="26"/>
-          <w:szCs w:val="26"/>
-          <w:highlight w:val="yellow"/>
-          <w:lang w:val="vi-VN"/>
-        </w:rPr>
-        <w:t>=&gt; Những actor và chức năng này chưa đụng</w:t>
-      </w:r>
+          <w:lang w:val="en-GB"/>
+        </w:rPr>
+      </w:pPr>
     </w:p>
     <w:p>
       <w:pPr>
@@ -3715,9 +3625,16 @@
           <w:sz w:val="26"/>
           <w:szCs w:val="26"/>
           <w:highlight w:val="yellow"/>
-        </w:rPr>
-      </w:pPr>
-      <w:r>
+          <w:lang w:val="en-GB"/>
+        </w:rPr>
+      </w:pPr>
+    </w:p>
+    <w:p>
+      <w:pPr>
+        <w:pStyle w:val="Heading3"/>
+        <w:keepNext w:val="0"/>
+        <w:keepLines w:val="0"/>
+        <w:spacing w:before="280"/>
         <w:rPr>
           <w:rFonts w:ascii="Times New Roman" w:eastAsia="Times New Roman" w:hAnsi="Times New Roman" w:cs="Times New Roman"/>
           <w:b/>
@@ -3726,6 +3643,264 @@
           <w:sz w:val="26"/>
           <w:szCs w:val="26"/>
           <w:highlight w:val="yellow"/>
+          <w:lang w:val="en-GB"/>
+        </w:rPr>
+      </w:pPr>
+    </w:p>
+    <w:p>
+      <w:pPr>
+        <w:pStyle w:val="Heading3"/>
+        <w:keepNext w:val="0"/>
+        <w:keepLines w:val="0"/>
+        <w:spacing w:before="280"/>
+        <w:rPr>
+          <w:rFonts w:ascii="Times New Roman" w:eastAsia="Times New Roman" w:hAnsi="Times New Roman" w:cs="Times New Roman"/>
+          <w:b/>
+          <w:bCs/>
+          <w:color w:val="000000"/>
+          <w:sz w:val="26"/>
+          <w:szCs w:val="26"/>
+          <w:highlight w:val="yellow"/>
+          <w:lang w:val="en-GB"/>
+        </w:rPr>
+      </w:pPr>
+    </w:p>
+    <w:p>
+      <w:pPr>
+        <w:pStyle w:val="Heading3"/>
+        <w:keepNext w:val="0"/>
+        <w:keepLines w:val="0"/>
+        <w:spacing w:before="280"/>
+        <w:rPr>
+          <w:rFonts w:ascii="Times New Roman" w:eastAsia="Times New Roman" w:hAnsi="Times New Roman" w:cs="Times New Roman"/>
+          <w:b/>
+          <w:bCs/>
+          <w:color w:val="000000"/>
+          <w:sz w:val="26"/>
+          <w:szCs w:val="26"/>
+          <w:highlight w:val="yellow"/>
+          <w:lang w:val="en-GB"/>
+        </w:rPr>
+      </w:pPr>
+    </w:p>
+    <w:p>
+      <w:pPr>
+        <w:pStyle w:val="Heading3"/>
+        <w:keepNext w:val="0"/>
+        <w:keepLines w:val="0"/>
+        <w:spacing w:before="280"/>
+        <w:rPr>
+          <w:rFonts w:ascii="Times New Roman" w:eastAsia="Times New Roman" w:hAnsi="Times New Roman" w:cs="Times New Roman"/>
+          <w:b/>
+          <w:bCs/>
+          <w:color w:val="000000"/>
+          <w:sz w:val="26"/>
+          <w:szCs w:val="26"/>
+          <w:highlight w:val="yellow"/>
+          <w:lang w:val="en-GB"/>
+        </w:rPr>
+      </w:pPr>
+    </w:p>
+    <w:p>
+      <w:pPr>
+        <w:pStyle w:val="Heading3"/>
+        <w:keepNext w:val="0"/>
+        <w:keepLines w:val="0"/>
+        <w:spacing w:before="280"/>
+        <w:rPr>
+          <w:rFonts w:ascii="Times New Roman" w:eastAsia="Times New Roman" w:hAnsi="Times New Roman" w:cs="Times New Roman"/>
+          <w:b/>
+          <w:bCs/>
+          <w:color w:val="000000"/>
+          <w:sz w:val="26"/>
+          <w:szCs w:val="26"/>
+          <w:highlight w:val="yellow"/>
+          <w:lang w:val="en-GB"/>
+        </w:rPr>
+      </w:pPr>
+    </w:p>
+    <w:p>
+      <w:pPr>
+        <w:pStyle w:val="Heading3"/>
+        <w:keepNext w:val="0"/>
+        <w:keepLines w:val="0"/>
+        <w:spacing w:before="280"/>
+        <w:rPr>
+          <w:rFonts w:ascii="Times New Roman" w:eastAsia="Times New Roman" w:hAnsi="Times New Roman" w:cs="Times New Roman"/>
+          <w:b/>
+          <w:bCs/>
+          <w:color w:val="000000"/>
+          <w:sz w:val="26"/>
+          <w:szCs w:val="26"/>
+          <w:highlight w:val="yellow"/>
+          <w:lang w:val="en-GB"/>
+        </w:rPr>
+      </w:pPr>
+    </w:p>
+    <w:p>
+      <w:pPr>
+        <w:pStyle w:val="Heading3"/>
+        <w:keepNext w:val="0"/>
+        <w:keepLines w:val="0"/>
+        <w:spacing w:before="280"/>
+        <w:rPr>
+          <w:rFonts w:ascii="Times New Roman" w:eastAsia="Times New Roman" w:hAnsi="Times New Roman" w:cs="Times New Roman"/>
+          <w:b/>
+          <w:bCs/>
+          <w:color w:val="000000"/>
+          <w:sz w:val="26"/>
+          <w:szCs w:val="26"/>
+          <w:highlight w:val="yellow"/>
+          <w:lang w:val="en-GB"/>
+        </w:rPr>
+      </w:pPr>
+    </w:p>
+    <w:p>
+      <w:pPr>
+        <w:pStyle w:val="Heading3"/>
+        <w:keepNext w:val="0"/>
+        <w:keepLines w:val="0"/>
+        <w:spacing w:before="280"/>
+        <w:rPr>
+          <w:rFonts w:ascii="Times New Roman" w:eastAsia="Times New Roman" w:hAnsi="Times New Roman" w:cs="Times New Roman"/>
+          <w:b/>
+          <w:bCs/>
+          <w:color w:val="000000"/>
+          <w:sz w:val="26"/>
+          <w:szCs w:val="26"/>
+          <w:highlight w:val="yellow"/>
+          <w:lang w:val="en-GB"/>
+        </w:rPr>
+      </w:pPr>
+    </w:p>
+    <w:p>
+      <w:pPr>
+        <w:pStyle w:val="Heading3"/>
+        <w:keepNext w:val="0"/>
+        <w:keepLines w:val="0"/>
+        <w:spacing w:before="280"/>
+        <w:rPr>
+          <w:rFonts w:ascii="Times New Roman" w:eastAsia="Times New Roman" w:hAnsi="Times New Roman" w:cs="Times New Roman"/>
+          <w:b/>
+          <w:bCs/>
+          <w:color w:val="000000"/>
+          <w:sz w:val="26"/>
+          <w:szCs w:val="26"/>
+          <w:highlight w:val="yellow"/>
+          <w:lang w:val="en-GB"/>
+        </w:rPr>
+      </w:pPr>
+    </w:p>
+    <w:p>
+      <w:pPr>
+        <w:pStyle w:val="Heading3"/>
+        <w:keepNext w:val="0"/>
+        <w:keepLines w:val="0"/>
+        <w:spacing w:before="280"/>
+        <w:rPr>
+          <w:rFonts w:ascii="Times New Roman" w:eastAsia="Times New Roman" w:hAnsi="Times New Roman" w:cs="Times New Roman"/>
+          <w:b/>
+          <w:bCs/>
+          <w:color w:val="000000"/>
+          <w:sz w:val="26"/>
+          <w:szCs w:val="26"/>
+          <w:highlight w:val="yellow"/>
+          <w:lang w:val="en-GB"/>
+        </w:rPr>
+      </w:pPr>
+    </w:p>
+    <w:p>
+      <w:pPr>
+        <w:pStyle w:val="Heading3"/>
+        <w:keepNext w:val="0"/>
+        <w:keepLines w:val="0"/>
+        <w:spacing w:before="280"/>
+        <w:rPr>
+          <w:rFonts w:ascii="Times New Roman" w:eastAsia="Times New Roman" w:hAnsi="Times New Roman" w:cs="Times New Roman"/>
+          <w:b/>
+          <w:bCs/>
+          <w:color w:val="000000"/>
+          <w:sz w:val="26"/>
+          <w:szCs w:val="26"/>
+          <w:highlight w:val="yellow"/>
+          <w:lang w:val="en-GB"/>
+        </w:rPr>
+      </w:pPr>
+    </w:p>
+    <w:p>
+      <w:pPr>
+        <w:pStyle w:val="Heading3"/>
+        <w:keepNext w:val="0"/>
+        <w:keepLines w:val="0"/>
+        <w:spacing w:before="280"/>
+        <w:rPr>
+          <w:rFonts w:ascii="Times New Roman" w:eastAsia="Times New Roman" w:hAnsi="Times New Roman" w:cs="Times New Roman"/>
+          <w:b/>
+          <w:bCs/>
+          <w:color w:val="000000"/>
+          <w:sz w:val="26"/>
+          <w:szCs w:val="26"/>
+          <w:highlight w:val="yellow"/>
+          <w:lang w:val="en-GB"/>
+        </w:rPr>
+      </w:pPr>
+    </w:p>
+    <w:p>
+      <w:pPr>
+        <w:pStyle w:val="Heading3"/>
+        <w:keepNext w:val="0"/>
+        <w:keepLines w:val="0"/>
+        <w:spacing w:before="280"/>
+        <w:rPr>
+          <w:rFonts w:ascii="Times New Roman" w:eastAsia="Times New Roman" w:hAnsi="Times New Roman" w:cs="Times New Roman"/>
+          <w:b/>
+          <w:bCs/>
+          <w:color w:val="000000"/>
+          <w:sz w:val="26"/>
+          <w:szCs w:val="26"/>
+          <w:highlight w:val="yellow"/>
+          <w:lang w:val="vi-VN"/>
+        </w:rPr>
+      </w:pPr>
+      <w:r>
+        <w:rPr>
+          <w:rFonts w:ascii="Times New Roman" w:eastAsia="Times New Roman" w:hAnsi="Times New Roman" w:cs="Times New Roman"/>
+          <w:b/>
+          <w:bCs/>
+          <w:color w:val="000000"/>
+          <w:sz w:val="26"/>
+          <w:szCs w:val="26"/>
+          <w:highlight w:val="yellow"/>
+          <w:lang w:val="vi-VN"/>
+        </w:rPr>
+        <w:t>=&gt; Những actor và chức năng này chưa đụng</w:t>
+      </w:r>
+    </w:p>
+    <w:p>
+      <w:pPr>
+        <w:pStyle w:val="Heading3"/>
+        <w:keepNext w:val="0"/>
+        <w:keepLines w:val="0"/>
+        <w:spacing w:before="280"/>
+        <w:rPr>
+          <w:rFonts w:ascii="Times New Roman" w:eastAsia="Times New Roman" w:hAnsi="Times New Roman" w:cs="Times New Roman"/>
+          <w:b/>
+          <w:bCs/>
+          <w:color w:val="000000"/>
+          <w:sz w:val="26"/>
+          <w:szCs w:val="26"/>
+          <w:highlight w:val="yellow"/>
+        </w:rPr>
+      </w:pPr>
+      <w:r>
+        <w:rPr>
+          <w:rFonts w:ascii="Times New Roman" w:eastAsia="Times New Roman" w:hAnsi="Times New Roman" w:cs="Times New Roman"/>
+          <w:b/>
+          <w:bCs/>
+          <w:color w:val="000000"/>
+          <w:sz w:val="26"/>
+          <w:szCs w:val="26"/>
+          <w:highlight w:val="yellow"/>
         </w:rPr>
         <w:t>6. Actor: Quản lý kho hàng (Warehouse Manager)</w:t>
       </w:r>
@@ -3749,6 +3924,7 @@
           <w:szCs w:val="26"/>
           <w:highlight w:val="yellow"/>
         </w:rPr>
+        <w:lastRenderedPageBreak/>
         <w:t>- Phê duyệt yêu cầu xuất kho</w:t>
       </w:r>
       <w:r>

</xml_diff>

<commit_message>
feat (customer + admin + ci/cd test): update cac chuc nang 90%
</commit_message>
<xml_diff>
--- a/CNM_ChucNangNguoiDung.docx
+++ b/CNM_ChucNangNguoiDung.docx
@@ -90,7 +90,31 @@
           <w:szCs w:val="26"/>
           <w:lang w:val="vi-VN"/>
         </w:rPr>
-        <w:t>- Xem sản phẩm:</w:t>
+        <w:t xml:space="preserve">- Xem </w:t>
+      </w:r>
+      <w:r>
+        <w:rPr>
+          <w:rFonts w:ascii="Times New Roman" w:eastAsia="Times New Roman" w:hAnsi="Times New Roman" w:cs="Times New Roman"/>
+          <w:b/>
+          <w:bCs/>
+          <w:color w:val="000000"/>
+          <w:sz w:val="26"/>
+          <w:szCs w:val="26"/>
+          <w:lang w:val="vi-VN"/>
+        </w:rPr>
+        <w:t>danh sách sản phẩm</w:t>
+      </w:r>
+      <w:r>
+        <w:rPr>
+          <w:rFonts w:ascii="Times New Roman" w:eastAsia="Times New Roman" w:hAnsi="Times New Roman" w:cs="Times New Roman"/>
+          <w:b/>
+          <w:bCs/>
+          <w:color w:val="000000"/>
+          <w:sz w:val="26"/>
+          <w:szCs w:val="26"/>
+          <w:lang w:val="vi-VN"/>
+        </w:rPr>
+        <w:t>:</w:t>
       </w:r>
       <w:r>
         <w:rPr>
@@ -104,26 +128,157 @@
         </w:rPr>
         <w:t xml:space="preserve"> </w:t>
       </w:r>
-    </w:p>
-    <w:p>
-      <w:pPr>
-        <w:rPr>
-          <w:rFonts w:ascii="Times New Roman" w:eastAsia="Times New Roman" w:hAnsi="Times New Roman" w:cs="Times New Roman"/>
-          <w:color w:val="000000"/>
-          <w:sz w:val="26"/>
-          <w:szCs w:val="26"/>
-          <w:lang w:val="vi-VN"/>
-        </w:rPr>
-      </w:pPr>
-      <w:r>
-        <w:rPr>
-          <w:rFonts w:ascii="Times New Roman" w:eastAsia="Times New Roman" w:hAnsi="Times New Roman" w:cs="Times New Roman"/>
-          <w:b/>
-          <w:bCs/>
-          <w:color w:val="000000"/>
-          <w:sz w:val="26"/>
-          <w:szCs w:val="26"/>
-          <w:highlight w:val="yellow"/>
+      <w:r>
+        <w:rPr>
+          <w:rFonts w:ascii="Times New Roman" w:eastAsia="Times New Roman" w:hAnsi="Times New Roman" w:cs="Times New Roman"/>
+          <w:color w:val="000000"/>
+          <w:sz w:val="26"/>
+          <w:szCs w:val="26"/>
+          <w:lang w:val="vi-VN"/>
+        </w:rPr>
+        <w:t>Xem sản phẩm theo loại,....</w:t>
+      </w:r>
+      <w:r>
+        <w:rPr>
+          <w:rFonts w:ascii="Times New Roman" w:eastAsia="Times New Roman" w:hAnsi="Times New Roman" w:cs="Times New Roman"/>
+          <w:b/>
+          <w:bCs/>
+          <w:color w:val="000000"/>
+          <w:sz w:val="26"/>
+          <w:szCs w:val="26"/>
+          <w:lang w:val="vi-VN"/>
+        </w:rPr>
+        <w:t xml:space="preserve"> </w:t>
+      </w:r>
+    </w:p>
+    <w:p>
+      <w:pPr>
+        <w:rPr>
+          <w:rFonts w:ascii="Times New Roman" w:eastAsia="Times New Roman" w:hAnsi="Times New Roman" w:cs="Times New Roman"/>
+          <w:color w:val="000000"/>
+          <w:sz w:val="26"/>
+          <w:szCs w:val="26"/>
+          <w:lang w:val="vi-VN"/>
+        </w:rPr>
+      </w:pPr>
+      <w:r>
+        <w:rPr>
+          <w:rFonts w:ascii="Times New Roman" w:eastAsia="Times New Roman" w:hAnsi="Times New Roman" w:cs="Times New Roman"/>
+          <w:color w:val="000000"/>
+          <w:sz w:val="26"/>
+          <w:szCs w:val="26"/>
+          <w:lang w:val="vi-VN"/>
+        </w:rPr>
+        <w:t>=&gt; Done</w:t>
+      </w:r>
+    </w:p>
+    <w:p>
+      <w:pPr>
+        <w:rPr>
+          <w:rFonts w:ascii="Times New Roman" w:eastAsia="Times New Roman" w:hAnsi="Times New Roman" w:cs="Times New Roman"/>
+          <w:sz w:val="26"/>
+          <w:szCs w:val="26"/>
+          <w:lang w:val="vi-VN"/>
+        </w:rPr>
+      </w:pPr>
+      <w:r>
+        <w:rPr>
+          <w:rFonts w:ascii="Times New Roman" w:eastAsia="Times New Roman" w:hAnsi="Times New Roman" w:cs="Times New Roman"/>
+          <w:b/>
+          <w:bCs/>
+          <w:sz w:val="26"/>
+          <w:szCs w:val="26"/>
+        </w:rPr>
+        <w:t>- Tìm kiếm &amp; Lọc</w:t>
+      </w:r>
+      <w:r>
+        <w:rPr>
+          <w:rFonts w:ascii="Times New Roman" w:eastAsia="Times New Roman" w:hAnsi="Times New Roman" w:cs="Times New Roman"/>
+          <w:sz w:val="26"/>
+          <w:szCs w:val="26"/>
+        </w:rPr>
+        <w:t>: Tìm món theo tên, loại, giá hoặc lọc theo tiêu chí (hot, new, khuyến mãi...).</w:t>
+      </w:r>
+      <w:r>
+        <w:rPr>
+          <w:rFonts w:ascii="Times New Roman" w:eastAsia="Times New Roman" w:hAnsi="Times New Roman" w:cs="Times New Roman"/>
+          <w:sz w:val="26"/>
+          <w:szCs w:val="26"/>
+          <w:lang w:val="vi-VN"/>
+        </w:rPr>
+        <w:t xml:space="preserve"> </w:t>
+      </w:r>
+    </w:p>
+    <w:p>
+      <w:pPr>
+        <w:rPr>
+          <w:rFonts w:ascii="Times New Roman" w:eastAsia="Times New Roman" w:hAnsi="Times New Roman" w:cs="Times New Roman"/>
+          <w:sz w:val="26"/>
+          <w:szCs w:val="26"/>
+          <w:lang w:val="vi-VN"/>
+        </w:rPr>
+      </w:pPr>
+      <w:r>
+        <w:rPr>
+          <w:rFonts w:ascii="Times New Roman" w:eastAsia="Times New Roman" w:hAnsi="Times New Roman" w:cs="Times New Roman"/>
+          <w:sz w:val="26"/>
+          <w:szCs w:val="26"/>
+          <w:lang w:val="vi-VN"/>
+        </w:rPr>
+        <w:t>=&gt; Done</w:t>
+      </w:r>
+    </w:p>
+    <w:p>
+      <w:pPr>
+        <w:rPr>
+          <w:rFonts w:ascii="Times New Roman" w:eastAsia="Times New Roman" w:hAnsi="Times New Roman" w:cs="Times New Roman"/>
+          <w:sz w:val="26"/>
+          <w:szCs w:val="26"/>
+          <w:lang w:val="vi-VN"/>
+        </w:rPr>
+      </w:pPr>
+      <w:r>
+        <w:rPr>
+          <w:rFonts w:ascii="Times New Roman" w:eastAsia="Times New Roman" w:hAnsi="Times New Roman" w:cs="Times New Roman"/>
+          <w:b/>
+          <w:bCs/>
+          <w:sz w:val="26"/>
+          <w:szCs w:val="26"/>
+        </w:rPr>
+        <w:t>- Đăng ký tài khoản</w:t>
+      </w:r>
+      <w:r>
+        <w:rPr>
+          <w:rFonts w:ascii="Times New Roman" w:eastAsia="Times New Roman" w:hAnsi="Times New Roman" w:cs="Times New Roman"/>
+          <w:sz w:val="26"/>
+          <w:szCs w:val="26"/>
+        </w:rPr>
+        <w:t>: Tạo tài khoản mới bằng email/số điện thoại để sử dụng dịch vụ đặt hàng và tích điểm.</w:t>
+      </w:r>
+      <w:r>
+        <w:rPr>
+          <w:rFonts w:ascii="Times New Roman" w:eastAsia="Times New Roman" w:hAnsi="Times New Roman" w:cs="Times New Roman"/>
+          <w:sz w:val="26"/>
+          <w:szCs w:val="26"/>
+          <w:lang w:val="vi-VN"/>
+        </w:rPr>
+        <w:t xml:space="preserve"> (Đăng ký bằng mail, google)</w:t>
+      </w:r>
+    </w:p>
+    <w:p>
+      <w:pPr>
+        <w:rPr>
+          <w:rFonts w:ascii="Times New Roman" w:eastAsia="Times New Roman" w:hAnsi="Times New Roman" w:cs="Times New Roman"/>
+          <w:sz w:val="26"/>
+          <w:szCs w:val="26"/>
+          <w:lang w:val="vi-VN"/>
+        </w:rPr>
+      </w:pPr>
+      <w:r>
+        <w:rPr>
+          <w:rFonts w:ascii="Times New Roman" w:eastAsia="Times New Roman" w:hAnsi="Times New Roman" w:cs="Times New Roman"/>
+          <w:sz w:val="26"/>
+          <w:szCs w:val="26"/>
           <w:lang w:val="vi-VN"/>
         </w:rPr>
         <w:t xml:space="preserve">=&gt; </w:t>
@@ -131,52 +286,396 @@
       <w:r>
         <w:rPr>
           <w:rFonts w:ascii="Times New Roman" w:eastAsia="Times New Roman" w:hAnsi="Times New Roman" w:cs="Times New Roman"/>
-          <w:color w:val="000000"/>
-          <w:sz w:val="26"/>
-          <w:szCs w:val="26"/>
-          <w:highlight w:val="yellow"/>
-          <w:lang w:val="vi-VN"/>
-        </w:rPr>
-        <w:t>Update: trang xem sản phẩm cần phải chỉnh cho nó nhiều mục sản phẩm đa dạng hơn</w:t>
-      </w:r>
-      <w:r>
-        <w:rPr>
-          <w:rFonts w:ascii="Times New Roman" w:eastAsia="Times New Roman" w:hAnsi="Times New Roman" w:cs="Times New Roman"/>
-          <w:color w:val="000000"/>
-          <w:sz w:val="26"/>
-          <w:szCs w:val="26"/>
-          <w:highlight w:val="yellow"/>
-          <w:lang w:val="vi-VN"/>
-        </w:rPr>
-        <w:t xml:space="preserve"> – nên thêm nhiều sản phẩm rồi làm</w:t>
-      </w:r>
-    </w:p>
-    <w:p>
-      <w:pPr>
-        <w:rPr>
-          <w:rFonts w:ascii="Times New Roman" w:eastAsia="Times New Roman" w:hAnsi="Times New Roman" w:cs="Times New Roman"/>
-          <w:sz w:val="26"/>
-          <w:szCs w:val="26"/>
-          <w:lang w:val="vi-VN"/>
-        </w:rPr>
-      </w:pPr>
-      <w:r>
-        <w:rPr>
-          <w:rFonts w:ascii="Times New Roman" w:eastAsia="Times New Roman" w:hAnsi="Times New Roman" w:cs="Times New Roman"/>
-          <w:b/>
-          <w:bCs/>
-          <w:sz w:val="26"/>
-          <w:szCs w:val="26"/>
-        </w:rPr>
-        <w:t>- Tìm kiếm &amp; Lọc</w:t>
-      </w:r>
-      <w:r>
-        <w:rPr>
-          <w:rFonts w:ascii="Times New Roman" w:eastAsia="Times New Roman" w:hAnsi="Times New Roman" w:cs="Times New Roman"/>
-          <w:sz w:val="26"/>
-          <w:szCs w:val="26"/>
-        </w:rPr>
-        <w:t>: Tìm món theo tên, loại, giá hoặc lọc theo tiêu chí (hot, new, khuyến mãi...).</w:t>
+          <w:sz w:val="26"/>
+          <w:szCs w:val="26"/>
+          <w:lang w:val="vi-VN"/>
+        </w:rPr>
+        <w:t>Done (fix nhẹ =&gt; tài khoản khác thì đừng</w:t>
+      </w:r>
+      <w:r>
+        <w:rPr>
+          <w:rFonts w:ascii="Times New Roman" w:eastAsia="Times New Roman" w:hAnsi="Times New Roman" w:cs="Times New Roman"/>
+          <w:sz w:val="26"/>
+          <w:szCs w:val="26"/>
+          <w:lang w:val="vi-VN"/>
+        </w:rPr>
+        <w:t xml:space="preserve"> hiện avt cũ</w:t>
+      </w:r>
+      <w:r>
+        <w:rPr>
+          <w:rFonts w:ascii="Times New Roman" w:eastAsia="Times New Roman" w:hAnsi="Times New Roman" w:cs="Times New Roman"/>
+          <w:sz w:val="26"/>
+          <w:szCs w:val="26"/>
+          <w:lang w:val="vi-VN"/>
+        </w:rPr>
+        <w:t xml:space="preserve"> hiển thị avt người đấy</w:t>
+      </w:r>
+      <w:r>
+        <w:rPr>
+          <w:rFonts w:ascii="Times New Roman" w:eastAsia="Times New Roman" w:hAnsi="Times New Roman" w:cs="Times New Roman"/>
+          <w:sz w:val="26"/>
+          <w:szCs w:val="26"/>
+          <w:lang w:val="vi-VN"/>
+        </w:rPr>
+        <w:t xml:space="preserve"> – để tạm</w:t>
+      </w:r>
+      <w:r>
+        <w:rPr>
+          <w:rFonts w:ascii="Times New Roman" w:eastAsia="Times New Roman" w:hAnsi="Times New Roman" w:cs="Times New Roman"/>
+          <w:sz w:val="26"/>
+          <w:szCs w:val="26"/>
+          <w:lang w:val="vi-VN"/>
+        </w:rPr>
+        <w:t>)</w:t>
+      </w:r>
+    </w:p>
+    <w:p>
+      <w:pPr>
+        <w:rPr>
+          <w:rFonts w:ascii="Times New Roman" w:eastAsia="Times New Roman" w:hAnsi="Times New Roman" w:cs="Times New Roman"/>
+          <w:b/>
+          <w:bCs/>
+          <w:color w:val="000000"/>
+          <w:sz w:val="26"/>
+          <w:szCs w:val="26"/>
+          <w:lang w:val="vi-VN"/>
+        </w:rPr>
+      </w:pPr>
+      <w:r>
+        <w:rPr>
+          <w:rFonts w:ascii="Times New Roman" w:eastAsia="Times New Roman" w:hAnsi="Times New Roman" w:cs="Times New Roman"/>
+          <w:b/>
+          <w:bCs/>
+          <w:color w:val="000000"/>
+          <w:sz w:val="26"/>
+          <w:szCs w:val="26"/>
+          <w:lang w:val="vi-VN"/>
+        </w:rPr>
+        <w:t xml:space="preserve">- Xem trang tin </w:t>
+      </w:r>
+      <w:r>
+        <w:rPr>
+          <w:rFonts w:ascii="Times New Roman" w:eastAsia="Times New Roman" w:hAnsi="Times New Roman" w:cs="Times New Roman"/>
+          <w:b/>
+          <w:bCs/>
+          <w:color w:val="000000"/>
+          <w:sz w:val="26"/>
+          <w:szCs w:val="26"/>
+          <w:lang w:val="vi-VN"/>
+        </w:rPr>
+        <w:t>tức, bài viết</w:t>
+      </w:r>
+    </w:p>
+    <w:p>
+      <w:pPr>
+        <w:rPr>
+          <w:rFonts w:ascii="Times New Roman" w:eastAsia="Times New Roman" w:hAnsi="Times New Roman" w:cs="Times New Roman"/>
+          <w:color w:val="000000"/>
+          <w:sz w:val="26"/>
+          <w:szCs w:val="26"/>
+          <w:lang w:val="en-GB"/>
+        </w:rPr>
+      </w:pPr>
+      <w:r>
+        <w:rPr>
+          <w:rFonts w:ascii="Times New Roman" w:eastAsia="Times New Roman" w:hAnsi="Times New Roman" w:cs="Times New Roman"/>
+          <w:color w:val="000000"/>
+          <w:sz w:val="26"/>
+          <w:szCs w:val="26"/>
+          <w:lang w:val="vi-VN"/>
+        </w:rPr>
+        <w:t>=&gt; Done</w:t>
+      </w:r>
+    </w:p>
+    <w:p>
+      <w:pPr>
+        <w:rPr>
+          <w:rFonts w:ascii="Times New Roman" w:eastAsia="Times New Roman" w:hAnsi="Times New Roman" w:cs="Times New Roman"/>
+          <w:color w:val="000000"/>
+          <w:sz w:val="26"/>
+          <w:szCs w:val="26"/>
+          <w:highlight w:val="yellow"/>
+          <w:lang w:val="vi-VN"/>
+        </w:rPr>
+      </w:pPr>
+      <w:r>
+        <w:rPr>
+          <w:rFonts w:ascii="Times New Roman" w:eastAsia="Times New Roman" w:hAnsi="Times New Roman" w:cs="Times New Roman"/>
+          <w:b/>
+          <w:bCs/>
+          <w:color w:val="000000"/>
+          <w:sz w:val="26"/>
+          <w:szCs w:val="26"/>
+          <w:highlight w:val="yellow"/>
+          <w:lang w:val="vi-VN"/>
+        </w:rPr>
+        <w:t xml:space="preserve">- </w:t>
+      </w:r>
+      <w:r>
+        <w:rPr>
+          <w:rFonts w:ascii="Times New Roman" w:eastAsia="Times New Roman" w:hAnsi="Times New Roman" w:cs="Times New Roman"/>
+          <w:b/>
+          <w:bCs/>
+          <w:color w:val="000000"/>
+          <w:sz w:val="26"/>
+          <w:szCs w:val="26"/>
+          <w:highlight w:val="yellow"/>
+          <w:lang w:val="vi-VN"/>
+        </w:rPr>
+        <w:t>Xem và tra cứu</w:t>
+      </w:r>
+      <w:r>
+        <w:rPr>
+          <w:rFonts w:ascii="Times New Roman" w:eastAsia="Times New Roman" w:hAnsi="Times New Roman" w:cs="Times New Roman"/>
+          <w:b/>
+          <w:bCs/>
+          <w:color w:val="000000"/>
+          <w:sz w:val="26"/>
+          <w:szCs w:val="26"/>
+          <w:highlight w:val="yellow"/>
+          <w:lang w:val="vi-VN"/>
+        </w:rPr>
+        <w:t xml:space="preserve"> địa chỉ </w:t>
+      </w:r>
+      <w:r>
+        <w:rPr>
+          <w:rFonts w:ascii="Times New Roman" w:eastAsia="Times New Roman" w:hAnsi="Times New Roman" w:cs="Times New Roman"/>
+          <w:b/>
+          <w:bCs/>
+          <w:color w:val="000000"/>
+          <w:sz w:val="26"/>
+          <w:szCs w:val="26"/>
+          <w:highlight w:val="yellow"/>
+          <w:lang w:val="vi-VN"/>
+        </w:rPr>
+        <w:t xml:space="preserve">quán: </w:t>
+      </w:r>
+      <w:r>
+        <w:rPr>
+          <w:rFonts w:ascii="Times New Roman" w:eastAsia="Times New Roman" w:hAnsi="Times New Roman" w:cs="Times New Roman"/>
+          <w:color w:val="000000"/>
+          <w:sz w:val="26"/>
+          <w:szCs w:val="26"/>
+          <w:highlight w:val="yellow"/>
+          <w:lang w:val="vi-VN"/>
+        </w:rPr>
+        <w:t xml:space="preserve">Xem thông tin các địa chỉ quán và tra cứu địa </w:t>
+      </w:r>
+      <w:r>
+        <w:rPr>
+          <w:rFonts w:ascii="Times New Roman" w:eastAsia="Times New Roman" w:hAnsi="Times New Roman" w:cs="Times New Roman"/>
+          <w:color w:val="000000"/>
+          <w:sz w:val="26"/>
+          <w:szCs w:val="26"/>
+          <w:highlight w:val="yellow"/>
+          <w:lang w:val="vi-VN"/>
+        </w:rPr>
+        <w:t>chỉ.</w:t>
+      </w:r>
+    </w:p>
+    <w:p>
+      <w:pPr>
+        <w:rPr>
+          <w:rFonts w:ascii="Times New Roman" w:eastAsia="Times New Roman" w:hAnsi="Times New Roman" w:cs="Times New Roman"/>
+          <w:color w:val="000000"/>
+          <w:sz w:val="26"/>
+          <w:szCs w:val="26"/>
+          <w:lang w:val="vi-VN"/>
+        </w:rPr>
+      </w:pPr>
+      <w:r>
+        <w:rPr>
+          <w:rFonts w:ascii="Times New Roman" w:eastAsia="Times New Roman" w:hAnsi="Times New Roman" w:cs="Times New Roman"/>
+          <w:color w:val="000000"/>
+          <w:sz w:val="26"/>
+          <w:szCs w:val="26"/>
+          <w:highlight w:val="yellow"/>
+          <w:lang w:val="vi-VN"/>
+        </w:rPr>
+        <w:t>=&gt; Done (fix nhẹ =&gt; dùng dữ liệu thật 2 cửa hàng thôi</w:t>
+      </w:r>
+      <w:r>
+        <w:rPr>
+          <w:rFonts w:ascii="Times New Roman" w:eastAsia="Times New Roman" w:hAnsi="Times New Roman" w:cs="Times New Roman"/>
+          <w:color w:val="000000"/>
+          <w:sz w:val="26"/>
+          <w:szCs w:val="26"/>
+          <w:highlight w:val="yellow"/>
+          <w:lang w:val="vi-VN"/>
+        </w:rPr>
+        <w:t xml:space="preserve"> trong CSDL</w:t>
+      </w:r>
+      <w:r>
+        <w:rPr>
+          <w:rFonts w:ascii="Times New Roman" w:eastAsia="Times New Roman" w:hAnsi="Times New Roman" w:cs="Times New Roman"/>
+          <w:color w:val="000000"/>
+          <w:sz w:val="26"/>
+          <w:szCs w:val="26"/>
+          <w:highlight w:val="yellow"/>
+          <w:lang w:val="vi-VN"/>
+        </w:rPr>
+        <w:t xml:space="preserve"> =&gt; này thêm vào 9 cửa hàng thật luôn</w:t>
+      </w:r>
+      <w:r>
+        <w:rPr>
+          <w:rFonts w:ascii="Times New Roman" w:eastAsia="Times New Roman" w:hAnsi="Times New Roman" w:cs="Times New Roman"/>
+          <w:color w:val="000000"/>
+          <w:sz w:val="26"/>
+          <w:szCs w:val="26"/>
+          <w:highlight w:val="yellow"/>
+          <w:lang w:val="vi-VN"/>
+        </w:rPr>
+        <w:t>)</w:t>
+      </w:r>
+    </w:p>
+    <w:p>
+      <w:pPr>
+        <w:rPr>
+          <w:rFonts w:ascii="Times New Roman" w:eastAsia="Times New Roman" w:hAnsi="Times New Roman" w:cs="Times New Roman"/>
+          <w:b/>
+          <w:bCs/>
+          <w:color w:val="000000"/>
+          <w:sz w:val="26"/>
+          <w:szCs w:val="26"/>
+          <w:lang w:val="vi-VN"/>
+        </w:rPr>
+      </w:pPr>
+      <w:r>
+        <w:rPr>
+          <w:rFonts w:ascii="Times New Roman" w:eastAsia="Times New Roman" w:hAnsi="Times New Roman" w:cs="Times New Roman"/>
+          <w:b/>
+          <w:bCs/>
+          <w:color w:val="000000"/>
+          <w:sz w:val="26"/>
+          <w:szCs w:val="26"/>
+          <w:lang w:val="vi-VN"/>
+        </w:rPr>
+        <w:t>- Nhắn tin (Chatbox, AI, Zalo, Số điện thoại)</w:t>
+      </w:r>
+      <w:r>
+        <w:rPr>
+          <w:rFonts w:ascii="Times New Roman" w:eastAsia="Times New Roman" w:hAnsi="Times New Roman" w:cs="Times New Roman"/>
+          <w:b/>
+          <w:bCs/>
+          <w:color w:val="000000"/>
+          <w:sz w:val="26"/>
+          <w:szCs w:val="26"/>
+          <w:lang w:val="vi-VN"/>
+        </w:rPr>
+        <w:t>:</w:t>
+      </w:r>
+    </w:p>
+    <w:p>
+      <w:pPr>
+        <w:rPr>
+          <w:rFonts w:ascii="Times New Roman" w:eastAsia="Times New Roman" w:hAnsi="Times New Roman" w:cs="Times New Roman"/>
+          <w:color w:val="000000"/>
+          <w:sz w:val="26"/>
+          <w:szCs w:val="26"/>
+          <w:lang w:val="vi-VN"/>
+        </w:rPr>
+      </w:pPr>
+      <w:r>
+        <w:rPr>
+          <w:rFonts w:ascii="Times New Roman" w:eastAsia="Times New Roman" w:hAnsi="Times New Roman" w:cs="Times New Roman"/>
+          <w:color w:val="000000"/>
+          <w:sz w:val="26"/>
+          <w:szCs w:val="26"/>
+          <w:lang w:val="vi-VN"/>
+        </w:rPr>
+        <w:t xml:space="preserve">=&gt; </w:t>
+      </w:r>
+      <w:r>
+        <w:rPr>
+          <w:rFonts w:ascii="Times New Roman" w:eastAsia="Times New Roman" w:hAnsi="Times New Roman" w:cs="Times New Roman"/>
+          <w:color w:val="000000"/>
+          <w:sz w:val="26"/>
+          <w:szCs w:val="26"/>
+          <w:lang w:val="vi-VN"/>
+        </w:rPr>
+        <w:t>Done</w:t>
+      </w:r>
+    </w:p>
+    <w:p>
+      <w:pPr>
+        <w:rPr>
+          <w:rFonts w:ascii="Times New Roman" w:eastAsia="Times New Roman" w:hAnsi="Times New Roman" w:cs="Times New Roman"/>
+          <w:b/>
+          <w:bCs/>
+          <w:color w:val="000000"/>
+          <w:sz w:val="26"/>
+          <w:szCs w:val="26"/>
+        </w:rPr>
+      </w:pPr>
+      <w:r>
+        <w:rPr>
+          <w:rFonts w:ascii="Times New Roman" w:eastAsia="Times New Roman" w:hAnsi="Times New Roman" w:cs="Times New Roman"/>
+          <w:b/>
+          <w:bCs/>
+          <w:color w:val="000000"/>
+          <w:sz w:val="26"/>
+          <w:szCs w:val="26"/>
+          <w:highlight w:val="yellow"/>
+          <w:lang w:val="en-GB"/>
+        </w:rPr>
+        <w:t>2</w:t>
+      </w:r>
+      <w:r>
+        <w:rPr>
+          <w:rFonts w:ascii="Times New Roman" w:eastAsia="Times New Roman" w:hAnsi="Times New Roman" w:cs="Times New Roman"/>
+          <w:b/>
+          <w:bCs/>
+          <w:color w:val="000000"/>
+          <w:sz w:val="26"/>
+          <w:szCs w:val="26"/>
+          <w:highlight w:val="yellow"/>
+        </w:rPr>
+        <w:t>. Actor: Người dùng (Base Actor - Các actor khác kế thừa)</w:t>
+      </w:r>
+    </w:p>
+    <w:p>
+      <w:pPr>
+        <w:rPr>
+          <w:rFonts w:ascii="Times New Roman" w:eastAsia="Times New Roman" w:hAnsi="Times New Roman" w:cs="Times New Roman"/>
+          <w:sz w:val="26"/>
+          <w:szCs w:val="26"/>
+          <w:lang w:val="vi-VN"/>
+        </w:rPr>
+      </w:pPr>
+      <w:r>
+        <w:rPr>
+          <w:rFonts w:ascii="Times New Roman" w:eastAsia="Times New Roman" w:hAnsi="Times New Roman" w:cs="Times New Roman"/>
+          <w:b/>
+          <w:bCs/>
+          <w:sz w:val="26"/>
+          <w:szCs w:val="26"/>
+        </w:rPr>
+        <w:t>- Đăng nhập</w:t>
+      </w:r>
+      <w:r>
+        <w:rPr>
+          <w:rFonts w:ascii="Times New Roman" w:eastAsia="Times New Roman" w:hAnsi="Times New Roman" w:cs="Times New Roman"/>
+          <w:sz w:val="26"/>
+          <w:szCs w:val="26"/>
+        </w:rPr>
+        <w:t>: Truy cập hệ thống bằng tên đăng nhập/tài khoản và mật khẩu để sử dụng các chức năng được phân quyền</w:t>
+      </w:r>
+      <w:r>
+        <w:rPr>
+          <w:rFonts w:ascii="Times New Roman" w:eastAsia="Times New Roman" w:hAnsi="Times New Roman" w:cs="Times New Roman"/>
+          <w:sz w:val="26"/>
+          <w:szCs w:val="26"/>
+          <w:lang w:val="vi-VN"/>
+        </w:rPr>
+        <w:t xml:space="preserve"> (Bằng mail, google)</w:t>
+      </w:r>
+      <w:r>
+        <w:rPr>
+          <w:rFonts w:ascii="Times New Roman" w:eastAsia="Times New Roman" w:hAnsi="Times New Roman" w:cs="Times New Roman"/>
+          <w:sz w:val="26"/>
+          <w:szCs w:val="26"/>
+        </w:rPr>
+        <w:t>.</w:t>
       </w:r>
       <w:r>
         <w:rPr>
@@ -200,38 +699,92 @@
       <w:r>
         <w:rPr>
           <w:rFonts w:ascii="Times New Roman" w:eastAsia="Times New Roman" w:hAnsi="Times New Roman" w:cs="Times New Roman"/>
-          <w:b/>
-          <w:bCs/>
-          <w:sz w:val="26"/>
-          <w:szCs w:val="26"/>
-        </w:rPr>
-        <w:t>- Đăng ký tài khoản</w:t>
-      </w:r>
-      <w:r>
-        <w:rPr>
-          <w:rFonts w:ascii="Times New Roman" w:eastAsia="Times New Roman" w:hAnsi="Times New Roman" w:cs="Times New Roman"/>
-          <w:sz w:val="26"/>
-          <w:szCs w:val="26"/>
-        </w:rPr>
-        <w:t>: Tạo tài khoản mới bằng email/số điện thoại để sử dụng dịch vụ đặt hàng và tích điểm.</w:t>
-      </w:r>
-      <w:r>
-        <w:rPr>
-          <w:rFonts w:ascii="Times New Roman" w:eastAsia="Times New Roman" w:hAnsi="Times New Roman" w:cs="Times New Roman"/>
-          <w:sz w:val="26"/>
-          <w:szCs w:val="26"/>
-          <w:lang w:val="vi-VN"/>
-        </w:rPr>
-        <w:t xml:space="preserve"> (Đăng ký bằng mail, google)</w:t>
-      </w:r>
-    </w:p>
-    <w:p>
-      <w:pPr>
-        <w:rPr>
-          <w:rFonts w:ascii="Times New Roman" w:eastAsia="Times New Roman" w:hAnsi="Times New Roman" w:cs="Times New Roman"/>
-          <w:b/>
-          <w:bCs/>
-          <w:color w:val="000000"/>
+          <w:sz w:val="26"/>
+          <w:szCs w:val="26"/>
+          <w:lang w:val="vi-VN"/>
+        </w:rPr>
+        <w:t xml:space="preserve">=&gt; </w:t>
+      </w:r>
+      <w:r>
+        <w:rPr>
+          <w:rFonts w:ascii="Times New Roman" w:eastAsia="Times New Roman" w:hAnsi="Times New Roman" w:cs="Times New Roman"/>
+          <w:sz w:val="26"/>
+          <w:szCs w:val="26"/>
+          <w:lang w:val="vi-VN"/>
+        </w:rPr>
+        <w:t>Done</w:t>
+      </w:r>
+      <w:r>
+        <w:rPr>
+          <w:rFonts w:ascii="Times New Roman" w:eastAsia="Times New Roman" w:hAnsi="Times New Roman" w:cs="Times New Roman"/>
+          <w:sz w:val="26"/>
+          <w:szCs w:val="26"/>
+          <w:lang w:val="vi-VN"/>
+        </w:rPr>
+        <w:t xml:space="preserve"> (fix nhẹ =&gt; tài khoản khác thì đừng hiện avt cũ hiển thị avt người đấy</w:t>
+      </w:r>
+      <w:r>
+        <w:rPr>
+          <w:rFonts w:ascii="Times New Roman" w:eastAsia="Times New Roman" w:hAnsi="Times New Roman" w:cs="Times New Roman"/>
+          <w:sz w:val="26"/>
+          <w:szCs w:val="26"/>
+          <w:lang w:val="vi-VN"/>
+        </w:rPr>
+        <w:t xml:space="preserve"> – để tạm</w:t>
+      </w:r>
+      <w:r>
+        <w:rPr>
+          <w:rFonts w:ascii="Times New Roman" w:eastAsia="Times New Roman" w:hAnsi="Times New Roman" w:cs="Times New Roman"/>
+          <w:sz w:val="26"/>
+          <w:szCs w:val="26"/>
+          <w:lang w:val="vi-VN"/>
+        </w:rPr>
+        <w:t>)</w:t>
+      </w:r>
+    </w:p>
+    <w:p>
+      <w:pPr>
+        <w:rPr>
+          <w:rFonts w:ascii="Times New Roman" w:eastAsia="Times New Roman" w:hAnsi="Times New Roman" w:cs="Times New Roman"/>
+          <w:sz w:val="26"/>
+          <w:szCs w:val="26"/>
+          <w:lang w:val="vi-VN"/>
+        </w:rPr>
+      </w:pPr>
+      <w:r>
+        <w:rPr>
+          <w:rFonts w:ascii="Times New Roman" w:eastAsia="Times New Roman" w:hAnsi="Times New Roman" w:cs="Times New Roman"/>
+          <w:b/>
+          <w:bCs/>
+          <w:sz w:val="26"/>
+          <w:szCs w:val="26"/>
+          <w:lang w:val="vi-VN"/>
+        </w:rPr>
+        <w:t>- Đăng xuất:</w:t>
+      </w:r>
+      <w:r>
+        <w:rPr>
+          <w:rFonts w:ascii="Times New Roman" w:eastAsia="Times New Roman" w:hAnsi="Times New Roman" w:cs="Times New Roman"/>
+          <w:sz w:val="26"/>
+          <w:szCs w:val="26"/>
+          <w:lang w:val="vi-VN"/>
+        </w:rPr>
+        <w:t xml:space="preserve"> người dùng đăng xuất khỏi trang </w:t>
+      </w:r>
+      <w:r>
+        <w:rPr>
+          <w:rFonts w:ascii="Times New Roman" w:eastAsia="Times New Roman" w:hAnsi="Times New Roman" w:cs="Times New Roman"/>
+          <w:sz w:val="26"/>
+          <w:szCs w:val="26"/>
+          <w:lang w:val="vi-VN"/>
+        </w:rPr>
+        <w:t>web.</w:t>
+      </w:r>
+    </w:p>
+    <w:p>
+      <w:pPr>
+        <w:rPr>
+          <w:rFonts w:ascii="Times New Roman" w:eastAsia="Times New Roman" w:hAnsi="Times New Roman" w:cs="Times New Roman"/>
           <w:sz w:val="26"/>
           <w:szCs w:val="26"/>
           <w:lang w:val="en-GB"/>
@@ -240,165 +793,39 @@
       <w:r>
         <w:rPr>
           <w:rFonts w:ascii="Times New Roman" w:eastAsia="Times New Roman" w:hAnsi="Times New Roman" w:cs="Times New Roman"/>
-          <w:b/>
-          <w:bCs/>
-          <w:color w:val="000000"/>
-          <w:sz w:val="26"/>
-          <w:szCs w:val="26"/>
-          <w:lang w:val="vi-VN"/>
-        </w:rPr>
-        <w:t xml:space="preserve">- Xem trang tin </w:t>
-      </w:r>
-      <w:r>
-        <w:rPr>
-          <w:rFonts w:ascii="Times New Roman" w:eastAsia="Times New Roman" w:hAnsi="Times New Roman" w:cs="Times New Roman"/>
-          <w:b/>
-          <w:bCs/>
-          <w:color w:val="000000"/>
-          <w:sz w:val="26"/>
-          <w:szCs w:val="26"/>
-          <w:lang w:val="vi-VN"/>
-        </w:rPr>
-        <w:t>tức, bài viết</w:t>
-      </w:r>
-    </w:p>
-    <w:p>
-      <w:pPr>
-        <w:rPr>
-          <w:rFonts w:ascii="Times New Roman" w:eastAsia="Times New Roman" w:hAnsi="Times New Roman" w:cs="Times New Roman"/>
-          <w:b/>
-          <w:bCs/>
-          <w:color w:val="000000"/>
-          <w:sz w:val="26"/>
-          <w:szCs w:val="26"/>
-          <w:lang w:val="vi-VN"/>
-        </w:rPr>
-      </w:pPr>
-      <w:r>
-        <w:rPr>
-          <w:rFonts w:ascii="Times New Roman" w:eastAsia="Times New Roman" w:hAnsi="Times New Roman" w:cs="Times New Roman"/>
-          <w:b/>
-          <w:bCs/>
-          <w:color w:val="000000"/>
-          <w:sz w:val="26"/>
-          <w:szCs w:val="26"/>
-          <w:lang w:val="vi-VN"/>
-        </w:rPr>
-        <w:t xml:space="preserve">- </w:t>
-      </w:r>
-      <w:r>
-        <w:rPr>
-          <w:rFonts w:ascii="Times New Roman" w:eastAsia="Times New Roman" w:hAnsi="Times New Roman" w:cs="Times New Roman"/>
-          <w:b/>
-          <w:bCs/>
-          <w:color w:val="000000"/>
-          <w:sz w:val="26"/>
-          <w:szCs w:val="26"/>
-          <w:lang w:val="vi-VN"/>
-        </w:rPr>
-        <w:t>Xem và tra cứu</w:t>
-      </w:r>
-      <w:r>
-        <w:rPr>
-          <w:rFonts w:ascii="Times New Roman" w:eastAsia="Times New Roman" w:hAnsi="Times New Roman" w:cs="Times New Roman"/>
-          <w:b/>
-          <w:bCs/>
-          <w:color w:val="000000"/>
-          <w:sz w:val="26"/>
-          <w:szCs w:val="26"/>
-          <w:lang w:val="vi-VN"/>
-        </w:rPr>
-        <w:t xml:space="preserve"> địa chỉ quán</w:t>
-      </w:r>
-    </w:p>
-    <w:p>
-      <w:pPr>
-        <w:rPr>
-          <w:rFonts w:ascii="Times New Roman" w:eastAsia="Times New Roman" w:hAnsi="Times New Roman" w:cs="Times New Roman"/>
-          <w:b/>
-          <w:bCs/>
-          <w:color w:val="000000"/>
-          <w:sz w:val="26"/>
-          <w:szCs w:val="26"/>
-          <w:lang w:val="vi-VN"/>
-        </w:rPr>
-      </w:pPr>
-      <w:r>
-        <w:rPr>
-          <w:rFonts w:ascii="Times New Roman" w:eastAsia="Times New Roman" w:hAnsi="Times New Roman" w:cs="Times New Roman"/>
-          <w:b/>
-          <w:bCs/>
-          <w:color w:val="000000"/>
-          <w:sz w:val="26"/>
-          <w:szCs w:val="26"/>
-          <w:lang w:val="vi-VN"/>
-        </w:rPr>
-        <w:t>- Nhắn tin (Chatbox, AI, Zalo, Số điện thoại)</w:t>
-      </w:r>
-    </w:p>
-    <w:p>
-      <w:pPr>
-        <w:rPr>
-          <w:rFonts w:ascii="Times New Roman" w:eastAsia="Times New Roman" w:hAnsi="Times New Roman" w:cs="Times New Roman"/>
-          <w:b/>
-          <w:bCs/>
-          <w:color w:val="000000"/>
-          <w:sz w:val="26"/>
-          <w:szCs w:val="26"/>
-        </w:rPr>
-      </w:pPr>
-      <w:r>
-        <w:rPr>
-          <w:rFonts w:ascii="Times New Roman" w:eastAsia="Times New Roman" w:hAnsi="Times New Roman" w:cs="Times New Roman"/>
-          <w:b/>
-          <w:bCs/>
-          <w:color w:val="000000"/>
-          <w:sz w:val="26"/>
-          <w:szCs w:val="26"/>
-          <w:highlight w:val="yellow"/>
-          <w:lang w:val="en-GB"/>
-        </w:rPr>
-        <w:t>2</w:t>
-      </w:r>
-      <w:r>
-        <w:rPr>
-          <w:rFonts w:ascii="Times New Roman" w:eastAsia="Times New Roman" w:hAnsi="Times New Roman" w:cs="Times New Roman"/>
-          <w:b/>
-          <w:bCs/>
-          <w:color w:val="000000"/>
-          <w:sz w:val="26"/>
-          <w:szCs w:val="26"/>
-          <w:highlight w:val="yellow"/>
-        </w:rPr>
-        <w:t>. Actor: Người dùng (Base Actor - Các actor khác kế thừa)</w:t>
-      </w:r>
-    </w:p>
-    <w:p>
-      <w:pPr>
-        <w:rPr>
-          <w:rFonts w:ascii="Times New Roman" w:eastAsia="Times New Roman" w:hAnsi="Times New Roman" w:cs="Times New Roman"/>
-          <w:sz w:val="26"/>
-          <w:szCs w:val="26"/>
-          <w:lang w:val="en-GB"/>
-        </w:rPr>
-      </w:pPr>
-      <w:r>
-        <w:rPr>
-          <w:rFonts w:ascii="Times New Roman" w:eastAsia="Times New Roman" w:hAnsi="Times New Roman" w:cs="Times New Roman"/>
-          <w:b/>
-          <w:bCs/>
-          <w:sz w:val="26"/>
-          <w:szCs w:val="26"/>
-        </w:rPr>
-        <w:t>- Đăng nhập</w:t>
-      </w:r>
-      <w:r>
-        <w:rPr>
-          <w:rFonts w:ascii="Times New Roman" w:eastAsia="Times New Roman" w:hAnsi="Times New Roman" w:cs="Times New Roman"/>
-          <w:sz w:val="26"/>
-          <w:szCs w:val="26"/>
-        </w:rPr>
-        <w:t>: Truy cập hệ thống bằng tên đăng nhập/tài khoản và mật khẩu để sử dụng các chức năng được phân quyền.</w:t>
+          <w:sz w:val="26"/>
+          <w:szCs w:val="26"/>
+          <w:lang w:val="vi-VN"/>
+        </w:rPr>
+        <w:t>=&gt; Done</w:t>
+      </w:r>
+    </w:p>
+    <w:p>
+      <w:pPr>
+        <w:rPr>
+          <w:rFonts w:ascii="Times New Roman" w:eastAsia="Times New Roman" w:hAnsi="Times New Roman" w:cs="Times New Roman"/>
+          <w:sz w:val="26"/>
+          <w:szCs w:val="26"/>
+          <w:lang w:val="vi-VN"/>
+        </w:rPr>
+      </w:pPr>
+      <w:r>
+        <w:rPr>
+          <w:rFonts w:ascii="Times New Roman" w:eastAsia="Times New Roman" w:hAnsi="Times New Roman" w:cs="Times New Roman"/>
+          <w:b/>
+          <w:bCs/>
+          <w:sz w:val="26"/>
+          <w:szCs w:val="26"/>
+        </w:rPr>
+        <w:t>- Cập nhật Profile</w:t>
+      </w:r>
+      <w:r>
+        <w:rPr>
+          <w:rFonts w:ascii="Times New Roman" w:eastAsia="Times New Roman" w:hAnsi="Times New Roman" w:cs="Times New Roman"/>
+          <w:sz w:val="26"/>
+          <w:szCs w:val="26"/>
+        </w:rPr>
+        <w:t>: Chỉnh sửa thông tin cá nhân (tên, số điện thoại, email, avatar...).</w:t>
       </w:r>
       <w:r>
         <w:rPr>
@@ -422,20 +849,48 @@
       <w:r>
         <w:rPr>
           <w:rFonts w:ascii="Times New Roman" w:eastAsia="Times New Roman" w:hAnsi="Times New Roman" w:cs="Times New Roman"/>
-          <w:b/>
-          <w:bCs/>
-          <w:sz w:val="26"/>
-          <w:szCs w:val="26"/>
-        </w:rPr>
-        <w:t>- Cập nhật Profile</w:t>
-      </w:r>
-      <w:r>
-        <w:rPr>
-          <w:rFonts w:ascii="Times New Roman" w:eastAsia="Times New Roman" w:hAnsi="Times New Roman" w:cs="Times New Roman"/>
-          <w:sz w:val="26"/>
-          <w:szCs w:val="26"/>
-        </w:rPr>
-        <w:t>: Chỉnh sửa thông tin cá nhân (tên, số điện thoại, email, avatar...).</w:t>
+          <w:sz w:val="26"/>
+          <w:szCs w:val="26"/>
+          <w:lang w:val="vi-VN"/>
+        </w:rPr>
+        <w:t xml:space="preserve">=&gt; </w:t>
+      </w:r>
+      <w:r>
+        <w:rPr>
+          <w:rFonts w:ascii="Times New Roman" w:eastAsia="Times New Roman" w:hAnsi="Times New Roman" w:cs="Times New Roman"/>
+          <w:sz w:val="26"/>
+          <w:szCs w:val="26"/>
+          <w:lang w:val="vi-VN"/>
+        </w:rPr>
+        <w:t>Done</w:t>
+      </w:r>
+    </w:p>
+    <w:p>
+      <w:pPr>
+        <w:rPr>
+          <w:rFonts w:ascii="Times New Roman" w:eastAsia="Times New Roman" w:hAnsi="Times New Roman" w:cs="Times New Roman"/>
+          <w:sz w:val="26"/>
+          <w:szCs w:val="26"/>
+          <w:lang w:val="vi-VN"/>
+        </w:rPr>
+      </w:pPr>
+      <w:r>
+        <w:rPr>
+          <w:rFonts w:ascii="Times New Roman" w:eastAsia="Times New Roman" w:hAnsi="Times New Roman" w:cs="Times New Roman"/>
+          <w:b/>
+          <w:bCs/>
+          <w:sz w:val="26"/>
+          <w:szCs w:val="26"/>
+        </w:rPr>
+        <w:t>- Đổi mật khẩu</w:t>
+      </w:r>
+      <w:r>
+        <w:rPr>
+          <w:rFonts w:ascii="Times New Roman" w:eastAsia="Times New Roman" w:hAnsi="Times New Roman" w:cs="Times New Roman"/>
+          <w:sz w:val="26"/>
+          <w:szCs w:val="26"/>
+        </w:rPr>
+        <w:t>: Thay đổi mật khẩu hiện tại để tăng cường bảo mật tài khoản.</w:t>
       </w:r>
       <w:r>
         <w:rPr>
@@ -459,20 +914,48 @@
       <w:r>
         <w:rPr>
           <w:rFonts w:ascii="Times New Roman" w:eastAsia="Times New Roman" w:hAnsi="Times New Roman" w:cs="Times New Roman"/>
-          <w:b/>
-          <w:bCs/>
-          <w:sz w:val="26"/>
-          <w:szCs w:val="26"/>
-        </w:rPr>
-        <w:t>- Đổi mật khẩu</w:t>
-      </w:r>
-      <w:r>
-        <w:rPr>
-          <w:rFonts w:ascii="Times New Roman" w:eastAsia="Times New Roman" w:hAnsi="Times New Roman" w:cs="Times New Roman"/>
-          <w:sz w:val="26"/>
-          <w:szCs w:val="26"/>
-        </w:rPr>
-        <w:t>: Thay đổi mật khẩu hiện tại để tăng cường bảo mật tài khoản.</w:t>
+          <w:sz w:val="26"/>
+          <w:szCs w:val="26"/>
+          <w:lang w:val="vi-VN"/>
+        </w:rPr>
+        <w:t xml:space="preserve">=&gt; </w:t>
+      </w:r>
+      <w:r>
+        <w:rPr>
+          <w:rFonts w:ascii="Times New Roman" w:eastAsia="Times New Roman" w:hAnsi="Times New Roman" w:cs="Times New Roman"/>
+          <w:sz w:val="26"/>
+          <w:szCs w:val="26"/>
+          <w:lang w:val="vi-VN"/>
+        </w:rPr>
+        <w:t>Done</w:t>
+      </w:r>
+    </w:p>
+    <w:p>
+      <w:pPr>
+        <w:rPr>
+          <w:rFonts w:ascii="Times New Roman" w:eastAsia="Times New Roman" w:hAnsi="Times New Roman" w:cs="Times New Roman"/>
+          <w:sz w:val="26"/>
+          <w:szCs w:val="26"/>
+          <w:lang w:val="vi-VN"/>
+        </w:rPr>
+      </w:pPr>
+      <w:r>
+        <w:rPr>
+          <w:rFonts w:ascii="Times New Roman" w:eastAsia="Times New Roman" w:hAnsi="Times New Roman" w:cs="Times New Roman"/>
+          <w:b/>
+          <w:bCs/>
+          <w:sz w:val="26"/>
+          <w:szCs w:val="26"/>
+        </w:rPr>
+        <w:t>- Nhận thông báo</w:t>
+      </w:r>
+      <w:r>
+        <w:rPr>
+          <w:rFonts w:ascii="Times New Roman" w:eastAsia="Times New Roman" w:hAnsi="Times New Roman" w:cs="Times New Roman"/>
+          <w:sz w:val="26"/>
+          <w:szCs w:val="26"/>
+        </w:rPr>
+        <w:t>: Xem và nhận các thông báo đẩy từ hệ thống (cập nhật đơn hàng, khuyến mãi, cảnh báo...).</w:t>
       </w:r>
       <w:r>
         <w:rPr>
@@ -496,29 +979,20 @@
       <w:r>
         <w:rPr>
           <w:rFonts w:ascii="Times New Roman" w:eastAsia="Times New Roman" w:hAnsi="Times New Roman" w:cs="Times New Roman"/>
-          <w:b/>
-          <w:bCs/>
-          <w:sz w:val="26"/>
-          <w:szCs w:val="26"/>
-        </w:rPr>
-        <w:t>- Nhận thông báo</w:t>
-      </w:r>
-      <w:r>
-        <w:rPr>
-          <w:rFonts w:ascii="Times New Roman" w:eastAsia="Times New Roman" w:hAnsi="Times New Roman" w:cs="Times New Roman"/>
-          <w:sz w:val="26"/>
-          <w:szCs w:val="26"/>
-        </w:rPr>
-        <w:t>: Xem và nhận các thông báo đẩy từ hệ thống (cập nhật đơn hàng, khuyến mãi, cảnh báo...).</w:t>
-      </w:r>
-      <w:r>
-        <w:rPr>
-          <w:rFonts w:ascii="Times New Roman" w:eastAsia="Times New Roman" w:hAnsi="Times New Roman" w:cs="Times New Roman"/>
-          <w:sz w:val="26"/>
-          <w:szCs w:val="26"/>
-          <w:lang w:val="vi-VN"/>
-        </w:rPr>
-        <w:t xml:space="preserve"> </w:t>
+          <w:sz w:val="26"/>
+          <w:szCs w:val="26"/>
+          <w:lang w:val="vi-VN"/>
+        </w:rPr>
+        <w:t xml:space="preserve">=&gt; </w:t>
+      </w:r>
+      <w:r>
+        <w:rPr>
+          <w:rFonts w:ascii="Times New Roman" w:eastAsia="Times New Roman" w:hAnsi="Times New Roman" w:cs="Times New Roman"/>
+          <w:sz w:val="26"/>
+          <w:szCs w:val="26"/>
+          <w:lang w:val="vi-VN"/>
+        </w:rPr>
+        <w:t>Done</w:t>
       </w:r>
     </w:p>
     <w:p>
@@ -565,23 +1039,71 @@
       <w:pPr>
         <w:rPr>
           <w:rFonts w:ascii="Times New Roman" w:eastAsia="Times New Roman" w:hAnsi="Times New Roman" w:cs="Times New Roman"/>
-          <w:b/>
-          <w:bCs/>
-          <w:sz w:val="26"/>
-          <w:szCs w:val="26"/>
-          <w:lang w:val="vi-VN"/>
-        </w:rPr>
-      </w:pPr>
-      <w:r>
-        <w:rPr>
-          <w:rFonts w:ascii="Times New Roman" w:eastAsia="Times New Roman" w:hAnsi="Times New Roman" w:cs="Times New Roman"/>
-          <w:b/>
-          <w:bCs/>
-          <w:sz w:val="26"/>
-          <w:szCs w:val="26"/>
-          <w:lang w:val="vi-VN"/>
-        </w:rPr>
-        <w:t>- Thêm sản phẩm vào mục yêu thích</w:t>
+          <w:sz w:val="26"/>
+          <w:szCs w:val="26"/>
+          <w:lang w:val="vi-VN"/>
+        </w:rPr>
+      </w:pPr>
+      <w:r>
+        <w:rPr>
+          <w:rFonts w:ascii="Times New Roman" w:eastAsia="Times New Roman" w:hAnsi="Times New Roman" w:cs="Times New Roman"/>
+          <w:b/>
+          <w:bCs/>
+          <w:sz w:val="26"/>
+          <w:szCs w:val="26"/>
+          <w:lang w:val="vi-VN"/>
+        </w:rPr>
+        <w:t xml:space="preserve">- </w:t>
+      </w:r>
+      <w:r>
+        <w:rPr>
+          <w:rFonts w:ascii="Times New Roman" w:eastAsia="Times New Roman" w:hAnsi="Times New Roman" w:cs="Times New Roman"/>
+          <w:b/>
+          <w:bCs/>
+          <w:sz w:val="26"/>
+          <w:szCs w:val="26"/>
+          <w:lang w:val="vi-VN"/>
+        </w:rPr>
+        <w:t>Quản lý sản phẩm yêu thích</w:t>
+      </w:r>
+      <w:r>
+        <w:rPr>
+          <w:rFonts w:ascii="Times New Roman" w:eastAsia="Times New Roman" w:hAnsi="Times New Roman" w:cs="Times New Roman"/>
+          <w:b/>
+          <w:bCs/>
+          <w:sz w:val="26"/>
+          <w:szCs w:val="26"/>
+          <w:lang w:val="vi-VN"/>
+        </w:rPr>
+        <w:t xml:space="preserve"> (CRUD): </w:t>
+      </w:r>
+      <w:r>
+        <w:rPr>
+          <w:rFonts w:ascii="Times New Roman" w:eastAsia="Times New Roman" w:hAnsi="Times New Roman" w:cs="Times New Roman"/>
+          <w:sz w:val="26"/>
+          <w:szCs w:val="26"/>
+          <w:lang w:val="vi-VN"/>
+        </w:rPr>
+        <w:t>xem, thêm, xóa, thêm vào giỏ hàng.</w:t>
+      </w:r>
+    </w:p>
+    <w:p>
+      <w:pPr>
+        <w:rPr>
+          <w:rFonts w:ascii="Times New Roman" w:eastAsia="Times New Roman" w:hAnsi="Times New Roman" w:cs="Times New Roman"/>
+          <w:sz w:val="26"/>
+          <w:szCs w:val="26"/>
+          <w:lang w:val="vi-VN"/>
+        </w:rPr>
+      </w:pPr>
+      <w:r>
+        <w:rPr>
+          <w:rFonts w:ascii="Times New Roman" w:eastAsia="Times New Roman" w:hAnsi="Times New Roman" w:cs="Times New Roman"/>
+          <w:sz w:val="26"/>
+          <w:szCs w:val="26"/>
+          <w:lang w:val="vi-VN"/>
+        </w:rPr>
+        <w:t xml:space="preserve">=&gt; Done </w:t>
       </w:r>
     </w:p>
     <w:p>
@@ -622,7 +1144,26 @@
           <w:szCs w:val="26"/>
           <w:lang w:val="vi-VN"/>
         </w:rPr>
-        <w:t>qua mail</w:t>
+        <w:t>Dùng gmail gửi mã xác nhận để lấy lại mật khẩu.</w:t>
+      </w:r>
+    </w:p>
+    <w:p>
+      <w:pPr>
+        <w:rPr>
+          <w:rFonts w:ascii="Times New Roman" w:eastAsia="Times New Roman" w:hAnsi="Times New Roman" w:cs="Times New Roman"/>
+          <w:sz w:val="26"/>
+          <w:szCs w:val="26"/>
+          <w:lang w:val="vi-VN"/>
+        </w:rPr>
+      </w:pPr>
+      <w:r>
+        <w:rPr>
+          <w:rFonts w:ascii="Times New Roman" w:eastAsia="Times New Roman" w:hAnsi="Times New Roman" w:cs="Times New Roman"/>
+          <w:sz w:val="26"/>
+          <w:szCs w:val="26"/>
+          <w:lang w:val="vi-VN"/>
+        </w:rPr>
+        <w:t>=&gt; Done</w:t>
       </w:r>
     </w:p>
     <w:p>
@@ -668,6 +1209,26 @@
           <w:rFonts w:ascii="Times New Roman" w:eastAsia="Times New Roman" w:hAnsi="Times New Roman" w:cs="Times New Roman"/>
           <w:sz w:val="26"/>
           <w:szCs w:val="26"/>
+          <w:lang w:val="vi-VN"/>
+        </w:rPr>
+      </w:pPr>
+      <w:r>
+        <w:rPr>
+          <w:rFonts w:ascii="Times New Roman" w:eastAsia="Times New Roman" w:hAnsi="Times New Roman" w:cs="Times New Roman"/>
+          <w:sz w:val="26"/>
+          <w:szCs w:val="26"/>
+          <w:lang w:val="vi-VN"/>
+        </w:rPr>
+        <w:lastRenderedPageBreak/>
+        <w:t>=&gt; Done</w:t>
+      </w:r>
+    </w:p>
+    <w:p>
+      <w:pPr>
+        <w:rPr>
+          <w:rFonts w:ascii="Times New Roman" w:eastAsia="Times New Roman" w:hAnsi="Times New Roman" w:cs="Times New Roman"/>
+          <w:sz w:val="26"/>
+          <w:szCs w:val="26"/>
         </w:rPr>
       </w:pPr>
       <w:r>
@@ -782,6 +1343,25 @@
       <w:r>
         <w:rPr>
           <w:rFonts w:ascii="Times New Roman" w:eastAsia="Times New Roman" w:hAnsi="Times New Roman" w:cs="Times New Roman"/>
+          <w:sz w:val="26"/>
+          <w:szCs w:val="26"/>
+          <w:lang w:val="vi-VN"/>
+        </w:rPr>
+        <w:t>=&gt; Done</w:t>
+      </w:r>
+    </w:p>
+    <w:p>
+      <w:pPr>
+        <w:rPr>
+          <w:rFonts w:ascii="Times New Roman" w:eastAsia="Times New Roman" w:hAnsi="Times New Roman" w:cs="Times New Roman"/>
+          <w:sz w:val="26"/>
+          <w:szCs w:val="26"/>
+          <w:lang w:val="vi-VN"/>
+        </w:rPr>
+      </w:pPr>
+      <w:r>
+        <w:rPr>
+          <w:rFonts w:ascii="Times New Roman" w:eastAsia="Times New Roman" w:hAnsi="Times New Roman" w:cs="Times New Roman"/>
           <w:b/>
           <w:bCs/>
           <w:sz w:val="26"/>
@@ -819,6 +1399,25 @@
       <w:r>
         <w:rPr>
           <w:rFonts w:ascii="Times New Roman" w:eastAsia="Times New Roman" w:hAnsi="Times New Roman" w:cs="Times New Roman"/>
+          <w:sz w:val="26"/>
+          <w:szCs w:val="26"/>
+          <w:lang w:val="vi-VN"/>
+        </w:rPr>
+        <w:t>=&gt; Done</w:t>
+      </w:r>
+    </w:p>
+    <w:p>
+      <w:pPr>
+        <w:rPr>
+          <w:rFonts w:ascii="Times New Roman" w:eastAsia="Times New Roman" w:hAnsi="Times New Roman" w:cs="Times New Roman"/>
+          <w:sz w:val="26"/>
+          <w:szCs w:val="26"/>
+          <w:lang w:val="vi-VN"/>
+        </w:rPr>
+      </w:pPr>
+      <w:r>
+        <w:rPr>
+          <w:rFonts w:ascii="Times New Roman" w:eastAsia="Times New Roman" w:hAnsi="Times New Roman" w:cs="Times New Roman"/>
           <w:b/>
           <w:bCs/>
           <w:sz w:val="26"/>
@@ -856,6 +1455,34 @@
       <w:r>
         <w:rPr>
           <w:rFonts w:ascii="Times New Roman" w:eastAsia="Times New Roman" w:hAnsi="Times New Roman" w:cs="Times New Roman"/>
+          <w:sz w:val="26"/>
+          <w:szCs w:val="26"/>
+          <w:lang w:val="vi-VN"/>
+        </w:rPr>
+        <w:t xml:space="preserve">=&gt; </w:t>
+      </w:r>
+      <w:r>
+        <w:rPr>
+          <w:rFonts w:ascii="Times New Roman" w:eastAsia="Times New Roman" w:hAnsi="Times New Roman" w:cs="Times New Roman"/>
+          <w:sz w:val="26"/>
+          <w:szCs w:val="26"/>
+          <w:lang w:val="vi-VN"/>
+        </w:rPr>
+        <w:t>Done</w:t>
+      </w:r>
+    </w:p>
+    <w:p>
+      <w:pPr>
+        <w:rPr>
+          <w:rFonts w:ascii="Times New Roman" w:eastAsia="Times New Roman" w:hAnsi="Times New Roman" w:cs="Times New Roman"/>
+          <w:sz w:val="26"/>
+          <w:szCs w:val="26"/>
+          <w:lang w:val="vi-VN"/>
+        </w:rPr>
+      </w:pPr>
+      <w:r>
+        <w:rPr>
+          <w:rFonts w:ascii="Times New Roman" w:eastAsia="Times New Roman" w:hAnsi="Times New Roman" w:cs="Times New Roman"/>
           <w:b/>
           <w:bCs/>
           <w:sz w:val="26"/>
@@ -887,6 +1514,34 @@
           <w:rFonts w:ascii="Times New Roman" w:eastAsia="Times New Roman" w:hAnsi="Times New Roman" w:cs="Times New Roman"/>
           <w:sz w:val="26"/>
           <w:szCs w:val="26"/>
+          <w:lang w:val="en-GB"/>
+        </w:rPr>
+      </w:pPr>
+      <w:r>
+        <w:rPr>
+          <w:rFonts w:ascii="Times New Roman" w:eastAsia="Times New Roman" w:hAnsi="Times New Roman" w:cs="Times New Roman"/>
+          <w:sz w:val="26"/>
+          <w:szCs w:val="26"/>
+          <w:lang w:val="en-GB"/>
+        </w:rPr>
+        <w:t xml:space="preserve">=&gt; </w:t>
+      </w:r>
+      <w:r>
+        <w:rPr>
+          <w:rFonts w:ascii="Times New Roman" w:eastAsia="Times New Roman" w:hAnsi="Times New Roman" w:cs="Times New Roman"/>
+          <w:sz w:val="26"/>
+          <w:szCs w:val="26"/>
+          <w:lang w:val="en-GB"/>
+        </w:rPr>
+        <w:t>Done</w:t>
+      </w:r>
+    </w:p>
+    <w:p>
+      <w:pPr>
+        <w:rPr>
+          <w:rFonts w:ascii="Times New Roman" w:eastAsia="Times New Roman" w:hAnsi="Times New Roman" w:cs="Times New Roman"/>
+          <w:sz w:val="26"/>
+          <w:szCs w:val="26"/>
           <w:highlight w:val="yellow"/>
           <w:lang w:val="vi-VN"/>
         </w:rPr>
@@ -928,50 +1583,77 @@
           <w:rFonts w:ascii="Times New Roman" w:eastAsia="Times New Roman" w:hAnsi="Times New Roman" w:cs="Times New Roman"/>
           <w:sz w:val="26"/>
           <w:szCs w:val="26"/>
-          <w:lang w:val="vi-VN"/>
-        </w:rPr>
-      </w:pPr>
-      <w:r>
-        <w:rPr>
-          <w:rFonts w:ascii="Times New Roman" w:eastAsia="Times New Roman" w:hAnsi="Times New Roman" w:cs="Times New Roman"/>
-          <w:sz w:val="26"/>
-          <w:szCs w:val="26"/>
-          <w:highlight w:val="yellow"/>
-          <w:lang w:val="vi-VN"/>
-        </w:rPr>
-        <w:t xml:space="preserve">=&gt; update: </w:t>
-      </w:r>
-      <w:r>
-        <w:rPr>
-          <w:rFonts w:ascii="Times New Roman" w:eastAsia="Times New Roman" w:hAnsi="Times New Roman" w:cs="Times New Roman"/>
-          <w:sz w:val="26"/>
-          <w:szCs w:val="26"/>
-          <w:highlight w:val="yellow"/>
-          <w:lang w:val="vi-VN"/>
-        </w:rPr>
-        <w:t>hiển thị hết rồi nhưng chưa xử lý phần nếu nó bị nhiều đánh giá quá</w:t>
-      </w:r>
-    </w:p>
-    <w:p>
-      <w:pPr>
-        <w:rPr>
-          <w:rFonts w:ascii="Times New Roman" w:eastAsia="Times New Roman" w:hAnsi="Times New Roman" w:cs="Times New Roman"/>
-          <w:sz w:val="26"/>
-          <w:szCs w:val="26"/>
-          <w:highlight w:val="yellow"/>
-          <w:lang w:val="vi-VN"/>
-        </w:rPr>
-      </w:pPr>
-      <w:r>
-        <w:rPr>
-          <w:rFonts w:ascii="Times New Roman" w:eastAsia="Times New Roman" w:hAnsi="Times New Roman" w:cs="Times New Roman"/>
-          <w:b/>
-          <w:bCs/>
-          <w:sz w:val="26"/>
-          <w:szCs w:val="26"/>
-          <w:highlight w:val="yellow"/>
-        </w:rPr>
-        <w:lastRenderedPageBreak/>
+          <w:lang w:val="en-GB"/>
+        </w:rPr>
+      </w:pPr>
+      <w:r>
+        <w:rPr>
+          <w:rFonts w:ascii="Times New Roman" w:eastAsia="Times New Roman" w:hAnsi="Times New Roman" w:cs="Times New Roman"/>
+          <w:sz w:val="26"/>
+          <w:szCs w:val="26"/>
+          <w:highlight w:val="yellow"/>
+          <w:lang w:val="vi-VN"/>
+        </w:rPr>
+        <w:t xml:space="preserve">=&gt; </w:t>
+      </w:r>
+      <w:r>
+        <w:rPr>
+          <w:rFonts w:ascii="Times New Roman" w:eastAsia="Times New Roman" w:hAnsi="Times New Roman" w:cs="Times New Roman"/>
+          <w:sz w:val="26"/>
+          <w:szCs w:val="26"/>
+          <w:highlight w:val="yellow"/>
+          <w:lang w:val="en-GB"/>
+        </w:rPr>
+        <w:t>Done (</w:t>
+      </w:r>
+      <w:r>
+        <w:rPr>
+          <w:rFonts w:ascii="Times New Roman" w:eastAsia="Times New Roman" w:hAnsi="Times New Roman" w:cs="Times New Roman"/>
+          <w:sz w:val="26"/>
+          <w:szCs w:val="26"/>
+          <w:highlight w:val="yellow"/>
+          <w:lang w:val="vi-VN"/>
+        </w:rPr>
+        <w:t>Fix nhẹ =&gt; được fix nhẹ giao diện tí để sau</w:t>
+      </w:r>
+      <w:r>
+        <w:rPr>
+          <w:rFonts w:ascii="Times New Roman" w:eastAsia="Times New Roman" w:hAnsi="Times New Roman" w:cs="Times New Roman"/>
+          <w:sz w:val="26"/>
+          <w:szCs w:val="26"/>
+          <w:highlight w:val="yellow"/>
+          <w:lang w:val="vi-VN"/>
+        </w:rPr>
+        <w:t xml:space="preserve"> =&gt; thêm xóa sửa cũng oke</w:t>
+      </w:r>
+      <w:r>
+        <w:rPr>
+          <w:rFonts w:ascii="Times New Roman" w:eastAsia="Times New Roman" w:hAnsi="Times New Roman" w:cs="Times New Roman"/>
+          <w:sz w:val="26"/>
+          <w:szCs w:val="26"/>
+          <w:highlight w:val="yellow"/>
+          <w:lang w:val="en-GB"/>
+        </w:rPr>
+        <w:t>)</w:t>
+      </w:r>
+    </w:p>
+    <w:p>
+      <w:pPr>
+        <w:rPr>
+          <w:rFonts w:ascii="Times New Roman" w:eastAsia="Times New Roman" w:hAnsi="Times New Roman" w:cs="Times New Roman"/>
+          <w:sz w:val="26"/>
+          <w:szCs w:val="26"/>
+          <w:lang w:val="vi-VN"/>
+        </w:rPr>
+      </w:pPr>
+      <w:r>
+        <w:rPr>
+          <w:rFonts w:ascii="Times New Roman" w:eastAsia="Times New Roman" w:hAnsi="Times New Roman" w:cs="Times New Roman"/>
+          <w:b/>
+          <w:bCs/>
+          <w:sz w:val="26"/>
+          <w:szCs w:val="26"/>
+        </w:rPr>
         <w:t>- Xem gợi ý món ăn/thức uống</w:t>
       </w:r>
       <w:r>
@@ -979,7 +1661,6 @@
           <w:rFonts w:ascii="Times New Roman" w:eastAsia="Times New Roman" w:hAnsi="Times New Roman" w:cs="Times New Roman"/>
           <w:sz w:val="26"/>
           <w:szCs w:val="26"/>
-          <w:highlight w:val="yellow"/>
         </w:rPr>
         <w:t>: Nhận đề xuất món dựa trên lịch sử đặt hàng hoặc khuyến mãi.</w:t>
       </w:r>
@@ -988,7 +1669,6 @@
           <w:rFonts w:ascii="Times New Roman" w:eastAsia="Times New Roman" w:hAnsi="Times New Roman" w:cs="Times New Roman"/>
           <w:sz w:val="26"/>
           <w:szCs w:val="26"/>
-          <w:highlight w:val="yellow"/>
           <w:lang w:val="vi-VN"/>
         </w:rPr>
         <w:t xml:space="preserve"> </w:t>
@@ -1008,20 +1688,18 @@
           <w:rFonts w:ascii="Times New Roman" w:eastAsia="Times New Roman" w:hAnsi="Times New Roman" w:cs="Times New Roman"/>
           <w:sz w:val="26"/>
           <w:szCs w:val="26"/>
-          <w:highlight w:val="yellow"/>
-          <w:lang w:val="vi-VN"/>
-        </w:rPr>
-        <w:t xml:space="preserve">=&gt; update: </w:t>
-      </w:r>
-      <w:r>
-        <w:rPr>
-          <w:rFonts w:ascii="Times New Roman" w:eastAsia="Times New Roman" w:hAnsi="Times New Roman" w:cs="Times New Roman"/>
-          <w:sz w:val="26"/>
-          <w:szCs w:val="26"/>
-          <w:highlight w:val="yellow"/>
-          <w:lang w:val="vi-VN"/>
-        </w:rPr>
-        <w:t>gợi ý =&gt; thêm nhiều dữ liệu mẫu vào để ra kqua chính xác</w:t>
+          <w:lang w:val="vi-VN"/>
+        </w:rPr>
+        <w:t xml:space="preserve">=&gt; </w:t>
+      </w:r>
+      <w:r>
+        <w:rPr>
+          <w:rFonts w:ascii="Times New Roman" w:eastAsia="Times New Roman" w:hAnsi="Times New Roman" w:cs="Times New Roman"/>
+          <w:sz w:val="26"/>
+          <w:szCs w:val="26"/>
+          <w:lang w:val="vi-VN"/>
+        </w:rPr>
+        <w:t>Done</w:t>
       </w:r>
     </w:p>
     <w:p>
@@ -1072,17 +1750,17 @@
           <w:highlight w:val="yellow"/>
           <w:lang w:val="vi-VN"/>
         </w:rPr>
-        <w:t>=&gt; update: được thì update các size các món riêng trong csdl</w:t>
-      </w:r>
-      <w:r>
-        <w:rPr>
-          <w:rFonts w:ascii="Times New Roman" w:eastAsia="Times New Roman" w:hAnsi="Times New Roman" w:cs="Times New Roman"/>
-          <w:sz w:val="26"/>
-          <w:szCs w:val="26"/>
-          <w:highlight w:val="yellow"/>
-          <w:lang w:val="vi-VN"/>
-        </w:rPr>
-        <w:t xml:space="preserve"> =&gt; từ chưa cần thiết lắm</w:t>
+        <w:t xml:space="preserve">=&gt; </w:t>
+      </w:r>
+      <w:r>
+        <w:rPr>
+          <w:rFonts w:ascii="Times New Roman" w:eastAsia="Times New Roman" w:hAnsi="Times New Roman" w:cs="Times New Roman"/>
+          <w:sz w:val="26"/>
+          <w:szCs w:val="26"/>
+          <w:highlight w:val="yellow"/>
+          <w:lang w:val="vi-VN"/>
+        </w:rPr>
+        <w:t>Done (Fix nhẹ =&gt; được thì fix nhẹ thêm csdl thật vào phần size – chưa cần lắm)</w:t>
       </w:r>
     </w:p>
     <w:p>
@@ -1125,6 +1803,25 @@
       <w:r>
         <w:rPr>
           <w:rFonts w:ascii="Times New Roman" w:eastAsia="Times New Roman" w:hAnsi="Times New Roman" w:cs="Times New Roman"/>
+          <w:sz w:val="26"/>
+          <w:szCs w:val="26"/>
+          <w:lang w:val="vi-VN"/>
+        </w:rPr>
+        <w:t>=&gt; Done</w:t>
+      </w:r>
+    </w:p>
+    <w:p>
+      <w:pPr>
+        <w:rPr>
+          <w:rFonts w:ascii="Times New Roman" w:eastAsia="Times New Roman" w:hAnsi="Times New Roman" w:cs="Times New Roman"/>
+          <w:sz w:val="26"/>
+          <w:szCs w:val="26"/>
+          <w:lang w:val="vi-VN"/>
+        </w:rPr>
+      </w:pPr>
+      <w:r>
+        <w:rPr>
+          <w:rFonts w:ascii="Times New Roman" w:eastAsia="Times New Roman" w:hAnsi="Times New Roman" w:cs="Times New Roman"/>
           <w:b/>
           <w:bCs/>
           <w:sz w:val="26"/>
@@ -1139,6 +1836,25 @@
           <w:szCs w:val="26"/>
         </w:rPr>
         <w:t>: Tích lũy điểm từ đơn hàng và xem số dư điểm loyalty.</w:t>
+      </w:r>
+    </w:p>
+    <w:p>
+      <w:pPr>
+        <w:rPr>
+          <w:rFonts w:ascii="Times New Roman" w:eastAsia="Times New Roman" w:hAnsi="Times New Roman" w:cs="Times New Roman"/>
+          <w:sz w:val="26"/>
+          <w:szCs w:val="26"/>
+          <w:lang w:val="vi-VN"/>
+        </w:rPr>
+      </w:pPr>
+      <w:r>
+        <w:rPr>
+          <w:rFonts w:ascii="Times New Roman" w:eastAsia="Times New Roman" w:hAnsi="Times New Roman" w:cs="Times New Roman"/>
+          <w:sz w:val="26"/>
+          <w:szCs w:val="26"/>
+          <w:lang w:val="vi-VN"/>
+        </w:rPr>
+        <w:t>=&gt; Done</w:t>
       </w:r>
     </w:p>
     <w:p>
@@ -1227,7 +1943,29 @@
           <w:szCs w:val="26"/>
           <w:lang w:val="vi-VN"/>
         </w:rPr>
-        <w:t xml:space="preserve"> (Tiếp nhận, xem, cập nhật)</w:t>
+        <w:t xml:space="preserve"> (Tiếp nhận, xem, cập </w:t>
+      </w:r>
+      <w:r>
+        <w:rPr>
+          <w:rFonts w:ascii="Times New Roman" w:eastAsia="Times New Roman" w:hAnsi="Times New Roman" w:cs="Times New Roman"/>
+          <w:b/>
+          <w:bCs/>
+          <w:sz w:val="26"/>
+          <w:szCs w:val="26"/>
+          <w:lang w:val="vi-VN"/>
+        </w:rPr>
+        <w:t>nhật, xóa</w:t>
+      </w:r>
+      <w:r>
+        <w:rPr>
+          <w:rFonts w:ascii="Times New Roman" w:eastAsia="Times New Roman" w:hAnsi="Times New Roman" w:cs="Times New Roman"/>
+          <w:b/>
+          <w:bCs/>
+          <w:sz w:val="26"/>
+          <w:szCs w:val="26"/>
+          <w:lang w:val="vi-VN"/>
+        </w:rPr>
+        <w:t>)</w:t>
       </w:r>
       <w:r>
         <w:rPr>
@@ -1244,18 +1982,35 @@
           <w:rFonts w:ascii="Times New Roman" w:eastAsia="Times New Roman" w:hAnsi="Times New Roman" w:cs="Times New Roman"/>
           <w:sz w:val="26"/>
           <w:szCs w:val="26"/>
-          <w:highlight w:val="yellow"/>
-          <w:lang w:val="vi-VN"/>
-        </w:rPr>
-      </w:pPr>
-      <w:r>
-        <w:rPr>
-          <w:rFonts w:ascii="Times New Roman" w:eastAsia="Times New Roman" w:hAnsi="Times New Roman" w:cs="Times New Roman"/>
-          <w:b/>
-          <w:bCs/>
-          <w:sz w:val="26"/>
-          <w:szCs w:val="26"/>
-          <w:highlight w:val="yellow"/>
+          <w:lang w:val="vi-VN"/>
+        </w:rPr>
+      </w:pPr>
+      <w:r>
+        <w:rPr>
+          <w:rFonts w:ascii="Times New Roman" w:eastAsia="Times New Roman" w:hAnsi="Times New Roman" w:cs="Times New Roman"/>
+          <w:sz w:val="26"/>
+          <w:szCs w:val="26"/>
+          <w:lang w:val="vi-VN"/>
+        </w:rPr>
+        <w:t>=&gt; Done</w:t>
+      </w:r>
+    </w:p>
+    <w:p>
+      <w:pPr>
+        <w:rPr>
+          <w:rFonts w:ascii="Times New Roman" w:eastAsia="Times New Roman" w:hAnsi="Times New Roman" w:cs="Times New Roman"/>
+          <w:sz w:val="26"/>
+          <w:szCs w:val="26"/>
+          <w:lang w:val="vi-VN"/>
+        </w:rPr>
+      </w:pPr>
+      <w:r>
+        <w:rPr>
+          <w:rFonts w:ascii="Times New Roman" w:eastAsia="Times New Roman" w:hAnsi="Times New Roman" w:cs="Times New Roman"/>
+          <w:b/>
+          <w:bCs/>
+          <w:sz w:val="26"/>
+          <w:szCs w:val="26"/>
         </w:rPr>
         <w:t>- Tạo đơn hàng tại quầy</w:t>
       </w:r>
@@ -1264,7 +2019,6 @@
           <w:rFonts w:ascii="Times New Roman" w:eastAsia="Times New Roman" w:hAnsi="Times New Roman" w:cs="Times New Roman"/>
           <w:sz w:val="26"/>
           <w:szCs w:val="26"/>
-          <w:highlight w:val="yellow"/>
         </w:rPr>
         <w:t>: Nhập đơn trực tiếp cho khách tại chỗ hoặc takeaway trên POS.</w:t>
       </w:r>
@@ -1273,7 +2027,6 @@
           <w:rFonts w:ascii="Times New Roman" w:eastAsia="Times New Roman" w:hAnsi="Times New Roman" w:cs="Times New Roman"/>
           <w:sz w:val="26"/>
           <w:szCs w:val="26"/>
-          <w:highlight w:val="yellow"/>
           <w:lang w:val="vi-VN"/>
         </w:rPr>
         <w:t xml:space="preserve"> </w:t>
@@ -1285,49 +2038,26 @@
           <w:rFonts w:ascii="Times New Roman" w:eastAsia="Times New Roman" w:hAnsi="Times New Roman" w:cs="Times New Roman"/>
           <w:sz w:val="26"/>
           <w:szCs w:val="26"/>
-          <w:highlight w:val="yellow"/>
-          <w:lang w:val="vi-VN"/>
-        </w:rPr>
-      </w:pPr>
-      <w:r>
-        <w:rPr>
-          <w:rFonts w:ascii="Times New Roman" w:eastAsia="Times New Roman" w:hAnsi="Times New Roman" w:cs="Times New Roman"/>
-          <w:sz w:val="26"/>
-          <w:szCs w:val="26"/>
-          <w:highlight w:val="yellow"/>
-          <w:lang w:val="vi-VN"/>
-        </w:rPr>
-        <w:t>=&gt; update: nếu có tgian thì cho khách thanh toán thành công thì tự xác nhận luôn</w:t>
-      </w:r>
-    </w:p>
-    <w:p>
-      <w:pPr>
-        <w:rPr>
-          <w:rFonts w:ascii="Times New Roman" w:eastAsia="Times New Roman" w:hAnsi="Times New Roman" w:cs="Times New Roman"/>
-          <w:sz w:val="26"/>
-          <w:szCs w:val="26"/>
-          <w:lang w:val="vi-VN"/>
-        </w:rPr>
-      </w:pPr>
-      <w:r>
-        <w:rPr>
-          <w:rFonts w:ascii="Times New Roman" w:eastAsia="Times New Roman" w:hAnsi="Times New Roman" w:cs="Times New Roman"/>
-          <w:sz w:val="26"/>
-          <w:szCs w:val="26"/>
-          <w:highlight w:val="yellow"/>
-          <w:lang w:val="vi-VN"/>
-        </w:rPr>
-        <w:t>=&gt; update: tạo đơn thành công thì reset lại</w:t>
-      </w:r>
-      <w:r>
-        <w:rPr>
-          <w:rFonts w:ascii="Times New Roman" w:eastAsia="Times New Roman" w:hAnsi="Times New Roman" w:cs="Times New Roman"/>
-          <w:sz w:val="26"/>
-          <w:szCs w:val="26"/>
-          <w:highlight w:val="yellow"/>
-          <w:lang w:val="vi-VN"/>
-        </w:rPr>
-        <w:t xml:space="preserve"> =&gt; từ chưa cần lắm</w:t>
+          <w:lang w:val="vi-VN"/>
+        </w:rPr>
+      </w:pPr>
+      <w:r>
+        <w:rPr>
+          <w:rFonts w:ascii="Times New Roman" w:eastAsia="Times New Roman" w:hAnsi="Times New Roman" w:cs="Times New Roman"/>
+          <w:sz w:val="26"/>
+          <w:szCs w:val="26"/>
+          <w:lang w:val="vi-VN"/>
+        </w:rPr>
+        <w:t xml:space="preserve">=&gt; </w:t>
+      </w:r>
+      <w:r>
+        <w:rPr>
+          <w:rFonts w:ascii="Times New Roman" w:eastAsia="Times New Roman" w:hAnsi="Times New Roman" w:cs="Times New Roman"/>
+          <w:sz w:val="26"/>
+          <w:szCs w:val="26"/>
+          <w:lang w:val="vi-VN"/>
+        </w:rPr>
+        <w:t>Done</w:t>
       </w:r>
     </w:p>
     <w:p>
@@ -1416,6 +2146,26 @@
       <w:r>
         <w:rPr>
           <w:rFonts w:ascii="Times New Roman" w:eastAsia="Times New Roman" w:hAnsi="Times New Roman" w:cs="Times New Roman"/>
+          <w:sz w:val="26"/>
+          <w:szCs w:val="26"/>
+          <w:lang w:val="vi-VN"/>
+        </w:rPr>
+        <w:lastRenderedPageBreak/>
+        <w:t>=&gt; Done</w:t>
+      </w:r>
+    </w:p>
+    <w:p>
+      <w:pPr>
+        <w:rPr>
+          <w:rFonts w:ascii="Times New Roman" w:eastAsia="Times New Roman" w:hAnsi="Times New Roman" w:cs="Times New Roman"/>
+          <w:sz w:val="26"/>
+          <w:szCs w:val="26"/>
+          <w:lang w:val="vi-VN"/>
+        </w:rPr>
+      </w:pPr>
+      <w:r>
+        <w:rPr>
+          <w:rFonts w:ascii="Times New Roman" w:eastAsia="Times New Roman" w:hAnsi="Times New Roman" w:cs="Times New Roman"/>
           <w:b/>
           <w:bCs/>
           <w:sz w:val="26"/>
@@ -1438,18 +2188,16 @@
           <w:rFonts w:ascii="Times New Roman" w:eastAsia="Times New Roman" w:hAnsi="Times New Roman" w:cs="Times New Roman"/>
           <w:sz w:val="26"/>
           <w:szCs w:val="26"/>
-          <w:highlight w:val="yellow"/>
-          <w:lang w:val="vi-VN"/>
-        </w:rPr>
-      </w:pPr>
-      <w:r>
-        <w:rPr>
-          <w:rFonts w:ascii="Times New Roman" w:eastAsia="Times New Roman" w:hAnsi="Times New Roman" w:cs="Times New Roman"/>
-          <w:b/>
-          <w:bCs/>
-          <w:sz w:val="26"/>
-          <w:szCs w:val="26"/>
-          <w:highlight w:val="yellow"/>
+          <w:lang w:val="vi-VN"/>
+        </w:rPr>
+      </w:pPr>
+      <w:r>
+        <w:rPr>
+          <w:rFonts w:ascii="Times New Roman" w:eastAsia="Times New Roman" w:hAnsi="Times New Roman" w:cs="Times New Roman"/>
+          <w:b/>
+          <w:bCs/>
+          <w:sz w:val="26"/>
+          <w:szCs w:val="26"/>
         </w:rPr>
         <w:t>- Xử lý thanh toán tại quầy</w:t>
       </w:r>
@@ -1458,7 +2206,6 @@
           <w:rFonts w:ascii="Times New Roman" w:eastAsia="Times New Roman" w:hAnsi="Times New Roman" w:cs="Times New Roman"/>
           <w:sz w:val="26"/>
           <w:szCs w:val="26"/>
-          <w:highlight w:val="yellow"/>
         </w:rPr>
         <w:t>: Thu tiền bằng tiền mặt, thẻ, ví điện tử hoặc QR code qua POS.</w:t>
       </w:r>
@@ -1469,47 +2216,32 @@
           <w:rFonts w:ascii="Times New Roman" w:eastAsia="Times New Roman" w:hAnsi="Times New Roman" w:cs="Times New Roman"/>
           <w:sz w:val="26"/>
           <w:szCs w:val="26"/>
-          <w:highlight w:val="yellow"/>
-          <w:lang w:val="vi-VN"/>
-        </w:rPr>
-      </w:pPr>
-      <w:r>
-        <w:rPr>
-          <w:rFonts w:ascii="Times New Roman" w:eastAsia="Times New Roman" w:hAnsi="Times New Roman" w:cs="Times New Roman"/>
-          <w:sz w:val="26"/>
-          <w:szCs w:val="26"/>
-          <w:highlight w:val="yellow"/>
-          <w:lang w:val="vi-VN"/>
-        </w:rPr>
-        <w:t>=&gt; update: nếu có tgian thì cho khách thanh toán thành công thì tự xác nhận luôn</w:t>
-      </w:r>
-    </w:p>
-    <w:p>
-      <w:pPr>
-        <w:rPr>
-          <w:rFonts w:ascii="Times New Roman" w:eastAsia="Times New Roman" w:hAnsi="Times New Roman" w:cs="Times New Roman"/>
-          <w:sz w:val="26"/>
-          <w:szCs w:val="26"/>
-          <w:lang w:val="vi-VN"/>
-        </w:rPr>
-      </w:pPr>
-      <w:r>
-        <w:rPr>
-          <w:rFonts w:ascii="Times New Roman" w:eastAsia="Times New Roman" w:hAnsi="Times New Roman" w:cs="Times New Roman"/>
-          <w:sz w:val="26"/>
-          <w:szCs w:val="26"/>
-          <w:highlight w:val="yellow"/>
-          <w:lang w:val="vi-VN"/>
-        </w:rPr>
-        <w:t>=&gt; update: tạo đơn thành công thì reset lại =&gt; từ chưa cần lắm</w:t>
-      </w:r>
-    </w:p>
-    <w:p>
-      <w:pPr>
-        <w:rPr>
-          <w:rFonts w:ascii="Times New Roman" w:eastAsia="Times New Roman" w:hAnsi="Times New Roman" w:cs="Times New Roman"/>
-          <w:b/>
-          <w:bCs/>
+          <w:lang w:val="vi-VN"/>
+        </w:rPr>
+      </w:pPr>
+      <w:r>
+        <w:rPr>
+          <w:rFonts w:ascii="Times New Roman" w:eastAsia="Times New Roman" w:hAnsi="Times New Roman" w:cs="Times New Roman"/>
+          <w:sz w:val="26"/>
+          <w:szCs w:val="26"/>
+          <w:lang w:val="vi-VN"/>
+        </w:rPr>
+        <w:t xml:space="preserve">=&gt; </w:t>
+      </w:r>
+      <w:r>
+        <w:rPr>
+          <w:rFonts w:ascii="Times New Roman" w:eastAsia="Times New Roman" w:hAnsi="Times New Roman" w:cs="Times New Roman"/>
+          <w:sz w:val="26"/>
+          <w:szCs w:val="26"/>
+          <w:lang w:val="vi-VN"/>
+        </w:rPr>
+        <w:t>Done</w:t>
+      </w:r>
+    </w:p>
+    <w:p>
+      <w:pPr>
+        <w:rPr>
+          <w:rFonts w:ascii="Times New Roman" w:eastAsia="Times New Roman" w:hAnsi="Times New Roman" w:cs="Times New Roman"/>
           <w:sz w:val="26"/>
           <w:szCs w:val="26"/>
           <w:lang w:val="vi-VN"/>
@@ -1537,6 +2269,45 @@
         </w:rPr>
         <w:t xml:space="preserve"> lý tin tức (CRUD)</w:t>
       </w:r>
+      <w:r>
+        <w:rPr>
+          <w:rFonts w:ascii="Times New Roman" w:eastAsia="Times New Roman" w:hAnsi="Times New Roman" w:cs="Times New Roman"/>
+          <w:b/>
+          <w:bCs/>
+          <w:sz w:val="26"/>
+          <w:szCs w:val="26"/>
+          <w:lang w:val="vi-VN"/>
+        </w:rPr>
+        <w:t xml:space="preserve">: </w:t>
+      </w:r>
+      <w:r>
+        <w:rPr>
+          <w:rFonts w:ascii="Times New Roman" w:eastAsia="Times New Roman" w:hAnsi="Times New Roman" w:cs="Times New Roman"/>
+          <w:sz w:val="26"/>
+          <w:szCs w:val="26"/>
+          <w:lang w:val="vi-VN"/>
+        </w:rPr>
+        <w:t>Xem, thêm, xóa, sửa bài viết cho khách hàng theo dõi.</w:t>
+      </w:r>
+    </w:p>
+    <w:p>
+      <w:pPr>
+        <w:rPr>
+          <w:rFonts w:ascii="Times New Roman" w:eastAsia="Times New Roman" w:hAnsi="Times New Roman" w:cs="Times New Roman"/>
+          <w:sz w:val="26"/>
+          <w:szCs w:val="26"/>
+          <w:lang w:val="vi-VN"/>
+        </w:rPr>
+      </w:pPr>
+      <w:r>
+        <w:rPr>
+          <w:rFonts w:ascii="Times New Roman" w:eastAsia="Times New Roman" w:hAnsi="Times New Roman" w:cs="Times New Roman"/>
+          <w:sz w:val="26"/>
+          <w:szCs w:val="26"/>
+          <w:lang w:val="vi-VN"/>
+        </w:rPr>
+        <w:t>=&gt; Done</w:t>
+      </w:r>
     </w:p>
     <w:p>
       <w:pPr>
@@ -1569,61 +2340,130 @@
           <w:szCs w:val="26"/>
           <w:lang w:val="vi-VN"/>
         </w:rPr>
-        <w:t>Xem lịch làm việc</w:t>
-      </w:r>
-    </w:p>
-    <w:p>
-      <w:pPr>
-        <w:rPr>
-          <w:rFonts w:ascii="Times New Roman" w:eastAsia="Times New Roman" w:hAnsi="Times New Roman" w:cs="Times New Roman"/>
-          <w:sz w:val="26"/>
-          <w:szCs w:val="26"/>
-          <w:lang w:val="vi-VN"/>
-        </w:rPr>
-      </w:pPr>
-      <w:r>
-        <w:rPr>
-          <w:rFonts w:ascii="Times New Roman" w:eastAsia="Times New Roman" w:hAnsi="Times New Roman" w:cs="Times New Roman"/>
-          <w:b/>
-          <w:bCs/>
-          <w:sz w:val="26"/>
-          <w:szCs w:val="26"/>
-          <w:lang w:val="vi-VN"/>
-        </w:rPr>
-        <w:t xml:space="preserve">- </w:t>
-      </w:r>
-      <w:r>
-        <w:rPr>
-          <w:rFonts w:ascii="Times New Roman" w:eastAsia="Times New Roman" w:hAnsi="Times New Roman" w:cs="Times New Roman"/>
-          <w:b/>
-          <w:bCs/>
-          <w:sz w:val="26"/>
-          <w:szCs w:val="26"/>
-          <w:lang w:val="vi-VN"/>
-        </w:rPr>
-        <w:t>Đăng ký lịch làm việc</w:t>
-      </w:r>
-      <w:r>
-        <w:rPr>
-          <w:rFonts w:ascii="Times New Roman" w:eastAsia="Times New Roman" w:hAnsi="Times New Roman" w:cs="Times New Roman"/>
-          <w:b/>
-          <w:bCs/>
-          <w:sz w:val="26"/>
-          <w:szCs w:val="26"/>
-          <w:lang w:val="vi-VN"/>
-        </w:rPr>
-        <w:t xml:space="preserve"> </w:t>
-      </w:r>
-      <w:r>
-        <w:rPr>
-          <w:rFonts w:ascii="Times New Roman" w:eastAsia="Times New Roman" w:hAnsi="Times New Roman" w:cs="Times New Roman"/>
-          <w:b/>
-          <w:bCs/>
-          <w:sz w:val="26"/>
-          <w:szCs w:val="26"/>
-          <w:lang w:val="vi-VN"/>
-        </w:rPr>
-        <w:t>()</w:t>
+        <w:t xml:space="preserve">Quản lý lịch làm việc cá </w:t>
+      </w:r>
+      <w:r>
+        <w:rPr>
+          <w:rFonts w:ascii="Times New Roman" w:eastAsia="Times New Roman" w:hAnsi="Times New Roman" w:cs="Times New Roman"/>
+          <w:b/>
+          <w:bCs/>
+          <w:sz w:val="26"/>
+          <w:szCs w:val="26"/>
+          <w:lang w:val="vi-VN"/>
+        </w:rPr>
+        <w:t>nhân:</w:t>
+      </w:r>
+    </w:p>
+    <w:p>
+      <w:pPr>
+        <w:rPr>
+          <w:rFonts w:ascii="Times New Roman" w:eastAsia="Times New Roman" w:hAnsi="Times New Roman" w:cs="Times New Roman"/>
+          <w:sz w:val="26"/>
+          <w:szCs w:val="26"/>
+          <w:lang w:val="vi-VN"/>
+        </w:rPr>
+      </w:pPr>
+      <w:r>
+        <w:rPr>
+          <w:rFonts w:ascii="Times New Roman" w:eastAsia="Times New Roman" w:hAnsi="Times New Roman" w:cs="Times New Roman"/>
+          <w:sz w:val="26"/>
+          <w:szCs w:val="26"/>
+          <w:lang w:val="vi-VN"/>
+        </w:rPr>
+        <w:t>+ Xem lịch làm cá nhân</w:t>
+      </w:r>
+    </w:p>
+    <w:p>
+      <w:pPr>
+        <w:rPr>
+          <w:rFonts w:ascii="Times New Roman" w:eastAsia="Times New Roman" w:hAnsi="Times New Roman" w:cs="Times New Roman"/>
+          <w:sz w:val="26"/>
+          <w:szCs w:val="26"/>
+          <w:lang w:val="vi-VN"/>
+        </w:rPr>
+      </w:pPr>
+      <w:r>
+        <w:rPr>
+          <w:rFonts w:ascii="Times New Roman" w:eastAsia="Times New Roman" w:hAnsi="Times New Roman" w:cs="Times New Roman"/>
+          <w:sz w:val="26"/>
+          <w:szCs w:val="26"/>
+          <w:lang w:val="vi-VN"/>
+        </w:rPr>
+        <w:t xml:space="preserve">+ </w:t>
+      </w:r>
+      <w:r>
+        <w:rPr>
+          <w:rFonts w:ascii="Times New Roman" w:eastAsia="Times New Roman" w:hAnsi="Times New Roman" w:cs="Times New Roman"/>
+          <w:sz w:val="26"/>
+          <w:szCs w:val="26"/>
+          <w:lang w:val="vi-VN"/>
+        </w:rPr>
+        <w:t>Gửi/Sửa/Xóa</w:t>
+      </w:r>
+      <w:r>
+        <w:rPr>
+          <w:rFonts w:ascii="Times New Roman" w:eastAsia="Times New Roman" w:hAnsi="Times New Roman" w:cs="Times New Roman"/>
+          <w:sz w:val="26"/>
+          <w:szCs w:val="26"/>
+          <w:lang w:val="vi-VN"/>
+        </w:rPr>
+        <w:t xml:space="preserve"> yêu cầu đăng ký ca làm</w:t>
+      </w:r>
+    </w:p>
+    <w:p>
+      <w:pPr>
+        <w:rPr>
+          <w:rFonts w:ascii="Times New Roman" w:eastAsia="Times New Roman" w:hAnsi="Times New Roman" w:cs="Times New Roman"/>
+          <w:sz w:val="26"/>
+          <w:szCs w:val="26"/>
+          <w:lang w:val="vi-VN"/>
+        </w:rPr>
+      </w:pPr>
+      <w:r>
+        <w:rPr>
+          <w:rFonts w:ascii="Times New Roman" w:eastAsia="Times New Roman" w:hAnsi="Times New Roman" w:cs="Times New Roman"/>
+          <w:sz w:val="26"/>
+          <w:szCs w:val="26"/>
+          <w:lang w:val="vi-VN"/>
+        </w:rPr>
+        <w:t xml:space="preserve">+ </w:t>
+      </w:r>
+      <w:r>
+        <w:rPr>
+          <w:rFonts w:ascii="Times New Roman" w:eastAsia="Times New Roman" w:hAnsi="Times New Roman" w:cs="Times New Roman"/>
+          <w:sz w:val="26"/>
+          <w:szCs w:val="26"/>
+          <w:lang w:val="vi-VN"/>
+        </w:rPr>
+        <w:t xml:space="preserve">Xem </w:t>
+      </w:r>
+      <w:r>
+        <w:rPr>
+          <w:rFonts w:ascii="Times New Roman" w:eastAsia="Times New Roman" w:hAnsi="Times New Roman" w:cs="Times New Roman"/>
+          <w:sz w:val="26"/>
+          <w:szCs w:val="26"/>
+          <w:lang w:val="vi-VN"/>
+        </w:rPr>
+        <w:t>lịch sử đăng ký ca làm</w:t>
+      </w:r>
+    </w:p>
+    <w:p>
+      <w:pPr>
+        <w:rPr>
+          <w:rFonts w:ascii="Times New Roman" w:eastAsia="Times New Roman" w:hAnsi="Times New Roman" w:cs="Times New Roman"/>
+          <w:sz w:val="26"/>
+          <w:szCs w:val="26"/>
+          <w:lang w:val="vi-VN"/>
+        </w:rPr>
+      </w:pPr>
+      <w:r>
+        <w:rPr>
+          <w:rFonts w:ascii="Times New Roman" w:eastAsia="Times New Roman" w:hAnsi="Times New Roman" w:cs="Times New Roman"/>
+          <w:sz w:val="26"/>
+          <w:szCs w:val="26"/>
+          <w:lang w:val="vi-VN"/>
+        </w:rPr>
+        <w:t>+ Check in/ check out tại cửa hàng</w:t>
       </w:r>
       <w:r>
         <w:rPr>
@@ -1633,25 +2473,16 @@
           <w:lang w:val="vi-VN"/>
         </w:rPr>
         <w:br/>
-        <w:t xml:space="preserve">=&gt; update: </w:t>
-      </w:r>
-      <w:r>
-        <w:rPr>
-          <w:rFonts w:ascii="Times New Roman" w:eastAsia="Times New Roman" w:hAnsi="Times New Roman" w:cs="Times New Roman"/>
-          <w:sz w:val="26"/>
-          <w:szCs w:val="26"/>
-          <w:lang w:val="vi-VN"/>
-        </w:rPr>
-        <w:t>tạm oke rồi</w:t>
-      </w:r>
-      <w:r>
-        <w:rPr>
-          <w:rFonts w:ascii="Times New Roman" w:eastAsia="Times New Roman" w:hAnsi="Times New Roman" w:cs="Times New Roman"/>
-          <w:sz w:val="26"/>
-          <w:szCs w:val="26"/>
-          <w:lang w:val="vi-VN"/>
-        </w:rPr>
-        <w:t xml:space="preserve"> </w:t>
+        <w:t xml:space="preserve">=&gt; </w:t>
+      </w:r>
+      <w:r>
+        <w:rPr>
+          <w:rFonts w:ascii="Times New Roman" w:eastAsia="Times New Roman" w:hAnsi="Times New Roman" w:cs="Times New Roman"/>
+          <w:sz w:val="26"/>
+          <w:szCs w:val="26"/>
+          <w:lang w:val="vi-VN"/>
+        </w:rPr>
+        <w:t>Done</w:t>
       </w:r>
     </w:p>
     <w:p>
@@ -1675,6 +2506,25 @@
           <w:lang w:val="vi-VN"/>
         </w:rPr>
         <w:t>- Nhắn tin và phản hồi khách hàng</w:t>
+      </w:r>
+    </w:p>
+    <w:p>
+      <w:pPr>
+        <w:rPr>
+          <w:rFonts w:ascii="Times New Roman" w:eastAsia="Times New Roman" w:hAnsi="Times New Roman" w:cs="Times New Roman"/>
+          <w:sz w:val="26"/>
+          <w:szCs w:val="26"/>
+          <w:lang w:val="vi-VN"/>
+        </w:rPr>
+      </w:pPr>
+      <w:r>
+        <w:rPr>
+          <w:rFonts w:ascii="Times New Roman" w:eastAsia="Times New Roman" w:hAnsi="Times New Roman" w:cs="Times New Roman"/>
+          <w:sz w:val="26"/>
+          <w:szCs w:val="26"/>
+          <w:lang w:val="vi-VN"/>
+        </w:rPr>
+        <w:t>=&gt; Done</w:t>
       </w:r>
     </w:p>
     <w:p>
@@ -1738,7 +2588,16 @@
           <w:szCs w:val="26"/>
           <w:lang w:val="vi-VN"/>
         </w:rPr>
-        <w:t xml:space="preserve"> + duyệt lịch làm việc nhân viên</w:t>
+        <w:t xml:space="preserve"> + duyệt lịch làm việc nhân </w:t>
+      </w:r>
+      <w:r>
+        <w:rPr>
+          <w:rFonts w:ascii="Times New Roman" w:eastAsia="Times New Roman" w:hAnsi="Times New Roman" w:cs="Times New Roman"/>
+          <w:sz w:val="26"/>
+          <w:szCs w:val="26"/>
+          <w:lang w:val="vi-VN"/>
+        </w:rPr>
+        <w:t>viên/ quản lý cá nhân</w:t>
       </w:r>
       <w:r>
         <w:rPr>
@@ -1761,29 +2620,87 @@
       <w:r>
         <w:rPr>
           <w:rFonts w:ascii="Times New Roman" w:eastAsia="Times New Roman" w:hAnsi="Times New Roman" w:cs="Times New Roman"/>
-          <w:sz w:val="26"/>
-          <w:szCs w:val="26"/>
-          <w:lang w:val="vi-VN"/>
-        </w:rPr>
-        <w:t xml:space="preserve">=&gt; update: </w:t>
-      </w:r>
-      <w:r>
-        <w:rPr>
-          <w:rFonts w:ascii="Times New Roman" w:eastAsia="Times New Roman" w:hAnsi="Times New Roman" w:cs="Times New Roman"/>
-          <w:sz w:val="26"/>
-          <w:szCs w:val="26"/>
-          <w:lang w:val="en-GB"/>
-        </w:rPr>
-        <w:t>tạm</w:t>
-      </w:r>
-      <w:r>
-        <w:rPr>
-          <w:rFonts w:ascii="Times New Roman" w:eastAsia="Times New Roman" w:hAnsi="Times New Roman" w:cs="Times New Roman"/>
-          <w:sz w:val="26"/>
-          <w:szCs w:val="26"/>
-          <w:lang w:val="vi-VN"/>
-        </w:rPr>
-        <w:t xml:space="preserve"> oke rồi</w:t>
+          <w:b/>
+          <w:bCs/>
+          <w:sz w:val="26"/>
+          <w:szCs w:val="26"/>
+          <w:lang w:val="vi-VN"/>
+        </w:rPr>
+        <w:t>- Xem lịch làm việc quản lý:</w:t>
+      </w:r>
+      <w:r>
+        <w:rPr>
+          <w:rFonts w:ascii="Times New Roman" w:eastAsia="Times New Roman" w:hAnsi="Times New Roman" w:cs="Times New Roman"/>
+          <w:sz w:val="26"/>
+          <w:szCs w:val="26"/>
+          <w:lang w:val="vi-VN"/>
+        </w:rPr>
+        <w:t xml:space="preserve"> Xem lịch làm việc cá nhân của quản lý.</w:t>
+      </w:r>
+    </w:p>
+    <w:p>
+      <w:pPr>
+        <w:rPr>
+          <w:rFonts w:ascii="Times New Roman" w:eastAsia="Times New Roman" w:hAnsi="Times New Roman" w:cs="Times New Roman"/>
+          <w:sz w:val="26"/>
+          <w:szCs w:val="26"/>
+          <w:lang w:val="vi-VN"/>
+        </w:rPr>
+      </w:pPr>
+      <w:r>
+        <w:rPr>
+          <w:rFonts w:ascii="Times New Roman" w:eastAsia="Times New Roman" w:hAnsi="Times New Roman" w:cs="Times New Roman"/>
+          <w:sz w:val="26"/>
+          <w:szCs w:val="26"/>
+          <w:lang w:val="vi-VN"/>
+        </w:rPr>
+        <w:t xml:space="preserve">=&gt; </w:t>
+      </w:r>
+      <w:r>
+        <w:rPr>
+          <w:rFonts w:ascii="Times New Roman" w:eastAsia="Times New Roman" w:hAnsi="Times New Roman" w:cs="Times New Roman"/>
+          <w:sz w:val="26"/>
+          <w:szCs w:val="26"/>
+          <w:lang w:val="vi-VN"/>
+        </w:rPr>
+        <w:t>Done</w:t>
+      </w:r>
+    </w:p>
+    <w:p>
+      <w:pPr>
+        <w:rPr>
+          <w:rFonts w:ascii="Times New Roman" w:eastAsia="Times New Roman" w:hAnsi="Times New Roman" w:cs="Times New Roman"/>
+          <w:sz w:val="26"/>
+          <w:szCs w:val="26"/>
+          <w:lang w:val="vi-VN"/>
+        </w:rPr>
+      </w:pPr>
+      <w:r>
+        <w:rPr>
+          <w:rFonts w:ascii="Times New Roman" w:eastAsia="Times New Roman" w:hAnsi="Times New Roman" w:cs="Times New Roman"/>
+          <w:sz w:val="26"/>
+          <w:szCs w:val="26"/>
+          <w:lang w:val="vi-VN"/>
+        </w:rPr>
+        <w:t xml:space="preserve">=&gt; =&gt; </w:t>
+      </w:r>
+      <w:r>
+        <w:rPr>
+          <w:rFonts w:ascii="Times New Roman" w:eastAsia="Times New Roman" w:hAnsi="Times New Roman" w:cs="Times New Roman"/>
+          <w:sz w:val="26"/>
+          <w:szCs w:val="26"/>
+          <w:lang w:val="vi-VN"/>
+        </w:rPr>
+        <w:t xml:space="preserve">2 cái này </w:t>
+      </w:r>
+      <w:r>
+        <w:rPr>
+          <w:rFonts w:ascii="Times New Roman" w:eastAsia="Times New Roman" w:hAnsi="Times New Roman" w:cs="Times New Roman"/>
+          <w:sz w:val="26"/>
+          <w:szCs w:val="26"/>
+          <w:lang w:val="vi-VN"/>
+        </w:rPr>
+        <w:t>gộp chung lại làm 1 cũng oke</w:t>
       </w:r>
     </w:p>
     <w:p>
@@ -1874,7 +2791,38 @@
           <w:sz w:val="26"/>
           <w:szCs w:val="26"/>
         </w:rPr>
-        <w:t>- Đối soát tiền mặt cuối ca</w:t>
+        <w:t xml:space="preserve">- Đối </w:t>
+      </w:r>
+      <w:r>
+        <w:rPr>
+          <w:rFonts w:ascii="Times New Roman" w:eastAsia="Times New Roman" w:hAnsi="Times New Roman" w:cs="Times New Roman"/>
+          <w:b/>
+          <w:bCs/>
+          <w:sz w:val="26"/>
+          <w:szCs w:val="26"/>
+        </w:rPr>
+        <w:t>soát</w:t>
+      </w:r>
+      <w:r>
+        <w:rPr>
+          <w:rFonts w:ascii="Times New Roman" w:eastAsia="Times New Roman" w:hAnsi="Times New Roman" w:cs="Times New Roman"/>
+          <w:b/>
+          <w:bCs/>
+          <w:sz w:val="26"/>
+          <w:szCs w:val="26"/>
+          <w:lang w:val="vi-VN"/>
+        </w:rPr>
+        <w:t>/duyệt</w:t>
+      </w:r>
+      <w:r>
+        <w:rPr>
+          <w:rFonts w:ascii="Times New Roman" w:eastAsia="Times New Roman" w:hAnsi="Times New Roman" w:cs="Times New Roman"/>
+          <w:b/>
+          <w:bCs/>
+          <w:sz w:val="26"/>
+          <w:szCs w:val="26"/>
+        </w:rPr>
+        <w:t xml:space="preserve"> tiền mặt cuối ca</w:t>
       </w:r>
       <w:r>
         <w:rPr>
@@ -1906,6 +2854,34 @@
       <w:r>
         <w:rPr>
           <w:rFonts w:ascii="Times New Roman" w:eastAsia="Times New Roman" w:hAnsi="Times New Roman" w:cs="Times New Roman"/>
+          <w:sz w:val="26"/>
+          <w:szCs w:val="26"/>
+          <w:lang w:val="vi-VN"/>
+        </w:rPr>
+        <w:t xml:space="preserve">=&gt; </w:t>
+      </w:r>
+      <w:r>
+        <w:rPr>
+          <w:rFonts w:ascii="Times New Roman" w:eastAsia="Times New Roman" w:hAnsi="Times New Roman" w:cs="Times New Roman"/>
+          <w:sz w:val="26"/>
+          <w:szCs w:val="26"/>
+          <w:lang w:val="vi-VN"/>
+        </w:rPr>
+        <w:t>Done</w:t>
+      </w:r>
+    </w:p>
+    <w:p>
+      <w:pPr>
+        <w:rPr>
+          <w:rFonts w:ascii="Times New Roman" w:eastAsia="Times New Roman" w:hAnsi="Times New Roman" w:cs="Times New Roman"/>
+          <w:sz w:val="26"/>
+          <w:szCs w:val="26"/>
+          <w:lang w:val="vi-VN"/>
+        </w:rPr>
+      </w:pPr>
+      <w:r>
+        <w:rPr>
+          <w:rFonts w:ascii="Times New Roman" w:eastAsia="Times New Roman" w:hAnsi="Times New Roman" w:cs="Times New Roman"/>
           <w:b/>
           <w:bCs/>
           <w:sz w:val="26"/>
@@ -1937,20 +2913,36 @@
           <w:rFonts w:ascii="Times New Roman" w:eastAsia="Times New Roman" w:hAnsi="Times New Roman" w:cs="Times New Roman"/>
           <w:sz w:val="26"/>
           <w:szCs w:val="26"/>
-          <w:highlight w:val="yellow"/>
-          <w:lang w:val="vi-VN"/>
-        </w:rPr>
-      </w:pPr>
-      <w:r>
-        <w:rPr>
-          <w:rFonts w:ascii="Times New Roman" w:eastAsia="Times New Roman" w:hAnsi="Times New Roman" w:cs="Times New Roman"/>
-          <w:b/>
-          <w:bCs/>
-          <w:sz w:val="26"/>
-          <w:szCs w:val="26"/>
-          <w:highlight w:val="yellow"/>
-        </w:rPr>
-        <w:lastRenderedPageBreak/>
+          <w:lang w:val="vi-VN"/>
+        </w:rPr>
+      </w:pPr>
+      <w:r>
+        <w:rPr>
+          <w:rFonts w:ascii="Times New Roman" w:eastAsia="Times New Roman" w:hAnsi="Times New Roman" w:cs="Times New Roman"/>
+          <w:sz w:val="26"/>
+          <w:szCs w:val="26"/>
+          <w:lang w:val="vi-VN"/>
+        </w:rPr>
+        <w:t>=&gt; Done</w:t>
+      </w:r>
+    </w:p>
+    <w:p>
+      <w:pPr>
+        <w:rPr>
+          <w:rFonts w:ascii="Times New Roman" w:eastAsia="Times New Roman" w:hAnsi="Times New Roman" w:cs="Times New Roman"/>
+          <w:sz w:val="26"/>
+          <w:szCs w:val="26"/>
+          <w:lang w:val="vi-VN"/>
+        </w:rPr>
+      </w:pPr>
+      <w:r>
+        <w:rPr>
+          <w:rFonts w:ascii="Times New Roman" w:eastAsia="Times New Roman" w:hAnsi="Times New Roman" w:cs="Times New Roman"/>
+          <w:b/>
+          <w:bCs/>
+          <w:sz w:val="26"/>
+          <w:szCs w:val="26"/>
+        </w:rPr>
         <w:t>- Chăm sóc khách hàng</w:t>
       </w:r>
       <w:r>
@@ -1958,7 +2950,6 @@
           <w:rFonts w:ascii="Times New Roman" w:eastAsia="Times New Roman" w:hAnsi="Times New Roman" w:cs="Times New Roman"/>
           <w:sz w:val="26"/>
           <w:szCs w:val="26"/>
-          <w:highlight w:val="yellow"/>
         </w:rPr>
         <w:t>: Xử lý và phản hồi khiếu nại, yêu cầu hỗ trợ từ khách hàng.</w:t>
       </w:r>
@@ -1977,7 +2968,6 @@
           <w:rFonts w:ascii="Times New Roman" w:eastAsia="Times New Roman" w:hAnsi="Times New Roman" w:cs="Times New Roman"/>
           <w:sz w:val="26"/>
           <w:szCs w:val="26"/>
-          <w:highlight w:val="yellow"/>
           <w:lang w:val="vi-VN"/>
         </w:rPr>
         <w:t xml:space="preserve">=&gt; </w:t>
@@ -1987,211 +2977,27 @@
           <w:rFonts w:ascii="Times New Roman" w:eastAsia="Times New Roman" w:hAnsi="Times New Roman" w:cs="Times New Roman"/>
           <w:sz w:val="26"/>
           <w:szCs w:val="26"/>
-          <w:highlight w:val="yellow"/>
-          <w:lang w:val="vi-VN"/>
-        </w:rPr>
-        <w:t xml:space="preserve">update: </w:t>
-      </w:r>
-      <w:r>
-        <w:rPr>
-          <w:rFonts w:ascii="Times New Roman" w:eastAsia="Times New Roman" w:hAnsi="Times New Roman" w:cs="Times New Roman"/>
-          <w:sz w:val="26"/>
-          <w:szCs w:val="26"/>
-          <w:highlight w:val="yellow"/>
-          <w:lang w:val="vi-VN"/>
-        </w:rPr>
-        <w:t>tạm</w:t>
-      </w:r>
-      <w:r>
-        <w:rPr>
-          <w:rFonts w:ascii="Times New Roman" w:eastAsia="Times New Roman" w:hAnsi="Times New Roman" w:cs="Times New Roman"/>
-          <w:sz w:val="26"/>
-          <w:szCs w:val="26"/>
-          <w:lang w:val="vi-VN"/>
-        </w:rPr>
-        <w:t xml:space="preserve"> </w:t>
-      </w:r>
-      <w:r>
-        <w:rPr>
-          <w:rFonts w:ascii="Times New Roman" w:eastAsia="Times New Roman" w:hAnsi="Times New Roman" w:cs="Times New Roman"/>
-          <w:sz w:val="26"/>
-          <w:szCs w:val="26"/>
-          <w:highlight w:val="yellow"/>
-          <w:lang w:val="vi-VN"/>
-        </w:rPr>
-        <w:t>vậy</w:t>
-      </w:r>
-      <w:r>
-        <w:rPr>
-          <w:rFonts w:ascii="Times New Roman" w:eastAsia="Times New Roman" w:hAnsi="Times New Roman" w:cs="Times New Roman"/>
-          <w:sz w:val="26"/>
-          <w:szCs w:val="26"/>
-          <w:lang w:val="vi-VN"/>
-        </w:rPr>
-        <w:t xml:space="preserve"> </w:t>
-      </w:r>
-      <w:r>
-        <w:rPr>
-          <w:rFonts w:ascii="Times New Roman" w:eastAsia="Times New Roman" w:hAnsi="Times New Roman" w:cs="Times New Roman"/>
-          <w:sz w:val="26"/>
-          <w:szCs w:val="26"/>
-          <w:highlight w:val="yellow"/>
-          <w:lang w:val="vi-VN"/>
-        </w:rPr>
-        <w:t>oke</w:t>
-      </w:r>
-      <w:r>
-        <w:rPr>
-          <w:rFonts w:ascii="Times New Roman" w:eastAsia="Times New Roman" w:hAnsi="Times New Roman" w:cs="Times New Roman"/>
-          <w:sz w:val="26"/>
-          <w:szCs w:val="26"/>
-          <w:lang w:val="vi-VN"/>
-        </w:rPr>
-        <w:t xml:space="preserve"> </w:t>
-      </w:r>
-      <w:r>
-        <w:rPr>
-          <w:rFonts w:ascii="Times New Roman" w:eastAsia="Times New Roman" w:hAnsi="Times New Roman" w:cs="Times New Roman"/>
-          <w:sz w:val="26"/>
-          <w:szCs w:val="26"/>
-          <w:highlight w:val="yellow"/>
-          <w:lang w:val="vi-VN"/>
-        </w:rPr>
-        <w:t>rồi</w:t>
-      </w:r>
-      <w:r>
-        <w:rPr>
-          <w:rFonts w:ascii="Times New Roman" w:eastAsia="Times New Roman" w:hAnsi="Times New Roman" w:cs="Times New Roman"/>
-          <w:sz w:val="26"/>
-          <w:szCs w:val="26"/>
-          <w:lang w:val="vi-VN"/>
-        </w:rPr>
-        <w:t xml:space="preserve"> </w:t>
-      </w:r>
-      <w:r>
-        <w:rPr>
-          <w:rFonts w:ascii="Times New Roman" w:eastAsia="Times New Roman" w:hAnsi="Times New Roman" w:cs="Times New Roman"/>
-          <w:sz w:val="26"/>
-          <w:szCs w:val="26"/>
-          <w:highlight w:val="yellow"/>
-          <w:lang w:val="vi-VN"/>
-        </w:rPr>
-        <w:t>hiển</w:t>
-      </w:r>
-      <w:r>
-        <w:rPr>
-          <w:rFonts w:ascii="Times New Roman" w:eastAsia="Times New Roman" w:hAnsi="Times New Roman" w:cs="Times New Roman"/>
-          <w:sz w:val="26"/>
-          <w:szCs w:val="26"/>
-          <w:lang w:val="vi-VN"/>
-        </w:rPr>
-        <w:t xml:space="preserve"> </w:t>
-      </w:r>
-      <w:r>
-        <w:rPr>
-          <w:rFonts w:ascii="Times New Roman" w:eastAsia="Times New Roman" w:hAnsi="Times New Roman" w:cs="Times New Roman"/>
-          <w:sz w:val="26"/>
-          <w:szCs w:val="26"/>
-          <w:highlight w:val="yellow"/>
-          <w:lang w:val="vi-VN"/>
-        </w:rPr>
-        <w:t>thị</w:t>
-      </w:r>
-      <w:r>
-        <w:rPr>
-          <w:rFonts w:ascii="Times New Roman" w:eastAsia="Times New Roman" w:hAnsi="Times New Roman" w:cs="Times New Roman"/>
-          <w:sz w:val="26"/>
-          <w:szCs w:val="26"/>
-          <w:lang w:val="vi-VN"/>
-        </w:rPr>
-        <w:t xml:space="preserve"> </w:t>
-      </w:r>
-      <w:r>
-        <w:rPr>
-          <w:rFonts w:ascii="Times New Roman" w:eastAsia="Times New Roman" w:hAnsi="Times New Roman" w:cs="Times New Roman"/>
-          <w:sz w:val="26"/>
-          <w:szCs w:val="26"/>
-          <w:highlight w:val="yellow"/>
-          <w:lang w:val="vi-VN"/>
-        </w:rPr>
-        <w:t>đang</w:t>
-      </w:r>
-      <w:r>
-        <w:rPr>
-          <w:rFonts w:ascii="Times New Roman" w:eastAsia="Times New Roman" w:hAnsi="Times New Roman" w:cs="Times New Roman"/>
-          <w:sz w:val="26"/>
-          <w:szCs w:val="26"/>
-          <w:lang w:val="vi-VN"/>
-        </w:rPr>
-        <w:t xml:space="preserve"> </w:t>
-      </w:r>
-      <w:r>
-        <w:rPr>
-          <w:rFonts w:ascii="Times New Roman" w:eastAsia="Times New Roman" w:hAnsi="Times New Roman" w:cs="Times New Roman"/>
-          <w:sz w:val="26"/>
-          <w:szCs w:val="26"/>
-          <w:highlight w:val="yellow"/>
-          <w:lang w:val="vi-VN"/>
-        </w:rPr>
-        <w:t>hơi</w:t>
-      </w:r>
-      <w:r>
-        <w:rPr>
-          <w:rFonts w:ascii="Times New Roman" w:eastAsia="Times New Roman" w:hAnsi="Times New Roman" w:cs="Times New Roman"/>
-          <w:sz w:val="26"/>
-          <w:szCs w:val="26"/>
-          <w:lang w:val="vi-VN"/>
-        </w:rPr>
-        <w:t xml:space="preserve"> </w:t>
-      </w:r>
-      <w:r>
-        <w:rPr>
-          <w:rFonts w:ascii="Times New Roman" w:eastAsia="Times New Roman" w:hAnsi="Times New Roman" w:cs="Times New Roman"/>
-          <w:sz w:val="26"/>
-          <w:szCs w:val="26"/>
-          <w:highlight w:val="yellow"/>
-          <w:lang w:val="vi-VN"/>
-        </w:rPr>
-        <w:t>xấu</w:t>
-      </w:r>
-      <w:r>
-        <w:rPr>
-          <w:rFonts w:ascii="Times New Roman" w:eastAsia="Times New Roman" w:hAnsi="Times New Roman" w:cs="Times New Roman"/>
-          <w:sz w:val="26"/>
-          <w:szCs w:val="26"/>
-          <w:lang w:val="vi-VN"/>
-        </w:rPr>
-        <w:t xml:space="preserve"> </w:t>
-      </w:r>
-      <w:r>
-        <w:rPr>
-          <w:rFonts w:ascii="Times New Roman" w:eastAsia="Times New Roman" w:hAnsi="Times New Roman" w:cs="Times New Roman"/>
-          <w:sz w:val="26"/>
-          <w:szCs w:val="26"/>
-          <w:highlight w:val="yellow"/>
-          <w:lang w:val="vi-VN"/>
-        </w:rPr>
-        <w:t>thôi</w:t>
-      </w:r>
-    </w:p>
-    <w:p>
-      <w:pPr>
-        <w:rPr>
-          <w:rFonts w:ascii="Times New Roman" w:eastAsia="Times New Roman" w:hAnsi="Times New Roman" w:cs="Times New Roman"/>
-          <w:sz w:val="26"/>
-          <w:szCs w:val="26"/>
-          <w:highlight w:val="yellow"/>
-          <w:lang w:val="vi-VN"/>
-        </w:rPr>
-      </w:pPr>
-      <w:r>
-        <w:rPr>
-          <w:rFonts w:ascii="Times New Roman" w:eastAsia="Times New Roman" w:hAnsi="Times New Roman" w:cs="Times New Roman"/>
-          <w:b/>
-          <w:bCs/>
-          <w:sz w:val="26"/>
-          <w:szCs w:val="26"/>
-          <w:highlight w:val="yellow"/>
+          <w:lang w:val="vi-VN"/>
+        </w:rPr>
+        <w:t>Done</w:t>
+      </w:r>
+    </w:p>
+    <w:p>
+      <w:pPr>
+        <w:rPr>
+          <w:rFonts w:ascii="Times New Roman" w:eastAsia="Times New Roman" w:hAnsi="Times New Roman" w:cs="Times New Roman"/>
+          <w:sz w:val="26"/>
+          <w:szCs w:val="26"/>
+          <w:lang w:val="vi-VN"/>
+        </w:rPr>
+      </w:pPr>
+      <w:r>
+        <w:rPr>
+          <w:rFonts w:ascii="Times New Roman" w:eastAsia="Times New Roman" w:hAnsi="Times New Roman" w:cs="Times New Roman"/>
+          <w:b/>
+          <w:bCs/>
+          <w:sz w:val="26"/>
+          <w:szCs w:val="26"/>
           <w:lang w:val="vi-VN"/>
         </w:rPr>
         <w:t>- Quản lý nhân viên:</w:t>
@@ -2201,7 +3007,6 @@
           <w:rFonts w:ascii="Times New Roman" w:eastAsia="Times New Roman" w:hAnsi="Times New Roman" w:cs="Times New Roman"/>
           <w:sz w:val="26"/>
           <w:szCs w:val="26"/>
-          <w:highlight w:val="yellow"/>
           <w:lang w:val="vi-VN"/>
         </w:rPr>
         <w:t xml:space="preserve"> xem thông tin nhân viên các kiểu,... </w:t>
@@ -2221,57 +3026,126 @@
           <w:rFonts w:ascii="Times New Roman" w:eastAsia="Times New Roman" w:hAnsi="Times New Roman" w:cs="Times New Roman"/>
           <w:sz w:val="26"/>
           <w:szCs w:val="26"/>
-          <w:highlight w:val="yellow"/>
-          <w:lang w:val="vi-VN"/>
-        </w:rPr>
-        <w:t xml:space="preserve">=&gt; update: </w:t>
-      </w:r>
-      <w:r>
-        <w:rPr>
-          <w:rFonts w:ascii="Times New Roman" w:eastAsia="Times New Roman" w:hAnsi="Times New Roman" w:cs="Times New Roman"/>
-          <w:sz w:val="26"/>
-          <w:szCs w:val="26"/>
-          <w:highlight w:val="yellow"/>
-          <w:lang w:val="vi-VN"/>
-        </w:rPr>
-        <w:t>sửa thông tin</w:t>
-      </w:r>
-      <w:r>
-        <w:rPr>
-          <w:rFonts w:ascii="Times New Roman" w:eastAsia="Times New Roman" w:hAnsi="Times New Roman" w:cs="Times New Roman"/>
-          <w:sz w:val="26"/>
-          <w:szCs w:val="26"/>
-          <w:highlight w:val="yellow"/>
-          <w:lang w:val="vi-VN"/>
-        </w:rPr>
-        <w:t xml:space="preserve"> thôi</w:t>
-      </w:r>
-      <w:r>
-        <w:rPr>
-          <w:rFonts w:ascii="Times New Roman" w:eastAsia="Times New Roman" w:hAnsi="Times New Roman" w:cs="Times New Roman"/>
-          <w:sz w:val="26"/>
-          <w:szCs w:val="26"/>
-          <w:highlight w:val="yellow"/>
-          <w:lang w:val="vi-VN"/>
-        </w:rPr>
-        <w:t xml:space="preserve"> =&gt; từ chưa cần làm</w:t>
-      </w:r>
-    </w:p>
-    <w:p>
-      <w:pPr>
-        <w:rPr>
-          <w:rFonts w:ascii="Times New Roman" w:eastAsia="Times New Roman" w:hAnsi="Times New Roman" w:cs="Times New Roman"/>
-          <w:b/>
-          <w:bCs/>
-          <w:color w:val="000000"/>
-          <w:sz w:val="26"/>
-          <w:szCs w:val="26"/>
+          <w:lang w:val="vi-VN"/>
+        </w:rPr>
+        <w:t xml:space="preserve">=&gt; </w:t>
+      </w:r>
+      <w:r>
+        <w:rPr>
+          <w:rFonts w:ascii="Times New Roman" w:eastAsia="Times New Roman" w:hAnsi="Times New Roman" w:cs="Times New Roman"/>
+          <w:sz w:val="26"/>
+          <w:szCs w:val="26"/>
+          <w:lang w:val="vi-VN"/>
+        </w:rPr>
+        <w:t>Done</w:t>
+      </w:r>
+    </w:p>
+    <w:p>
+      <w:pPr>
+        <w:rPr>
+          <w:rFonts w:ascii="Times New Roman" w:eastAsia="Times New Roman" w:hAnsi="Times New Roman" w:cs="Times New Roman"/>
+          <w:b/>
+          <w:bCs/>
+          <w:color w:val="000000"/>
+          <w:sz w:val="26"/>
+          <w:szCs w:val="26"/>
+          <w:lang w:val="vi-VN"/>
         </w:rPr>
       </w:pPr>
       <w:bookmarkStart w:id="4" w:name="_cbhkr01cmea3" w:colFirst="0" w:colLast="0"/>
       <w:bookmarkStart w:id="5" w:name="_25lg1ie43jwz" w:colFirst="0" w:colLast="0"/>
       <w:bookmarkEnd w:id="4"/>
       <w:bookmarkEnd w:id="5"/>
+    </w:p>
+    <w:p>
+      <w:pPr>
+        <w:rPr>
+          <w:rFonts w:ascii="Times New Roman" w:eastAsia="Times New Roman" w:hAnsi="Times New Roman" w:cs="Times New Roman"/>
+          <w:b/>
+          <w:bCs/>
+          <w:color w:val="000000"/>
+          <w:sz w:val="26"/>
+          <w:szCs w:val="26"/>
+          <w:lang w:val="vi-VN"/>
+        </w:rPr>
+      </w:pPr>
+    </w:p>
+    <w:p>
+      <w:pPr>
+        <w:rPr>
+          <w:rFonts w:ascii="Times New Roman" w:eastAsia="Times New Roman" w:hAnsi="Times New Roman" w:cs="Times New Roman"/>
+          <w:b/>
+          <w:bCs/>
+          <w:color w:val="000000"/>
+          <w:sz w:val="26"/>
+          <w:szCs w:val="26"/>
+          <w:lang w:val="vi-VN"/>
+        </w:rPr>
+      </w:pPr>
+    </w:p>
+    <w:p>
+      <w:pPr>
+        <w:rPr>
+          <w:rFonts w:ascii="Times New Roman" w:eastAsia="Times New Roman" w:hAnsi="Times New Roman" w:cs="Times New Roman"/>
+          <w:b/>
+          <w:bCs/>
+          <w:color w:val="000000"/>
+          <w:sz w:val="26"/>
+          <w:szCs w:val="26"/>
+          <w:lang w:val="vi-VN"/>
+        </w:rPr>
+      </w:pPr>
+    </w:p>
+    <w:p>
+      <w:pPr>
+        <w:rPr>
+          <w:rFonts w:ascii="Times New Roman" w:eastAsia="Times New Roman" w:hAnsi="Times New Roman" w:cs="Times New Roman"/>
+          <w:b/>
+          <w:bCs/>
+          <w:color w:val="000000"/>
+          <w:sz w:val="26"/>
+          <w:szCs w:val="26"/>
+          <w:lang w:val="vi-VN"/>
+        </w:rPr>
+      </w:pPr>
+    </w:p>
+    <w:p>
+      <w:pPr>
+        <w:rPr>
+          <w:rFonts w:ascii="Times New Roman" w:eastAsia="Times New Roman" w:hAnsi="Times New Roman" w:cs="Times New Roman"/>
+          <w:b/>
+          <w:bCs/>
+          <w:color w:val="000000"/>
+          <w:sz w:val="26"/>
+          <w:szCs w:val="26"/>
+          <w:lang w:val="vi-VN"/>
+        </w:rPr>
+      </w:pPr>
+    </w:p>
+    <w:p>
+      <w:pPr>
+        <w:rPr>
+          <w:rFonts w:ascii="Times New Roman" w:eastAsia="Times New Roman" w:hAnsi="Times New Roman" w:cs="Times New Roman"/>
+          <w:b/>
+          <w:bCs/>
+          <w:color w:val="000000"/>
+          <w:sz w:val="26"/>
+          <w:szCs w:val="26"/>
+          <w:lang w:val="vi-VN"/>
+        </w:rPr>
+      </w:pPr>
+    </w:p>
+    <w:p>
+      <w:pPr>
+        <w:rPr>
+          <w:rFonts w:ascii="Times New Roman" w:eastAsia="Times New Roman" w:hAnsi="Times New Roman" w:cs="Times New Roman"/>
+          <w:b/>
+          <w:bCs/>
+          <w:color w:val="000000"/>
+          <w:sz w:val="26"/>
+          <w:szCs w:val="26"/>
+        </w:rPr>
+      </w:pPr>
       <w:r>
         <w:rPr>
           <w:rFonts w:ascii="Times New Roman" w:eastAsia="Times New Roman" w:hAnsi="Times New Roman" w:cs="Times New Roman"/>
@@ -2300,8 +3174,94 @@
           <w:bCs/>
           <w:sz w:val="26"/>
           <w:szCs w:val="26"/>
-        </w:rPr>
-        <w:t>- Quản lý người dùng và phân quyền (CRUD)</w:t>
+          <w:lang w:val="vi-VN"/>
+        </w:rPr>
+        <w:t xml:space="preserve">- Quản lý khách hàng (CRUD): </w:t>
+      </w:r>
+      <w:r>
+        <w:rPr>
+          <w:rFonts w:ascii="Times New Roman" w:eastAsia="Times New Roman" w:hAnsi="Times New Roman" w:cs="Times New Roman"/>
+          <w:sz w:val="26"/>
+          <w:szCs w:val="26"/>
+        </w:rPr>
+        <w:t xml:space="preserve">Tạo, sửa, xóa tài khoản người dùng và gán quyền truy </w:t>
+      </w:r>
+      <w:r>
+        <w:rPr>
+          <w:rFonts w:ascii="Times New Roman" w:eastAsia="Times New Roman" w:hAnsi="Times New Roman" w:cs="Times New Roman"/>
+          <w:sz w:val="26"/>
+          <w:szCs w:val="26"/>
+        </w:rPr>
+        <w:t>cập</w:t>
+      </w:r>
+      <w:r>
+        <w:rPr>
+          <w:rFonts w:ascii="Times New Roman" w:eastAsia="Times New Roman" w:hAnsi="Times New Roman" w:cs="Times New Roman"/>
+          <w:sz w:val="26"/>
+          <w:szCs w:val="26"/>
+          <w:lang w:val="vi-VN"/>
+        </w:rPr>
+        <w:t xml:space="preserve"> của khách hàng.</w:t>
+      </w:r>
+    </w:p>
+    <w:p>
+      <w:pPr>
+        <w:rPr>
+          <w:rFonts w:ascii="Times New Roman" w:eastAsia="Times New Roman" w:hAnsi="Times New Roman" w:cs="Times New Roman"/>
+          <w:sz w:val="26"/>
+          <w:szCs w:val="26"/>
+          <w:lang w:val="vi-VN"/>
+        </w:rPr>
+      </w:pPr>
+      <w:r>
+        <w:rPr>
+          <w:rFonts w:ascii="Times New Roman" w:eastAsia="Times New Roman" w:hAnsi="Times New Roman" w:cs="Times New Roman"/>
+          <w:sz w:val="26"/>
+          <w:szCs w:val="26"/>
+          <w:lang w:val="vi-VN"/>
+        </w:rPr>
+        <w:t>=&gt; Done</w:t>
+      </w:r>
+    </w:p>
+    <w:p>
+      <w:pPr>
+        <w:rPr>
+          <w:rFonts w:ascii="Times New Roman" w:eastAsia="Times New Roman" w:hAnsi="Times New Roman" w:cs="Times New Roman"/>
+          <w:sz w:val="26"/>
+          <w:szCs w:val="26"/>
+          <w:lang w:val="vi-VN"/>
+        </w:rPr>
+      </w:pPr>
+      <w:r>
+        <w:rPr>
+          <w:rFonts w:ascii="Times New Roman" w:eastAsia="Times New Roman" w:hAnsi="Times New Roman" w:cs="Times New Roman"/>
+          <w:b/>
+          <w:bCs/>
+          <w:sz w:val="26"/>
+          <w:szCs w:val="26"/>
+        </w:rPr>
+        <w:t>- Quản lý người dùng</w:t>
+      </w:r>
+      <w:r>
+        <w:rPr>
+          <w:rFonts w:ascii="Times New Roman" w:eastAsia="Times New Roman" w:hAnsi="Times New Roman" w:cs="Times New Roman"/>
+          <w:b/>
+          <w:bCs/>
+          <w:sz w:val="26"/>
+          <w:szCs w:val="26"/>
+          <w:lang w:val="vi-VN"/>
+        </w:rPr>
+        <w:t xml:space="preserve"> (nhân viên)</w:t>
+      </w:r>
+      <w:r>
+        <w:rPr>
+          <w:rFonts w:ascii="Times New Roman" w:eastAsia="Times New Roman" w:hAnsi="Times New Roman" w:cs="Times New Roman"/>
+          <w:b/>
+          <w:bCs/>
+          <w:sz w:val="26"/>
+          <w:szCs w:val="26"/>
+        </w:rPr>
+        <w:t xml:space="preserve"> và phân quyền (CRUD)</w:t>
       </w:r>
       <w:r>
         <w:rPr>
@@ -2324,6 +3284,25 @@
       <w:r>
         <w:rPr>
           <w:rFonts w:ascii="Times New Roman" w:eastAsia="Times New Roman" w:hAnsi="Times New Roman" w:cs="Times New Roman"/>
+          <w:sz w:val="26"/>
+          <w:szCs w:val="26"/>
+          <w:lang w:val="vi-VN"/>
+        </w:rPr>
+        <w:t>=&gt; Done</w:t>
+      </w:r>
+    </w:p>
+    <w:p>
+      <w:pPr>
+        <w:rPr>
+          <w:rFonts w:ascii="Times New Roman" w:eastAsia="Times New Roman" w:hAnsi="Times New Roman" w:cs="Times New Roman"/>
+          <w:sz w:val="26"/>
+          <w:szCs w:val="26"/>
+          <w:lang w:val="vi-VN"/>
+        </w:rPr>
+      </w:pPr>
+      <w:r>
+        <w:rPr>
+          <w:rFonts w:ascii="Times New Roman" w:eastAsia="Times New Roman" w:hAnsi="Times New Roman" w:cs="Times New Roman"/>
           <w:b/>
           <w:bCs/>
           <w:sz w:val="26"/>
@@ -2352,11 +3331,38 @@
       <w:r>
         <w:rPr>
           <w:rFonts w:ascii="Times New Roman" w:eastAsia="Times New Roman" w:hAnsi="Times New Roman" w:cs="Times New Roman"/>
-          <w:b/>
-          <w:bCs/>
-          <w:sz w:val="26"/>
-          <w:szCs w:val="26"/>
-          <w:highlight w:val="yellow"/>
+          <w:sz w:val="26"/>
+          <w:szCs w:val="26"/>
+          <w:lang w:val="vi-VN"/>
+        </w:rPr>
+        <w:t xml:space="preserve">=&gt; </w:t>
+      </w:r>
+      <w:r>
+        <w:rPr>
+          <w:rFonts w:ascii="Times New Roman" w:eastAsia="Times New Roman" w:hAnsi="Times New Roman" w:cs="Times New Roman"/>
+          <w:sz w:val="26"/>
+          <w:szCs w:val="26"/>
+          <w:lang w:val="vi-VN"/>
+        </w:rPr>
+        <w:t>Dpne</w:t>
+      </w:r>
+    </w:p>
+    <w:p>
+      <w:pPr>
+        <w:rPr>
+          <w:rFonts w:ascii="Times New Roman" w:eastAsia="Times New Roman" w:hAnsi="Times New Roman" w:cs="Times New Roman"/>
+          <w:sz w:val="26"/>
+          <w:szCs w:val="26"/>
+          <w:lang w:val="vi-VN"/>
+        </w:rPr>
+      </w:pPr>
+      <w:r>
+        <w:rPr>
+          <w:rFonts w:ascii="Times New Roman" w:eastAsia="Times New Roman" w:hAnsi="Times New Roman" w:cs="Times New Roman"/>
+          <w:b/>
+          <w:bCs/>
+          <w:sz w:val="26"/>
+          <w:szCs w:val="26"/>
           <w:lang w:val="vi-VN"/>
         </w:rPr>
         <w:t>- Quản lý danh mục (CRUD):</w:t>
@@ -2366,28 +3372,66 @@
           <w:rFonts w:ascii="Times New Roman" w:eastAsia="Times New Roman" w:hAnsi="Times New Roman" w:cs="Times New Roman"/>
           <w:sz w:val="26"/>
           <w:szCs w:val="26"/>
-          <w:highlight w:val="yellow"/>
-          <w:lang w:val="vi-VN"/>
-        </w:rPr>
-        <w:t xml:space="preserve"> Thêm, sửa, xóa danh mục trên toàn chuối.</w:t>
-      </w:r>
-    </w:p>
-    <w:p>
-      <w:pPr>
-        <w:rPr>
-          <w:rFonts w:ascii="Times New Roman" w:eastAsia="Times New Roman" w:hAnsi="Times New Roman" w:cs="Times New Roman"/>
-          <w:sz w:val="26"/>
-          <w:szCs w:val="26"/>
-          <w:lang w:val="vi-VN"/>
-        </w:rPr>
-      </w:pPr>
-      <w:r>
-        <w:rPr>
-          <w:rFonts w:ascii="Times New Roman" w:eastAsia="Times New Roman" w:hAnsi="Times New Roman" w:cs="Times New Roman"/>
-          <w:b/>
-          <w:bCs/>
-          <w:sz w:val="26"/>
-          <w:szCs w:val="26"/>
+          <w:lang w:val="vi-VN"/>
+        </w:rPr>
+        <w:t xml:space="preserve"> Thêm, sửa, xóa danh mục trên toàn </w:t>
+      </w:r>
+      <w:r>
+        <w:rPr>
+          <w:rFonts w:ascii="Times New Roman" w:eastAsia="Times New Roman" w:hAnsi="Times New Roman" w:cs="Times New Roman"/>
+          <w:sz w:val="26"/>
+          <w:szCs w:val="26"/>
+          <w:lang w:val="vi-VN"/>
+        </w:rPr>
+        <w:t>chuỗi</w:t>
+      </w:r>
+      <w:r>
+        <w:rPr>
+          <w:rFonts w:ascii="Times New Roman" w:eastAsia="Times New Roman" w:hAnsi="Times New Roman" w:cs="Times New Roman"/>
+          <w:sz w:val="26"/>
+          <w:szCs w:val="26"/>
+          <w:lang w:val="vi-VN"/>
+        </w:rPr>
+        <w:t>.</w:t>
+      </w:r>
+    </w:p>
+    <w:p>
+      <w:pPr>
+        <w:rPr>
+          <w:rFonts w:ascii="Times New Roman" w:eastAsia="Times New Roman" w:hAnsi="Times New Roman" w:cs="Times New Roman"/>
+          <w:sz w:val="26"/>
+          <w:szCs w:val="26"/>
+          <w:lang w:val="vi-VN"/>
+        </w:rPr>
+      </w:pPr>
+      <w:r>
+        <w:rPr>
+          <w:rFonts w:ascii="Times New Roman" w:eastAsia="Times New Roman" w:hAnsi="Times New Roman" w:cs="Times New Roman"/>
+          <w:sz w:val="26"/>
+          <w:szCs w:val="26"/>
+          <w:lang w:val="vi-VN"/>
+        </w:rPr>
+        <w:t>=&gt; Done</w:t>
+      </w:r>
+    </w:p>
+    <w:p>
+      <w:pPr>
+        <w:rPr>
+          <w:rFonts w:ascii="Times New Roman" w:eastAsia="Times New Roman" w:hAnsi="Times New Roman" w:cs="Times New Roman"/>
+          <w:sz w:val="26"/>
+          <w:szCs w:val="26"/>
+          <w:highlight w:val="yellow"/>
+          <w:lang w:val="vi-VN"/>
+        </w:rPr>
+      </w:pPr>
+      <w:r>
+        <w:rPr>
+          <w:rFonts w:ascii="Times New Roman" w:eastAsia="Times New Roman" w:hAnsi="Times New Roman" w:cs="Times New Roman"/>
+          <w:b/>
+          <w:bCs/>
+          <w:sz w:val="26"/>
+          <w:szCs w:val="26"/>
+          <w:highlight w:val="yellow"/>
         </w:rPr>
         <w:t>- Quản lý chi nhánh cửa hàng</w:t>
       </w:r>
@@ -2398,6 +3442,7 @@
           <w:bCs/>
           <w:sz w:val="26"/>
           <w:szCs w:val="26"/>
+          <w:highlight w:val="yellow"/>
           <w:lang w:val="vi-VN"/>
         </w:rPr>
         <w:t xml:space="preserve"> </w:t>
@@ -2409,6 +3454,7 @@
           <w:bCs/>
           <w:sz w:val="26"/>
           <w:szCs w:val="26"/>
+          <w:highlight w:val="yellow"/>
         </w:rPr>
         <w:t>(CRUD)</w:t>
       </w:r>
@@ -2417,6 +3463,7 @@
           <w:rFonts w:ascii="Times New Roman" w:eastAsia="Times New Roman" w:hAnsi="Times New Roman" w:cs="Times New Roman"/>
           <w:sz w:val="26"/>
           <w:szCs w:val="26"/>
+          <w:highlight w:val="yellow"/>
         </w:rPr>
         <w:t xml:space="preserve">: Tạo, chỉnh sửa, xóa thông tin chi </w:t>
       </w:r>
@@ -2425,6 +3472,7 @@
           <w:rFonts w:ascii="Times New Roman" w:eastAsia="Times New Roman" w:hAnsi="Times New Roman" w:cs="Times New Roman"/>
           <w:sz w:val="26"/>
           <w:szCs w:val="26"/>
+          <w:highlight w:val="yellow"/>
         </w:rPr>
         <w:t>nhánh</w:t>
       </w:r>
@@ -2433,6 +3481,7 @@
           <w:rFonts w:ascii="Times New Roman" w:eastAsia="Times New Roman" w:hAnsi="Times New Roman" w:cs="Times New Roman"/>
           <w:sz w:val="26"/>
           <w:szCs w:val="26"/>
+          <w:highlight w:val="yellow"/>
           <w:lang w:val="vi-VN"/>
         </w:rPr>
         <w:t>.</w:t>
@@ -2444,18 +3493,46 @@
           <w:rFonts w:ascii="Times New Roman" w:eastAsia="Times New Roman" w:hAnsi="Times New Roman" w:cs="Times New Roman"/>
           <w:sz w:val="26"/>
           <w:szCs w:val="26"/>
-          <w:highlight w:val="yellow"/>
-          <w:lang w:val="vi-VN"/>
-        </w:rPr>
-      </w:pPr>
-      <w:r>
-        <w:rPr>
-          <w:rFonts w:ascii="Times New Roman" w:eastAsia="Times New Roman" w:hAnsi="Times New Roman" w:cs="Times New Roman"/>
-          <w:b/>
-          <w:bCs/>
-          <w:sz w:val="26"/>
-          <w:szCs w:val="26"/>
-          <w:highlight w:val="yellow"/>
+          <w:lang w:val="vi-VN"/>
+        </w:rPr>
+      </w:pPr>
+      <w:r>
+        <w:rPr>
+          <w:rFonts w:ascii="Times New Roman" w:eastAsia="Times New Roman" w:hAnsi="Times New Roman" w:cs="Times New Roman"/>
+          <w:sz w:val="26"/>
+          <w:szCs w:val="26"/>
+          <w:highlight w:val="yellow"/>
+          <w:lang w:val="vi-VN"/>
+        </w:rPr>
+        <w:t xml:space="preserve">=&gt; </w:t>
+      </w:r>
+      <w:r>
+        <w:rPr>
+          <w:rFonts w:ascii="Times New Roman" w:eastAsia="Times New Roman" w:hAnsi="Times New Roman" w:cs="Times New Roman"/>
+          <w:sz w:val="26"/>
+          <w:szCs w:val="26"/>
+          <w:highlight w:val="yellow"/>
+          <w:lang w:val="vi-VN"/>
+        </w:rPr>
+        <w:t>Done – tí dậy test sau</w:t>
+      </w:r>
+    </w:p>
+    <w:p>
+      <w:pPr>
+        <w:rPr>
+          <w:rFonts w:ascii="Times New Roman" w:eastAsia="Times New Roman" w:hAnsi="Times New Roman" w:cs="Times New Roman"/>
+          <w:sz w:val="26"/>
+          <w:szCs w:val="26"/>
+          <w:lang w:val="vi-VN"/>
+        </w:rPr>
+      </w:pPr>
+      <w:r>
+        <w:rPr>
+          <w:rFonts w:ascii="Times New Roman" w:eastAsia="Times New Roman" w:hAnsi="Times New Roman" w:cs="Times New Roman"/>
+          <w:b/>
+          <w:bCs/>
+          <w:sz w:val="26"/>
+          <w:szCs w:val="26"/>
         </w:rPr>
         <w:t>- Quản lý chương trình khuyến mãi</w:t>
       </w:r>
@@ -2464,7 +3541,6 @@
           <w:rFonts w:ascii="Times New Roman" w:eastAsia="Times New Roman" w:hAnsi="Times New Roman" w:cs="Times New Roman"/>
           <w:sz w:val="26"/>
           <w:szCs w:val="26"/>
-          <w:highlight w:val="yellow"/>
         </w:rPr>
         <w:t>: Thiết lập, chỉnh sửa và kích hoạt các chương trình giảm giá/voucher.</w:t>
       </w:r>
@@ -2473,7 +3549,6 @@
           <w:rFonts w:ascii="Times New Roman" w:eastAsia="Times New Roman" w:hAnsi="Times New Roman" w:cs="Times New Roman"/>
           <w:sz w:val="26"/>
           <w:szCs w:val="26"/>
-          <w:highlight w:val="yellow"/>
           <w:lang w:val="vi-VN"/>
         </w:rPr>
         <w:t xml:space="preserve"> </w:t>
@@ -2493,10 +3568,18 @@
           <w:rFonts w:ascii="Times New Roman" w:eastAsia="Times New Roman" w:hAnsi="Times New Roman" w:cs="Times New Roman"/>
           <w:sz w:val="26"/>
           <w:szCs w:val="26"/>
-          <w:highlight w:val="yellow"/>
-          <w:lang w:val="vi-VN"/>
-        </w:rPr>
-        <w:t>=&gt; update: hình bên customer</w:t>
+          <w:lang w:val="vi-VN"/>
+        </w:rPr>
+        <w:t xml:space="preserve">=&gt; </w:t>
+      </w:r>
+      <w:r>
+        <w:rPr>
+          <w:rFonts w:ascii="Times New Roman" w:eastAsia="Times New Roman" w:hAnsi="Times New Roman" w:cs="Times New Roman"/>
+          <w:sz w:val="26"/>
+          <w:szCs w:val="26"/>
+          <w:lang w:val="vi-VN"/>
+        </w:rPr>
+        <w:t>Done</w:t>
       </w:r>
     </w:p>
     <w:p>
@@ -2540,31 +3623,139 @@
       <w:pPr>
         <w:rPr>
           <w:rFonts w:ascii="Times New Roman" w:eastAsia="Times New Roman" w:hAnsi="Times New Roman" w:cs="Times New Roman"/>
-          <w:b/>
-          <w:bCs/>
-          <w:sz w:val="26"/>
-          <w:szCs w:val="26"/>
-          <w:lang w:val="vi-VN"/>
-        </w:rPr>
-      </w:pPr>
-      <w:r>
-        <w:rPr>
-          <w:rFonts w:ascii="Times New Roman" w:eastAsia="Times New Roman" w:hAnsi="Times New Roman" w:cs="Times New Roman"/>
-          <w:b/>
-          <w:bCs/>
-          <w:sz w:val="26"/>
-          <w:szCs w:val="26"/>
-          <w:lang w:val="vi-VN"/>
-        </w:rPr>
-        <w:t>- Xem dự báo nhu cầu anlystic</w:t>
-      </w:r>
-      <w:r>
-        <w:rPr>
-          <w:rFonts w:ascii="Times New Roman" w:eastAsia="Times New Roman" w:hAnsi="Times New Roman" w:cs="Times New Roman"/>
-          <w:b/>
-          <w:bCs/>
-          <w:sz w:val="26"/>
-          <w:szCs w:val="26"/>
+          <w:sz w:val="26"/>
+          <w:szCs w:val="26"/>
+          <w:lang w:val="vi-VN"/>
+        </w:rPr>
+      </w:pPr>
+      <w:r>
+        <w:rPr>
+          <w:rFonts w:ascii="Times New Roman" w:eastAsia="Times New Roman" w:hAnsi="Times New Roman" w:cs="Times New Roman"/>
+          <w:sz w:val="26"/>
+          <w:szCs w:val="26"/>
+          <w:lang w:val="vi-VN"/>
+        </w:rPr>
+        <w:t>=&gt; Done</w:t>
+      </w:r>
+    </w:p>
+    <w:p>
+      <w:pPr>
+        <w:rPr>
+          <w:rFonts w:ascii="Times New Roman" w:eastAsia="Times New Roman" w:hAnsi="Times New Roman" w:cs="Times New Roman"/>
+          <w:sz w:val="26"/>
+          <w:szCs w:val="26"/>
+          <w:lang w:val="vi-VN"/>
+        </w:rPr>
+      </w:pPr>
+      <w:r>
+        <w:rPr>
+          <w:rFonts w:ascii="Times New Roman" w:eastAsia="Times New Roman" w:hAnsi="Times New Roman" w:cs="Times New Roman"/>
+          <w:b/>
+          <w:bCs/>
+          <w:sz w:val="26"/>
+          <w:szCs w:val="26"/>
+          <w:lang w:val="vi-VN"/>
+        </w:rPr>
+        <w:t xml:space="preserve">- </w:t>
+      </w:r>
+      <w:r>
+        <w:rPr>
+          <w:rFonts w:ascii="Times New Roman" w:eastAsia="Times New Roman" w:hAnsi="Times New Roman" w:cs="Times New Roman"/>
+          <w:b/>
+          <w:bCs/>
+          <w:sz w:val="26"/>
+          <w:szCs w:val="26"/>
+          <w:lang w:val="vi-VN"/>
+        </w:rPr>
+        <w:t xml:space="preserve">Phân tích mua </w:t>
+      </w:r>
+      <w:r>
+        <w:rPr>
+          <w:rFonts w:ascii="Times New Roman" w:eastAsia="Times New Roman" w:hAnsi="Times New Roman" w:cs="Times New Roman"/>
+          <w:b/>
+          <w:bCs/>
+          <w:sz w:val="26"/>
+          <w:szCs w:val="26"/>
+          <w:lang w:val="vi-VN"/>
+        </w:rPr>
+        <w:t xml:space="preserve">sắm: </w:t>
+      </w:r>
+      <w:r>
+        <w:rPr>
+          <w:rFonts w:ascii="Times New Roman" w:eastAsia="Times New Roman" w:hAnsi="Times New Roman" w:cs="Times New Roman"/>
+          <w:sz w:val="26"/>
+          <w:szCs w:val="26"/>
+          <w:lang w:val="vi-VN"/>
+        </w:rPr>
+        <w:t>Phân tích hành vi mua sắm khách hàng gợi ý sp.</w:t>
+      </w:r>
+    </w:p>
+    <w:p>
+      <w:pPr>
+        <w:rPr>
+          <w:rFonts w:ascii="Times New Roman" w:eastAsia="Times New Roman" w:hAnsi="Times New Roman" w:cs="Times New Roman"/>
+          <w:sz w:val="26"/>
+          <w:szCs w:val="26"/>
+          <w:lang w:val="vi-VN"/>
+        </w:rPr>
+      </w:pPr>
+      <w:r>
+        <w:rPr>
+          <w:rFonts w:ascii="Times New Roman" w:eastAsia="Times New Roman" w:hAnsi="Times New Roman" w:cs="Times New Roman"/>
+          <w:b/>
+          <w:bCs/>
+          <w:sz w:val="26"/>
+          <w:szCs w:val="26"/>
+          <w:lang w:val="vi-VN"/>
+        </w:rPr>
+        <w:t xml:space="preserve">=&gt; </w:t>
+      </w:r>
+      <w:r>
+        <w:rPr>
+          <w:rFonts w:ascii="Times New Roman" w:eastAsia="Times New Roman" w:hAnsi="Times New Roman" w:cs="Times New Roman"/>
+          <w:sz w:val="26"/>
+          <w:szCs w:val="26"/>
+          <w:lang w:val="vi-VN"/>
+        </w:rPr>
+        <w:t>Done</w:t>
+      </w:r>
+    </w:p>
+    <w:p>
+      <w:pPr>
+        <w:rPr>
+          <w:rFonts w:ascii="Times New Roman" w:eastAsia="Times New Roman" w:hAnsi="Times New Roman" w:cs="Times New Roman"/>
+          <w:sz w:val="26"/>
+          <w:szCs w:val="26"/>
+          <w:highlight w:val="yellow"/>
+          <w:lang w:val="vi-VN"/>
+        </w:rPr>
+      </w:pPr>
+      <w:r>
+        <w:rPr>
+          <w:rFonts w:ascii="Times New Roman" w:eastAsia="Times New Roman" w:hAnsi="Times New Roman" w:cs="Times New Roman"/>
+          <w:b/>
+          <w:bCs/>
+          <w:sz w:val="26"/>
+          <w:szCs w:val="26"/>
+          <w:highlight w:val="yellow"/>
+        </w:rPr>
+        <w:t>- Cấu hình và giám sát hệ thống</w:t>
+      </w:r>
+      <w:r>
+        <w:rPr>
+          <w:rFonts w:ascii="Times New Roman" w:eastAsia="Times New Roman" w:hAnsi="Times New Roman" w:cs="Times New Roman"/>
+          <w:sz w:val="26"/>
+          <w:szCs w:val="26"/>
+          <w:highlight w:val="yellow"/>
+        </w:rPr>
+        <w:t>: Thiết lập thông số hệ thống, theo dõi log và hiệu suất server.</w:t>
+      </w:r>
+      <w:r>
+        <w:rPr>
+          <w:rFonts w:ascii="Times New Roman" w:eastAsia="Times New Roman" w:hAnsi="Times New Roman" w:cs="Times New Roman"/>
+          <w:sz w:val="26"/>
+          <w:szCs w:val="26"/>
+          <w:highlight w:val="yellow"/>
           <w:lang w:val="vi-VN"/>
         </w:rPr>
         <w:t xml:space="preserve"> </w:t>
@@ -2576,33 +3767,657 @@
           <w:rFonts w:ascii="Times New Roman" w:eastAsia="Times New Roman" w:hAnsi="Times New Roman" w:cs="Times New Roman"/>
           <w:sz w:val="26"/>
           <w:szCs w:val="26"/>
-          <w:highlight w:val="yellow"/>
-          <w:lang w:val="vi-VN"/>
-        </w:rPr>
-      </w:pPr>
-      <w:r>
-        <w:rPr>
-          <w:rFonts w:ascii="Times New Roman" w:eastAsia="Times New Roman" w:hAnsi="Times New Roman" w:cs="Times New Roman"/>
-          <w:b/>
-          <w:bCs/>
-          <w:sz w:val="26"/>
-          <w:szCs w:val="26"/>
-          <w:highlight w:val="yellow"/>
-        </w:rPr>
-        <w:t>- Cấu hình và giám sát hệ thống</w:t>
-      </w:r>
-      <w:r>
-        <w:rPr>
-          <w:rFonts w:ascii="Times New Roman" w:eastAsia="Times New Roman" w:hAnsi="Times New Roman" w:cs="Times New Roman"/>
-          <w:sz w:val="26"/>
-          <w:szCs w:val="26"/>
-          <w:highlight w:val="yellow"/>
-        </w:rPr>
-        <w:t>: Thiết lập thông số hệ thống, theo dõi log và hiệu suất server.</w:t>
-      </w:r>
-      <w:r>
-        <w:rPr>
-          <w:rFonts w:ascii="Times New Roman" w:eastAsia="Times New Roman" w:hAnsi="Times New Roman" w:cs="Times New Roman"/>
+          <w:lang w:val="vi-VN"/>
+        </w:rPr>
+      </w:pPr>
+      <w:r>
+        <w:rPr>
+          <w:rFonts w:ascii="Times New Roman" w:eastAsia="Times New Roman" w:hAnsi="Times New Roman" w:cs="Times New Roman"/>
+          <w:sz w:val="26"/>
+          <w:szCs w:val="26"/>
+          <w:highlight w:val="yellow"/>
+          <w:lang w:val="vi-VN"/>
+        </w:rPr>
+        <w:t xml:space="preserve">=&gt; </w:t>
+      </w:r>
+      <w:r>
+        <w:rPr>
+          <w:rFonts w:ascii="Times New Roman" w:eastAsia="Times New Roman" w:hAnsi="Times New Roman" w:cs="Times New Roman"/>
+          <w:sz w:val="26"/>
+          <w:szCs w:val="26"/>
+          <w:highlight w:val="yellow"/>
+          <w:lang w:val="vi-VN"/>
+        </w:rPr>
+        <w:t xml:space="preserve">Done =&gt; </w:t>
+      </w:r>
+      <w:r>
+        <w:rPr>
+          <w:rFonts w:ascii="Times New Roman" w:eastAsia="Times New Roman" w:hAnsi="Times New Roman" w:cs="Times New Roman"/>
+          <w:sz w:val="26"/>
+          <w:szCs w:val="26"/>
+          <w:highlight w:val="yellow"/>
+          <w:lang w:val="vi-VN"/>
+        </w:rPr>
+        <w:t>này cần fix lại tại ch hiện hết :v</w:t>
+      </w:r>
+    </w:p>
+    <w:p>
+      <w:pPr>
+        <w:rPr>
+          <w:rFonts w:ascii="Times New Roman" w:eastAsia="Times New Roman" w:hAnsi="Times New Roman" w:cs="Times New Roman"/>
+          <w:b/>
+          <w:bCs/>
+          <w:color w:val="000000"/>
+          <w:sz w:val="26"/>
+          <w:szCs w:val="26"/>
+          <w:highlight w:val="yellow"/>
+          <w:lang w:val="en-GB"/>
+        </w:rPr>
+      </w:pPr>
+    </w:p>
+    <w:p>
+      <w:pPr>
+        <w:rPr>
+          <w:rFonts w:ascii="Times New Roman" w:eastAsia="Times New Roman" w:hAnsi="Times New Roman" w:cs="Times New Roman"/>
+          <w:b/>
+          <w:bCs/>
+          <w:color w:val="000000"/>
+          <w:sz w:val="26"/>
+          <w:szCs w:val="26"/>
+          <w:highlight w:val="yellow"/>
+          <w:lang w:val="vi-VN"/>
+        </w:rPr>
+      </w:pPr>
+    </w:p>
+    <w:p>
+      <w:pPr>
+        <w:rPr>
+          <w:rFonts w:ascii="Times New Roman" w:eastAsia="Times New Roman" w:hAnsi="Times New Roman" w:cs="Times New Roman"/>
+          <w:b/>
+          <w:bCs/>
+          <w:color w:val="000000"/>
+          <w:sz w:val="26"/>
+          <w:szCs w:val="26"/>
+          <w:highlight w:val="yellow"/>
+          <w:lang w:val="vi-VN"/>
+        </w:rPr>
+      </w:pPr>
+      <w:r>
+        <w:rPr>
+          <w:rFonts w:ascii="Times New Roman" w:eastAsia="Times New Roman" w:hAnsi="Times New Roman" w:cs="Times New Roman"/>
+          <w:b/>
+          <w:bCs/>
+          <w:color w:val="000000"/>
+          <w:sz w:val="26"/>
+          <w:szCs w:val="26"/>
+          <w:highlight w:val="yellow"/>
+          <w:lang w:val="vi-VN"/>
+        </w:rPr>
+        <w:t xml:space="preserve">PHẦN </w:t>
+      </w:r>
+      <w:r>
+        <w:rPr>
+          <w:rFonts w:ascii="Times New Roman" w:eastAsia="Times New Roman" w:hAnsi="Times New Roman" w:cs="Times New Roman"/>
+          <w:b/>
+          <w:bCs/>
+          <w:color w:val="000000"/>
+          <w:sz w:val="26"/>
+          <w:szCs w:val="26"/>
+          <w:highlight w:val="yellow"/>
+          <w:lang w:val="vi-VN"/>
+        </w:rPr>
+        <w:t>2</w:t>
+      </w:r>
+      <w:r>
+        <w:rPr>
+          <w:rFonts w:ascii="Times New Roman" w:eastAsia="Times New Roman" w:hAnsi="Times New Roman" w:cs="Times New Roman"/>
+          <w:b/>
+          <w:bCs/>
+          <w:color w:val="000000"/>
+          <w:sz w:val="26"/>
+          <w:szCs w:val="26"/>
+          <w:highlight w:val="yellow"/>
+          <w:lang w:val="vi-VN"/>
+        </w:rPr>
+        <w:t xml:space="preserve">: </w:t>
+      </w:r>
+      <w:r>
+        <w:rPr>
+          <w:rFonts w:ascii="Times New Roman" w:eastAsia="Times New Roman" w:hAnsi="Times New Roman" w:cs="Times New Roman"/>
+          <w:b/>
+          <w:bCs/>
+          <w:color w:val="000000"/>
+          <w:sz w:val="26"/>
+          <w:szCs w:val="26"/>
+          <w:highlight w:val="yellow"/>
+          <w:lang w:val="vi-VN"/>
+        </w:rPr>
+        <w:t>NHỮNG UPDATE BÊN GIAO DIỆN</w:t>
+      </w:r>
+      <w:r>
+        <w:rPr>
+          <w:rFonts w:ascii="Times New Roman" w:eastAsia="Times New Roman" w:hAnsi="Times New Roman" w:cs="Times New Roman"/>
+          <w:b/>
+          <w:bCs/>
+          <w:color w:val="000000"/>
+          <w:sz w:val="26"/>
+          <w:szCs w:val="26"/>
+          <w:highlight w:val="yellow"/>
+          <w:lang w:val="vi-VN"/>
+        </w:rPr>
+        <w:t xml:space="preserve"> + CSDL</w:t>
+      </w:r>
+      <w:r>
+        <w:rPr>
+          <w:rFonts w:ascii="Times New Roman" w:eastAsia="Times New Roman" w:hAnsi="Times New Roman" w:cs="Times New Roman"/>
+          <w:b/>
+          <w:bCs/>
+          <w:color w:val="000000"/>
+          <w:sz w:val="26"/>
+          <w:szCs w:val="26"/>
+          <w:highlight w:val="yellow"/>
+          <w:lang w:val="vi-VN"/>
+        </w:rPr>
+        <w:t>:</w:t>
+      </w:r>
+    </w:p>
+    <w:p>
+      <w:pPr>
+        <w:rPr>
+          <w:rFonts w:ascii="Times New Roman" w:eastAsia="Times New Roman" w:hAnsi="Times New Roman" w:cs="Times New Roman"/>
+          <w:b/>
+          <w:bCs/>
+          <w:color w:val="000000"/>
+          <w:sz w:val="26"/>
+          <w:szCs w:val="26"/>
+          <w:highlight w:val="yellow"/>
+          <w:lang w:val="vi-VN"/>
+        </w:rPr>
+      </w:pPr>
+      <w:r>
+        <w:rPr>
+          <w:rFonts w:ascii="Times New Roman" w:eastAsia="Times New Roman" w:hAnsi="Times New Roman" w:cs="Times New Roman"/>
+          <w:b/>
+          <w:bCs/>
+          <w:color w:val="000000"/>
+          <w:sz w:val="26"/>
+          <w:szCs w:val="26"/>
+          <w:highlight w:val="yellow"/>
+          <w:lang w:val="vi-VN"/>
+        </w:rPr>
+        <w:t xml:space="preserve">1. </w:t>
+      </w:r>
+      <w:r>
+        <w:rPr>
+          <w:rFonts w:ascii="Times New Roman" w:eastAsia="Times New Roman" w:hAnsi="Times New Roman" w:cs="Times New Roman"/>
+          <w:b/>
+          <w:bCs/>
+          <w:color w:val="000000"/>
+          <w:sz w:val="26"/>
+          <w:szCs w:val="26"/>
+          <w:highlight w:val="yellow"/>
+          <w:lang w:val="vi-VN"/>
+        </w:rPr>
+        <w:t>Ví dụ cập nhật gì đấy bên admin hay customer thì tự động load lại</w:t>
+      </w:r>
+    </w:p>
+    <w:p>
+      <w:pPr>
+        <w:rPr>
+          <w:rFonts w:ascii="Times New Roman" w:eastAsia="Times New Roman" w:hAnsi="Times New Roman" w:cs="Times New Roman"/>
+          <w:b/>
+          <w:bCs/>
+          <w:color w:val="000000"/>
+          <w:sz w:val="26"/>
+          <w:szCs w:val="26"/>
+          <w:highlight w:val="yellow"/>
+          <w:lang w:val="vi-VN"/>
+        </w:rPr>
+      </w:pPr>
+      <w:r>
+        <w:rPr>
+          <w:rFonts w:ascii="Times New Roman" w:eastAsia="Times New Roman" w:hAnsi="Times New Roman" w:cs="Times New Roman"/>
+          <w:b/>
+          <w:bCs/>
+          <w:color w:val="000000"/>
+          <w:sz w:val="26"/>
+          <w:szCs w:val="26"/>
+          <w:highlight w:val="yellow"/>
+          <w:lang w:val="vi-VN"/>
+        </w:rPr>
+        <w:t xml:space="preserve">2. </w:t>
+      </w:r>
+      <w:r>
+        <w:rPr>
+          <w:rFonts w:ascii="Times New Roman" w:eastAsia="Times New Roman" w:hAnsi="Times New Roman" w:cs="Times New Roman"/>
+          <w:b/>
+          <w:bCs/>
+          <w:color w:val="000000"/>
+          <w:sz w:val="26"/>
+          <w:szCs w:val="26"/>
+          <w:highlight w:val="yellow"/>
+          <w:lang w:val="vi-VN"/>
+        </w:rPr>
+        <w:t>Giao diện trang chủ =&gt; thiếu hình</w:t>
+      </w:r>
+    </w:p>
+    <w:p>
+      <w:pPr>
+        <w:rPr>
+          <w:rFonts w:ascii="Times New Roman" w:eastAsia="Times New Roman" w:hAnsi="Times New Roman" w:cs="Times New Roman"/>
+          <w:b/>
+          <w:bCs/>
+          <w:color w:val="000000"/>
+          <w:sz w:val="26"/>
+          <w:szCs w:val="26"/>
+          <w:highlight w:val="yellow"/>
+          <w:lang w:val="vi-VN"/>
+        </w:rPr>
+      </w:pPr>
+      <w:r>
+        <w:rPr>
+          <w:rFonts w:ascii="Times New Roman" w:eastAsia="Times New Roman" w:hAnsi="Times New Roman" w:cs="Times New Roman"/>
+          <w:b/>
+          <w:bCs/>
+          <w:color w:val="000000"/>
+          <w:sz w:val="26"/>
+          <w:szCs w:val="26"/>
+          <w:highlight w:val="yellow"/>
+          <w:lang w:val="vi-VN"/>
+        </w:rPr>
+        <w:t>3. Giao diện sản phẩm =&gt; thêm nhiều sản phẩm chia thành các loại</w:t>
+      </w:r>
+    </w:p>
+    <w:p>
+      <w:pPr>
+        <w:rPr>
+          <w:rFonts w:ascii="Times New Roman" w:eastAsia="Times New Roman" w:hAnsi="Times New Roman" w:cs="Times New Roman"/>
+          <w:b/>
+          <w:bCs/>
+          <w:color w:val="000000"/>
+          <w:sz w:val="26"/>
+          <w:szCs w:val="26"/>
+          <w:highlight w:val="yellow"/>
+          <w:lang w:val="vi-VN"/>
+        </w:rPr>
+      </w:pPr>
+      <w:r>
+        <w:rPr>
+          <w:rFonts w:ascii="Times New Roman" w:eastAsia="Times New Roman" w:hAnsi="Times New Roman" w:cs="Times New Roman"/>
+          <w:b/>
+          <w:bCs/>
+          <w:color w:val="000000"/>
+          <w:sz w:val="26"/>
+          <w:szCs w:val="26"/>
+          <w:highlight w:val="yellow"/>
+          <w:lang w:val="vi-VN"/>
+        </w:rPr>
+        <w:t xml:space="preserve">4. </w:t>
+      </w:r>
+      <w:r>
+        <w:rPr>
+          <w:rFonts w:ascii="Times New Roman" w:eastAsia="Times New Roman" w:hAnsi="Times New Roman" w:cs="Times New Roman"/>
+          <w:b/>
+          <w:bCs/>
+          <w:color w:val="000000"/>
+          <w:sz w:val="26"/>
+          <w:szCs w:val="26"/>
+          <w:highlight w:val="yellow"/>
+          <w:lang w:val="vi-VN"/>
+        </w:rPr>
+        <w:t>Giao diện sản phẩm =&gt; giảm giá =&gt; quản lý menu tổng thêm khuyến mãi</w:t>
+      </w:r>
+    </w:p>
+    <w:p>
+      <w:pPr>
+        <w:rPr>
+          <w:rFonts w:ascii="Times New Roman" w:eastAsia="Times New Roman" w:hAnsi="Times New Roman" w:cs="Times New Roman"/>
+          <w:b/>
+          <w:bCs/>
+          <w:color w:val="000000"/>
+          <w:sz w:val="26"/>
+          <w:szCs w:val="26"/>
+          <w:highlight w:val="yellow"/>
+          <w:lang w:val="vi-VN"/>
+        </w:rPr>
+      </w:pPr>
+      <w:r>
+        <w:rPr>
+          <w:rFonts w:ascii="Times New Roman" w:eastAsia="Times New Roman" w:hAnsi="Times New Roman" w:cs="Times New Roman"/>
+          <w:b/>
+          <w:bCs/>
+          <w:color w:val="000000"/>
+          <w:sz w:val="26"/>
+          <w:szCs w:val="26"/>
+          <w:highlight w:val="yellow"/>
+          <w:lang w:val="vi-VN"/>
+        </w:rPr>
+        <w:t>5. Chỉnh giao diện qua tiếng việt có dấu hết + từ ngữ lại</w:t>
+      </w:r>
+    </w:p>
+    <w:p>
+      <w:pPr>
+        <w:rPr>
+          <w:rFonts w:ascii="Times New Roman" w:eastAsia="Times New Roman" w:hAnsi="Times New Roman" w:cs="Times New Roman"/>
+          <w:b/>
+          <w:bCs/>
+          <w:color w:val="000000"/>
+          <w:sz w:val="26"/>
+          <w:szCs w:val="26"/>
+          <w:highlight w:val="yellow"/>
+          <w:lang w:val="vi-VN"/>
+        </w:rPr>
+      </w:pPr>
+      <w:r>
+        <w:rPr>
+          <w:rFonts w:ascii="Times New Roman" w:eastAsia="Times New Roman" w:hAnsi="Times New Roman" w:cs="Times New Roman"/>
+          <w:b/>
+          <w:bCs/>
+          <w:color w:val="000000"/>
+          <w:sz w:val="26"/>
+          <w:szCs w:val="26"/>
+          <w:highlight w:val="yellow"/>
+          <w:lang w:val="vi-VN"/>
+        </w:rPr>
+        <w:lastRenderedPageBreak/>
+        <w:t>6. Riêng phần gợi ý sản phẩm cho nhiều dữ liệu mẫu hơn :v để có thể phân tích hành vi của khách hàng</w:t>
+      </w:r>
+    </w:p>
+    <w:p>
+      <w:pPr>
+        <w:rPr>
+          <w:rFonts w:ascii="Times New Roman" w:eastAsia="Times New Roman" w:hAnsi="Times New Roman" w:cs="Times New Roman"/>
+          <w:b/>
+          <w:bCs/>
+          <w:color w:val="000000"/>
+          <w:sz w:val="26"/>
+          <w:szCs w:val="26"/>
+          <w:highlight w:val="yellow"/>
+          <w:lang w:val="en-GB"/>
+        </w:rPr>
+      </w:pPr>
+    </w:p>
+    <w:p>
+      <w:pPr>
+        <w:rPr>
+          <w:rFonts w:ascii="Times New Roman" w:eastAsia="Times New Roman" w:hAnsi="Times New Roman" w:cs="Times New Roman"/>
+          <w:b/>
+          <w:bCs/>
+          <w:color w:val="000000"/>
+          <w:sz w:val="26"/>
+          <w:szCs w:val="26"/>
+          <w:highlight w:val="yellow"/>
+          <w:lang w:val="en-GB"/>
+        </w:rPr>
+      </w:pPr>
+    </w:p>
+    <w:p>
+      <w:pPr>
+        <w:rPr>
+          <w:rFonts w:ascii="Times New Roman" w:eastAsia="Times New Roman" w:hAnsi="Times New Roman" w:cs="Times New Roman"/>
+          <w:b/>
+          <w:bCs/>
+          <w:color w:val="000000"/>
+          <w:sz w:val="26"/>
+          <w:szCs w:val="26"/>
+          <w:highlight w:val="yellow"/>
+          <w:lang w:val="vi-VN"/>
+        </w:rPr>
+      </w:pPr>
+      <w:r>
+        <w:rPr>
+          <w:rFonts w:ascii="Times New Roman" w:eastAsia="Times New Roman" w:hAnsi="Times New Roman" w:cs="Times New Roman"/>
+          <w:b/>
+          <w:bCs/>
+          <w:color w:val="000000"/>
+          <w:sz w:val="26"/>
+          <w:szCs w:val="26"/>
+          <w:highlight w:val="yellow"/>
+          <w:lang w:val="en-GB"/>
+        </w:rPr>
+        <w:t>Phần</w:t>
+      </w:r>
+      <w:r>
+        <w:rPr>
+          <w:rFonts w:ascii="Times New Roman" w:eastAsia="Times New Roman" w:hAnsi="Times New Roman" w:cs="Times New Roman"/>
+          <w:b/>
+          <w:bCs/>
+          <w:color w:val="000000"/>
+          <w:sz w:val="26"/>
+          <w:szCs w:val="26"/>
+          <w:highlight w:val="yellow"/>
+          <w:lang w:val="vi-VN"/>
+        </w:rPr>
+        <w:t xml:space="preserve"> 3: </w:t>
+      </w:r>
+      <w:r>
+        <w:rPr>
+          <w:rFonts w:ascii="Times New Roman" w:eastAsia="Times New Roman" w:hAnsi="Times New Roman" w:cs="Times New Roman"/>
+          <w:b/>
+          <w:bCs/>
+          <w:color w:val="000000"/>
+          <w:sz w:val="26"/>
+          <w:szCs w:val="26"/>
+          <w:highlight w:val="yellow"/>
+          <w:lang w:val="en-GB"/>
+        </w:rPr>
+        <w:t>NHỮNG</w:t>
+      </w:r>
+      <w:r>
+        <w:rPr>
+          <w:rFonts w:ascii="Times New Roman" w:eastAsia="Times New Roman" w:hAnsi="Times New Roman" w:cs="Times New Roman"/>
+          <w:b/>
+          <w:bCs/>
+          <w:color w:val="000000"/>
+          <w:sz w:val="26"/>
+          <w:szCs w:val="26"/>
+          <w:highlight w:val="yellow"/>
+          <w:lang w:val="vi-VN"/>
+        </w:rPr>
+        <w:t xml:space="preserve"> UPDATE CÔNG NGHÊ:</w:t>
+      </w:r>
+    </w:p>
+    <w:p>
+      <w:pPr>
+        <w:rPr>
+          <w:rFonts w:ascii="Times New Roman" w:eastAsia="Times New Roman" w:hAnsi="Times New Roman" w:cs="Times New Roman"/>
+          <w:b/>
+          <w:bCs/>
+          <w:color w:val="000000"/>
+          <w:sz w:val="26"/>
+          <w:szCs w:val="26"/>
+          <w:highlight w:val="yellow"/>
+          <w:lang w:val="vi-VN"/>
+        </w:rPr>
+      </w:pPr>
+      <w:r>
+        <w:rPr>
+          <w:rFonts w:ascii="Times New Roman" w:eastAsia="Times New Roman" w:hAnsi="Times New Roman" w:cs="Times New Roman"/>
+          <w:b/>
+          <w:bCs/>
+          <w:color w:val="000000"/>
+          <w:sz w:val="26"/>
+          <w:szCs w:val="26"/>
+          <w:highlight w:val="yellow"/>
+          <w:lang w:val="vi-VN"/>
+        </w:rPr>
+        <w:t>=&gt; CHECK LẠI – CẬP NHẬT LẠI BÊN ĐỀ TÀI KỸ THUẬT</w:t>
+      </w:r>
+    </w:p>
+    <w:p>
+      <w:pPr>
+        <w:rPr>
+          <w:rFonts w:ascii="Times New Roman" w:eastAsia="Times New Roman" w:hAnsi="Times New Roman" w:cs="Times New Roman"/>
+          <w:b/>
+          <w:bCs/>
+          <w:color w:val="000000"/>
+          <w:sz w:val="26"/>
+          <w:szCs w:val="26"/>
+          <w:highlight w:val="yellow"/>
+          <w:lang w:val="en-GB"/>
+        </w:rPr>
+      </w:pPr>
+    </w:p>
+    <w:p>
+      <w:pPr>
+        <w:rPr>
+          <w:rFonts w:ascii="Times New Roman" w:eastAsia="Times New Roman" w:hAnsi="Times New Roman" w:cs="Times New Roman"/>
+          <w:b/>
+          <w:bCs/>
+          <w:color w:val="000000"/>
+          <w:sz w:val="26"/>
+          <w:szCs w:val="26"/>
+          <w:highlight w:val="yellow"/>
+          <w:lang w:val="en-GB"/>
+        </w:rPr>
+      </w:pPr>
+    </w:p>
+    <w:p>
+      <w:pPr>
+        <w:rPr>
+          <w:rFonts w:ascii="Times New Roman" w:eastAsia="Times New Roman" w:hAnsi="Times New Roman" w:cs="Times New Roman"/>
+          <w:b/>
+          <w:bCs/>
+          <w:color w:val="000000"/>
+          <w:sz w:val="26"/>
+          <w:szCs w:val="26"/>
+          <w:highlight w:val="yellow"/>
+          <w:lang w:val="en-GB"/>
+        </w:rPr>
+      </w:pPr>
+    </w:p>
+    <w:p>
+      <w:pPr>
+        <w:rPr>
+          <w:rFonts w:ascii="Times New Roman" w:eastAsia="Times New Roman" w:hAnsi="Times New Roman" w:cs="Times New Roman"/>
+          <w:b/>
+          <w:bCs/>
+          <w:color w:val="000000"/>
+          <w:sz w:val="26"/>
+          <w:szCs w:val="26"/>
+          <w:highlight w:val="yellow"/>
+          <w:lang w:val="en-GB"/>
+        </w:rPr>
+      </w:pPr>
+    </w:p>
+    <w:p>
+      <w:pPr>
+        <w:rPr>
+          <w:rFonts w:ascii="Times New Roman" w:eastAsia="Times New Roman" w:hAnsi="Times New Roman" w:cs="Times New Roman"/>
+          <w:b/>
+          <w:bCs/>
+          <w:color w:val="000000"/>
+          <w:sz w:val="26"/>
+          <w:szCs w:val="26"/>
+          <w:highlight w:val="yellow"/>
+          <w:lang w:val="en-GB"/>
+        </w:rPr>
+      </w:pPr>
+    </w:p>
+    <w:p>
+      <w:pPr>
+        <w:rPr>
+          <w:highlight w:val="yellow"/>
+          <w:lang w:val="en-GB"/>
+        </w:rPr>
+      </w:pPr>
+    </w:p>
+    <w:p>
+      <w:pPr>
+        <w:rPr>
+          <w:highlight w:val="yellow"/>
+          <w:lang w:val="en-GB"/>
+        </w:rPr>
+      </w:pPr>
+    </w:p>
+    <w:p>
+      <w:pPr>
+        <w:rPr>
+          <w:highlight w:val="yellow"/>
+          <w:lang w:val="en-GB"/>
+        </w:rPr>
+      </w:pPr>
+    </w:p>
+    <w:p>
+      <w:pPr>
+        <w:rPr>
+          <w:highlight w:val="yellow"/>
+          <w:lang w:val="en-GB"/>
+        </w:rPr>
+      </w:pPr>
+    </w:p>
+    <w:p>
+      <w:pPr>
+        <w:rPr>
+          <w:highlight w:val="yellow"/>
+          <w:lang w:val="en-GB"/>
+        </w:rPr>
+      </w:pPr>
+    </w:p>
+    <w:p>
+      <w:pPr>
+        <w:rPr>
+          <w:highlight w:val="yellow"/>
+          <w:lang w:val="en-GB"/>
+        </w:rPr>
+      </w:pPr>
+    </w:p>
+    <w:p>
+      <w:pPr>
+        <w:rPr>
+          <w:highlight w:val="yellow"/>
+          <w:lang w:val="en-GB"/>
+        </w:rPr>
+      </w:pPr>
+    </w:p>
+    <w:p>
+      <w:pPr>
+        <w:rPr>
+          <w:highlight w:val="yellow"/>
+          <w:lang w:val="en-GB"/>
+        </w:rPr>
+      </w:pPr>
+    </w:p>
+    <w:p>
+      <w:pPr>
+        <w:rPr>
+          <w:highlight w:val="yellow"/>
+          <w:lang w:val="en-GB"/>
+        </w:rPr>
+      </w:pPr>
+    </w:p>
+    <w:p>
+      <w:pPr>
+        <w:rPr>
+          <w:rFonts w:ascii="Times New Roman" w:eastAsia="Times New Roman" w:hAnsi="Times New Roman" w:cs="Times New Roman"/>
+          <w:b/>
+          <w:bCs/>
+          <w:color w:val="000000"/>
+          <w:sz w:val="26"/>
+          <w:szCs w:val="26"/>
+          <w:highlight w:val="yellow"/>
+          <w:lang w:val="vi-VN"/>
+        </w:rPr>
+      </w:pPr>
+      <w:r>
+        <w:rPr>
+          <w:rFonts w:ascii="Times New Roman" w:eastAsia="Times New Roman" w:hAnsi="Times New Roman" w:cs="Times New Roman"/>
+          <w:b/>
+          <w:bCs/>
+          <w:color w:val="000000"/>
+          <w:sz w:val="26"/>
+          <w:szCs w:val="26"/>
+          <w:highlight w:val="yellow"/>
+          <w:lang w:val="en-GB"/>
+        </w:rPr>
+        <w:t>Phần</w:t>
+      </w:r>
+      <w:r>
+        <w:rPr>
+          <w:rFonts w:ascii="Times New Roman" w:eastAsia="Times New Roman" w:hAnsi="Times New Roman" w:cs="Times New Roman"/>
+          <w:b/>
+          <w:bCs/>
+          <w:color w:val="000000"/>
           <w:sz w:val="26"/>
           <w:szCs w:val="26"/>
           <w:highlight w:val="yellow"/>
@@ -2610,29 +4425,33 @@
         </w:rPr>
         <w:t xml:space="preserve"> </w:t>
       </w:r>
-    </w:p>
-    <w:p>
-      <w:pPr>
-        <w:rPr>
-          <w:rFonts w:ascii="Times New Roman" w:eastAsia="Times New Roman" w:hAnsi="Times New Roman" w:cs="Times New Roman"/>
-          <w:sz w:val="26"/>
-          <w:szCs w:val="26"/>
-          <w:lang w:val="vi-VN"/>
-        </w:rPr>
-      </w:pPr>
-      <w:r>
-        <w:rPr>
-          <w:rFonts w:ascii="Times New Roman" w:eastAsia="Times New Roman" w:hAnsi="Times New Roman" w:cs="Times New Roman"/>
-          <w:sz w:val="26"/>
-          <w:szCs w:val="26"/>
-          <w:highlight w:val="yellow"/>
-          <w:lang w:val="vi-VN"/>
-        </w:rPr>
-        <w:t>=&gt; update: này chưa làm</w:t>
-      </w:r>
-    </w:p>
-    <w:p>
-      <w:pPr>
+      <w:r>
+        <w:rPr>
+          <w:rFonts w:ascii="Times New Roman" w:eastAsia="Times New Roman" w:hAnsi="Times New Roman" w:cs="Times New Roman"/>
+          <w:b/>
+          <w:bCs/>
+          <w:color w:val="000000"/>
+          <w:sz w:val="26"/>
+          <w:szCs w:val="26"/>
+          <w:highlight w:val="yellow"/>
+          <w:lang w:val="vi-VN"/>
+        </w:rPr>
+        <w:t>4</w:t>
+      </w:r>
+      <w:r>
+        <w:rPr>
+          <w:rFonts w:ascii="Times New Roman" w:eastAsia="Times New Roman" w:hAnsi="Times New Roman" w:cs="Times New Roman"/>
+          <w:b/>
+          <w:bCs/>
+          <w:color w:val="000000"/>
+          <w:sz w:val="26"/>
+          <w:szCs w:val="26"/>
+          <w:highlight w:val="yellow"/>
+          <w:lang w:val="vi-VN"/>
+        </w:rPr>
+        <w:t xml:space="preserve">: </w:t>
+      </w:r>
+      <w:r>
         <w:rPr>
           <w:rFonts w:ascii="Times New Roman" w:eastAsia="Times New Roman" w:hAnsi="Times New Roman" w:cs="Times New Roman"/>
           <w:b/>
@@ -2643,99 +4462,33 @@
           <w:highlight w:val="yellow"/>
           <w:lang w:val="en-GB"/>
         </w:rPr>
-      </w:pPr>
-    </w:p>
-    <w:p>
-      <w:pPr>
-        <w:rPr>
-          <w:rFonts w:ascii="Times New Roman" w:eastAsia="Times New Roman" w:hAnsi="Times New Roman" w:cs="Times New Roman"/>
-          <w:b/>
-          <w:bCs/>
-          <w:color w:val="000000"/>
-          <w:sz w:val="26"/>
-          <w:szCs w:val="26"/>
-          <w:highlight w:val="yellow"/>
-          <w:lang w:val="vi-VN"/>
-        </w:rPr>
-      </w:pPr>
-    </w:p>
-    <w:p>
-      <w:pPr>
-        <w:rPr>
-          <w:rFonts w:ascii="Times New Roman" w:eastAsia="Times New Roman" w:hAnsi="Times New Roman" w:cs="Times New Roman"/>
-          <w:b/>
-          <w:bCs/>
-          <w:color w:val="000000"/>
-          <w:sz w:val="26"/>
-          <w:szCs w:val="26"/>
-          <w:highlight w:val="yellow"/>
-          <w:lang w:val="vi-VN"/>
-        </w:rPr>
-      </w:pPr>
-      <w:r>
-        <w:rPr>
-          <w:rFonts w:ascii="Times New Roman" w:eastAsia="Times New Roman" w:hAnsi="Times New Roman" w:cs="Times New Roman"/>
-          <w:b/>
-          <w:bCs/>
-          <w:color w:val="000000"/>
-          <w:sz w:val="26"/>
-          <w:szCs w:val="26"/>
-          <w:highlight w:val="yellow"/>
-          <w:lang w:val="vi-VN"/>
-        </w:rPr>
-        <w:t xml:space="preserve">PHẦN </w:t>
-      </w:r>
-      <w:r>
-        <w:rPr>
-          <w:rFonts w:ascii="Times New Roman" w:eastAsia="Times New Roman" w:hAnsi="Times New Roman" w:cs="Times New Roman"/>
-          <w:b/>
-          <w:bCs/>
-          <w:color w:val="000000"/>
-          <w:sz w:val="26"/>
-          <w:szCs w:val="26"/>
-          <w:highlight w:val="yellow"/>
-          <w:lang w:val="vi-VN"/>
-        </w:rPr>
-        <w:t>2</w:t>
-      </w:r>
-      <w:r>
-        <w:rPr>
-          <w:rFonts w:ascii="Times New Roman" w:eastAsia="Times New Roman" w:hAnsi="Times New Roman" w:cs="Times New Roman"/>
-          <w:b/>
-          <w:bCs/>
-          <w:color w:val="000000"/>
-          <w:sz w:val="26"/>
-          <w:szCs w:val="26"/>
-          <w:highlight w:val="yellow"/>
-          <w:lang w:val="vi-VN"/>
-        </w:rPr>
-        <w:t xml:space="preserve">: </w:t>
-      </w:r>
-      <w:r>
-        <w:rPr>
-          <w:rFonts w:ascii="Times New Roman" w:eastAsia="Times New Roman" w:hAnsi="Times New Roman" w:cs="Times New Roman"/>
-          <w:b/>
-          <w:bCs/>
-          <w:color w:val="000000"/>
-          <w:sz w:val="26"/>
-          <w:szCs w:val="26"/>
-          <w:highlight w:val="yellow"/>
-          <w:lang w:val="vi-VN"/>
-        </w:rPr>
-        <w:t>NHỮNG UPDATE BÊN GIAO DIỆN</w:t>
-      </w:r>
-      <w:r>
-        <w:rPr>
-          <w:rFonts w:ascii="Times New Roman" w:eastAsia="Times New Roman" w:hAnsi="Times New Roman" w:cs="Times New Roman"/>
-          <w:b/>
-          <w:bCs/>
-          <w:color w:val="000000"/>
-          <w:sz w:val="26"/>
-          <w:szCs w:val="26"/>
-          <w:highlight w:val="yellow"/>
-          <w:lang w:val="vi-VN"/>
-        </w:rPr>
-        <w:t xml:space="preserve"> + CSDL</w:t>
+        <w:t>NHỮNG</w:t>
+      </w:r>
+      <w:r>
+        <w:rPr>
+          <w:rFonts w:ascii="Times New Roman" w:eastAsia="Times New Roman" w:hAnsi="Times New Roman" w:cs="Times New Roman"/>
+          <w:b/>
+          <w:bCs/>
+          <w:color w:val="000000"/>
+          <w:sz w:val="26"/>
+          <w:szCs w:val="26"/>
+          <w:highlight w:val="yellow"/>
+          <w:lang w:val="vi-VN"/>
+        </w:rPr>
+        <w:t xml:space="preserve"> UPDATE CÔNG</w:t>
+      </w:r>
+      <w:r>
+        <w:rPr>
+          <w:rFonts w:ascii="Times New Roman" w:eastAsia="Times New Roman" w:hAnsi="Times New Roman" w:cs="Times New Roman"/>
+          <w:b/>
+          <w:bCs/>
+          <w:color w:val="000000"/>
+          <w:sz w:val="26"/>
+          <w:szCs w:val="26"/>
+          <w:highlight w:val="yellow"/>
+          <w:lang w:val="vi-VN"/>
+        </w:rPr>
+        <w:t xml:space="preserve"> VỀ ACTOR – QUY TRÌNH NGHIỆP VỤ</w:t>
       </w:r>
       <w:r>
         <w:rPr>
@@ -2750,554 +4503,6 @@
         </w:rPr>
         <w:t>:</w:t>
       </w:r>
-    </w:p>
-    <w:p>
-      <w:pPr>
-        <w:rPr>
-          <w:rFonts w:ascii="Times New Roman" w:eastAsia="Times New Roman" w:hAnsi="Times New Roman" w:cs="Times New Roman"/>
-          <w:b/>
-          <w:bCs/>
-          <w:color w:val="000000"/>
-          <w:sz w:val="26"/>
-          <w:szCs w:val="26"/>
-          <w:highlight w:val="yellow"/>
-          <w:lang w:val="vi-VN"/>
-        </w:rPr>
-      </w:pPr>
-      <w:r>
-        <w:rPr>
-          <w:rFonts w:ascii="Times New Roman" w:eastAsia="Times New Roman" w:hAnsi="Times New Roman" w:cs="Times New Roman"/>
-          <w:b/>
-          <w:bCs/>
-          <w:color w:val="000000"/>
-          <w:sz w:val="26"/>
-          <w:szCs w:val="26"/>
-          <w:highlight w:val="yellow"/>
-          <w:lang w:val="vi-VN"/>
-        </w:rPr>
-        <w:t xml:space="preserve">1. </w:t>
-      </w:r>
-      <w:r>
-        <w:rPr>
-          <w:rFonts w:ascii="Times New Roman" w:eastAsia="Times New Roman" w:hAnsi="Times New Roman" w:cs="Times New Roman"/>
-          <w:b/>
-          <w:bCs/>
-          <w:color w:val="000000"/>
-          <w:sz w:val="26"/>
-          <w:szCs w:val="26"/>
-          <w:highlight w:val="yellow"/>
-          <w:lang w:val="vi-VN"/>
-        </w:rPr>
-        <w:t>Ví dụ cập nhật gì đấy bên admin hay customer thì tự động load lại</w:t>
-      </w:r>
-    </w:p>
-    <w:p>
-      <w:pPr>
-        <w:rPr>
-          <w:rFonts w:ascii="Times New Roman" w:eastAsia="Times New Roman" w:hAnsi="Times New Roman" w:cs="Times New Roman"/>
-          <w:b/>
-          <w:bCs/>
-          <w:color w:val="000000"/>
-          <w:sz w:val="26"/>
-          <w:szCs w:val="26"/>
-          <w:highlight w:val="yellow"/>
-          <w:lang w:val="vi-VN"/>
-        </w:rPr>
-      </w:pPr>
-      <w:r>
-        <w:rPr>
-          <w:rFonts w:ascii="Times New Roman" w:eastAsia="Times New Roman" w:hAnsi="Times New Roman" w:cs="Times New Roman"/>
-          <w:b/>
-          <w:bCs/>
-          <w:color w:val="000000"/>
-          <w:sz w:val="26"/>
-          <w:szCs w:val="26"/>
-          <w:highlight w:val="yellow"/>
-          <w:lang w:val="vi-VN"/>
-        </w:rPr>
-        <w:t xml:space="preserve">2. </w:t>
-      </w:r>
-      <w:r>
-        <w:rPr>
-          <w:rFonts w:ascii="Times New Roman" w:eastAsia="Times New Roman" w:hAnsi="Times New Roman" w:cs="Times New Roman"/>
-          <w:b/>
-          <w:bCs/>
-          <w:color w:val="000000"/>
-          <w:sz w:val="26"/>
-          <w:szCs w:val="26"/>
-          <w:highlight w:val="yellow"/>
-          <w:lang w:val="vi-VN"/>
-        </w:rPr>
-        <w:t>Giao diện trang chủ =&gt; thiếu hình</w:t>
-      </w:r>
-    </w:p>
-    <w:p>
-      <w:pPr>
-        <w:rPr>
-          <w:rFonts w:ascii="Times New Roman" w:eastAsia="Times New Roman" w:hAnsi="Times New Roman" w:cs="Times New Roman"/>
-          <w:b/>
-          <w:bCs/>
-          <w:color w:val="000000"/>
-          <w:sz w:val="26"/>
-          <w:szCs w:val="26"/>
-          <w:highlight w:val="yellow"/>
-          <w:lang w:val="vi-VN"/>
-        </w:rPr>
-      </w:pPr>
-      <w:r>
-        <w:rPr>
-          <w:rFonts w:ascii="Times New Roman" w:eastAsia="Times New Roman" w:hAnsi="Times New Roman" w:cs="Times New Roman"/>
-          <w:b/>
-          <w:bCs/>
-          <w:color w:val="000000"/>
-          <w:sz w:val="26"/>
-          <w:szCs w:val="26"/>
-          <w:highlight w:val="yellow"/>
-          <w:lang w:val="vi-VN"/>
-        </w:rPr>
-        <w:t>3. Giao diện sản phẩm =&gt; thêm nhiều sản phẩm chia thành các loại</w:t>
-      </w:r>
-    </w:p>
-    <w:p>
-      <w:pPr>
-        <w:rPr>
-          <w:rFonts w:ascii="Times New Roman" w:eastAsia="Times New Roman" w:hAnsi="Times New Roman" w:cs="Times New Roman"/>
-          <w:b/>
-          <w:bCs/>
-          <w:color w:val="000000"/>
-          <w:sz w:val="26"/>
-          <w:szCs w:val="26"/>
-          <w:highlight w:val="yellow"/>
-          <w:lang w:val="vi-VN"/>
-        </w:rPr>
-      </w:pPr>
-      <w:r>
-        <w:rPr>
-          <w:rFonts w:ascii="Times New Roman" w:eastAsia="Times New Roman" w:hAnsi="Times New Roman" w:cs="Times New Roman"/>
-          <w:b/>
-          <w:bCs/>
-          <w:color w:val="000000"/>
-          <w:sz w:val="26"/>
-          <w:szCs w:val="26"/>
-          <w:highlight w:val="yellow"/>
-          <w:lang w:val="vi-VN"/>
-        </w:rPr>
-        <w:t xml:space="preserve">4. </w:t>
-      </w:r>
-      <w:r>
-        <w:rPr>
-          <w:rFonts w:ascii="Times New Roman" w:eastAsia="Times New Roman" w:hAnsi="Times New Roman" w:cs="Times New Roman"/>
-          <w:b/>
-          <w:bCs/>
-          <w:color w:val="000000"/>
-          <w:sz w:val="26"/>
-          <w:szCs w:val="26"/>
-          <w:highlight w:val="yellow"/>
-          <w:lang w:val="vi-VN"/>
-        </w:rPr>
-        <w:t>Giao diện sản phẩm =&gt; giảm giá =&gt; quản lý menu tổng thêm khuyến mãi</w:t>
-      </w:r>
-    </w:p>
-    <w:p>
-      <w:pPr>
-        <w:rPr>
-          <w:rFonts w:ascii="Times New Roman" w:eastAsia="Times New Roman" w:hAnsi="Times New Roman" w:cs="Times New Roman"/>
-          <w:b/>
-          <w:bCs/>
-          <w:color w:val="000000"/>
-          <w:sz w:val="26"/>
-          <w:szCs w:val="26"/>
-          <w:highlight w:val="yellow"/>
-          <w:lang w:val="vi-VN"/>
-        </w:rPr>
-      </w:pPr>
-      <w:r>
-        <w:rPr>
-          <w:rFonts w:ascii="Times New Roman" w:eastAsia="Times New Roman" w:hAnsi="Times New Roman" w:cs="Times New Roman"/>
-          <w:b/>
-          <w:bCs/>
-          <w:color w:val="000000"/>
-          <w:sz w:val="26"/>
-          <w:szCs w:val="26"/>
-          <w:highlight w:val="yellow"/>
-          <w:lang w:val="vi-VN"/>
-        </w:rPr>
-        <w:t>5. Chỉnh giao diện qua tiếng việt có dấu hết + từ ngữ lại</w:t>
-      </w:r>
-    </w:p>
-    <w:p>
-      <w:pPr>
-        <w:rPr>
-          <w:rFonts w:ascii="Times New Roman" w:eastAsia="Times New Roman" w:hAnsi="Times New Roman" w:cs="Times New Roman"/>
-          <w:b/>
-          <w:bCs/>
-          <w:color w:val="000000"/>
-          <w:sz w:val="26"/>
-          <w:szCs w:val="26"/>
-          <w:highlight w:val="yellow"/>
-          <w:lang w:val="vi-VN"/>
-        </w:rPr>
-      </w:pPr>
-      <w:r>
-        <w:rPr>
-          <w:rFonts w:ascii="Times New Roman" w:eastAsia="Times New Roman" w:hAnsi="Times New Roman" w:cs="Times New Roman"/>
-          <w:b/>
-          <w:bCs/>
-          <w:color w:val="000000"/>
-          <w:sz w:val="26"/>
-          <w:szCs w:val="26"/>
-          <w:highlight w:val="yellow"/>
-          <w:lang w:val="vi-VN"/>
-        </w:rPr>
-        <w:t>6. Riêng phần gợi ý sản phẩm cho nhiều dữ liệu mẫu hơn :v để có thể phân tích hành vi của khách hàng</w:t>
-      </w:r>
-    </w:p>
-    <w:p>
-      <w:pPr>
-        <w:rPr>
-          <w:rFonts w:ascii="Times New Roman" w:eastAsia="Times New Roman" w:hAnsi="Times New Roman" w:cs="Times New Roman"/>
-          <w:b/>
-          <w:bCs/>
-          <w:color w:val="000000"/>
-          <w:sz w:val="26"/>
-          <w:szCs w:val="26"/>
-          <w:highlight w:val="yellow"/>
-          <w:lang w:val="en-GB"/>
-        </w:rPr>
-      </w:pPr>
-    </w:p>
-    <w:p>
-      <w:pPr>
-        <w:rPr>
-          <w:rFonts w:ascii="Times New Roman" w:eastAsia="Times New Roman" w:hAnsi="Times New Roman" w:cs="Times New Roman"/>
-          <w:b/>
-          <w:bCs/>
-          <w:color w:val="000000"/>
-          <w:sz w:val="26"/>
-          <w:szCs w:val="26"/>
-          <w:highlight w:val="yellow"/>
-          <w:lang w:val="en-GB"/>
-        </w:rPr>
-      </w:pPr>
-    </w:p>
-    <w:p>
-      <w:pPr>
-        <w:rPr>
-          <w:rFonts w:ascii="Times New Roman" w:eastAsia="Times New Roman" w:hAnsi="Times New Roman" w:cs="Times New Roman"/>
-          <w:b/>
-          <w:bCs/>
-          <w:color w:val="000000"/>
-          <w:sz w:val="26"/>
-          <w:szCs w:val="26"/>
-          <w:highlight w:val="yellow"/>
-          <w:lang w:val="vi-VN"/>
-        </w:rPr>
-      </w:pPr>
-      <w:r>
-        <w:rPr>
-          <w:rFonts w:ascii="Times New Roman" w:eastAsia="Times New Roman" w:hAnsi="Times New Roman" w:cs="Times New Roman"/>
-          <w:b/>
-          <w:bCs/>
-          <w:color w:val="000000"/>
-          <w:sz w:val="26"/>
-          <w:szCs w:val="26"/>
-          <w:highlight w:val="yellow"/>
-          <w:lang w:val="en-GB"/>
-        </w:rPr>
-        <w:t>Phần</w:t>
-      </w:r>
-      <w:r>
-        <w:rPr>
-          <w:rFonts w:ascii="Times New Roman" w:eastAsia="Times New Roman" w:hAnsi="Times New Roman" w:cs="Times New Roman"/>
-          <w:b/>
-          <w:bCs/>
-          <w:color w:val="000000"/>
-          <w:sz w:val="26"/>
-          <w:szCs w:val="26"/>
-          <w:highlight w:val="yellow"/>
-          <w:lang w:val="vi-VN"/>
-        </w:rPr>
-        <w:t xml:space="preserve"> 3: </w:t>
-      </w:r>
-      <w:r>
-        <w:rPr>
-          <w:rFonts w:ascii="Times New Roman" w:eastAsia="Times New Roman" w:hAnsi="Times New Roman" w:cs="Times New Roman"/>
-          <w:b/>
-          <w:bCs/>
-          <w:color w:val="000000"/>
-          <w:sz w:val="26"/>
-          <w:szCs w:val="26"/>
-          <w:highlight w:val="yellow"/>
-          <w:lang w:val="en-GB"/>
-        </w:rPr>
-        <w:t>NHỮNG</w:t>
-      </w:r>
-      <w:r>
-        <w:rPr>
-          <w:rFonts w:ascii="Times New Roman" w:eastAsia="Times New Roman" w:hAnsi="Times New Roman" w:cs="Times New Roman"/>
-          <w:b/>
-          <w:bCs/>
-          <w:color w:val="000000"/>
-          <w:sz w:val="26"/>
-          <w:szCs w:val="26"/>
-          <w:highlight w:val="yellow"/>
-          <w:lang w:val="vi-VN"/>
-        </w:rPr>
-        <w:t xml:space="preserve"> UPDATE CÔNG NGHÊ:</w:t>
-      </w:r>
-    </w:p>
-    <w:p>
-      <w:pPr>
-        <w:rPr>
-          <w:rFonts w:ascii="Times New Roman" w:eastAsia="Times New Roman" w:hAnsi="Times New Roman" w:cs="Times New Roman"/>
-          <w:b/>
-          <w:bCs/>
-          <w:color w:val="000000"/>
-          <w:sz w:val="26"/>
-          <w:szCs w:val="26"/>
-          <w:highlight w:val="yellow"/>
-          <w:lang w:val="vi-VN"/>
-        </w:rPr>
-      </w:pPr>
-      <w:r>
-        <w:rPr>
-          <w:rFonts w:ascii="Times New Roman" w:eastAsia="Times New Roman" w:hAnsi="Times New Roman" w:cs="Times New Roman"/>
-          <w:b/>
-          <w:bCs/>
-          <w:color w:val="000000"/>
-          <w:sz w:val="26"/>
-          <w:szCs w:val="26"/>
-          <w:highlight w:val="yellow"/>
-          <w:lang w:val="vi-VN"/>
-        </w:rPr>
-        <w:t>=&gt; CHECK LẠI – CẬP NHẬT LẠI BÊN ĐỀ TÀI KỸ THUẬT</w:t>
-      </w:r>
-    </w:p>
-    <w:p>
-      <w:pPr>
-        <w:rPr>
-          <w:rFonts w:ascii="Times New Roman" w:eastAsia="Times New Roman" w:hAnsi="Times New Roman" w:cs="Times New Roman"/>
-          <w:b/>
-          <w:bCs/>
-          <w:color w:val="000000"/>
-          <w:sz w:val="26"/>
-          <w:szCs w:val="26"/>
-          <w:highlight w:val="yellow"/>
-          <w:lang w:val="en-GB"/>
-        </w:rPr>
-      </w:pPr>
-    </w:p>
-    <w:p>
-      <w:pPr>
-        <w:rPr>
-          <w:rFonts w:ascii="Times New Roman" w:eastAsia="Times New Roman" w:hAnsi="Times New Roman" w:cs="Times New Roman"/>
-          <w:b/>
-          <w:bCs/>
-          <w:color w:val="000000"/>
-          <w:sz w:val="26"/>
-          <w:szCs w:val="26"/>
-          <w:highlight w:val="yellow"/>
-          <w:lang w:val="en-GB"/>
-        </w:rPr>
-      </w:pPr>
-    </w:p>
-    <w:p>
-      <w:pPr>
-        <w:rPr>
-          <w:rFonts w:ascii="Times New Roman" w:eastAsia="Times New Roman" w:hAnsi="Times New Roman" w:cs="Times New Roman"/>
-          <w:b/>
-          <w:bCs/>
-          <w:color w:val="000000"/>
-          <w:sz w:val="26"/>
-          <w:szCs w:val="26"/>
-          <w:highlight w:val="yellow"/>
-          <w:lang w:val="en-GB"/>
-        </w:rPr>
-      </w:pPr>
-    </w:p>
-    <w:p>
-      <w:pPr>
-        <w:rPr>
-          <w:rFonts w:ascii="Times New Roman" w:eastAsia="Times New Roman" w:hAnsi="Times New Roman" w:cs="Times New Roman"/>
-          <w:b/>
-          <w:bCs/>
-          <w:color w:val="000000"/>
-          <w:sz w:val="26"/>
-          <w:szCs w:val="26"/>
-          <w:highlight w:val="yellow"/>
-          <w:lang w:val="en-GB"/>
-        </w:rPr>
-      </w:pPr>
-    </w:p>
-    <w:p>
-      <w:pPr>
-        <w:rPr>
-          <w:rFonts w:ascii="Times New Roman" w:eastAsia="Times New Roman" w:hAnsi="Times New Roman" w:cs="Times New Roman"/>
-          <w:b/>
-          <w:bCs/>
-          <w:color w:val="000000"/>
-          <w:sz w:val="26"/>
-          <w:szCs w:val="26"/>
-          <w:highlight w:val="yellow"/>
-          <w:lang w:val="en-GB"/>
-        </w:rPr>
-      </w:pPr>
-    </w:p>
-    <w:p>
-      <w:pPr>
-        <w:rPr>
-          <w:rFonts w:ascii="Times New Roman" w:eastAsia="Times New Roman" w:hAnsi="Times New Roman" w:cs="Times New Roman"/>
-          <w:b/>
-          <w:bCs/>
-          <w:color w:val="000000"/>
-          <w:sz w:val="26"/>
-          <w:szCs w:val="26"/>
-          <w:highlight w:val="yellow"/>
-          <w:lang w:val="en-GB"/>
-        </w:rPr>
-      </w:pPr>
-    </w:p>
-    <w:p>
-      <w:pPr>
-        <w:rPr>
-          <w:rFonts w:ascii="Times New Roman" w:eastAsia="Times New Roman" w:hAnsi="Times New Roman" w:cs="Times New Roman"/>
-          <w:b/>
-          <w:bCs/>
-          <w:color w:val="000000"/>
-          <w:sz w:val="26"/>
-          <w:szCs w:val="26"/>
-          <w:highlight w:val="yellow"/>
-          <w:lang w:val="en-GB"/>
-        </w:rPr>
-      </w:pPr>
-    </w:p>
-    <w:p>
-      <w:pPr>
-        <w:rPr>
-          <w:highlight w:val="yellow"/>
-          <w:lang w:val="en-GB"/>
-        </w:rPr>
-      </w:pPr>
-    </w:p>
-    <w:p>
-      <w:pPr>
-        <w:rPr>
-          <w:highlight w:val="yellow"/>
-          <w:lang w:val="en-GB"/>
-        </w:rPr>
-      </w:pPr>
-    </w:p>
-    <w:p>
-      <w:pPr>
-        <w:rPr>
-          <w:highlight w:val="yellow"/>
-          <w:lang w:val="en-GB"/>
-        </w:rPr>
-      </w:pPr>
-    </w:p>
-    <w:p>
-      <w:pPr>
-        <w:rPr>
-          <w:highlight w:val="yellow"/>
-          <w:lang w:val="en-GB"/>
-        </w:rPr>
-      </w:pPr>
-    </w:p>
-    <w:p>
-      <w:pPr>
-        <w:rPr>
-          <w:highlight w:val="yellow"/>
-          <w:lang w:val="en-GB"/>
-        </w:rPr>
-      </w:pPr>
-    </w:p>
-    <w:p>
-      <w:pPr>
-        <w:rPr>
-          <w:highlight w:val="yellow"/>
-          <w:lang w:val="en-GB"/>
-        </w:rPr>
-      </w:pPr>
-    </w:p>
-    <w:p>
-      <w:pPr>
-        <w:rPr>
-          <w:highlight w:val="yellow"/>
-          <w:lang w:val="en-GB"/>
-        </w:rPr>
-      </w:pPr>
-    </w:p>
-    <w:p>
-      <w:pPr>
-        <w:rPr>
-          <w:highlight w:val="yellow"/>
-          <w:lang w:val="en-GB"/>
-        </w:rPr>
-      </w:pPr>
-    </w:p>
-    <w:p>
-      <w:pPr>
-        <w:rPr>
-          <w:highlight w:val="yellow"/>
-          <w:lang w:val="en-GB"/>
-        </w:rPr>
-      </w:pPr>
-    </w:p>
-    <w:p>
-      <w:pPr>
-        <w:rPr>
-          <w:highlight w:val="yellow"/>
-          <w:lang w:val="en-GB"/>
-        </w:rPr>
-      </w:pPr>
-    </w:p>
-    <w:p>
-      <w:pPr>
-        <w:rPr>
-          <w:highlight w:val="yellow"/>
-          <w:lang w:val="en-GB"/>
-        </w:rPr>
-      </w:pPr>
-    </w:p>
-    <w:p>
-      <w:pPr>
-        <w:rPr>
-          <w:highlight w:val="yellow"/>
-          <w:lang w:val="en-GB"/>
-        </w:rPr>
-      </w:pPr>
-    </w:p>
-    <w:p>
-      <w:pPr>
-        <w:rPr>
-          <w:highlight w:val="yellow"/>
-          <w:lang w:val="vi-VN"/>
-        </w:rPr>
-      </w:pPr>
-    </w:p>
-    <w:p>
-      <w:pPr>
-        <w:rPr>
-          <w:highlight w:val="yellow"/>
-          <w:lang w:val="vi-VN"/>
-        </w:rPr>
-      </w:pPr>
-    </w:p>
-    <w:p>
-      <w:pPr>
-        <w:rPr>
-          <w:highlight w:val="yellow"/>
-          <w:lang w:val="vi-VN"/>
-        </w:rPr>
-      </w:pPr>
-    </w:p>
-    <w:p>
-      <w:pPr>
-        <w:rPr>
-          <w:highlight w:val="yellow"/>
-          <w:lang w:val="en-GB"/>
-        </w:rPr>
-      </w:pPr>
     </w:p>
     <w:p>
       <w:pPr>
@@ -4071,7 +5276,7 @@
   <w:style w:type="paragraph" w:default="1" w:styleId="Normal">
     <w:name w:val="Normal"/>
     <w:qFormat/>
-    <w:rsid w:val="00CD2464"/>
+    <w:rsid w:val="00DF0602"/>
   </w:style>
   <w:style w:type="paragraph" w:styleId="Heading1">
     <w:name w:val="heading 1"/>

</xml_diff>

<commit_message>
feat (customer + admin + cicd): gan update xong
</commit_message>
<xml_diff>
--- a/CNM_ChucNangNguoiDung.docx
+++ b/CNM_ChucNangNguoiDung.docx
@@ -112,6 +112,30 @@
           <w:color w:val="000000"/>
           <w:sz w:val="26"/>
           <w:szCs w:val="26"/>
+          <w:lang w:val="en-GB"/>
+        </w:rPr>
+        <w:t>/ chi tiết</w:t>
+      </w:r>
+      <w:r>
+        <w:rPr>
+          <w:rFonts w:ascii="Times New Roman" w:eastAsia="Times New Roman" w:hAnsi="Times New Roman" w:cs="Times New Roman"/>
+          <w:b/>
+          <w:bCs/>
+          <w:color w:val="000000"/>
+          <w:sz w:val="26"/>
+          <w:szCs w:val="26"/>
+          <w:lang w:val="vi-VN"/>
+        </w:rPr>
+        <w:t xml:space="preserve"> sp</w:t>
+      </w:r>
+      <w:r>
+        <w:rPr>
+          <w:rFonts w:ascii="Times New Roman" w:eastAsia="Times New Roman" w:hAnsi="Times New Roman" w:cs="Times New Roman"/>
+          <w:b/>
+          <w:bCs/>
+          <w:color w:val="000000"/>
+          <w:sz w:val="26"/>
+          <w:szCs w:val="26"/>
           <w:lang w:val="vi-VN"/>
         </w:rPr>
         <w:t>:</w:t>
@@ -391,22 +415,18 @@
       <w:pPr>
         <w:rPr>
           <w:rFonts w:ascii="Times New Roman" w:eastAsia="Times New Roman" w:hAnsi="Times New Roman" w:cs="Times New Roman"/>
-          <w:color w:val="000000"/>
-          <w:sz w:val="26"/>
-          <w:szCs w:val="26"/>
-          <w:highlight w:val="yellow"/>
-          <w:lang w:val="vi-VN"/>
-        </w:rPr>
-      </w:pPr>
-      <w:r>
-        <w:rPr>
-          <w:rFonts w:ascii="Times New Roman" w:eastAsia="Times New Roman" w:hAnsi="Times New Roman" w:cs="Times New Roman"/>
-          <w:b/>
-          <w:bCs/>
-          <w:color w:val="000000"/>
-          <w:sz w:val="26"/>
-          <w:szCs w:val="26"/>
-          <w:highlight w:val="yellow"/>
+          <w:sz w:val="26"/>
+          <w:szCs w:val="26"/>
+          <w:lang w:val="vi-VN"/>
+        </w:rPr>
+      </w:pPr>
+      <w:r>
+        <w:rPr>
+          <w:rFonts w:ascii="Times New Roman" w:eastAsia="Times New Roman" w:hAnsi="Times New Roman" w:cs="Times New Roman"/>
+          <w:b/>
+          <w:bCs/>
+          <w:sz w:val="26"/>
+          <w:szCs w:val="26"/>
           <w:lang w:val="vi-VN"/>
         </w:rPr>
         <w:t xml:space="preserve">- </w:t>
@@ -416,10 +436,8 @@
           <w:rFonts w:ascii="Times New Roman" w:eastAsia="Times New Roman" w:hAnsi="Times New Roman" w:cs="Times New Roman"/>
           <w:b/>
           <w:bCs/>
-          <w:color w:val="000000"/>
-          <w:sz w:val="26"/>
-          <w:szCs w:val="26"/>
-          <w:highlight w:val="yellow"/>
+          <w:sz w:val="26"/>
+          <w:szCs w:val="26"/>
           <w:lang w:val="vi-VN"/>
         </w:rPr>
         <w:t>Xem và tra cứu</w:t>
@@ -429,10 +447,8 @@
           <w:rFonts w:ascii="Times New Roman" w:eastAsia="Times New Roman" w:hAnsi="Times New Roman" w:cs="Times New Roman"/>
           <w:b/>
           <w:bCs/>
-          <w:color w:val="000000"/>
-          <w:sz w:val="26"/>
-          <w:szCs w:val="26"/>
-          <w:highlight w:val="yellow"/>
+          <w:sz w:val="26"/>
+          <w:szCs w:val="26"/>
           <w:lang w:val="vi-VN"/>
         </w:rPr>
         <w:t xml:space="preserve"> địa chỉ </w:t>
@@ -442,10 +458,8 @@
           <w:rFonts w:ascii="Times New Roman" w:eastAsia="Times New Roman" w:hAnsi="Times New Roman" w:cs="Times New Roman"/>
           <w:b/>
           <w:bCs/>
-          <w:color w:val="000000"/>
-          <w:sz w:val="26"/>
-          <w:szCs w:val="26"/>
-          <w:highlight w:val="yellow"/>
+          <w:sz w:val="26"/>
+          <w:szCs w:val="26"/>
           <w:lang w:val="vi-VN"/>
         </w:rPr>
         <w:t xml:space="preserve">quán: </w:t>
@@ -453,10 +467,8 @@
       <w:r>
         <w:rPr>
           <w:rFonts w:ascii="Times New Roman" w:eastAsia="Times New Roman" w:hAnsi="Times New Roman" w:cs="Times New Roman"/>
-          <w:color w:val="000000"/>
-          <w:sz w:val="26"/>
-          <w:szCs w:val="26"/>
-          <w:highlight w:val="yellow"/>
+          <w:sz w:val="26"/>
+          <w:szCs w:val="26"/>
           <w:lang w:val="vi-VN"/>
         </w:rPr>
         <w:t xml:space="preserve">Xem thông tin các địa chỉ quán và tra cứu địa </w:t>
@@ -464,10 +476,8 @@
       <w:r>
         <w:rPr>
           <w:rFonts w:ascii="Times New Roman" w:eastAsia="Times New Roman" w:hAnsi="Times New Roman" w:cs="Times New Roman"/>
-          <w:color w:val="000000"/>
-          <w:sz w:val="26"/>
-          <w:szCs w:val="26"/>
-          <w:highlight w:val="yellow"/>
+          <w:sz w:val="26"/>
+          <w:szCs w:val="26"/>
           <w:lang w:val="vi-VN"/>
         </w:rPr>
         <w:t>chỉ.</w:t>
@@ -477,55 +487,19 @@
       <w:pPr>
         <w:rPr>
           <w:rFonts w:ascii="Times New Roman" w:eastAsia="Times New Roman" w:hAnsi="Times New Roman" w:cs="Times New Roman"/>
-          <w:color w:val="000000"/>
-          <w:sz w:val="26"/>
-          <w:szCs w:val="26"/>
-          <w:lang w:val="vi-VN"/>
-        </w:rPr>
-      </w:pPr>
-      <w:r>
-        <w:rPr>
-          <w:rFonts w:ascii="Times New Roman" w:eastAsia="Times New Roman" w:hAnsi="Times New Roman" w:cs="Times New Roman"/>
-          <w:color w:val="000000"/>
-          <w:sz w:val="26"/>
-          <w:szCs w:val="26"/>
-          <w:highlight w:val="yellow"/>
-          <w:lang w:val="vi-VN"/>
-        </w:rPr>
-        <w:t>=&gt; Done (fix nhẹ =&gt; dùng dữ liệu thật 2 cửa hàng thôi</w:t>
-      </w:r>
-      <w:r>
-        <w:rPr>
-          <w:rFonts w:ascii="Times New Roman" w:eastAsia="Times New Roman" w:hAnsi="Times New Roman" w:cs="Times New Roman"/>
-          <w:color w:val="000000"/>
-          <w:sz w:val="26"/>
-          <w:szCs w:val="26"/>
-          <w:highlight w:val="yellow"/>
-          <w:lang w:val="vi-VN"/>
-        </w:rPr>
-        <w:t xml:space="preserve"> trong CSDL</w:t>
-      </w:r>
-      <w:r>
-        <w:rPr>
-          <w:rFonts w:ascii="Times New Roman" w:eastAsia="Times New Roman" w:hAnsi="Times New Roman" w:cs="Times New Roman"/>
-          <w:color w:val="000000"/>
-          <w:sz w:val="26"/>
-          <w:szCs w:val="26"/>
-          <w:highlight w:val="yellow"/>
-          <w:lang w:val="vi-VN"/>
-        </w:rPr>
-        <w:t xml:space="preserve"> =&gt; này thêm vào 9 cửa hàng thật luôn</w:t>
-      </w:r>
-      <w:r>
-        <w:rPr>
-          <w:rFonts w:ascii="Times New Roman" w:eastAsia="Times New Roman" w:hAnsi="Times New Roman" w:cs="Times New Roman"/>
-          <w:color w:val="000000"/>
-          <w:sz w:val="26"/>
-          <w:szCs w:val="26"/>
-          <w:highlight w:val="yellow"/>
-          <w:lang w:val="vi-VN"/>
-        </w:rPr>
-        <w:t>)</w:t>
+          <w:sz w:val="26"/>
+          <w:szCs w:val="26"/>
+          <w:lang w:val="vi-VN"/>
+        </w:rPr>
+      </w:pPr>
+      <w:r>
+        <w:rPr>
+          <w:rFonts w:ascii="Times New Roman" w:eastAsia="Times New Roman" w:hAnsi="Times New Roman" w:cs="Times New Roman"/>
+          <w:sz w:val="26"/>
+          <w:szCs w:val="26"/>
+          <w:lang w:val="vi-VN"/>
+        </w:rPr>
+        <w:t>=&gt; Done</w:t>
       </w:r>
     </w:p>
     <w:p>
@@ -1172,16 +1146,18 @@
           <w:rFonts w:ascii="Times New Roman" w:eastAsia="Times New Roman" w:hAnsi="Times New Roman" w:cs="Times New Roman"/>
           <w:sz w:val="26"/>
           <w:szCs w:val="26"/>
-          <w:lang w:val="vi-VN"/>
-        </w:rPr>
-      </w:pPr>
-      <w:r>
-        <w:rPr>
-          <w:rFonts w:ascii="Times New Roman" w:eastAsia="Times New Roman" w:hAnsi="Times New Roman" w:cs="Times New Roman"/>
-          <w:b/>
-          <w:bCs/>
-          <w:sz w:val="26"/>
-          <w:szCs w:val="26"/>
+          <w:highlight w:val="yellow"/>
+          <w:lang w:val="vi-VN"/>
+        </w:rPr>
+      </w:pPr>
+      <w:r>
+        <w:rPr>
+          <w:rFonts w:ascii="Times New Roman" w:eastAsia="Times New Roman" w:hAnsi="Times New Roman" w:cs="Times New Roman"/>
+          <w:b/>
+          <w:bCs/>
+          <w:sz w:val="26"/>
+          <w:szCs w:val="26"/>
+          <w:highlight w:val="yellow"/>
         </w:rPr>
         <w:t>- Theo dõi đơn hàng</w:t>
       </w:r>
@@ -1190,6 +1166,7 @@
           <w:rFonts w:ascii="Times New Roman" w:eastAsia="Times New Roman" w:hAnsi="Times New Roman" w:cs="Times New Roman"/>
           <w:sz w:val="26"/>
           <w:szCs w:val="26"/>
+          <w:highlight w:val="yellow"/>
         </w:rPr>
         <w:t>: Xem trạng thái đơn hàng thời gian thực (đang chuẩn bị, đang giao, hoàn thành...).</w:t>
       </w:r>
@@ -1198,6 +1175,7 @@
           <w:rFonts w:ascii="Times New Roman" w:eastAsia="Times New Roman" w:hAnsi="Times New Roman" w:cs="Times New Roman"/>
           <w:sz w:val="26"/>
           <w:szCs w:val="26"/>
+          <w:highlight w:val="yellow"/>
           <w:lang w:val="vi-VN"/>
         </w:rPr>
         <w:t xml:space="preserve"> </w:t>
@@ -1217,9 +1195,147 @@
           <w:rFonts w:ascii="Times New Roman" w:eastAsia="Times New Roman" w:hAnsi="Times New Roman" w:cs="Times New Roman"/>
           <w:sz w:val="26"/>
           <w:szCs w:val="26"/>
-          <w:lang w:val="vi-VN"/>
+          <w:highlight w:val="yellow"/>
+          <w:lang w:val="vi-VN"/>
+        </w:rPr>
+        <w:t>=&gt; Done</w:t>
+      </w:r>
+      <w:r>
+        <w:rPr>
+          <w:rFonts w:ascii="Times New Roman" w:eastAsia="Times New Roman" w:hAnsi="Times New Roman" w:cs="Times New Roman"/>
+          <w:sz w:val="26"/>
+          <w:szCs w:val="26"/>
+          <w:highlight w:val="yellow"/>
+          <w:lang w:val="vi-VN"/>
+        </w:rPr>
+        <w:t xml:space="preserve"> (Fix =&gt; ko cần refresh lại trang bên admin xác nhận thì bên kia hiện luôn)</w:t>
+      </w:r>
+    </w:p>
+    <w:p>
+      <w:pPr>
+        <w:rPr>
+          <w:rFonts w:ascii="Times New Roman" w:eastAsia="Times New Roman" w:hAnsi="Times New Roman" w:cs="Times New Roman"/>
+          <w:sz w:val="26"/>
+          <w:szCs w:val="26"/>
+        </w:rPr>
+      </w:pPr>
+      <w:r>
+        <w:rPr>
+          <w:rFonts w:ascii="Times New Roman" w:eastAsia="Times New Roman" w:hAnsi="Times New Roman" w:cs="Times New Roman"/>
+          <w:b/>
+          <w:bCs/>
+          <w:sz w:val="26"/>
+          <w:szCs w:val="26"/>
         </w:rPr>
         <w:lastRenderedPageBreak/>
+        <w:t>- Quản lý đặt hàng</w:t>
+      </w:r>
+      <w:r>
+        <w:rPr>
+          <w:rFonts w:ascii="Times New Roman" w:eastAsia="Times New Roman" w:hAnsi="Times New Roman" w:cs="Times New Roman"/>
+          <w:sz w:val="26"/>
+          <w:szCs w:val="26"/>
+        </w:rPr>
+        <w:t>:</w:t>
+      </w:r>
+    </w:p>
+    <w:p>
+      <w:pPr>
+        <w:rPr>
+          <w:rFonts w:ascii="Times New Roman" w:eastAsia="Times New Roman" w:hAnsi="Times New Roman" w:cs="Times New Roman"/>
+          <w:sz w:val="26"/>
+          <w:szCs w:val="26"/>
+          <w:lang w:val="vi-VN"/>
+        </w:rPr>
+      </w:pPr>
+      <w:r>
+        <w:rPr>
+          <w:rFonts w:ascii="Times New Roman" w:eastAsia="Times New Roman" w:hAnsi="Times New Roman" w:cs="Times New Roman"/>
+          <w:sz w:val="26"/>
+          <w:szCs w:val="26"/>
+        </w:rPr>
+        <w:t>+ Đặt hàng (với chọn khung giờ giao/lịch nhận hàng): Chọn món, thêm vào giỏ hàng, chọn thời gian nhận và xác nhận đơn.</w:t>
+      </w:r>
+      <w:r>
+        <w:rPr>
+          <w:rFonts w:ascii="Times New Roman" w:eastAsia="Times New Roman" w:hAnsi="Times New Roman" w:cs="Times New Roman"/>
+          <w:sz w:val="26"/>
+          <w:szCs w:val="26"/>
+          <w:lang w:val="vi-VN"/>
+        </w:rPr>
+        <w:t xml:space="preserve"> </w:t>
+      </w:r>
+    </w:p>
+    <w:p>
+      <w:pPr>
+        <w:rPr>
+          <w:rFonts w:ascii="Times New Roman" w:eastAsia="Times New Roman" w:hAnsi="Times New Roman" w:cs="Times New Roman"/>
+          <w:sz w:val="26"/>
+          <w:szCs w:val="26"/>
+          <w:lang w:val="vi-VN"/>
+        </w:rPr>
+      </w:pPr>
+      <w:r>
+        <w:rPr>
+          <w:rFonts w:ascii="Times New Roman" w:eastAsia="Times New Roman" w:hAnsi="Times New Roman" w:cs="Times New Roman"/>
+          <w:sz w:val="26"/>
+          <w:szCs w:val="26"/>
+        </w:rPr>
+        <w:t>+ Chỉnh sửa thông tin đơn hàng: Thay đổi món, số lượng hoặc ghi chú trước khi đơn được xác nhận.</w:t>
+      </w:r>
+      <w:r>
+        <w:rPr>
+          <w:rFonts w:ascii="Times New Roman" w:eastAsia="Times New Roman" w:hAnsi="Times New Roman" w:cs="Times New Roman"/>
+          <w:sz w:val="26"/>
+          <w:szCs w:val="26"/>
+          <w:lang w:val="vi-VN"/>
+        </w:rPr>
+        <w:t xml:space="preserve"> </w:t>
+      </w:r>
+      <w:r>
+        <w:rPr>
+          <w:rFonts w:ascii="Times New Roman" w:eastAsia="Times New Roman" w:hAnsi="Times New Roman" w:cs="Times New Roman"/>
+          <w:sz w:val="26"/>
+          <w:szCs w:val="26"/>
+          <w:lang w:val="vi-VN"/>
+        </w:rPr>
+        <w:t xml:space="preserve"> </w:t>
+      </w:r>
+    </w:p>
+    <w:p>
+      <w:pPr>
+        <w:rPr>
+          <w:rFonts w:ascii="Times New Roman" w:eastAsia="Times New Roman" w:hAnsi="Times New Roman" w:cs="Times New Roman"/>
+          <w:sz w:val="26"/>
+          <w:szCs w:val="26"/>
+          <w:lang w:val="vi-VN"/>
+        </w:rPr>
+      </w:pPr>
+      <w:r>
+        <w:rPr>
+          <w:rFonts w:ascii="Times New Roman" w:eastAsia="Times New Roman" w:hAnsi="Times New Roman" w:cs="Times New Roman"/>
+          <w:sz w:val="26"/>
+          <w:szCs w:val="26"/>
+        </w:rPr>
+        <w:t>+ Hủy đơn hàng: Hủy đơn trước khi cửa hàng tiếp nhận, kèm lý do nếu cần.</w:t>
+      </w:r>
+    </w:p>
+    <w:p>
+      <w:pPr>
+        <w:rPr>
+          <w:rFonts w:ascii="Times New Roman" w:eastAsia="Times New Roman" w:hAnsi="Times New Roman" w:cs="Times New Roman"/>
+          <w:sz w:val="26"/>
+          <w:szCs w:val="26"/>
+          <w:lang w:val="vi-VN"/>
+        </w:rPr>
+      </w:pPr>
+      <w:r>
+        <w:rPr>
+          <w:rFonts w:ascii="Times New Roman" w:eastAsia="Times New Roman" w:hAnsi="Times New Roman" w:cs="Times New Roman"/>
+          <w:sz w:val="26"/>
+          <w:szCs w:val="26"/>
+          <w:lang w:val="vi-VN"/>
+        </w:rPr>
         <w:t>=&gt; Done</w:t>
       </w:r>
     </w:p>
@@ -1229,43 +1345,26 @@
           <w:rFonts w:ascii="Times New Roman" w:eastAsia="Times New Roman" w:hAnsi="Times New Roman" w:cs="Times New Roman"/>
           <w:sz w:val="26"/>
           <w:szCs w:val="26"/>
-        </w:rPr>
-      </w:pPr>
-      <w:r>
-        <w:rPr>
-          <w:rFonts w:ascii="Times New Roman" w:eastAsia="Times New Roman" w:hAnsi="Times New Roman" w:cs="Times New Roman"/>
-          <w:b/>
-          <w:bCs/>
-          <w:sz w:val="26"/>
-          <w:szCs w:val="26"/>
-        </w:rPr>
-        <w:t>- Quản lý đặt hàng</w:t>
-      </w:r>
-      <w:r>
-        <w:rPr>
-          <w:rFonts w:ascii="Times New Roman" w:eastAsia="Times New Roman" w:hAnsi="Times New Roman" w:cs="Times New Roman"/>
-          <w:sz w:val="26"/>
-          <w:szCs w:val="26"/>
-        </w:rPr>
-        <w:t>:</w:t>
-      </w:r>
-    </w:p>
-    <w:p>
-      <w:pPr>
-        <w:rPr>
-          <w:rFonts w:ascii="Times New Roman" w:eastAsia="Times New Roman" w:hAnsi="Times New Roman" w:cs="Times New Roman"/>
-          <w:sz w:val="26"/>
-          <w:szCs w:val="26"/>
-          <w:lang w:val="vi-VN"/>
-        </w:rPr>
-      </w:pPr>
-      <w:r>
-        <w:rPr>
-          <w:rFonts w:ascii="Times New Roman" w:eastAsia="Times New Roman" w:hAnsi="Times New Roman" w:cs="Times New Roman"/>
-          <w:sz w:val="26"/>
-          <w:szCs w:val="26"/>
-        </w:rPr>
-        <w:t>+ Đặt hàng (với chọn khung giờ giao/lịch nhận hàng): Chọn món, thêm vào giỏ hàng, chọn thời gian nhận và xác nhận đơn.</w:t>
+          <w:lang w:val="vi-VN"/>
+        </w:rPr>
+      </w:pPr>
+      <w:r>
+        <w:rPr>
+          <w:rFonts w:ascii="Times New Roman" w:eastAsia="Times New Roman" w:hAnsi="Times New Roman" w:cs="Times New Roman"/>
+          <w:b/>
+          <w:bCs/>
+          <w:sz w:val="26"/>
+          <w:szCs w:val="26"/>
+        </w:rPr>
+        <w:t>- Quản lý địa chỉ giao hàng</w:t>
+      </w:r>
+      <w:r>
+        <w:rPr>
+          <w:rFonts w:ascii="Times New Roman" w:eastAsia="Times New Roman" w:hAnsi="Times New Roman" w:cs="Times New Roman"/>
+          <w:sz w:val="26"/>
+          <w:szCs w:val="26"/>
+        </w:rPr>
+        <w:t>: Thêm, sửa, xóa hoặc đặt địa chỉ mặc định cho các đơn giao hàng.</w:t>
       </w:r>
       <w:r>
         <w:rPr>
@@ -1291,8 +1390,37 @@
           <w:rFonts w:ascii="Times New Roman" w:eastAsia="Times New Roman" w:hAnsi="Times New Roman" w:cs="Times New Roman"/>
           <w:sz w:val="26"/>
           <w:szCs w:val="26"/>
-        </w:rPr>
-        <w:t>+ Chỉnh sửa thông tin đơn hàng: Thay đổi món, số lượng hoặc ghi chú trước khi đơn được xác nhận.</w:t>
+          <w:lang w:val="vi-VN"/>
+        </w:rPr>
+        <w:t>=&gt; Done</w:t>
+      </w:r>
+    </w:p>
+    <w:p>
+      <w:pPr>
+        <w:rPr>
+          <w:rFonts w:ascii="Times New Roman" w:eastAsia="Times New Roman" w:hAnsi="Times New Roman" w:cs="Times New Roman"/>
+          <w:sz w:val="26"/>
+          <w:szCs w:val="26"/>
+          <w:lang w:val="vi-VN"/>
+        </w:rPr>
+      </w:pPr>
+      <w:r>
+        <w:rPr>
+          <w:rFonts w:ascii="Times New Roman" w:eastAsia="Times New Roman" w:hAnsi="Times New Roman" w:cs="Times New Roman"/>
+          <w:b/>
+          <w:bCs/>
+          <w:sz w:val="26"/>
+          <w:szCs w:val="26"/>
+        </w:rPr>
+        <w:t>- Xem lịch sử đơn hàng chi tiết</w:t>
+      </w:r>
+      <w:r>
+        <w:rPr>
+          <w:rFonts w:ascii="Times New Roman" w:eastAsia="Times New Roman" w:hAnsi="Times New Roman" w:cs="Times New Roman"/>
+          <w:sz w:val="26"/>
+          <w:szCs w:val="26"/>
+        </w:rPr>
+        <w:t>: Tra cứu các đơn hàng cũ với thông tin món, giá trị, ngày giờ và trạng thái.</w:t>
       </w:r>
       <w:r>
         <w:rPr>
@@ -1303,6 +1431,62 @@
         </w:rPr>
         <w:t xml:space="preserve"> </w:t>
       </w:r>
+    </w:p>
+    <w:p>
+      <w:pPr>
+        <w:rPr>
+          <w:rFonts w:ascii="Times New Roman" w:eastAsia="Times New Roman" w:hAnsi="Times New Roman" w:cs="Times New Roman"/>
+          <w:sz w:val="26"/>
+          <w:szCs w:val="26"/>
+          <w:lang w:val="vi-VN"/>
+        </w:rPr>
+      </w:pPr>
+      <w:r>
+        <w:rPr>
+          <w:rFonts w:ascii="Times New Roman" w:eastAsia="Times New Roman" w:hAnsi="Times New Roman" w:cs="Times New Roman"/>
+          <w:sz w:val="26"/>
+          <w:szCs w:val="26"/>
+          <w:lang w:val="vi-VN"/>
+        </w:rPr>
+        <w:t xml:space="preserve">=&gt; </w:t>
+      </w:r>
+      <w:r>
+        <w:rPr>
+          <w:rFonts w:ascii="Times New Roman" w:eastAsia="Times New Roman" w:hAnsi="Times New Roman" w:cs="Times New Roman"/>
+          <w:sz w:val="26"/>
+          <w:szCs w:val="26"/>
+          <w:lang w:val="vi-VN"/>
+        </w:rPr>
+        <w:t>Done</w:t>
+      </w:r>
+    </w:p>
+    <w:p>
+      <w:pPr>
+        <w:rPr>
+          <w:rFonts w:ascii="Times New Roman" w:eastAsia="Times New Roman" w:hAnsi="Times New Roman" w:cs="Times New Roman"/>
+          <w:sz w:val="26"/>
+          <w:szCs w:val="26"/>
+          <w:lang w:val="vi-VN"/>
+        </w:rPr>
+      </w:pPr>
+      <w:r>
+        <w:rPr>
+          <w:rFonts w:ascii="Times New Roman" w:eastAsia="Times New Roman" w:hAnsi="Times New Roman" w:cs="Times New Roman"/>
+          <w:b/>
+          <w:bCs/>
+          <w:sz w:val="26"/>
+          <w:szCs w:val="26"/>
+        </w:rPr>
+        <w:t>- Thanh toán</w:t>
+      </w:r>
+      <w:r>
+        <w:rPr>
+          <w:rFonts w:ascii="Times New Roman" w:eastAsia="Times New Roman" w:hAnsi="Times New Roman" w:cs="Times New Roman"/>
+          <w:sz w:val="26"/>
+          <w:szCs w:val="26"/>
+        </w:rPr>
+        <w:t>: Thực hiện thanh toán online qua ví điện tử, thẻ hoặc COD khi đặt hàng.</w:t>
+      </w:r>
       <w:r>
         <w:rPr>
           <w:rFonts w:ascii="Times New Roman" w:eastAsia="Times New Roman" w:hAnsi="Times New Roman" w:cs="Times New Roman"/>
@@ -1319,69 +1503,64 @@
           <w:rFonts w:ascii="Times New Roman" w:eastAsia="Times New Roman" w:hAnsi="Times New Roman" w:cs="Times New Roman"/>
           <w:sz w:val="26"/>
           <w:szCs w:val="26"/>
-          <w:lang w:val="vi-VN"/>
-        </w:rPr>
-      </w:pPr>
-      <w:r>
-        <w:rPr>
-          <w:rFonts w:ascii="Times New Roman" w:eastAsia="Times New Roman" w:hAnsi="Times New Roman" w:cs="Times New Roman"/>
-          <w:sz w:val="26"/>
-          <w:szCs w:val="26"/>
-        </w:rPr>
-        <w:t>+ Hủy đơn hàng: Hủy đơn trước khi cửa hàng tiếp nhận, kèm lý do nếu cần.</w:t>
-      </w:r>
-    </w:p>
-    <w:p>
-      <w:pPr>
-        <w:rPr>
-          <w:rFonts w:ascii="Times New Roman" w:eastAsia="Times New Roman" w:hAnsi="Times New Roman" w:cs="Times New Roman"/>
-          <w:sz w:val="26"/>
-          <w:szCs w:val="26"/>
-          <w:lang w:val="vi-VN"/>
-        </w:rPr>
-      </w:pPr>
-      <w:r>
-        <w:rPr>
-          <w:rFonts w:ascii="Times New Roman" w:eastAsia="Times New Roman" w:hAnsi="Times New Roman" w:cs="Times New Roman"/>
-          <w:sz w:val="26"/>
-          <w:szCs w:val="26"/>
-          <w:lang w:val="vi-VN"/>
-        </w:rPr>
-        <w:t>=&gt; Done</w:t>
-      </w:r>
-    </w:p>
-    <w:p>
-      <w:pPr>
-        <w:rPr>
-          <w:rFonts w:ascii="Times New Roman" w:eastAsia="Times New Roman" w:hAnsi="Times New Roman" w:cs="Times New Roman"/>
-          <w:sz w:val="26"/>
-          <w:szCs w:val="26"/>
-          <w:lang w:val="vi-VN"/>
-        </w:rPr>
-      </w:pPr>
-      <w:r>
-        <w:rPr>
-          <w:rFonts w:ascii="Times New Roman" w:eastAsia="Times New Roman" w:hAnsi="Times New Roman" w:cs="Times New Roman"/>
-          <w:b/>
-          <w:bCs/>
-          <w:sz w:val="26"/>
-          <w:szCs w:val="26"/>
-        </w:rPr>
-        <w:t>- Quản lý địa chỉ giao hàng</w:t>
-      </w:r>
-      <w:r>
-        <w:rPr>
-          <w:rFonts w:ascii="Times New Roman" w:eastAsia="Times New Roman" w:hAnsi="Times New Roman" w:cs="Times New Roman"/>
-          <w:sz w:val="26"/>
-          <w:szCs w:val="26"/>
-        </w:rPr>
-        <w:t>: Thêm, sửa, xóa hoặc đặt địa chỉ mặc định cho các đơn giao hàng.</w:t>
-      </w:r>
-      <w:r>
-        <w:rPr>
-          <w:rFonts w:ascii="Times New Roman" w:eastAsia="Times New Roman" w:hAnsi="Times New Roman" w:cs="Times New Roman"/>
-          <w:sz w:val="26"/>
-          <w:szCs w:val="26"/>
+          <w:lang w:val="en-GB"/>
+        </w:rPr>
+      </w:pPr>
+      <w:r>
+        <w:rPr>
+          <w:rFonts w:ascii="Times New Roman" w:eastAsia="Times New Roman" w:hAnsi="Times New Roman" w:cs="Times New Roman"/>
+          <w:sz w:val="26"/>
+          <w:szCs w:val="26"/>
+          <w:lang w:val="en-GB"/>
+        </w:rPr>
+        <w:t xml:space="preserve">=&gt; </w:t>
+      </w:r>
+      <w:r>
+        <w:rPr>
+          <w:rFonts w:ascii="Times New Roman" w:eastAsia="Times New Roman" w:hAnsi="Times New Roman" w:cs="Times New Roman"/>
+          <w:sz w:val="26"/>
+          <w:szCs w:val="26"/>
+          <w:lang w:val="en-GB"/>
+        </w:rPr>
+        <w:t>Done</w:t>
+      </w:r>
+    </w:p>
+    <w:p>
+      <w:pPr>
+        <w:rPr>
+          <w:rFonts w:ascii="Times New Roman" w:eastAsia="Times New Roman" w:hAnsi="Times New Roman" w:cs="Times New Roman"/>
+          <w:sz w:val="26"/>
+          <w:szCs w:val="26"/>
+          <w:highlight w:val="yellow"/>
+          <w:lang w:val="vi-VN"/>
+        </w:rPr>
+      </w:pPr>
+      <w:r>
+        <w:rPr>
+          <w:rFonts w:ascii="Times New Roman" w:eastAsia="Times New Roman" w:hAnsi="Times New Roman" w:cs="Times New Roman"/>
+          <w:b/>
+          <w:bCs/>
+          <w:sz w:val="26"/>
+          <w:szCs w:val="26"/>
+          <w:highlight w:val="yellow"/>
+        </w:rPr>
+        <w:t>- Đánh giá &amp; Phản hồi</w:t>
+      </w:r>
+      <w:r>
+        <w:rPr>
+          <w:rFonts w:ascii="Times New Roman" w:eastAsia="Times New Roman" w:hAnsi="Times New Roman" w:cs="Times New Roman"/>
+          <w:sz w:val="26"/>
+          <w:szCs w:val="26"/>
+          <w:highlight w:val="yellow"/>
+        </w:rPr>
+        <w:t>: Đánh giá món ăn, dịch vụ và gửi phản hồi sau khi nhận hàng.</w:t>
+      </w:r>
+      <w:r>
+        <w:rPr>
+          <w:rFonts w:ascii="Times New Roman" w:eastAsia="Times New Roman" w:hAnsi="Times New Roman" w:cs="Times New Roman"/>
+          <w:sz w:val="26"/>
+          <w:szCs w:val="26"/>
+          <w:highlight w:val="yellow"/>
           <w:lang w:val="vi-VN"/>
         </w:rPr>
         <w:t xml:space="preserve"> </w:t>
@@ -1401,43 +1580,68 @@
           <w:rFonts w:ascii="Times New Roman" w:eastAsia="Times New Roman" w:hAnsi="Times New Roman" w:cs="Times New Roman"/>
           <w:sz w:val="26"/>
           <w:szCs w:val="26"/>
-          <w:lang w:val="vi-VN"/>
-        </w:rPr>
-        <w:t>=&gt; Done</w:t>
-      </w:r>
-    </w:p>
-    <w:p>
-      <w:pPr>
-        <w:rPr>
-          <w:rFonts w:ascii="Times New Roman" w:eastAsia="Times New Roman" w:hAnsi="Times New Roman" w:cs="Times New Roman"/>
-          <w:sz w:val="26"/>
-          <w:szCs w:val="26"/>
-          <w:lang w:val="vi-VN"/>
-        </w:rPr>
-      </w:pPr>
-      <w:r>
-        <w:rPr>
-          <w:rFonts w:ascii="Times New Roman" w:eastAsia="Times New Roman" w:hAnsi="Times New Roman" w:cs="Times New Roman"/>
-          <w:b/>
-          <w:bCs/>
-          <w:sz w:val="26"/>
-          <w:szCs w:val="26"/>
-        </w:rPr>
-        <w:t>- Xem lịch sử đơn hàng chi tiết</w:t>
-      </w:r>
-      <w:r>
-        <w:rPr>
-          <w:rFonts w:ascii="Times New Roman" w:eastAsia="Times New Roman" w:hAnsi="Times New Roman" w:cs="Times New Roman"/>
-          <w:sz w:val="26"/>
-          <w:szCs w:val="26"/>
-        </w:rPr>
-        <w:t>: Tra cứu các đơn hàng cũ với thông tin món, giá trị, ngày giờ và trạng thái.</w:t>
-      </w:r>
-      <w:r>
-        <w:rPr>
-          <w:rFonts w:ascii="Times New Roman" w:eastAsia="Times New Roman" w:hAnsi="Times New Roman" w:cs="Times New Roman"/>
-          <w:sz w:val="26"/>
-          <w:szCs w:val="26"/>
+          <w:highlight w:val="yellow"/>
+          <w:lang w:val="vi-VN"/>
+        </w:rPr>
+        <w:t xml:space="preserve">=&gt; </w:t>
+      </w:r>
+      <w:r>
+        <w:rPr>
+          <w:rFonts w:ascii="Times New Roman" w:eastAsia="Times New Roman" w:hAnsi="Times New Roman" w:cs="Times New Roman"/>
+          <w:sz w:val="26"/>
+          <w:szCs w:val="26"/>
+          <w:highlight w:val="yellow"/>
+          <w:lang w:val="en-GB"/>
+        </w:rPr>
+        <w:t>Done</w:t>
+      </w:r>
+      <w:r>
+        <w:rPr>
+          <w:rFonts w:ascii="Times New Roman" w:eastAsia="Times New Roman" w:hAnsi="Times New Roman" w:cs="Times New Roman"/>
+          <w:sz w:val="26"/>
+          <w:szCs w:val="26"/>
+          <w:highlight w:val="yellow"/>
+          <w:lang w:val="vi-VN"/>
+        </w:rPr>
+        <w:t xml:space="preserve"> (Fix nhẹ =&gt; giao diện nhiều ng bình luận)</w:t>
+      </w:r>
+    </w:p>
+    <w:p>
+      <w:pPr>
+        <w:rPr>
+          <w:rFonts w:ascii="Times New Roman" w:eastAsia="Times New Roman" w:hAnsi="Times New Roman" w:cs="Times New Roman"/>
+          <w:sz w:val="26"/>
+          <w:szCs w:val="26"/>
+          <w:highlight w:val="yellow"/>
+          <w:lang w:val="vi-VN"/>
+        </w:rPr>
+      </w:pPr>
+      <w:r>
+        <w:rPr>
+          <w:rFonts w:ascii="Times New Roman" w:eastAsia="Times New Roman" w:hAnsi="Times New Roman" w:cs="Times New Roman"/>
+          <w:b/>
+          <w:bCs/>
+          <w:sz w:val="26"/>
+          <w:szCs w:val="26"/>
+          <w:highlight w:val="yellow"/>
+        </w:rPr>
+        <w:t>- Xem gợi ý món ăn/thức uống</w:t>
+      </w:r>
+      <w:r>
+        <w:rPr>
+          <w:rFonts w:ascii="Times New Roman" w:eastAsia="Times New Roman" w:hAnsi="Times New Roman" w:cs="Times New Roman"/>
+          <w:sz w:val="26"/>
+          <w:szCs w:val="26"/>
+          <w:highlight w:val="yellow"/>
+        </w:rPr>
+        <w:t>: Nhận đề xuất món dựa trên lịch sử đặt hàng hoặc khuyến mãi.</w:t>
+      </w:r>
+      <w:r>
+        <w:rPr>
+          <w:rFonts w:ascii="Times New Roman" w:eastAsia="Times New Roman" w:hAnsi="Times New Roman" w:cs="Times New Roman"/>
+          <w:sz w:val="26"/>
+          <w:szCs w:val="26"/>
+          <w:highlight w:val="yellow"/>
           <w:lang w:val="vi-VN"/>
         </w:rPr>
         <w:t xml:space="preserve"> </w:t>
@@ -1457,6 +1661,7 @@
           <w:rFonts w:ascii="Times New Roman" w:eastAsia="Times New Roman" w:hAnsi="Times New Roman" w:cs="Times New Roman"/>
           <w:sz w:val="26"/>
           <w:szCs w:val="26"/>
+          <w:highlight w:val="yellow"/>
           <w:lang w:val="vi-VN"/>
         </w:rPr>
         <w:t xml:space="preserve">=&gt; </w:t>
@@ -1466,240 +1671,20 @@
           <w:rFonts w:ascii="Times New Roman" w:eastAsia="Times New Roman" w:hAnsi="Times New Roman" w:cs="Times New Roman"/>
           <w:sz w:val="26"/>
           <w:szCs w:val="26"/>
+          <w:highlight w:val="yellow"/>
           <w:lang w:val="vi-VN"/>
         </w:rPr>
         <w:t>Done</w:t>
       </w:r>
-    </w:p>
-    <w:p>
-      <w:pPr>
-        <w:rPr>
-          <w:rFonts w:ascii="Times New Roman" w:eastAsia="Times New Roman" w:hAnsi="Times New Roman" w:cs="Times New Roman"/>
-          <w:sz w:val="26"/>
-          <w:szCs w:val="26"/>
-          <w:lang w:val="vi-VN"/>
-        </w:rPr>
-      </w:pPr>
-      <w:r>
-        <w:rPr>
-          <w:rFonts w:ascii="Times New Roman" w:eastAsia="Times New Roman" w:hAnsi="Times New Roman" w:cs="Times New Roman"/>
-          <w:b/>
-          <w:bCs/>
-          <w:sz w:val="26"/>
-          <w:szCs w:val="26"/>
-        </w:rPr>
-        <w:t>- Thanh toán</w:t>
-      </w:r>
-      <w:r>
-        <w:rPr>
-          <w:rFonts w:ascii="Times New Roman" w:eastAsia="Times New Roman" w:hAnsi="Times New Roman" w:cs="Times New Roman"/>
-          <w:sz w:val="26"/>
-          <w:szCs w:val="26"/>
-        </w:rPr>
-        <w:t>: Thực hiện thanh toán online qua ví điện tử, thẻ hoặc COD khi đặt hàng.</w:t>
-      </w:r>
-      <w:r>
-        <w:rPr>
-          <w:rFonts w:ascii="Times New Roman" w:eastAsia="Times New Roman" w:hAnsi="Times New Roman" w:cs="Times New Roman"/>
-          <w:sz w:val="26"/>
-          <w:szCs w:val="26"/>
-          <w:lang w:val="vi-VN"/>
-        </w:rPr>
-        <w:t xml:space="preserve"> </w:t>
-      </w:r>
-    </w:p>
-    <w:p>
-      <w:pPr>
-        <w:rPr>
-          <w:rFonts w:ascii="Times New Roman" w:eastAsia="Times New Roman" w:hAnsi="Times New Roman" w:cs="Times New Roman"/>
-          <w:sz w:val="26"/>
-          <w:szCs w:val="26"/>
-          <w:lang w:val="en-GB"/>
-        </w:rPr>
-      </w:pPr>
-      <w:r>
-        <w:rPr>
-          <w:rFonts w:ascii="Times New Roman" w:eastAsia="Times New Roman" w:hAnsi="Times New Roman" w:cs="Times New Roman"/>
-          <w:sz w:val="26"/>
-          <w:szCs w:val="26"/>
-          <w:lang w:val="en-GB"/>
-        </w:rPr>
-        <w:t xml:space="preserve">=&gt; </w:t>
-      </w:r>
-      <w:r>
-        <w:rPr>
-          <w:rFonts w:ascii="Times New Roman" w:eastAsia="Times New Roman" w:hAnsi="Times New Roman" w:cs="Times New Roman"/>
-          <w:sz w:val="26"/>
-          <w:szCs w:val="26"/>
-          <w:lang w:val="en-GB"/>
-        </w:rPr>
-        <w:t>Done</w:t>
-      </w:r>
-    </w:p>
-    <w:p>
-      <w:pPr>
-        <w:rPr>
-          <w:rFonts w:ascii="Times New Roman" w:eastAsia="Times New Roman" w:hAnsi="Times New Roman" w:cs="Times New Roman"/>
-          <w:sz w:val="26"/>
-          <w:szCs w:val="26"/>
-          <w:highlight w:val="yellow"/>
-          <w:lang w:val="vi-VN"/>
-        </w:rPr>
-      </w:pPr>
-      <w:r>
-        <w:rPr>
-          <w:rFonts w:ascii="Times New Roman" w:eastAsia="Times New Roman" w:hAnsi="Times New Roman" w:cs="Times New Roman"/>
-          <w:b/>
-          <w:bCs/>
-          <w:sz w:val="26"/>
-          <w:szCs w:val="26"/>
-          <w:highlight w:val="yellow"/>
-        </w:rPr>
-        <w:t>- Đánh giá &amp; Phản hồi</w:t>
-      </w:r>
-      <w:r>
-        <w:rPr>
-          <w:rFonts w:ascii="Times New Roman" w:eastAsia="Times New Roman" w:hAnsi="Times New Roman" w:cs="Times New Roman"/>
-          <w:sz w:val="26"/>
-          <w:szCs w:val="26"/>
-          <w:highlight w:val="yellow"/>
-        </w:rPr>
-        <w:t>: Đánh giá món ăn, dịch vụ và gửi phản hồi sau khi nhận hàng.</w:t>
-      </w:r>
-      <w:r>
-        <w:rPr>
-          <w:rFonts w:ascii="Times New Roman" w:eastAsia="Times New Roman" w:hAnsi="Times New Roman" w:cs="Times New Roman"/>
-          <w:sz w:val="26"/>
-          <w:szCs w:val="26"/>
-          <w:highlight w:val="yellow"/>
-          <w:lang w:val="vi-VN"/>
-        </w:rPr>
-        <w:t xml:space="preserve"> </w:t>
-      </w:r>
-    </w:p>
-    <w:p>
-      <w:pPr>
-        <w:rPr>
-          <w:rFonts w:ascii="Times New Roman" w:eastAsia="Times New Roman" w:hAnsi="Times New Roman" w:cs="Times New Roman"/>
-          <w:sz w:val="26"/>
-          <w:szCs w:val="26"/>
-          <w:lang w:val="en-GB"/>
-        </w:rPr>
-      </w:pPr>
-      <w:r>
-        <w:rPr>
-          <w:rFonts w:ascii="Times New Roman" w:eastAsia="Times New Roman" w:hAnsi="Times New Roman" w:cs="Times New Roman"/>
-          <w:sz w:val="26"/>
-          <w:szCs w:val="26"/>
-          <w:highlight w:val="yellow"/>
-          <w:lang w:val="vi-VN"/>
-        </w:rPr>
-        <w:t xml:space="preserve">=&gt; </w:t>
-      </w:r>
-      <w:r>
-        <w:rPr>
-          <w:rFonts w:ascii="Times New Roman" w:eastAsia="Times New Roman" w:hAnsi="Times New Roman" w:cs="Times New Roman"/>
-          <w:sz w:val="26"/>
-          <w:szCs w:val="26"/>
-          <w:highlight w:val="yellow"/>
-          <w:lang w:val="en-GB"/>
-        </w:rPr>
-        <w:t>Done (</w:t>
-      </w:r>
-      <w:r>
-        <w:rPr>
-          <w:rFonts w:ascii="Times New Roman" w:eastAsia="Times New Roman" w:hAnsi="Times New Roman" w:cs="Times New Roman"/>
-          <w:sz w:val="26"/>
-          <w:szCs w:val="26"/>
-          <w:highlight w:val="yellow"/>
-          <w:lang w:val="vi-VN"/>
-        </w:rPr>
-        <w:t>Fix nhẹ =&gt; được fix nhẹ giao diện tí để sau</w:t>
-      </w:r>
-      <w:r>
-        <w:rPr>
-          <w:rFonts w:ascii="Times New Roman" w:eastAsia="Times New Roman" w:hAnsi="Times New Roman" w:cs="Times New Roman"/>
-          <w:sz w:val="26"/>
-          <w:szCs w:val="26"/>
-          <w:highlight w:val="yellow"/>
-          <w:lang w:val="vi-VN"/>
-        </w:rPr>
-        <w:t xml:space="preserve"> =&gt; thêm xóa sửa cũng oke</w:t>
-      </w:r>
-      <w:r>
-        <w:rPr>
-          <w:rFonts w:ascii="Times New Roman" w:eastAsia="Times New Roman" w:hAnsi="Times New Roman" w:cs="Times New Roman"/>
-          <w:sz w:val="26"/>
-          <w:szCs w:val="26"/>
-          <w:highlight w:val="yellow"/>
-          <w:lang w:val="en-GB"/>
-        </w:rPr>
-        <w:t>)</w:t>
-      </w:r>
-    </w:p>
-    <w:p>
-      <w:pPr>
-        <w:rPr>
-          <w:rFonts w:ascii="Times New Roman" w:eastAsia="Times New Roman" w:hAnsi="Times New Roman" w:cs="Times New Roman"/>
-          <w:sz w:val="26"/>
-          <w:szCs w:val="26"/>
-          <w:lang w:val="vi-VN"/>
-        </w:rPr>
-      </w:pPr>
-      <w:r>
-        <w:rPr>
-          <w:rFonts w:ascii="Times New Roman" w:eastAsia="Times New Roman" w:hAnsi="Times New Roman" w:cs="Times New Roman"/>
-          <w:b/>
-          <w:bCs/>
-          <w:sz w:val="26"/>
-          <w:szCs w:val="26"/>
-        </w:rPr>
-        <w:t>- Xem gợi ý món ăn/thức uống</w:t>
-      </w:r>
-      <w:r>
-        <w:rPr>
-          <w:rFonts w:ascii="Times New Roman" w:eastAsia="Times New Roman" w:hAnsi="Times New Roman" w:cs="Times New Roman"/>
-          <w:sz w:val="26"/>
-          <w:szCs w:val="26"/>
-        </w:rPr>
-        <w:t>: Nhận đề xuất món dựa trên lịch sử đặt hàng hoặc khuyến mãi.</w:t>
-      </w:r>
-      <w:r>
-        <w:rPr>
-          <w:rFonts w:ascii="Times New Roman" w:eastAsia="Times New Roman" w:hAnsi="Times New Roman" w:cs="Times New Roman"/>
-          <w:sz w:val="26"/>
-          <w:szCs w:val="26"/>
-          <w:lang w:val="vi-VN"/>
-        </w:rPr>
-        <w:t xml:space="preserve"> </w:t>
-      </w:r>
-    </w:p>
-    <w:p>
-      <w:pPr>
-        <w:rPr>
-          <w:rFonts w:ascii="Times New Roman" w:eastAsia="Times New Roman" w:hAnsi="Times New Roman" w:cs="Times New Roman"/>
-          <w:sz w:val="26"/>
-          <w:szCs w:val="26"/>
-          <w:lang w:val="vi-VN"/>
-        </w:rPr>
-      </w:pPr>
-      <w:r>
-        <w:rPr>
-          <w:rFonts w:ascii="Times New Roman" w:eastAsia="Times New Roman" w:hAnsi="Times New Roman" w:cs="Times New Roman"/>
-          <w:sz w:val="26"/>
-          <w:szCs w:val="26"/>
-          <w:lang w:val="vi-VN"/>
-        </w:rPr>
-        <w:t xml:space="preserve">=&gt; </w:t>
-      </w:r>
-      <w:r>
-        <w:rPr>
-          <w:rFonts w:ascii="Times New Roman" w:eastAsia="Times New Roman" w:hAnsi="Times New Roman" w:cs="Times New Roman"/>
-          <w:sz w:val="26"/>
-          <w:szCs w:val="26"/>
-          <w:lang w:val="vi-VN"/>
-        </w:rPr>
-        <w:t>Done</w:t>
+      <w:r>
+        <w:rPr>
+          <w:rFonts w:ascii="Times New Roman" w:eastAsia="Times New Roman" w:hAnsi="Times New Roman" w:cs="Times New Roman"/>
+          <w:sz w:val="26"/>
+          <w:szCs w:val="26"/>
+          <w:highlight w:val="yellow"/>
+          <w:lang w:val="vi-VN"/>
+        </w:rPr>
+        <w:t xml:space="preserve"> (Xem lại có cập nhật theo thời gian thực khi có thay đổi dữ liệu không)</w:t>
       </w:r>
     </w:p>
     <w:p>
@@ -2150,27 +2135,27 @@
           <w:szCs w:val="26"/>
           <w:lang w:val="vi-VN"/>
         </w:rPr>
+        <w:t>=&gt; Done</w:t>
+      </w:r>
+    </w:p>
+    <w:p>
+      <w:pPr>
+        <w:rPr>
+          <w:rFonts w:ascii="Times New Roman" w:eastAsia="Times New Roman" w:hAnsi="Times New Roman" w:cs="Times New Roman"/>
+          <w:sz w:val="26"/>
+          <w:szCs w:val="26"/>
+          <w:lang w:val="vi-VN"/>
+        </w:rPr>
+      </w:pPr>
+      <w:r>
+        <w:rPr>
+          <w:rFonts w:ascii="Times New Roman" w:eastAsia="Times New Roman" w:hAnsi="Times New Roman" w:cs="Times New Roman"/>
+          <w:b/>
+          <w:bCs/>
+          <w:sz w:val="26"/>
+          <w:szCs w:val="26"/>
+        </w:rPr>
         <w:lastRenderedPageBreak/>
-        <w:t>=&gt; Done</w:t>
-      </w:r>
-    </w:p>
-    <w:p>
-      <w:pPr>
-        <w:rPr>
-          <w:rFonts w:ascii="Times New Roman" w:eastAsia="Times New Roman" w:hAnsi="Times New Roman" w:cs="Times New Roman"/>
-          <w:sz w:val="26"/>
-          <w:szCs w:val="26"/>
-          <w:lang w:val="vi-VN"/>
-        </w:rPr>
-      </w:pPr>
-      <w:r>
-        <w:rPr>
-          <w:rFonts w:ascii="Times New Roman" w:eastAsia="Times New Roman" w:hAnsi="Times New Roman" w:cs="Times New Roman"/>
-          <w:b/>
-          <w:bCs/>
-          <w:sz w:val="26"/>
-          <w:szCs w:val="26"/>
-        </w:rPr>
         <w:t>- In hóa đơn/Biên lai</w:t>
       </w:r>
       <w:r>
@@ -2236,6 +2221,15 @@
           <w:lang w:val="vi-VN"/>
         </w:rPr>
         <w:t>Done</w:t>
+      </w:r>
+      <w:r>
+        <w:rPr>
+          <w:rFonts w:ascii="Times New Roman" w:eastAsia="Times New Roman" w:hAnsi="Times New Roman" w:cs="Times New Roman"/>
+          <w:sz w:val="26"/>
+          <w:szCs w:val="26"/>
+          <w:lang w:val="vi-VN"/>
+        </w:rPr>
+        <w:t xml:space="preserve"> (Fix hiện thông báo trên ký hiệu =&gt; bên dưới bên phải note)</w:t>
       </w:r>
     </w:p>
     <w:p>
@@ -3344,7 +3338,7 @@
           <w:szCs w:val="26"/>
           <w:lang w:val="vi-VN"/>
         </w:rPr>
-        <w:t>Dpne</w:t>
+        <w:t>Done</w:t>
       </w:r>
     </w:p>
     <w:p>
@@ -3514,7 +3508,16 @@
           <w:highlight w:val="yellow"/>
           <w:lang w:val="vi-VN"/>
         </w:rPr>
-        <w:t>Done – tí dậy test sau</w:t>
+        <w:t xml:space="preserve">Done </w:t>
+      </w:r>
+      <w:r>
+        <w:rPr>
+          <w:rFonts w:ascii="Times New Roman" w:eastAsia="Times New Roman" w:hAnsi="Times New Roman" w:cs="Times New Roman"/>
+          <w:sz w:val="26"/>
+          <w:szCs w:val="26"/>
+          <w:lang w:val="vi-VN"/>
+        </w:rPr>
+        <w:t>(Fix lại)</w:t>
       </w:r>
     </w:p>
     <w:p>

</xml_diff>

<commit_message>
feat (hoan thanh): hoan thanh - done xong customer + admin
</commit_message>
<xml_diff>
--- a/CNM_ChucNangNguoiDung.docx
+++ b/CNM_ChucNangNguoiDung.docx
@@ -258,16 +258,18 @@
           <w:rFonts w:ascii="Times New Roman" w:eastAsia="Times New Roman" w:hAnsi="Times New Roman" w:cs="Times New Roman"/>
           <w:sz w:val="26"/>
           <w:szCs w:val="26"/>
-          <w:lang w:val="vi-VN"/>
-        </w:rPr>
-      </w:pPr>
-      <w:r>
-        <w:rPr>
-          <w:rFonts w:ascii="Times New Roman" w:eastAsia="Times New Roman" w:hAnsi="Times New Roman" w:cs="Times New Roman"/>
-          <w:b/>
-          <w:bCs/>
-          <w:sz w:val="26"/>
-          <w:szCs w:val="26"/>
+          <w:highlight w:val="yellow"/>
+          <w:lang w:val="vi-VN"/>
+        </w:rPr>
+      </w:pPr>
+      <w:r>
+        <w:rPr>
+          <w:rFonts w:ascii="Times New Roman" w:eastAsia="Times New Roman" w:hAnsi="Times New Roman" w:cs="Times New Roman"/>
+          <w:b/>
+          <w:bCs/>
+          <w:sz w:val="26"/>
+          <w:szCs w:val="26"/>
+          <w:highlight w:val="yellow"/>
         </w:rPr>
         <w:t>- Đăng ký tài khoản</w:t>
       </w:r>
@@ -276,6 +278,7 @@
           <w:rFonts w:ascii="Times New Roman" w:eastAsia="Times New Roman" w:hAnsi="Times New Roman" w:cs="Times New Roman"/>
           <w:sz w:val="26"/>
           <w:szCs w:val="26"/>
+          <w:highlight w:val="yellow"/>
         </w:rPr>
         <w:t>: Tạo tài khoản mới bằng email/số điện thoại để sử dụng dịch vụ đặt hàng và tích điểm.</w:t>
       </w:r>
@@ -284,6 +287,7 @@
           <w:rFonts w:ascii="Times New Roman" w:eastAsia="Times New Roman" w:hAnsi="Times New Roman" w:cs="Times New Roman"/>
           <w:sz w:val="26"/>
           <w:szCs w:val="26"/>
+          <w:highlight w:val="yellow"/>
           <w:lang w:val="vi-VN"/>
         </w:rPr>
         <w:t xml:space="preserve"> (Đăng ký bằng mail, google)</w:t>
@@ -303,6 +307,7 @@
           <w:rFonts w:ascii="Times New Roman" w:eastAsia="Times New Roman" w:hAnsi="Times New Roman" w:cs="Times New Roman"/>
           <w:sz w:val="26"/>
           <w:szCs w:val="26"/>
+          <w:highlight w:val="yellow"/>
           <w:lang w:val="vi-VN"/>
         </w:rPr>
         <w:t xml:space="preserve">=&gt; </w:t>
@@ -312,6 +317,7 @@
           <w:rFonts w:ascii="Times New Roman" w:eastAsia="Times New Roman" w:hAnsi="Times New Roman" w:cs="Times New Roman"/>
           <w:sz w:val="26"/>
           <w:szCs w:val="26"/>
+          <w:highlight w:val="yellow"/>
           <w:lang w:val="vi-VN"/>
         </w:rPr>
         <w:t>Done (fix nhẹ =&gt; tài khoản khác thì đừng</w:t>
@@ -321,6 +327,7 @@
           <w:rFonts w:ascii="Times New Roman" w:eastAsia="Times New Roman" w:hAnsi="Times New Roman" w:cs="Times New Roman"/>
           <w:sz w:val="26"/>
           <w:szCs w:val="26"/>
+          <w:highlight w:val="yellow"/>
           <w:lang w:val="vi-VN"/>
         </w:rPr>
         <w:t xml:space="preserve"> hiện avt cũ</w:t>
@@ -330,6 +337,7 @@
           <w:rFonts w:ascii="Times New Roman" w:eastAsia="Times New Roman" w:hAnsi="Times New Roman" w:cs="Times New Roman"/>
           <w:sz w:val="26"/>
           <w:szCs w:val="26"/>
+          <w:highlight w:val="yellow"/>
           <w:lang w:val="vi-VN"/>
         </w:rPr>
         <w:t xml:space="preserve"> hiển thị avt người đấy</w:t>
@@ -339,6 +347,7 @@
           <w:rFonts w:ascii="Times New Roman" w:eastAsia="Times New Roman" w:hAnsi="Times New Roman" w:cs="Times New Roman"/>
           <w:sz w:val="26"/>
           <w:szCs w:val="26"/>
+          <w:highlight w:val="yellow"/>
           <w:lang w:val="vi-VN"/>
         </w:rPr>
         <w:t xml:space="preserve"> – để tạm</w:t>
@@ -348,6 +357,7 @@
           <w:rFonts w:ascii="Times New Roman" w:eastAsia="Times New Roman" w:hAnsi="Times New Roman" w:cs="Times New Roman"/>
           <w:sz w:val="26"/>
           <w:szCs w:val="26"/>
+          <w:highlight w:val="yellow"/>
           <w:lang w:val="vi-VN"/>
         </w:rPr>
         <w:t>)</w:t>
@@ -613,16 +623,18 @@
           <w:rFonts w:ascii="Times New Roman" w:eastAsia="Times New Roman" w:hAnsi="Times New Roman" w:cs="Times New Roman"/>
           <w:sz w:val="26"/>
           <w:szCs w:val="26"/>
-          <w:lang w:val="vi-VN"/>
-        </w:rPr>
-      </w:pPr>
-      <w:r>
-        <w:rPr>
-          <w:rFonts w:ascii="Times New Roman" w:eastAsia="Times New Roman" w:hAnsi="Times New Roman" w:cs="Times New Roman"/>
-          <w:b/>
-          <w:bCs/>
-          <w:sz w:val="26"/>
-          <w:szCs w:val="26"/>
+          <w:highlight w:val="yellow"/>
+          <w:lang w:val="vi-VN"/>
+        </w:rPr>
+      </w:pPr>
+      <w:r>
+        <w:rPr>
+          <w:rFonts w:ascii="Times New Roman" w:eastAsia="Times New Roman" w:hAnsi="Times New Roman" w:cs="Times New Roman"/>
+          <w:b/>
+          <w:bCs/>
+          <w:sz w:val="26"/>
+          <w:szCs w:val="26"/>
+          <w:highlight w:val="yellow"/>
         </w:rPr>
         <w:t>- Đăng nhập</w:t>
       </w:r>
@@ -631,6 +643,7 @@
           <w:rFonts w:ascii="Times New Roman" w:eastAsia="Times New Roman" w:hAnsi="Times New Roman" w:cs="Times New Roman"/>
           <w:sz w:val="26"/>
           <w:szCs w:val="26"/>
+          <w:highlight w:val="yellow"/>
         </w:rPr>
         <w:t>: Truy cập hệ thống bằng tên đăng nhập/tài khoản và mật khẩu để sử dụng các chức năng được phân quyền</w:t>
       </w:r>
@@ -639,6 +652,7 @@
           <w:rFonts w:ascii="Times New Roman" w:eastAsia="Times New Roman" w:hAnsi="Times New Roman" w:cs="Times New Roman"/>
           <w:sz w:val="26"/>
           <w:szCs w:val="26"/>
+          <w:highlight w:val="yellow"/>
           <w:lang w:val="vi-VN"/>
         </w:rPr>
         <w:t xml:space="preserve"> (Bằng mail, google)</w:t>
@@ -648,6 +662,7 @@
           <w:rFonts w:ascii="Times New Roman" w:eastAsia="Times New Roman" w:hAnsi="Times New Roman" w:cs="Times New Roman"/>
           <w:sz w:val="26"/>
           <w:szCs w:val="26"/>
+          <w:highlight w:val="yellow"/>
         </w:rPr>
         <w:t>.</w:t>
       </w:r>
@@ -656,6 +671,7 @@
           <w:rFonts w:ascii="Times New Roman" w:eastAsia="Times New Roman" w:hAnsi="Times New Roman" w:cs="Times New Roman"/>
           <w:sz w:val="26"/>
           <w:szCs w:val="26"/>
+          <w:highlight w:val="yellow"/>
           <w:lang w:val="vi-VN"/>
         </w:rPr>
         <w:t xml:space="preserve"> </w:t>
@@ -675,6 +691,7 @@
           <w:rFonts w:ascii="Times New Roman" w:eastAsia="Times New Roman" w:hAnsi="Times New Roman" w:cs="Times New Roman"/>
           <w:sz w:val="26"/>
           <w:szCs w:val="26"/>
+          <w:highlight w:val="yellow"/>
           <w:lang w:val="vi-VN"/>
         </w:rPr>
         <w:t xml:space="preserve">=&gt; </w:t>
@@ -684,6 +701,7 @@
           <w:rFonts w:ascii="Times New Roman" w:eastAsia="Times New Roman" w:hAnsi="Times New Roman" w:cs="Times New Roman"/>
           <w:sz w:val="26"/>
           <w:szCs w:val="26"/>
+          <w:highlight w:val="yellow"/>
           <w:lang w:val="vi-VN"/>
         </w:rPr>
         <w:t>Done</w:t>
@@ -693,6 +711,7 @@
           <w:rFonts w:ascii="Times New Roman" w:eastAsia="Times New Roman" w:hAnsi="Times New Roman" w:cs="Times New Roman"/>
           <w:sz w:val="26"/>
           <w:szCs w:val="26"/>
+          <w:highlight w:val="yellow"/>
           <w:lang w:val="vi-VN"/>
         </w:rPr>
         <w:t xml:space="preserve"> (fix nhẹ =&gt; tài khoản khác thì đừng hiện avt cũ hiển thị avt người đấy</w:t>
@@ -702,6 +721,7 @@
           <w:rFonts w:ascii="Times New Roman" w:eastAsia="Times New Roman" w:hAnsi="Times New Roman" w:cs="Times New Roman"/>
           <w:sz w:val="26"/>
           <w:szCs w:val="26"/>
+          <w:highlight w:val="yellow"/>
           <w:lang w:val="vi-VN"/>
         </w:rPr>
         <w:t xml:space="preserve"> – để tạm</w:t>
@@ -711,6 +731,7 @@
           <w:rFonts w:ascii="Times New Roman" w:eastAsia="Times New Roman" w:hAnsi="Times New Roman" w:cs="Times New Roman"/>
           <w:sz w:val="26"/>
           <w:szCs w:val="26"/>
+          <w:highlight w:val="yellow"/>
           <w:lang w:val="vi-VN"/>
         </w:rPr>
         <w:t>)</w:t>
@@ -1146,18 +1167,16 @@
           <w:rFonts w:ascii="Times New Roman" w:eastAsia="Times New Roman" w:hAnsi="Times New Roman" w:cs="Times New Roman"/>
           <w:sz w:val="26"/>
           <w:szCs w:val="26"/>
-          <w:highlight w:val="yellow"/>
-          <w:lang w:val="vi-VN"/>
-        </w:rPr>
-      </w:pPr>
-      <w:r>
-        <w:rPr>
-          <w:rFonts w:ascii="Times New Roman" w:eastAsia="Times New Roman" w:hAnsi="Times New Roman" w:cs="Times New Roman"/>
-          <w:b/>
-          <w:bCs/>
-          <w:sz w:val="26"/>
-          <w:szCs w:val="26"/>
-          <w:highlight w:val="yellow"/>
+          <w:lang w:val="vi-VN"/>
+        </w:rPr>
+      </w:pPr>
+      <w:r>
+        <w:rPr>
+          <w:rFonts w:ascii="Times New Roman" w:eastAsia="Times New Roman" w:hAnsi="Times New Roman" w:cs="Times New Roman"/>
+          <w:b/>
+          <w:bCs/>
+          <w:sz w:val="26"/>
+          <w:szCs w:val="26"/>
         </w:rPr>
         <w:t>- Theo dõi đơn hàng</w:t>
       </w:r>
@@ -1166,7 +1185,6 @@
           <w:rFonts w:ascii="Times New Roman" w:eastAsia="Times New Roman" w:hAnsi="Times New Roman" w:cs="Times New Roman"/>
           <w:sz w:val="26"/>
           <w:szCs w:val="26"/>
-          <w:highlight w:val="yellow"/>
         </w:rPr>
         <w:t>: Xem trạng thái đơn hàng thời gian thực (đang chuẩn bị, đang giao, hoàn thành...).</w:t>
       </w:r>
@@ -1175,7 +1193,6 @@
           <w:rFonts w:ascii="Times New Roman" w:eastAsia="Times New Roman" w:hAnsi="Times New Roman" w:cs="Times New Roman"/>
           <w:sz w:val="26"/>
           <w:szCs w:val="26"/>
-          <w:highlight w:val="yellow"/>
           <w:lang w:val="vi-VN"/>
         </w:rPr>
         <w:t xml:space="preserve"> </w:t>
@@ -1195,20 +1212,9 @@
           <w:rFonts w:ascii="Times New Roman" w:eastAsia="Times New Roman" w:hAnsi="Times New Roman" w:cs="Times New Roman"/>
           <w:sz w:val="26"/>
           <w:szCs w:val="26"/>
-          <w:highlight w:val="yellow"/>
           <w:lang w:val="vi-VN"/>
         </w:rPr>
         <w:t>=&gt; Done</w:t>
-      </w:r>
-      <w:r>
-        <w:rPr>
-          <w:rFonts w:ascii="Times New Roman" w:eastAsia="Times New Roman" w:hAnsi="Times New Roman" w:cs="Times New Roman"/>
-          <w:sz w:val="26"/>
-          <w:szCs w:val="26"/>
-          <w:highlight w:val="yellow"/>
-          <w:lang w:val="vi-VN"/>
-        </w:rPr>
-        <w:t xml:space="preserve"> (Fix =&gt; ko cần refresh lại trang bên admin xác nhận thì bên kia hiện luôn)</w:t>
       </w:r>
     </w:p>
     <w:p>
@@ -1549,6 +1555,18 @@
       <w:r>
         <w:rPr>
           <w:rFonts w:ascii="Times New Roman" w:eastAsia="Times New Roman" w:hAnsi="Times New Roman" w:cs="Times New Roman"/>
+          <w:b/>
+          <w:bCs/>
+          <w:sz w:val="26"/>
+          <w:szCs w:val="26"/>
+          <w:highlight w:val="yellow"/>
+          <w:lang w:val="vi-VN"/>
+        </w:rPr>
+        <w:t xml:space="preserve"> (xem lịch sử đánh giá)</w:t>
+      </w:r>
+      <w:r>
+        <w:rPr>
+          <w:rFonts w:ascii="Times New Roman" w:eastAsia="Times New Roman" w:hAnsi="Times New Roman" w:cs="Times New Roman"/>
           <w:sz w:val="26"/>
           <w:szCs w:val="26"/>
           <w:highlight w:val="yellow"/>
@@ -1603,27 +1621,55 @@
           <w:highlight w:val="yellow"/>
           <w:lang w:val="vi-VN"/>
         </w:rPr>
-        <w:t xml:space="preserve"> (Fix nhẹ =&gt; giao diện nhiều ng bình luận)</w:t>
-      </w:r>
-    </w:p>
-    <w:p>
-      <w:pPr>
-        <w:rPr>
-          <w:rFonts w:ascii="Times New Roman" w:eastAsia="Times New Roman" w:hAnsi="Times New Roman" w:cs="Times New Roman"/>
-          <w:sz w:val="26"/>
-          <w:szCs w:val="26"/>
-          <w:highlight w:val="yellow"/>
-          <w:lang w:val="vi-VN"/>
-        </w:rPr>
-      </w:pPr>
-      <w:r>
-        <w:rPr>
-          <w:rFonts w:ascii="Times New Roman" w:eastAsia="Times New Roman" w:hAnsi="Times New Roman" w:cs="Times New Roman"/>
-          <w:b/>
-          <w:bCs/>
-          <w:sz w:val="26"/>
-          <w:szCs w:val="26"/>
-          <w:highlight w:val="yellow"/>
+        <w:t xml:space="preserve"> (Fix nhẹ =&gt; giao diện nhiều ng bình luận</w:t>
+      </w:r>
+      <w:r>
+        <w:rPr>
+          <w:rFonts w:ascii="Times New Roman" w:eastAsia="Times New Roman" w:hAnsi="Times New Roman" w:cs="Times New Roman"/>
+          <w:sz w:val="26"/>
+          <w:szCs w:val="26"/>
+          <w:highlight w:val="yellow"/>
+          <w:lang w:val="vi-VN"/>
+        </w:rPr>
+        <w:t xml:space="preserve"> =&gt; chia trang </w:t>
+      </w:r>
+      <w:r>
+        <w:rPr>
+          <w:rFonts w:ascii="Times New Roman" w:eastAsia="Times New Roman" w:hAnsi="Times New Roman" w:cs="Times New Roman"/>
+          <w:sz w:val="26"/>
+          <w:szCs w:val="26"/>
+          <w:highlight w:val="yellow"/>
+          <w:lang w:val="vi-VN"/>
+        </w:rPr>
+        <w:t>để sau</w:t>
+      </w:r>
+      <w:r>
+        <w:rPr>
+          <w:rFonts w:ascii="Times New Roman" w:eastAsia="Times New Roman" w:hAnsi="Times New Roman" w:cs="Times New Roman"/>
+          <w:sz w:val="26"/>
+          <w:szCs w:val="26"/>
+          <w:highlight w:val="yellow"/>
+          <w:lang w:val="vi-VN"/>
+        </w:rPr>
+        <w:t>)</w:t>
+      </w:r>
+    </w:p>
+    <w:p>
+      <w:pPr>
+        <w:rPr>
+          <w:rFonts w:ascii="Times New Roman" w:eastAsia="Times New Roman" w:hAnsi="Times New Roman" w:cs="Times New Roman"/>
+          <w:sz w:val="26"/>
+          <w:szCs w:val="26"/>
+          <w:lang w:val="vi-VN"/>
+        </w:rPr>
+      </w:pPr>
+      <w:r>
+        <w:rPr>
+          <w:rFonts w:ascii="Times New Roman" w:eastAsia="Times New Roman" w:hAnsi="Times New Roman" w:cs="Times New Roman"/>
+          <w:b/>
+          <w:bCs/>
+          <w:sz w:val="26"/>
+          <w:szCs w:val="26"/>
         </w:rPr>
         <w:t>- Xem gợi ý món ăn/thức uống</w:t>
       </w:r>
@@ -1632,7 +1678,6 @@
           <w:rFonts w:ascii="Times New Roman" w:eastAsia="Times New Roman" w:hAnsi="Times New Roman" w:cs="Times New Roman"/>
           <w:sz w:val="26"/>
           <w:szCs w:val="26"/>
-          <w:highlight w:val="yellow"/>
         </w:rPr>
         <w:t>: Nhận đề xuất món dựa trên lịch sử đặt hàng hoặc khuyến mãi.</w:t>
       </w:r>
@@ -1641,7 +1686,6 @@
           <w:rFonts w:ascii="Times New Roman" w:eastAsia="Times New Roman" w:hAnsi="Times New Roman" w:cs="Times New Roman"/>
           <w:sz w:val="26"/>
           <w:szCs w:val="26"/>
-          <w:highlight w:val="yellow"/>
           <w:lang w:val="vi-VN"/>
         </w:rPr>
         <w:t xml:space="preserve"> </w:t>
@@ -1661,7 +1705,6 @@
           <w:rFonts w:ascii="Times New Roman" w:eastAsia="Times New Roman" w:hAnsi="Times New Roman" w:cs="Times New Roman"/>
           <w:sz w:val="26"/>
           <w:szCs w:val="26"/>
-          <w:highlight w:val="yellow"/>
           <w:lang w:val="vi-VN"/>
         </w:rPr>
         <w:t xml:space="preserve">=&gt; </w:t>
@@ -1671,20 +1714,9 @@
           <w:rFonts w:ascii="Times New Roman" w:eastAsia="Times New Roman" w:hAnsi="Times New Roman" w:cs="Times New Roman"/>
           <w:sz w:val="26"/>
           <w:szCs w:val="26"/>
-          <w:highlight w:val="yellow"/>
           <w:lang w:val="vi-VN"/>
         </w:rPr>
         <w:t>Done</w:t>
-      </w:r>
-      <w:r>
-        <w:rPr>
-          <w:rFonts w:ascii="Times New Roman" w:eastAsia="Times New Roman" w:hAnsi="Times New Roman" w:cs="Times New Roman"/>
-          <w:sz w:val="26"/>
-          <w:szCs w:val="26"/>
-          <w:highlight w:val="yellow"/>
-          <w:lang w:val="vi-VN"/>
-        </w:rPr>
-        <w:t xml:space="preserve"> (Xem lại có cập nhật theo thời gian thực khi có thay đổi dữ liệu không)</w:t>
       </w:r>
     </w:p>
     <w:p>
@@ -2135,6 +2167,7 @@
           <w:szCs w:val="26"/>
           <w:lang w:val="vi-VN"/>
         </w:rPr>
+        <w:lastRenderedPageBreak/>
         <w:t>=&gt; Done</w:t>
       </w:r>
     </w:p>
@@ -2155,7 +2188,6 @@
           <w:sz w:val="26"/>
           <w:szCs w:val="26"/>
         </w:rPr>
-        <w:lastRenderedPageBreak/>
         <w:t>- In hóa đơn/Biên lai</w:t>
       </w:r>
       <w:r>
@@ -2221,15 +2253,6 @@
           <w:lang w:val="vi-VN"/>
         </w:rPr>
         <w:t>Done</w:t>
-      </w:r>
-      <w:r>
-        <w:rPr>
-          <w:rFonts w:ascii="Times New Roman" w:eastAsia="Times New Roman" w:hAnsi="Times New Roman" w:cs="Times New Roman"/>
-          <w:sz w:val="26"/>
-          <w:szCs w:val="26"/>
-          <w:lang w:val="vi-VN"/>
-        </w:rPr>
-        <w:t xml:space="preserve"> (Fix hiện thông báo trên ký hiệu =&gt; bên dưới bên phải note)</w:t>
       </w:r>
     </w:p>
     <w:p>
@@ -3086,69 +3109,18 @@
           <w:color w:val="000000"/>
           <w:sz w:val="26"/>
           <w:szCs w:val="26"/>
-          <w:lang w:val="vi-VN"/>
-        </w:rPr>
-      </w:pPr>
-    </w:p>
-    <w:p>
-      <w:pPr>
-        <w:rPr>
-          <w:rFonts w:ascii="Times New Roman" w:eastAsia="Times New Roman" w:hAnsi="Times New Roman" w:cs="Times New Roman"/>
-          <w:b/>
-          <w:bCs/>
-          <w:color w:val="000000"/>
-          <w:sz w:val="26"/>
-          <w:szCs w:val="26"/>
-          <w:lang w:val="vi-VN"/>
-        </w:rPr>
-      </w:pPr>
-    </w:p>
-    <w:p>
-      <w:pPr>
-        <w:rPr>
-          <w:rFonts w:ascii="Times New Roman" w:eastAsia="Times New Roman" w:hAnsi="Times New Roman" w:cs="Times New Roman"/>
-          <w:b/>
-          <w:bCs/>
-          <w:color w:val="000000"/>
-          <w:sz w:val="26"/>
-          <w:szCs w:val="26"/>
-          <w:lang w:val="vi-VN"/>
-        </w:rPr>
-      </w:pPr>
-    </w:p>
-    <w:p>
-      <w:pPr>
-        <w:rPr>
-          <w:rFonts w:ascii="Times New Roman" w:eastAsia="Times New Roman" w:hAnsi="Times New Roman" w:cs="Times New Roman"/>
-          <w:b/>
-          <w:bCs/>
-          <w:color w:val="000000"/>
-          <w:sz w:val="26"/>
-          <w:szCs w:val="26"/>
-          <w:lang w:val="vi-VN"/>
-        </w:rPr>
-      </w:pPr>
-    </w:p>
-    <w:p>
-      <w:pPr>
-        <w:rPr>
-          <w:rFonts w:ascii="Times New Roman" w:eastAsia="Times New Roman" w:hAnsi="Times New Roman" w:cs="Times New Roman"/>
-          <w:b/>
-          <w:bCs/>
-          <w:color w:val="000000"/>
-          <w:sz w:val="26"/>
-          <w:szCs w:val="26"/>
-        </w:rPr>
-      </w:pPr>
-      <w:r>
-        <w:rPr>
-          <w:rFonts w:ascii="Times New Roman" w:eastAsia="Times New Roman" w:hAnsi="Times New Roman" w:cs="Times New Roman"/>
-          <w:b/>
-          <w:bCs/>
-          <w:color w:val="000000"/>
-          <w:sz w:val="26"/>
-          <w:szCs w:val="26"/>
-        </w:rPr>
+        </w:rPr>
+      </w:pPr>
+      <w:r>
+        <w:rPr>
+          <w:rFonts w:ascii="Times New Roman" w:eastAsia="Times New Roman" w:hAnsi="Times New Roman" w:cs="Times New Roman"/>
+          <w:b/>
+          <w:bCs/>
+          <w:color w:val="000000"/>
+          <w:sz w:val="26"/>
+          <w:szCs w:val="26"/>
+        </w:rPr>
+        <w:lastRenderedPageBreak/>
         <w:t>5. Actor: Quản trị viên (Admin)</w:t>
       </w:r>
     </w:p>
@@ -3414,18 +3386,16 @@
           <w:rFonts w:ascii="Times New Roman" w:eastAsia="Times New Roman" w:hAnsi="Times New Roman" w:cs="Times New Roman"/>
           <w:sz w:val="26"/>
           <w:szCs w:val="26"/>
-          <w:highlight w:val="yellow"/>
-          <w:lang w:val="vi-VN"/>
-        </w:rPr>
-      </w:pPr>
-      <w:r>
-        <w:rPr>
-          <w:rFonts w:ascii="Times New Roman" w:eastAsia="Times New Roman" w:hAnsi="Times New Roman" w:cs="Times New Roman"/>
-          <w:b/>
-          <w:bCs/>
-          <w:sz w:val="26"/>
-          <w:szCs w:val="26"/>
-          <w:highlight w:val="yellow"/>
+          <w:lang w:val="vi-VN"/>
+        </w:rPr>
+      </w:pPr>
+      <w:r>
+        <w:rPr>
+          <w:rFonts w:ascii="Times New Roman" w:eastAsia="Times New Roman" w:hAnsi="Times New Roman" w:cs="Times New Roman"/>
+          <w:b/>
+          <w:bCs/>
+          <w:sz w:val="26"/>
+          <w:szCs w:val="26"/>
         </w:rPr>
         <w:t>- Quản lý chi nhánh cửa hàng</w:t>
       </w:r>
@@ -3436,7 +3406,6 @@
           <w:bCs/>
           <w:sz w:val="26"/>
           <w:szCs w:val="26"/>
-          <w:highlight w:val="yellow"/>
           <w:lang w:val="vi-VN"/>
         </w:rPr>
         <w:t xml:space="preserve"> </w:t>
@@ -3448,7 +3417,6 @@
           <w:bCs/>
           <w:sz w:val="26"/>
           <w:szCs w:val="26"/>
-          <w:highlight w:val="yellow"/>
         </w:rPr>
         <w:t>(CRUD)</w:t>
       </w:r>
@@ -3457,7 +3425,6 @@
           <w:rFonts w:ascii="Times New Roman" w:eastAsia="Times New Roman" w:hAnsi="Times New Roman" w:cs="Times New Roman"/>
           <w:sz w:val="26"/>
           <w:szCs w:val="26"/>
-          <w:highlight w:val="yellow"/>
         </w:rPr>
         <w:t xml:space="preserve">: Tạo, chỉnh sửa, xóa thông tin chi </w:t>
       </w:r>
@@ -3466,7 +3433,6 @@
           <w:rFonts w:ascii="Times New Roman" w:eastAsia="Times New Roman" w:hAnsi="Times New Roman" w:cs="Times New Roman"/>
           <w:sz w:val="26"/>
           <w:szCs w:val="26"/>
-          <w:highlight w:val="yellow"/>
         </w:rPr>
         <w:t>nhánh</w:t>
       </w:r>
@@ -3475,7 +3441,6 @@
           <w:rFonts w:ascii="Times New Roman" w:eastAsia="Times New Roman" w:hAnsi="Times New Roman" w:cs="Times New Roman"/>
           <w:sz w:val="26"/>
           <w:szCs w:val="26"/>
-          <w:highlight w:val="yellow"/>
           <w:lang w:val="vi-VN"/>
         </w:rPr>
         <w:t>.</w:t>
@@ -3495,7 +3460,6 @@
           <w:rFonts w:ascii="Times New Roman" w:eastAsia="Times New Roman" w:hAnsi="Times New Roman" w:cs="Times New Roman"/>
           <w:sz w:val="26"/>
           <w:szCs w:val="26"/>
-          <w:highlight w:val="yellow"/>
           <w:lang w:val="vi-VN"/>
         </w:rPr>
         <w:t xml:space="preserve">=&gt; </w:t>
@@ -3505,19 +3469,9 @@
           <w:rFonts w:ascii="Times New Roman" w:eastAsia="Times New Roman" w:hAnsi="Times New Roman" w:cs="Times New Roman"/>
           <w:sz w:val="26"/>
           <w:szCs w:val="26"/>
-          <w:highlight w:val="yellow"/>
-          <w:lang w:val="vi-VN"/>
-        </w:rPr>
-        <w:t xml:space="preserve">Done </w:t>
-      </w:r>
-      <w:r>
-        <w:rPr>
-          <w:rFonts w:ascii="Times New Roman" w:eastAsia="Times New Roman" w:hAnsi="Times New Roman" w:cs="Times New Roman"/>
-          <w:sz w:val="26"/>
-          <w:szCs w:val="26"/>
-          <w:lang w:val="vi-VN"/>
-        </w:rPr>
-        <w:t>(Fix lại)</w:t>
+          <w:lang w:val="vi-VN"/>
+        </w:rPr>
+        <w:t>Done</w:t>
       </w:r>
     </w:p>
     <w:p>
@@ -3729,18 +3683,16 @@
           <w:rFonts w:ascii="Times New Roman" w:eastAsia="Times New Roman" w:hAnsi="Times New Roman" w:cs="Times New Roman"/>
           <w:sz w:val="26"/>
           <w:szCs w:val="26"/>
-          <w:highlight w:val="yellow"/>
-          <w:lang w:val="vi-VN"/>
-        </w:rPr>
-      </w:pPr>
-      <w:r>
-        <w:rPr>
-          <w:rFonts w:ascii="Times New Roman" w:eastAsia="Times New Roman" w:hAnsi="Times New Roman" w:cs="Times New Roman"/>
-          <w:b/>
-          <w:bCs/>
-          <w:sz w:val="26"/>
-          <w:szCs w:val="26"/>
-          <w:highlight w:val="yellow"/>
+          <w:lang w:val="vi-VN"/>
+        </w:rPr>
+      </w:pPr>
+      <w:r>
+        <w:rPr>
+          <w:rFonts w:ascii="Times New Roman" w:eastAsia="Times New Roman" w:hAnsi="Times New Roman" w:cs="Times New Roman"/>
+          <w:b/>
+          <w:bCs/>
+          <w:sz w:val="26"/>
+          <w:szCs w:val="26"/>
         </w:rPr>
         <w:t>- Cấu hình và giám sát hệ thống</w:t>
       </w:r>
@@ -3749,7 +3701,6 @@
           <w:rFonts w:ascii="Times New Roman" w:eastAsia="Times New Roman" w:hAnsi="Times New Roman" w:cs="Times New Roman"/>
           <w:sz w:val="26"/>
           <w:szCs w:val="26"/>
-          <w:highlight w:val="yellow"/>
         </w:rPr>
         <w:t>: Thiết lập thông số hệ thống, theo dõi log và hiệu suất server.</w:t>
       </w:r>
@@ -3758,7 +3709,6 @@
           <w:rFonts w:ascii="Times New Roman" w:eastAsia="Times New Roman" w:hAnsi="Times New Roman" w:cs="Times New Roman"/>
           <w:sz w:val="26"/>
           <w:szCs w:val="26"/>
-          <w:highlight w:val="yellow"/>
           <w:lang w:val="vi-VN"/>
         </w:rPr>
         <w:t xml:space="preserve"> </w:t>
@@ -3778,7 +3728,6 @@
           <w:rFonts w:ascii="Times New Roman" w:eastAsia="Times New Roman" w:hAnsi="Times New Roman" w:cs="Times New Roman"/>
           <w:sz w:val="26"/>
           <w:szCs w:val="26"/>
-          <w:highlight w:val="yellow"/>
           <w:lang w:val="vi-VN"/>
         </w:rPr>
         <w:t xml:space="preserve">=&gt; </w:t>
@@ -3788,20 +3737,9 @@
           <w:rFonts w:ascii="Times New Roman" w:eastAsia="Times New Roman" w:hAnsi="Times New Roman" w:cs="Times New Roman"/>
           <w:sz w:val="26"/>
           <w:szCs w:val="26"/>
-          <w:highlight w:val="yellow"/>
-          <w:lang w:val="vi-VN"/>
-        </w:rPr>
-        <w:t xml:space="preserve">Done =&gt; </w:t>
-      </w:r>
-      <w:r>
-        <w:rPr>
-          <w:rFonts w:ascii="Times New Roman" w:eastAsia="Times New Roman" w:hAnsi="Times New Roman" w:cs="Times New Roman"/>
-          <w:sz w:val="26"/>
-          <w:szCs w:val="26"/>
-          <w:highlight w:val="yellow"/>
-          <w:lang w:val="vi-VN"/>
-        </w:rPr>
-        <w:t>này cần fix lại tại ch hiện hết :v</w:t>
+          <w:lang w:val="vi-VN"/>
+        </w:rPr>
+        <w:t>Done</w:t>
       </w:r>
     </w:p>
     <w:p>
@@ -3845,6 +3783,104 @@
           <w:lang w:val="vi-VN"/>
         </w:rPr>
       </w:pPr>
+    </w:p>
+    <w:p>
+      <w:pPr>
+        <w:rPr>
+          <w:rFonts w:ascii="Times New Roman" w:eastAsia="Times New Roman" w:hAnsi="Times New Roman" w:cs="Times New Roman"/>
+          <w:b/>
+          <w:bCs/>
+          <w:color w:val="000000"/>
+          <w:sz w:val="26"/>
+          <w:szCs w:val="26"/>
+          <w:highlight w:val="yellow"/>
+          <w:lang w:val="vi-VN"/>
+        </w:rPr>
+      </w:pPr>
+    </w:p>
+    <w:p>
+      <w:pPr>
+        <w:rPr>
+          <w:rFonts w:ascii="Times New Roman" w:eastAsia="Times New Roman" w:hAnsi="Times New Roman" w:cs="Times New Roman"/>
+          <w:b/>
+          <w:bCs/>
+          <w:color w:val="000000"/>
+          <w:sz w:val="26"/>
+          <w:szCs w:val="26"/>
+          <w:highlight w:val="yellow"/>
+          <w:lang w:val="vi-VN"/>
+        </w:rPr>
+      </w:pPr>
+    </w:p>
+    <w:p>
+      <w:pPr>
+        <w:rPr>
+          <w:rFonts w:ascii="Times New Roman" w:eastAsia="Times New Roman" w:hAnsi="Times New Roman" w:cs="Times New Roman"/>
+          <w:b/>
+          <w:bCs/>
+          <w:color w:val="000000"/>
+          <w:sz w:val="26"/>
+          <w:szCs w:val="26"/>
+          <w:highlight w:val="yellow"/>
+          <w:lang w:val="vi-VN"/>
+        </w:rPr>
+      </w:pPr>
+    </w:p>
+    <w:p>
+      <w:pPr>
+        <w:rPr>
+          <w:rFonts w:ascii="Times New Roman" w:eastAsia="Times New Roman" w:hAnsi="Times New Roman" w:cs="Times New Roman"/>
+          <w:b/>
+          <w:bCs/>
+          <w:color w:val="000000"/>
+          <w:sz w:val="26"/>
+          <w:szCs w:val="26"/>
+          <w:highlight w:val="yellow"/>
+          <w:lang w:val="vi-VN"/>
+        </w:rPr>
+      </w:pPr>
+    </w:p>
+    <w:p>
+      <w:pPr>
+        <w:rPr>
+          <w:rFonts w:ascii="Times New Roman" w:eastAsia="Times New Roman" w:hAnsi="Times New Roman" w:cs="Times New Roman"/>
+          <w:b/>
+          <w:bCs/>
+          <w:color w:val="000000"/>
+          <w:sz w:val="26"/>
+          <w:szCs w:val="26"/>
+          <w:highlight w:val="yellow"/>
+          <w:lang w:val="vi-VN"/>
+        </w:rPr>
+      </w:pPr>
+    </w:p>
+    <w:p>
+      <w:pPr>
+        <w:rPr>
+          <w:rFonts w:ascii="Times New Roman" w:eastAsia="Times New Roman" w:hAnsi="Times New Roman" w:cs="Times New Roman"/>
+          <w:b/>
+          <w:bCs/>
+          <w:color w:val="000000"/>
+          <w:sz w:val="26"/>
+          <w:szCs w:val="26"/>
+          <w:highlight w:val="yellow"/>
+          <w:lang w:val="vi-VN"/>
+        </w:rPr>
+      </w:pPr>
+    </w:p>
+    <w:p>
+      <w:pPr>
+        <w:rPr>
+          <w:rFonts w:ascii="Times New Roman" w:eastAsia="Times New Roman" w:hAnsi="Times New Roman" w:cs="Times New Roman"/>
+          <w:b/>
+          <w:bCs/>
+          <w:color w:val="000000"/>
+          <w:sz w:val="26"/>
+          <w:szCs w:val="26"/>
+          <w:highlight w:val="yellow"/>
+          <w:lang w:val="vi-VN"/>
+        </w:rPr>
+      </w:pPr>
       <w:r>
         <w:rPr>
           <w:rFonts w:ascii="Times New Roman" w:eastAsia="Times New Roman" w:hAnsi="Times New Roman" w:cs="Times New Roman"/>
@@ -4028,6 +4064,7 @@
           <w:highlight w:val="yellow"/>
           <w:lang w:val="vi-VN"/>
         </w:rPr>
+        <w:lastRenderedPageBreak/>
         <w:t>3. Giao diện sản phẩm =&gt; thêm nhiều sản phẩm chia thành các loại</w:t>
       </w:r>
     </w:p>
@@ -4122,665 +4159,707 @@
           <w:highlight w:val="yellow"/>
           <w:lang w:val="vi-VN"/>
         </w:rPr>
+        <w:t>6. Riêng phần gợi ý sản phẩm cho nhiều dữ liệu mẫu hơn :v để có thể phân tích hành vi của khách hàng</w:t>
+      </w:r>
+    </w:p>
+    <w:p>
+      <w:pPr>
+        <w:rPr>
+          <w:rFonts w:ascii="Times New Roman" w:eastAsia="Times New Roman" w:hAnsi="Times New Roman" w:cs="Times New Roman"/>
+          <w:b/>
+          <w:bCs/>
+          <w:color w:val="000000"/>
+          <w:sz w:val="26"/>
+          <w:szCs w:val="26"/>
+          <w:highlight w:val="yellow"/>
+          <w:lang w:val="en-GB"/>
+        </w:rPr>
+      </w:pPr>
+    </w:p>
+    <w:p>
+      <w:pPr>
+        <w:rPr>
+          <w:rFonts w:ascii="Times New Roman" w:eastAsia="Times New Roman" w:hAnsi="Times New Roman" w:cs="Times New Roman"/>
+          <w:b/>
+          <w:bCs/>
+          <w:color w:val="000000"/>
+          <w:sz w:val="26"/>
+          <w:szCs w:val="26"/>
+          <w:highlight w:val="yellow"/>
+          <w:lang w:val="vi-VN"/>
+        </w:rPr>
+      </w:pPr>
+    </w:p>
+    <w:p>
+      <w:pPr>
+        <w:rPr>
+          <w:rFonts w:ascii="Times New Roman" w:eastAsia="Times New Roman" w:hAnsi="Times New Roman" w:cs="Times New Roman"/>
+          <w:b/>
+          <w:bCs/>
+          <w:color w:val="000000"/>
+          <w:sz w:val="26"/>
+          <w:szCs w:val="26"/>
+          <w:highlight w:val="yellow"/>
+          <w:lang w:val="vi-VN"/>
+        </w:rPr>
+      </w:pPr>
+    </w:p>
+    <w:p>
+      <w:pPr>
+        <w:rPr>
+          <w:rFonts w:ascii="Times New Roman" w:eastAsia="Times New Roman" w:hAnsi="Times New Roman" w:cs="Times New Roman"/>
+          <w:b/>
+          <w:bCs/>
+          <w:color w:val="000000"/>
+          <w:sz w:val="26"/>
+          <w:szCs w:val="26"/>
+          <w:highlight w:val="yellow"/>
+          <w:lang w:val="vi-VN"/>
+        </w:rPr>
+      </w:pPr>
+    </w:p>
+    <w:p>
+      <w:pPr>
+        <w:rPr>
+          <w:rFonts w:ascii="Times New Roman" w:eastAsia="Times New Roman" w:hAnsi="Times New Roman" w:cs="Times New Roman"/>
+          <w:b/>
+          <w:bCs/>
+          <w:color w:val="000000"/>
+          <w:sz w:val="26"/>
+          <w:szCs w:val="26"/>
+          <w:highlight w:val="yellow"/>
+          <w:lang w:val="vi-VN"/>
+        </w:rPr>
+      </w:pPr>
+    </w:p>
+    <w:p>
+      <w:pPr>
+        <w:rPr>
+          <w:rFonts w:ascii="Times New Roman" w:eastAsia="Times New Roman" w:hAnsi="Times New Roman" w:cs="Times New Roman"/>
+          <w:b/>
+          <w:bCs/>
+          <w:color w:val="000000"/>
+          <w:sz w:val="26"/>
+          <w:szCs w:val="26"/>
+          <w:highlight w:val="yellow"/>
+          <w:lang w:val="vi-VN"/>
+        </w:rPr>
+      </w:pPr>
+      <w:r>
+        <w:rPr>
+          <w:rFonts w:ascii="Times New Roman" w:eastAsia="Times New Roman" w:hAnsi="Times New Roman" w:cs="Times New Roman"/>
+          <w:b/>
+          <w:bCs/>
+          <w:color w:val="000000"/>
+          <w:sz w:val="26"/>
+          <w:szCs w:val="26"/>
+          <w:highlight w:val="yellow"/>
+          <w:lang w:val="en-GB"/>
+        </w:rPr>
+        <w:t>Phần</w:t>
+      </w:r>
+      <w:r>
+        <w:rPr>
+          <w:rFonts w:ascii="Times New Roman" w:eastAsia="Times New Roman" w:hAnsi="Times New Roman" w:cs="Times New Roman"/>
+          <w:b/>
+          <w:bCs/>
+          <w:color w:val="000000"/>
+          <w:sz w:val="26"/>
+          <w:szCs w:val="26"/>
+          <w:highlight w:val="yellow"/>
+          <w:lang w:val="vi-VN"/>
+        </w:rPr>
+        <w:t xml:space="preserve"> 3: </w:t>
+      </w:r>
+      <w:r>
+        <w:rPr>
+          <w:rFonts w:ascii="Times New Roman" w:eastAsia="Times New Roman" w:hAnsi="Times New Roman" w:cs="Times New Roman"/>
+          <w:b/>
+          <w:bCs/>
+          <w:color w:val="000000"/>
+          <w:sz w:val="26"/>
+          <w:szCs w:val="26"/>
+          <w:highlight w:val="yellow"/>
+          <w:lang w:val="en-GB"/>
+        </w:rPr>
+        <w:t>NHỮNG</w:t>
+      </w:r>
+      <w:r>
+        <w:rPr>
+          <w:rFonts w:ascii="Times New Roman" w:eastAsia="Times New Roman" w:hAnsi="Times New Roman" w:cs="Times New Roman"/>
+          <w:b/>
+          <w:bCs/>
+          <w:color w:val="000000"/>
+          <w:sz w:val="26"/>
+          <w:szCs w:val="26"/>
+          <w:highlight w:val="yellow"/>
+          <w:lang w:val="vi-VN"/>
+        </w:rPr>
+        <w:t xml:space="preserve"> UPDATE CÔNG NGHÊ:</w:t>
+      </w:r>
+    </w:p>
+    <w:p>
+      <w:pPr>
+        <w:rPr>
+          <w:rFonts w:ascii="Times New Roman" w:eastAsia="Times New Roman" w:hAnsi="Times New Roman" w:cs="Times New Roman"/>
+          <w:b/>
+          <w:bCs/>
+          <w:color w:val="000000"/>
+          <w:sz w:val="26"/>
+          <w:szCs w:val="26"/>
+          <w:highlight w:val="yellow"/>
+          <w:lang w:val="vi-VN"/>
+        </w:rPr>
+      </w:pPr>
+      <w:r>
+        <w:rPr>
+          <w:rFonts w:ascii="Times New Roman" w:eastAsia="Times New Roman" w:hAnsi="Times New Roman" w:cs="Times New Roman"/>
+          <w:b/>
+          <w:bCs/>
+          <w:color w:val="000000"/>
+          <w:sz w:val="26"/>
+          <w:szCs w:val="26"/>
+          <w:highlight w:val="yellow"/>
+          <w:lang w:val="vi-VN"/>
+        </w:rPr>
+        <w:t>=&gt; CHECK LẠI – CẬP NHẬT LẠI BÊN ĐỀ TÀI KỸ THUẬT</w:t>
+      </w:r>
+    </w:p>
+    <w:p>
+      <w:pPr>
+        <w:rPr>
+          <w:rFonts w:ascii="Times New Roman" w:eastAsia="Times New Roman" w:hAnsi="Times New Roman" w:cs="Times New Roman"/>
+          <w:b/>
+          <w:bCs/>
+          <w:color w:val="000000"/>
+          <w:sz w:val="26"/>
+          <w:szCs w:val="26"/>
+          <w:highlight w:val="yellow"/>
+          <w:lang w:val="en-GB"/>
+        </w:rPr>
+      </w:pPr>
+    </w:p>
+    <w:p>
+      <w:pPr>
+        <w:rPr>
+          <w:rFonts w:ascii="Times New Roman" w:eastAsia="Times New Roman" w:hAnsi="Times New Roman" w:cs="Times New Roman"/>
+          <w:b/>
+          <w:bCs/>
+          <w:color w:val="000000"/>
+          <w:sz w:val="26"/>
+          <w:szCs w:val="26"/>
+          <w:highlight w:val="yellow"/>
+          <w:lang w:val="en-GB"/>
+        </w:rPr>
+      </w:pPr>
+    </w:p>
+    <w:p>
+      <w:pPr>
+        <w:rPr>
+          <w:rFonts w:ascii="Times New Roman" w:eastAsia="Times New Roman" w:hAnsi="Times New Roman" w:cs="Times New Roman"/>
+          <w:b/>
+          <w:bCs/>
+          <w:color w:val="000000"/>
+          <w:sz w:val="26"/>
+          <w:szCs w:val="26"/>
+          <w:highlight w:val="yellow"/>
+          <w:lang w:val="en-GB"/>
+        </w:rPr>
+      </w:pPr>
+    </w:p>
+    <w:p>
+      <w:pPr>
+        <w:rPr>
+          <w:rFonts w:ascii="Times New Roman" w:eastAsia="Times New Roman" w:hAnsi="Times New Roman" w:cs="Times New Roman"/>
+          <w:b/>
+          <w:bCs/>
+          <w:color w:val="000000"/>
+          <w:sz w:val="26"/>
+          <w:szCs w:val="26"/>
+          <w:highlight w:val="yellow"/>
+          <w:lang w:val="en-GB"/>
+        </w:rPr>
+      </w:pPr>
+    </w:p>
+    <w:p>
+      <w:pPr>
+        <w:rPr>
+          <w:rFonts w:ascii="Times New Roman" w:eastAsia="Times New Roman" w:hAnsi="Times New Roman" w:cs="Times New Roman"/>
+          <w:b/>
+          <w:bCs/>
+          <w:color w:val="000000"/>
+          <w:sz w:val="26"/>
+          <w:szCs w:val="26"/>
+          <w:highlight w:val="yellow"/>
+          <w:lang w:val="en-GB"/>
+        </w:rPr>
+      </w:pPr>
+    </w:p>
+    <w:p>
+      <w:pPr>
+        <w:rPr>
+          <w:highlight w:val="yellow"/>
+          <w:lang w:val="en-GB"/>
+        </w:rPr>
+      </w:pPr>
+    </w:p>
+    <w:p>
+      <w:pPr>
+        <w:rPr>
+          <w:highlight w:val="yellow"/>
+          <w:lang w:val="en-GB"/>
+        </w:rPr>
+      </w:pPr>
+    </w:p>
+    <w:p>
+      <w:pPr>
+        <w:rPr>
+          <w:highlight w:val="yellow"/>
+          <w:lang w:val="en-GB"/>
+        </w:rPr>
+      </w:pPr>
+    </w:p>
+    <w:p>
+      <w:pPr>
+        <w:rPr>
+          <w:highlight w:val="yellow"/>
+          <w:lang w:val="en-GB"/>
+        </w:rPr>
+      </w:pPr>
+    </w:p>
+    <w:p>
+      <w:pPr>
+        <w:rPr>
+          <w:highlight w:val="yellow"/>
+          <w:lang w:val="en-GB"/>
+        </w:rPr>
+      </w:pPr>
+    </w:p>
+    <w:p>
+      <w:pPr>
+        <w:rPr>
+          <w:highlight w:val="yellow"/>
+          <w:lang w:val="en-GB"/>
+        </w:rPr>
+      </w:pPr>
+    </w:p>
+    <w:p>
+      <w:pPr>
+        <w:rPr>
+          <w:highlight w:val="yellow"/>
+          <w:lang w:val="en-GB"/>
+        </w:rPr>
+      </w:pPr>
+    </w:p>
+    <w:p>
+      <w:pPr>
+        <w:rPr>
+          <w:highlight w:val="yellow"/>
+          <w:lang w:val="en-GB"/>
+        </w:rPr>
+      </w:pPr>
+    </w:p>
+    <w:p>
+      <w:pPr>
+        <w:rPr>
+          <w:highlight w:val="yellow"/>
+          <w:lang w:val="en-GB"/>
+        </w:rPr>
+      </w:pPr>
+    </w:p>
+    <w:p>
+      <w:pPr>
+        <w:rPr>
+          <w:rFonts w:ascii="Times New Roman" w:eastAsia="Times New Roman" w:hAnsi="Times New Roman" w:cs="Times New Roman"/>
+          <w:b/>
+          <w:bCs/>
+          <w:color w:val="000000"/>
+          <w:sz w:val="26"/>
+          <w:szCs w:val="26"/>
+          <w:highlight w:val="yellow"/>
+          <w:lang w:val="vi-VN"/>
+        </w:rPr>
+      </w:pPr>
+      <w:r>
+        <w:rPr>
+          <w:rFonts w:ascii="Times New Roman" w:eastAsia="Times New Roman" w:hAnsi="Times New Roman" w:cs="Times New Roman"/>
+          <w:b/>
+          <w:bCs/>
+          <w:color w:val="000000"/>
+          <w:sz w:val="26"/>
+          <w:szCs w:val="26"/>
+          <w:highlight w:val="yellow"/>
+          <w:lang w:val="en-GB"/>
+        </w:rPr>
+        <w:t>Phần</w:t>
+      </w:r>
+      <w:r>
+        <w:rPr>
+          <w:rFonts w:ascii="Times New Roman" w:eastAsia="Times New Roman" w:hAnsi="Times New Roman" w:cs="Times New Roman"/>
+          <w:b/>
+          <w:bCs/>
+          <w:color w:val="000000"/>
+          <w:sz w:val="26"/>
+          <w:szCs w:val="26"/>
+          <w:highlight w:val="yellow"/>
+          <w:lang w:val="vi-VN"/>
+        </w:rPr>
+        <w:t xml:space="preserve"> </w:t>
+      </w:r>
+      <w:r>
+        <w:rPr>
+          <w:rFonts w:ascii="Times New Roman" w:eastAsia="Times New Roman" w:hAnsi="Times New Roman" w:cs="Times New Roman"/>
+          <w:b/>
+          <w:bCs/>
+          <w:color w:val="000000"/>
+          <w:sz w:val="26"/>
+          <w:szCs w:val="26"/>
+          <w:highlight w:val="yellow"/>
+          <w:lang w:val="vi-VN"/>
+        </w:rPr>
+        <w:t>4</w:t>
+      </w:r>
+      <w:r>
+        <w:rPr>
+          <w:rFonts w:ascii="Times New Roman" w:eastAsia="Times New Roman" w:hAnsi="Times New Roman" w:cs="Times New Roman"/>
+          <w:b/>
+          <w:bCs/>
+          <w:color w:val="000000"/>
+          <w:sz w:val="26"/>
+          <w:szCs w:val="26"/>
+          <w:highlight w:val="yellow"/>
+          <w:lang w:val="vi-VN"/>
+        </w:rPr>
+        <w:t xml:space="preserve">: </w:t>
+      </w:r>
+      <w:r>
+        <w:rPr>
+          <w:rFonts w:ascii="Times New Roman" w:eastAsia="Times New Roman" w:hAnsi="Times New Roman" w:cs="Times New Roman"/>
+          <w:b/>
+          <w:bCs/>
+          <w:color w:val="000000"/>
+          <w:sz w:val="26"/>
+          <w:szCs w:val="26"/>
+          <w:highlight w:val="yellow"/>
+          <w:lang w:val="en-GB"/>
+        </w:rPr>
+        <w:t>NHỮNG</w:t>
+      </w:r>
+      <w:r>
+        <w:rPr>
+          <w:rFonts w:ascii="Times New Roman" w:eastAsia="Times New Roman" w:hAnsi="Times New Roman" w:cs="Times New Roman"/>
+          <w:b/>
+          <w:bCs/>
+          <w:color w:val="000000"/>
+          <w:sz w:val="26"/>
+          <w:szCs w:val="26"/>
+          <w:highlight w:val="yellow"/>
+          <w:lang w:val="vi-VN"/>
+        </w:rPr>
+        <w:t xml:space="preserve"> UPDATE CÔNG</w:t>
+      </w:r>
+      <w:r>
+        <w:rPr>
+          <w:rFonts w:ascii="Times New Roman" w:eastAsia="Times New Roman" w:hAnsi="Times New Roman" w:cs="Times New Roman"/>
+          <w:b/>
+          <w:bCs/>
+          <w:color w:val="000000"/>
+          <w:sz w:val="26"/>
+          <w:szCs w:val="26"/>
+          <w:highlight w:val="yellow"/>
+          <w:lang w:val="vi-VN"/>
+        </w:rPr>
+        <w:t xml:space="preserve"> VỀ ACTOR – QUY TRÌNH NGHIỆP VỤ</w:t>
+      </w:r>
+      <w:r>
+        <w:rPr>
+          <w:rFonts w:ascii="Times New Roman" w:eastAsia="Times New Roman" w:hAnsi="Times New Roman" w:cs="Times New Roman"/>
+          <w:b/>
+          <w:bCs/>
+          <w:color w:val="000000"/>
+          <w:sz w:val="26"/>
+          <w:szCs w:val="26"/>
+          <w:highlight w:val="yellow"/>
+          <w:lang w:val="vi-VN"/>
+        </w:rPr>
+        <w:t>:</w:t>
+      </w:r>
+    </w:p>
+    <w:p>
+      <w:pPr>
+        <w:rPr>
+          <w:rFonts w:ascii="Times New Roman" w:eastAsia="Times New Roman" w:hAnsi="Times New Roman" w:cs="Times New Roman"/>
+          <w:b/>
+          <w:bCs/>
+          <w:color w:val="000000"/>
+          <w:sz w:val="26"/>
+          <w:szCs w:val="26"/>
+          <w:highlight w:val="yellow"/>
+          <w:lang w:val="vi-VN"/>
+        </w:rPr>
+      </w:pPr>
+      <w:r>
+        <w:rPr>
+          <w:rFonts w:ascii="Times New Roman" w:eastAsia="Times New Roman" w:hAnsi="Times New Roman" w:cs="Times New Roman"/>
+          <w:b/>
+          <w:bCs/>
+          <w:color w:val="000000"/>
+          <w:sz w:val="26"/>
+          <w:szCs w:val="26"/>
+          <w:highlight w:val="yellow"/>
+          <w:lang w:val="vi-VN"/>
+        </w:rPr>
+        <w:t>=&gt; Những actor và chức năng này chưa đụng</w:t>
+      </w:r>
+    </w:p>
+    <w:p>
+      <w:pPr>
+        <w:rPr>
+          <w:rFonts w:ascii="Times New Roman" w:eastAsia="Times New Roman" w:hAnsi="Times New Roman" w:cs="Times New Roman"/>
+          <w:b/>
+          <w:bCs/>
+          <w:color w:val="000000"/>
+          <w:sz w:val="26"/>
+          <w:szCs w:val="26"/>
+          <w:highlight w:val="yellow"/>
+        </w:rPr>
+      </w:pPr>
+      <w:r>
+        <w:rPr>
+          <w:rFonts w:ascii="Times New Roman" w:eastAsia="Times New Roman" w:hAnsi="Times New Roman" w:cs="Times New Roman"/>
+          <w:b/>
+          <w:bCs/>
+          <w:color w:val="000000"/>
+          <w:sz w:val="26"/>
+          <w:szCs w:val="26"/>
+          <w:highlight w:val="yellow"/>
+        </w:rPr>
+        <w:t>6. Actor: Quản lý kho hàng (Warehouse Manager)</w:t>
+      </w:r>
+    </w:p>
+    <w:p>
+      <w:pPr>
+        <w:rPr>
+          <w:rFonts w:ascii="Times New Roman" w:eastAsia="Times New Roman" w:hAnsi="Times New Roman" w:cs="Times New Roman"/>
+          <w:sz w:val="26"/>
+          <w:szCs w:val="26"/>
+          <w:highlight w:val="yellow"/>
+        </w:rPr>
+      </w:pPr>
+      <w:r>
+        <w:rPr>
+          <w:rFonts w:ascii="Times New Roman" w:eastAsia="Times New Roman" w:hAnsi="Times New Roman" w:cs="Times New Roman"/>
+          <w:b/>
+          <w:bCs/>
+          <w:sz w:val="26"/>
+          <w:szCs w:val="26"/>
+          <w:highlight w:val="yellow"/>
+        </w:rPr>
+        <w:t>- Phê duyệt yêu cầu xuất kho</w:t>
+      </w:r>
+      <w:r>
+        <w:rPr>
+          <w:rFonts w:ascii="Times New Roman" w:eastAsia="Times New Roman" w:hAnsi="Times New Roman" w:cs="Times New Roman"/>
+          <w:sz w:val="26"/>
+          <w:szCs w:val="26"/>
+          <w:highlight w:val="yellow"/>
+        </w:rPr>
+        <w:t>: Xem xét và phê duyệt yêu cầu xuất nguyên liệu từ các cửa hàng.</w:t>
+      </w:r>
+    </w:p>
+    <w:p>
+      <w:pPr>
+        <w:rPr>
+          <w:rFonts w:ascii="Times New Roman" w:eastAsia="Times New Roman" w:hAnsi="Times New Roman" w:cs="Times New Roman"/>
+          <w:sz w:val="26"/>
+          <w:szCs w:val="26"/>
+          <w:highlight w:val="yellow"/>
+        </w:rPr>
+      </w:pPr>
+      <w:r>
+        <w:rPr>
+          <w:rFonts w:ascii="Times New Roman" w:eastAsia="Times New Roman" w:hAnsi="Times New Roman" w:cs="Times New Roman"/>
+          <w:b/>
+          <w:bCs/>
+          <w:sz w:val="26"/>
+          <w:szCs w:val="26"/>
+          <w:highlight w:val="yellow"/>
+        </w:rPr>
+        <w:t>- Quản lý danh sách nhà cung cấp</w:t>
+      </w:r>
+      <w:r>
+        <w:rPr>
+          <w:rFonts w:ascii="Times New Roman" w:eastAsia="Times New Roman" w:hAnsi="Times New Roman" w:cs="Times New Roman"/>
+          <w:sz w:val="26"/>
+          <w:szCs w:val="26"/>
+          <w:highlight w:val="yellow"/>
+        </w:rPr>
+        <w:t>: Thêm, sửa, xóa thông tin nhà cung cấp và lịch sử giao dịch.</w:t>
+      </w:r>
+    </w:p>
+    <w:p>
+      <w:pPr>
+        <w:rPr>
+          <w:rFonts w:ascii="Times New Roman" w:eastAsia="Times New Roman" w:hAnsi="Times New Roman" w:cs="Times New Roman"/>
+          <w:sz w:val="26"/>
+          <w:szCs w:val="26"/>
+        </w:rPr>
+      </w:pPr>
+      <w:r>
+        <w:rPr>
+          <w:rFonts w:ascii="Times New Roman" w:eastAsia="Times New Roman" w:hAnsi="Times New Roman" w:cs="Times New Roman"/>
+          <w:b/>
+          <w:bCs/>
+          <w:sz w:val="26"/>
+          <w:szCs w:val="26"/>
+          <w:highlight w:val="yellow"/>
+        </w:rPr>
+        <w:t>- Xem báo cáo và dự báo tồn kho</w:t>
+      </w:r>
+      <w:r>
+        <w:rPr>
+          <w:rFonts w:ascii="Times New Roman" w:eastAsia="Times New Roman" w:hAnsi="Times New Roman" w:cs="Times New Roman"/>
+          <w:sz w:val="26"/>
+          <w:szCs w:val="26"/>
+          <w:highlight w:val="yellow"/>
+        </w:rPr>
+        <w:t>: Theo dõi báo cáo tồn kho hiện tại và dự báo nhu cầu tương lai.</w:t>
+      </w:r>
+    </w:p>
+    <w:p>
+      <w:pPr>
+        <w:rPr>
+          <w:rFonts w:ascii="Times New Roman" w:eastAsia="Times New Roman" w:hAnsi="Times New Roman" w:cs="Times New Roman"/>
+          <w:b/>
+          <w:bCs/>
+          <w:color w:val="000000"/>
+          <w:sz w:val="26"/>
+          <w:szCs w:val="26"/>
+          <w:highlight w:val="yellow"/>
+        </w:rPr>
+      </w:pPr>
+      <w:r>
+        <w:rPr>
+          <w:rFonts w:ascii="Times New Roman" w:eastAsia="Times New Roman" w:hAnsi="Times New Roman" w:cs="Times New Roman"/>
+          <w:b/>
+          <w:bCs/>
+          <w:color w:val="000000"/>
+          <w:sz w:val="26"/>
+          <w:szCs w:val="26"/>
+          <w:highlight w:val="yellow"/>
+        </w:rPr>
+        <w:t>4. Actor: Nhân viên kho hàng (Warehouse Staff)</w:t>
+      </w:r>
+    </w:p>
+    <w:p>
+      <w:pPr>
+        <w:rPr>
+          <w:rFonts w:ascii="Times New Roman" w:eastAsia="Times New Roman" w:hAnsi="Times New Roman" w:cs="Times New Roman"/>
+          <w:sz w:val="26"/>
+          <w:szCs w:val="26"/>
+          <w:highlight w:val="yellow"/>
+        </w:rPr>
+      </w:pPr>
+      <w:r>
+        <w:rPr>
+          <w:rFonts w:ascii="Times New Roman" w:eastAsia="Times New Roman" w:hAnsi="Times New Roman" w:cs="Times New Roman"/>
+          <w:b/>
+          <w:bCs/>
+          <w:sz w:val="26"/>
+          <w:szCs w:val="26"/>
+          <w:highlight w:val="yellow"/>
+        </w:rPr>
+        <w:t>- Lập phiếu nhập kho</w:t>
+      </w:r>
+      <w:r>
+        <w:rPr>
+          <w:rFonts w:ascii="Times New Roman" w:eastAsia="Times New Roman" w:hAnsi="Times New Roman" w:cs="Times New Roman"/>
+          <w:sz w:val="26"/>
+          <w:szCs w:val="26"/>
+          <w:highlight w:val="yellow"/>
+        </w:rPr>
+        <w:t>: Tạo phiếu ghi nhận nguyên vật liệu nhập từ nhà cung cấp.</w:t>
+      </w:r>
+    </w:p>
+    <w:p>
+      <w:pPr>
+        <w:rPr>
+          <w:rFonts w:ascii="Times New Roman" w:eastAsia="Times New Roman" w:hAnsi="Times New Roman" w:cs="Times New Roman"/>
+          <w:sz w:val="26"/>
+          <w:szCs w:val="26"/>
+          <w:highlight w:val="yellow"/>
+        </w:rPr>
+      </w:pPr>
+      <w:r>
+        <w:rPr>
+          <w:rFonts w:ascii="Times New Roman" w:eastAsia="Times New Roman" w:hAnsi="Times New Roman" w:cs="Times New Roman"/>
+          <w:b/>
+          <w:bCs/>
+          <w:sz w:val="26"/>
+          <w:szCs w:val="26"/>
+          <w:highlight w:val="yellow"/>
+        </w:rPr>
+        <w:t>- Lập phiếu xuất kho</w:t>
+      </w:r>
+      <w:r>
+        <w:rPr>
+          <w:rFonts w:ascii="Times New Roman" w:eastAsia="Times New Roman" w:hAnsi="Times New Roman" w:cs="Times New Roman"/>
+          <w:sz w:val="26"/>
+          <w:szCs w:val="26"/>
+          <w:highlight w:val="yellow"/>
+        </w:rPr>
+        <w:t>: Tạo phiếu xuất nguyên vật liệu cho cửa hàng hoặc sản xuất.</w:t>
+      </w:r>
+    </w:p>
+    <w:p>
+      <w:pPr>
+        <w:rPr>
+          <w:rFonts w:ascii="Times New Roman" w:eastAsia="Times New Roman" w:hAnsi="Times New Roman" w:cs="Times New Roman"/>
+          <w:sz w:val="26"/>
+          <w:szCs w:val="26"/>
+          <w:highlight w:val="yellow"/>
+        </w:rPr>
+      </w:pPr>
+      <w:r>
+        <w:rPr>
+          <w:rFonts w:ascii="Times New Roman" w:eastAsia="Times New Roman" w:hAnsi="Times New Roman" w:cs="Times New Roman"/>
+          <w:b/>
+          <w:bCs/>
+          <w:sz w:val="26"/>
+          <w:szCs w:val="26"/>
+          <w:highlight w:val="yellow"/>
+        </w:rPr>
+        <w:t>- Cập nhật tồn kho thực tế</w:t>
+      </w:r>
+      <w:r>
+        <w:rPr>
+          <w:rFonts w:ascii="Times New Roman" w:eastAsia="Times New Roman" w:hAnsi="Times New Roman" w:cs="Times New Roman"/>
+          <w:sz w:val="26"/>
+          <w:szCs w:val="26"/>
+          <w:highlight w:val="yellow"/>
+        </w:rPr>
+        <w:t>: Điều chỉnh số lượng tồn kho dựa trên kiểm kê thực tế.</w:t>
+      </w:r>
+    </w:p>
+    <w:p>
+      <w:pPr>
+        <w:rPr>
+          <w:rFonts w:ascii="Times New Roman" w:eastAsia="Times New Roman" w:hAnsi="Times New Roman" w:cs="Times New Roman"/>
+          <w:sz w:val="26"/>
+          <w:szCs w:val="26"/>
+          <w:highlight w:val="yellow"/>
+        </w:rPr>
+      </w:pPr>
+      <w:r>
+        <w:rPr>
+          <w:rFonts w:ascii="Times New Roman" w:eastAsia="Times New Roman" w:hAnsi="Times New Roman" w:cs="Times New Roman"/>
+          <w:b/>
+          <w:bCs/>
+          <w:sz w:val="26"/>
+          <w:szCs w:val="26"/>
+          <w:highlight w:val="yellow"/>
+        </w:rPr>
         <w:lastRenderedPageBreak/>
-        <w:t>6. Riêng phần gợi ý sản phẩm cho nhiều dữ liệu mẫu hơn :v để có thể phân tích hành vi của khách hàng</w:t>
-      </w:r>
-    </w:p>
-    <w:p>
-      <w:pPr>
-        <w:rPr>
-          <w:rFonts w:ascii="Times New Roman" w:eastAsia="Times New Roman" w:hAnsi="Times New Roman" w:cs="Times New Roman"/>
-          <w:b/>
-          <w:bCs/>
-          <w:color w:val="000000"/>
-          <w:sz w:val="26"/>
-          <w:szCs w:val="26"/>
-          <w:highlight w:val="yellow"/>
-          <w:lang w:val="en-GB"/>
-        </w:rPr>
-      </w:pPr>
-    </w:p>
-    <w:p>
-      <w:pPr>
-        <w:rPr>
-          <w:rFonts w:ascii="Times New Roman" w:eastAsia="Times New Roman" w:hAnsi="Times New Roman" w:cs="Times New Roman"/>
-          <w:b/>
-          <w:bCs/>
-          <w:color w:val="000000"/>
-          <w:sz w:val="26"/>
-          <w:szCs w:val="26"/>
-          <w:highlight w:val="yellow"/>
-          <w:lang w:val="en-GB"/>
-        </w:rPr>
-      </w:pPr>
-    </w:p>
-    <w:p>
-      <w:pPr>
-        <w:rPr>
-          <w:rFonts w:ascii="Times New Roman" w:eastAsia="Times New Roman" w:hAnsi="Times New Roman" w:cs="Times New Roman"/>
-          <w:b/>
-          <w:bCs/>
-          <w:color w:val="000000"/>
-          <w:sz w:val="26"/>
-          <w:szCs w:val="26"/>
-          <w:highlight w:val="yellow"/>
-          <w:lang w:val="vi-VN"/>
-        </w:rPr>
-      </w:pPr>
-      <w:r>
-        <w:rPr>
-          <w:rFonts w:ascii="Times New Roman" w:eastAsia="Times New Roman" w:hAnsi="Times New Roman" w:cs="Times New Roman"/>
-          <w:b/>
-          <w:bCs/>
-          <w:color w:val="000000"/>
-          <w:sz w:val="26"/>
-          <w:szCs w:val="26"/>
-          <w:highlight w:val="yellow"/>
-          <w:lang w:val="en-GB"/>
-        </w:rPr>
-        <w:t>Phần</w:t>
-      </w:r>
-      <w:r>
-        <w:rPr>
-          <w:rFonts w:ascii="Times New Roman" w:eastAsia="Times New Roman" w:hAnsi="Times New Roman" w:cs="Times New Roman"/>
-          <w:b/>
-          <w:bCs/>
-          <w:color w:val="000000"/>
-          <w:sz w:val="26"/>
-          <w:szCs w:val="26"/>
-          <w:highlight w:val="yellow"/>
-          <w:lang w:val="vi-VN"/>
-        </w:rPr>
-        <w:t xml:space="preserve"> 3: </w:t>
-      </w:r>
-      <w:r>
-        <w:rPr>
-          <w:rFonts w:ascii="Times New Roman" w:eastAsia="Times New Roman" w:hAnsi="Times New Roman" w:cs="Times New Roman"/>
-          <w:b/>
-          <w:bCs/>
-          <w:color w:val="000000"/>
-          <w:sz w:val="26"/>
-          <w:szCs w:val="26"/>
-          <w:highlight w:val="yellow"/>
-          <w:lang w:val="en-GB"/>
-        </w:rPr>
-        <w:t>NHỮNG</w:t>
-      </w:r>
-      <w:r>
-        <w:rPr>
-          <w:rFonts w:ascii="Times New Roman" w:eastAsia="Times New Roman" w:hAnsi="Times New Roman" w:cs="Times New Roman"/>
-          <w:b/>
-          <w:bCs/>
-          <w:color w:val="000000"/>
-          <w:sz w:val="26"/>
-          <w:szCs w:val="26"/>
-          <w:highlight w:val="yellow"/>
-          <w:lang w:val="vi-VN"/>
-        </w:rPr>
-        <w:t xml:space="preserve"> UPDATE CÔNG NGHÊ:</w:t>
-      </w:r>
-    </w:p>
-    <w:p>
-      <w:pPr>
-        <w:rPr>
-          <w:rFonts w:ascii="Times New Roman" w:eastAsia="Times New Roman" w:hAnsi="Times New Roman" w:cs="Times New Roman"/>
-          <w:b/>
-          <w:bCs/>
-          <w:color w:val="000000"/>
-          <w:sz w:val="26"/>
-          <w:szCs w:val="26"/>
-          <w:highlight w:val="yellow"/>
-          <w:lang w:val="vi-VN"/>
-        </w:rPr>
-      </w:pPr>
-      <w:r>
-        <w:rPr>
-          <w:rFonts w:ascii="Times New Roman" w:eastAsia="Times New Roman" w:hAnsi="Times New Roman" w:cs="Times New Roman"/>
-          <w:b/>
-          <w:bCs/>
-          <w:color w:val="000000"/>
-          <w:sz w:val="26"/>
-          <w:szCs w:val="26"/>
-          <w:highlight w:val="yellow"/>
-          <w:lang w:val="vi-VN"/>
-        </w:rPr>
-        <w:t>=&gt; CHECK LẠI – CẬP NHẬT LẠI BÊN ĐỀ TÀI KỸ THUẬT</w:t>
-      </w:r>
-    </w:p>
-    <w:p>
-      <w:pPr>
-        <w:rPr>
-          <w:rFonts w:ascii="Times New Roman" w:eastAsia="Times New Roman" w:hAnsi="Times New Roman" w:cs="Times New Roman"/>
-          <w:b/>
-          <w:bCs/>
-          <w:color w:val="000000"/>
-          <w:sz w:val="26"/>
-          <w:szCs w:val="26"/>
-          <w:highlight w:val="yellow"/>
-          <w:lang w:val="en-GB"/>
-        </w:rPr>
-      </w:pPr>
-    </w:p>
-    <w:p>
-      <w:pPr>
-        <w:rPr>
-          <w:rFonts w:ascii="Times New Roman" w:eastAsia="Times New Roman" w:hAnsi="Times New Roman" w:cs="Times New Roman"/>
-          <w:b/>
-          <w:bCs/>
-          <w:color w:val="000000"/>
-          <w:sz w:val="26"/>
-          <w:szCs w:val="26"/>
-          <w:highlight w:val="yellow"/>
-          <w:lang w:val="en-GB"/>
-        </w:rPr>
-      </w:pPr>
-    </w:p>
-    <w:p>
-      <w:pPr>
-        <w:rPr>
-          <w:rFonts w:ascii="Times New Roman" w:eastAsia="Times New Roman" w:hAnsi="Times New Roman" w:cs="Times New Roman"/>
-          <w:b/>
-          <w:bCs/>
-          <w:color w:val="000000"/>
-          <w:sz w:val="26"/>
-          <w:szCs w:val="26"/>
-          <w:highlight w:val="yellow"/>
-          <w:lang w:val="en-GB"/>
-        </w:rPr>
-      </w:pPr>
-    </w:p>
-    <w:p>
-      <w:pPr>
-        <w:rPr>
-          <w:rFonts w:ascii="Times New Roman" w:eastAsia="Times New Roman" w:hAnsi="Times New Roman" w:cs="Times New Roman"/>
-          <w:b/>
-          <w:bCs/>
-          <w:color w:val="000000"/>
-          <w:sz w:val="26"/>
-          <w:szCs w:val="26"/>
-          <w:highlight w:val="yellow"/>
-          <w:lang w:val="en-GB"/>
-        </w:rPr>
-      </w:pPr>
-    </w:p>
-    <w:p>
-      <w:pPr>
-        <w:rPr>
-          <w:rFonts w:ascii="Times New Roman" w:eastAsia="Times New Roman" w:hAnsi="Times New Roman" w:cs="Times New Roman"/>
-          <w:b/>
-          <w:bCs/>
-          <w:color w:val="000000"/>
-          <w:sz w:val="26"/>
-          <w:szCs w:val="26"/>
-          <w:highlight w:val="yellow"/>
-          <w:lang w:val="en-GB"/>
-        </w:rPr>
-      </w:pPr>
-    </w:p>
-    <w:p>
-      <w:pPr>
-        <w:rPr>
-          <w:highlight w:val="yellow"/>
-          <w:lang w:val="en-GB"/>
-        </w:rPr>
-      </w:pPr>
-    </w:p>
-    <w:p>
-      <w:pPr>
-        <w:rPr>
-          <w:highlight w:val="yellow"/>
-          <w:lang w:val="en-GB"/>
-        </w:rPr>
-      </w:pPr>
-    </w:p>
-    <w:p>
-      <w:pPr>
-        <w:rPr>
-          <w:highlight w:val="yellow"/>
-          <w:lang w:val="en-GB"/>
-        </w:rPr>
-      </w:pPr>
-    </w:p>
-    <w:p>
-      <w:pPr>
-        <w:rPr>
-          <w:highlight w:val="yellow"/>
-          <w:lang w:val="en-GB"/>
-        </w:rPr>
-      </w:pPr>
-    </w:p>
-    <w:p>
-      <w:pPr>
-        <w:rPr>
-          <w:highlight w:val="yellow"/>
-          <w:lang w:val="en-GB"/>
-        </w:rPr>
-      </w:pPr>
-    </w:p>
-    <w:p>
-      <w:pPr>
-        <w:rPr>
-          <w:highlight w:val="yellow"/>
-          <w:lang w:val="en-GB"/>
-        </w:rPr>
-      </w:pPr>
-    </w:p>
-    <w:p>
-      <w:pPr>
-        <w:rPr>
-          <w:highlight w:val="yellow"/>
-          <w:lang w:val="en-GB"/>
-        </w:rPr>
-      </w:pPr>
-    </w:p>
-    <w:p>
-      <w:pPr>
-        <w:rPr>
-          <w:highlight w:val="yellow"/>
-          <w:lang w:val="en-GB"/>
-        </w:rPr>
-      </w:pPr>
-    </w:p>
-    <w:p>
-      <w:pPr>
-        <w:rPr>
-          <w:highlight w:val="yellow"/>
-          <w:lang w:val="en-GB"/>
-        </w:rPr>
-      </w:pPr>
-    </w:p>
-    <w:p>
-      <w:pPr>
-        <w:rPr>
-          <w:rFonts w:ascii="Times New Roman" w:eastAsia="Times New Roman" w:hAnsi="Times New Roman" w:cs="Times New Roman"/>
-          <w:b/>
-          <w:bCs/>
-          <w:color w:val="000000"/>
-          <w:sz w:val="26"/>
-          <w:szCs w:val="26"/>
-          <w:highlight w:val="yellow"/>
-          <w:lang w:val="vi-VN"/>
-        </w:rPr>
-      </w:pPr>
-      <w:r>
-        <w:rPr>
-          <w:rFonts w:ascii="Times New Roman" w:eastAsia="Times New Roman" w:hAnsi="Times New Roman" w:cs="Times New Roman"/>
-          <w:b/>
-          <w:bCs/>
-          <w:color w:val="000000"/>
-          <w:sz w:val="26"/>
-          <w:szCs w:val="26"/>
-          <w:highlight w:val="yellow"/>
-          <w:lang w:val="en-GB"/>
-        </w:rPr>
-        <w:t>Phần</w:t>
-      </w:r>
-      <w:r>
-        <w:rPr>
-          <w:rFonts w:ascii="Times New Roman" w:eastAsia="Times New Roman" w:hAnsi="Times New Roman" w:cs="Times New Roman"/>
-          <w:b/>
-          <w:bCs/>
-          <w:color w:val="000000"/>
-          <w:sz w:val="26"/>
-          <w:szCs w:val="26"/>
-          <w:highlight w:val="yellow"/>
-          <w:lang w:val="vi-VN"/>
-        </w:rPr>
-        <w:t xml:space="preserve"> </w:t>
-      </w:r>
-      <w:r>
-        <w:rPr>
-          <w:rFonts w:ascii="Times New Roman" w:eastAsia="Times New Roman" w:hAnsi="Times New Roman" w:cs="Times New Roman"/>
-          <w:b/>
-          <w:bCs/>
-          <w:color w:val="000000"/>
-          <w:sz w:val="26"/>
-          <w:szCs w:val="26"/>
-          <w:highlight w:val="yellow"/>
-          <w:lang w:val="vi-VN"/>
-        </w:rPr>
-        <w:t>4</w:t>
-      </w:r>
-      <w:r>
-        <w:rPr>
-          <w:rFonts w:ascii="Times New Roman" w:eastAsia="Times New Roman" w:hAnsi="Times New Roman" w:cs="Times New Roman"/>
-          <w:b/>
-          <w:bCs/>
-          <w:color w:val="000000"/>
-          <w:sz w:val="26"/>
-          <w:szCs w:val="26"/>
-          <w:highlight w:val="yellow"/>
-          <w:lang w:val="vi-VN"/>
-        </w:rPr>
-        <w:t xml:space="preserve">: </w:t>
-      </w:r>
-      <w:r>
-        <w:rPr>
-          <w:rFonts w:ascii="Times New Roman" w:eastAsia="Times New Roman" w:hAnsi="Times New Roman" w:cs="Times New Roman"/>
-          <w:b/>
-          <w:bCs/>
-          <w:color w:val="000000"/>
-          <w:sz w:val="26"/>
-          <w:szCs w:val="26"/>
-          <w:highlight w:val="yellow"/>
-          <w:lang w:val="en-GB"/>
-        </w:rPr>
-        <w:t>NHỮNG</w:t>
-      </w:r>
-      <w:r>
-        <w:rPr>
-          <w:rFonts w:ascii="Times New Roman" w:eastAsia="Times New Roman" w:hAnsi="Times New Roman" w:cs="Times New Roman"/>
-          <w:b/>
-          <w:bCs/>
-          <w:color w:val="000000"/>
-          <w:sz w:val="26"/>
-          <w:szCs w:val="26"/>
-          <w:highlight w:val="yellow"/>
-          <w:lang w:val="vi-VN"/>
-        </w:rPr>
-        <w:t xml:space="preserve"> UPDATE CÔNG</w:t>
-      </w:r>
-      <w:r>
-        <w:rPr>
-          <w:rFonts w:ascii="Times New Roman" w:eastAsia="Times New Roman" w:hAnsi="Times New Roman" w:cs="Times New Roman"/>
-          <w:b/>
-          <w:bCs/>
-          <w:color w:val="000000"/>
-          <w:sz w:val="26"/>
-          <w:szCs w:val="26"/>
-          <w:highlight w:val="yellow"/>
-          <w:lang w:val="vi-VN"/>
-        </w:rPr>
-        <w:t xml:space="preserve"> VỀ ACTOR – QUY TRÌNH NGHIỆP VỤ</w:t>
-      </w:r>
-      <w:r>
-        <w:rPr>
-          <w:rFonts w:ascii="Times New Roman" w:eastAsia="Times New Roman" w:hAnsi="Times New Roman" w:cs="Times New Roman"/>
-          <w:b/>
-          <w:bCs/>
-          <w:color w:val="000000"/>
-          <w:sz w:val="26"/>
-          <w:szCs w:val="26"/>
-          <w:highlight w:val="yellow"/>
-          <w:lang w:val="vi-VN"/>
-        </w:rPr>
-        <w:t>:</w:t>
-      </w:r>
-    </w:p>
-    <w:p>
-      <w:pPr>
-        <w:rPr>
-          <w:rFonts w:ascii="Times New Roman" w:eastAsia="Times New Roman" w:hAnsi="Times New Roman" w:cs="Times New Roman"/>
-          <w:b/>
-          <w:bCs/>
-          <w:color w:val="000000"/>
-          <w:sz w:val="26"/>
-          <w:szCs w:val="26"/>
-          <w:highlight w:val="yellow"/>
-          <w:lang w:val="vi-VN"/>
-        </w:rPr>
-      </w:pPr>
-      <w:r>
-        <w:rPr>
-          <w:rFonts w:ascii="Times New Roman" w:eastAsia="Times New Roman" w:hAnsi="Times New Roman" w:cs="Times New Roman"/>
-          <w:b/>
-          <w:bCs/>
-          <w:color w:val="000000"/>
-          <w:sz w:val="26"/>
-          <w:szCs w:val="26"/>
-          <w:highlight w:val="yellow"/>
-          <w:lang w:val="vi-VN"/>
-        </w:rPr>
-        <w:t>=&gt; Những actor và chức năng này chưa đụng</w:t>
-      </w:r>
-    </w:p>
-    <w:p>
-      <w:pPr>
-        <w:rPr>
-          <w:rFonts w:ascii="Times New Roman" w:eastAsia="Times New Roman" w:hAnsi="Times New Roman" w:cs="Times New Roman"/>
-          <w:b/>
-          <w:bCs/>
-          <w:color w:val="000000"/>
-          <w:sz w:val="26"/>
-          <w:szCs w:val="26"/>
-          <w:highlight w:val="yellow"/>
-        </w:rPr>
-      </w:pPr>
-      <w:r>
-        <w:rPr>
-          <w:rFonts w:ascii="Times New Roman" w:eastAsia="Times New Roman" w:hAnsi="Times New Roman" w:cs="Times New Roman"/>
-          <w:b/>
-          <w:bCs/>
-          <w:color w:val="000000"/>
-          <w:sz w:val="26"/>
-          <w:szCs w:val="26"/>
-          <w:highlight w:val="yellow"/>
-        </w:rPr>
-        <w:t>6. Actor: Quản lý kho hàng (Warehouse Manager)</w:t>
-      </w:r>
-    </w:p>
-    <w:p>
-      <w:pPr>
-        <w:rPr>
-          <w:rFonts w:ascii="Times New Roman" w:eastAsia="Times New Roman" w:hAnsi="Times New Roman" w:cs="Times New Roman"/>
-          <w:sz w:val="26"/>
-          <w:szCs w:val="26"/>
-          <w:highlight w:val="yellow"/>
-        </w:rPr>
-      </w:pPr>
-      <w:r>
-        <w:rPr>
-          <w:rFonts w:ascii="Times New Roman" w:eastAsia="Times New Roman" w:hAnsi="Times New Roman" w:cs="Times New Roman"/>
-          <w:b/>
-          <w:bCs/>
-          <w:sz w:val="26"/>
-          <w:szCs w:val="26"/>
-          <w:highlight w:val="yellow"/>
-        </w:rPr>
-        <w:t>- Phê duyệt yêu cầu xuất kho</w:t>
-      </w:r>
-      <w:r>
-        <w:rPr>
-          <w:rFonts w:ascii="Times New Roman" w:eastAsia="Times New Roman" w:hAnsi="Times New Roman" w:cs="Times New Roman"/>
-          <w:sz w:val="26"/>
-          <w:szCs w:val="26"/>
-          <w:highlight w:val="yellow"/>
-        </w:rPr>
-        <w:t>: Xem xét và phê duyệt yêu cầu xuất nguyên liệu từ các cửa hàng.</w:t>
-      </w:r>
-    </w:p>
-    <w:p>
-      <w:pPr>
-        <w:rPr>
-          <w:rFonts w:ascii="Times New Roman" w:eastAsia="Times New Roman" w:hAnsi="Times New Roman" w:cs="Times New Roman"/>
-          <w:sz w:val="26"/>
-          <w:szCs w:val="26"/>
-          <w:highlight w:val="yellow"/>
-        </w:rPr>
-      </w:pPr>
-      <w:r>
-        <w:rPr>
-          <w:rFonts w:ascii="Times New Roman" w:eastAsia="Times New Roman" w:hAnsi="Times New Roman" w:cs="Times New Roman"/>
-          <w:b/>
-          <w:bCs/>
-          <w:sz w:val="26"/>
-          <w:szCs w:val="26"/>
-          <w:highlight w:val="yellow"/>
-        </w:rPr>
-        <w:t>- Quản lý danh sách nhà cung cấp</w:t>
-      </w:r>
-      <w:r>
-        <w:rPr>
-          <w:rFonts w:ascii="Times New Roman" w:eastAsia="Times New Roman" w:hAnsi="Times New Roman" w:cs="Times New Roman"/>
-          <w:sz w:val="26"/>
-          <w:szCs w:val="26"/>
-          <w:highlight w:val="yellow"/>
-        </w:rPr>
-        <w:t>: Thêm, sửa, xóa thông tin nhà cung cấp và lịch sử giao dịch.</w:t>
-      </w:r>
-    </w:p>
-    <w:p>
-      <w:pPr>
-        <w:rPr>
-          <w:rFonts w:ascii="Times New Roman" w:eastAsia="Times New Roman" w:hAnsi="Times New Roman" w:cs="Times New Roman"/>
-          <w:sz w:val="26"/>
-          <w:szCs w:val="26"/>
-        </w:rPr>
-      </w:pPr>
-      <w:r>
-        <w:rPr>
-          <w:rFonts w:ascii="Times New Roman" w:eastAsia="Times New Roman" w:hAnsi="Times New Roman" w:cs="Times New Roman"/>
-          <w:b/>
-          <w:bCs/>
-          <w:sz w:val="26"/>
-          <w:szCs w:val="26"/>
-          <w:highlight w:val="yellow"/>
-        </w:rPr>
-        <w:t>- Xem báo cáo và dự báo tồn kho</w:t>
-      </w:r>
-      <w:r>
-        <w:rPr>
-          <w:rFonts w:ascii="Times New Roman" w:eastAsia="Times New Roman" w:hAnsi="Times New Roman" w:cs="Times New Roman"/>
-          <w:sz w:val="26"/>
-          <w:szCs w:val="26"/>
-          <w:highlight w:val="yellow"/>
-        </w:rPr>
-        <w:t>: Theo dõi báo cáo tồn kho hiện tại và dự báo nhu cầu tương lai.</w:t>
-      </w:r>
-    </w:p>
-    <w:p>
-      <w:pPr>
-        <w:rPr>
-          <w:rFonts w:ascii="Times New Roman" w:eastAsia="Times New Roman" w:hAnsi="Times New Roman" w:cs="Times New Roman"/>
-          <w:b/>
-          <w:bCs/>
-          <w:color w:val="000000"/>
-          <w:sz w:val="26"/>
-          <w:szCs w:val="26"/>
-          <w:highlight w:val="yellow"/>
-        </w:rPr>
-      </w:pPr>
-      <w:r>
-        <w:rPr>
-          <w:rFonts w:ascii="Times New Roman" w:eastAsia="Times New Roman" w:hAnsi="Times New Roman" w:cs="Times New Roman"/>
-          <w:b/>
-          <w:bCs/>
-          <w:color w:val="000000"/>
-          <w:sz w:val="26"/>
-          <w:szCs w:val="26"/>
-          <w:highlight w:val="yellow"/>
-        </w:rPr>
-        <w:t>4. Actor: Nhân viên kho hàng (Warehouse Staff)</w:t>
-      </w:r>
-    </w:p>
-    <w:p>
-      <w:pPr>
-        <w:rPr>
-          <w:rFonts w:ascii="Times New Roman" w:eastAsia="Times New Roman" w:hAnsi="Times New Roman" w:cs="Times New Roman"/>
-          <w:sz w:val="26"/>
-          <w:szCs w:val="26"/>
-          <w:highlight w:val="yellow"/>
-        </w:rPr>
-      </w:pPr>
-      <w:r>
-        <w:rPr>
-          <w:rFonts w:ascii="Times New Roman" w:eastAsia="Times New Roman" w:hAnsi="Times New Roman" w:cs="Times New Roman"/>
-          <w:b/>
-          <w:bCs/>
-          <w:sz w:val="26"/>
-          <w:szCs w:val="26"/>
-          <w:highlight w:val="yellow"/>
-        </w:rPr>
-        <w:t>- Lập phiếu nhập kho</w:t>
-      </w:r>
-      <w:r>
-        <w:rPr>
-          <w:rFonts w:ascii="Times New Roman" w:eastAsia="Times New Roman" w:hAnsi="Times New Roman" w:cs="Times New Roman"/>
-          <w:sz w:val="26"/>
-          <w:szCs w:val="26"/>
-          <w:highlight w:val="yellow"/>
-        </w:rPr>
-        <w:t>: Tạo phiếu ghi nhận nguyên vật liệu nhập từ nhà cung cấp.</w:t>
-      </w:r>
-    </w:p>
-    <w:p>
-      <w:pPr>
-        <w:rPr>
-          <w:rFonts w:ascii="Times New Roman" w:eastAsia="Times New Roman" w:hAnsi="Times New Roman" w:cs="Times New Roman"/>
-          <w:sz w:val="26"/>
-          <w:szCs w:val="26"/>
-          <w:highlight w:val="yellow"/>
-        </w:rPr>
-      </w:pPr>
-      <w:r>
-        <w:rPr>
-          <w:rFonts w:ascii="Times New Roman" w:eastAsia="Times New Roman" w:hAnsi="Times New Roman" w:cs="Times New Roman"/>
-          <w:b/>
-          <w:bCs/>
-          <w:sz w:val="26"/>
-          <w:szCs w:val="26"/>
-          <w:highlight w:val="yellow"/>
-        </w:rPr>
-        <w:t>- Lập phiếu xuất kho</w:t>
-      </w:r>
-      <w:r>
-        <w:rPr>
-          <w:rFonts w:ascii="Times New Roman" w:eastAsia="Times New Roman" w:hAnsi="Times New Roman" w:cs="Times New Roman"/>
-          <w:sz w:val="26"/>
-          <w:szCs w:val="26"/>
-          <w:highlight w:val="yellow"/>
-        </w:rPr>
-        <w:t>: Tạo phiếu xuất nguyên vật liệu cho cửa hàng hoặc sản xuất.</w:t>
-      </w:r>
-    </w:p>
-    <w:p>
-      <w:pPr>
-        <w:rPr>
-          <w:rFonts w:ascii="Times New Roman" w:eastAsia="Times New Roman" w:hAnsi="Times New Roman" w:cs="Times New Roman"/>
-          <w:sz w:val="26"/>
-          <w:szCs w:val="26"/>
-          <w:highlight w:val="yellow"/>
-        </w:rPr>
-      </w:pPr>
-      <w:r>
-        <w:rPr>
-          <w:rFonts w:ascii="Times New Roman" w:eastAsia="Times New Roman" w:hAnsi="Times New Roman" w:cs="Times New Roman"/>
-          <w:b/>
-          <w:bCs/>
-          <w:sz w:val="26"/>
-          <w:szCs w:val="26"/>
-          <w:highlight w:val="yellow"/>
-        </w:rPr>
-        <w:t>- Cập nhật tồn kho thực tế</w:t>
-      </w:r>
-      <w:r>
-        <w:rPr>
-          <w:rFonts w:ascii="Times New Roman" w:eastAsia="Times New Roman" w:hAnsi="Times New Roman" w:cs="Times New Roman"/>
-          <w:sz w:val="26"/>
-          <w:szCs w:val="26"/>
-          <w:highlight w:val="yellow"/>
-        </w:rPr>
-        <w:t>: Điều chỉnh số lượng tồn kho dựa trên kiểm kê thực tế.</w:t>
-      </w:r>
-    </w:p>
-    <w:p>
-      <w:pPr>
-        <w:rPr>
-          <w:rFonts w:ascii="Times New Roman" w:eastAsia="Times New Roman" w:hAnsi="Times New Roman" w:cs="Times New Roman"/>
-          <w:sz w:val="26"/>
-          <w:szCs w:val="26"/>
-          <w:highlight w:val="yellow"/>
-        </w:rPr>
-      </w:pPr>
-      <w:r>
-        <w:rPr>
-          <w:rFonts w:ascii="Times New Roman" w:eastAsia="Times New Roman" w:hAnsi="Times New Roman" w:cs="Times New Roman"/>
-          <w:b/>
-          <w:bCs/>
-          <w:sz w:val="26"/>
-          <w:szCs w:val="26"/>
-          <w:highlight w:val="yellow"/>
-        </w:rPr>
         <w:t>- Quản lý nguyên vật liệu</w:t>
       </w:r>
       <w:r>

</xml_diff>

<commit_message>
feat (mobile app - customer): cap nhat app mobile cho customer
</commit_message>
<xml_diff>
--- a/CNM_ChucNangNguoiDung.docx
+++ b/CNM_ChucNangNguoiDung.docx
@@ -20,12 +20,148 @@
           <w:rFonts w:ascii="Times New Roman" w:eastAsia="Times New Roman" w:hAnsi="Times New Roman" w:cs="Times New Roman"/>
           <w:b/>
           <w:bCs/>
+          <w:noProof/>
+          <w:color w:val="000000"/>
+          <w:sz w:val="26"/>
+          <w:szCs w:val="26"/>
+          <w:lang w:val="vi-VN"/>
+        </w:rPr>
+        <w:drawing>
+          <wp:inline distT="0" distB="0" distL="0" distR="0" wp14:anchorId="31DA8D05" wp14:editId="33B88668">
+            <wp:extent cx="5943600" cy="7226300"/>
+            <wp:effectExtent l="0" t="0" r="0" b="0"/>
+            <wp:docPr id="849388942" name="Picture 1"/>
+            <wp:cNvGraphicFramePr>
+              <a:graphicFrameLocks xmlns:a="http://schemas.openxmlformats.org/drawingml/2006/main" noChangeAspect="1"/>
+            </wp:cNvGraphicFramePr>
+            <a:graphic xmlns:a="http://schemas.openxmlformats.org/drawingml/2006/main">
+              <a:graphicData uri="http://schemas.openxmlformats.org/drawingml/2006/picture">
+                <pic:pic xmlns:pic="http://schemas.openxmlformats.org/drawingml/2006/picture">
+                  <pic:nvPicPr>
+                    <pic:cNvPr id="849388942" name="Picture 849388942"/>
+                    <pic:cNvPicPr/>
+                  </pic:nvPicPr>
+                  <pic:blipFill>
+                    <a:blip r:embed="rId6">
+                      <a:extLst>
+                        <a:ext uri="{28A0092B-C50C-407E-A947-70E740481C1C}">
+                          <a14:useLocalDpi xmlns:a14="http://schemas.microsoft.com/office/drawing/2010/main" val="0"/>
+                        </a:ext>
+                      </a:extLst>
+                    </a:blip>
+                    <a:stretch>
+                      <a:fillRect/>
+                    </a:stretch>
+                  </pic:blipFill>
+                  <pic:spPr>
+                    <a:xfrm>
+                      <a:off x="0" y="0"/>
+                      <a:ext cx="5943600" cy="7226300"/>
+                    </a:xfrm>
+                    <a:prstGeom prst="rect">
+                      <a:avLst/>
+                    </a:prstGeom>
+                  </pic:spPr>
+                </pic:pic>
+              </a:graphicData>
+            </a:graphic>
+          </wp:inline>
+        </w:drawing>
+      </w:r>
+    </w:p>
+    <w:p>
+      <w:pPr>
+        <w:rPr>
+          <w:rFonts w:ascii="Times New Roman" w:eastAsia="Times New Roman" w:hAnsi="Times New Roman" w:cs="Times New Roman"/>
+          <w:b/>
+          <w:bCs/>
           <w:color w:val="000000"/>
           <w:sz w:val="26"/>
           <w:szCs w:val="26"/>
           <w:highlight w:val="yellow"/>
           <w:lang w:val="vi-VN"/>
         </w:rPr>
+      </w:pPr>
+    </w:p>
+    <w:p>
+      <w:pPr>
+        <w:jc w:val="center"/>
+        <w:rPr>
+          <w:rFonts w:ascii="Times New Roman" w:eastAsia="Times New Roman" w:hAnsi="Times New Roman" w:cs="Times New Roman"/>
+          <w:b/>
+          <w:bCs/>
+          <w:color w:val="000000"/>
+          <w:sz w:val="26"/>
+          <w:szCs w:val="26"/>
+          <w:lang w:val="vi-VN"/>
+        </w:rPr>
+      </w:pPr>
+      <w:r>
+        <w:rPr>
+          <w:rFonts w:ascii="Times New Roman" w:eastAsia="Times New Roman" w:hAnsi="Times New Roman" w:cs="Times New Roman"/>
+          <w:b/>
+          <w:bCs/>
+          <w:color w:val="000000"/>
+          <w:sz w:val="26"/>
+          <w:szCs w:val="26"/>
+          <w:lang w:val="vi-VN"/>
+        </w:rPr>
+        <w:t>SƠ ĐỒ USECASE TỔNG QUÁT</w:t>
+      </w:r>
+    </w:p>
+    <w:p>
+      <w:pPr>
+        <w:rPr>
+          <w:rFonts w:ascii="Times New Roman" w:eastAsia="Times New Roman" w:hAnsi="Times New Roman" w:cs="Times New Roman"/>
+          <w:b/>
+          <w:bCs/>
+          <w:color w:val="000000"/>
+          <w:sz w:val="26"/>
+          <w:szCs w:val="26"/>
+          <w:highlight w:val="yellow"/>
+          <w:lang w:val="vi-VN"/>
+        </w:rPr>
+      </w:pPr>
+    </w:p>
+    <w:p>
+      <w:pPr>
+        <w:rPr>
+          <w:rFonts w:ascii="Times New Roman" w:eastAsia="Times New Roman" w:hAnsi="Times New Roman" w:cs="Times New Roman"/>
+          <w:b/>
+          <w:bCs/>
+          <w:color w:val="000000"/>
+          <w:sz w:val="26"/>
+          <w:szCs w:val="26"/>
+          <w:highlight w:val="yellow"/>
+          <w:lang w:val="vi-VN"/>
+        </w:rPr>
+      </w:pPr>
+    </w:p>
+    <w:p>
+      <w:pPr>
+        <w:rPr>
+          <w:rFonts w:ascii="Times New Roman" w:eastAsia="Times New Roman" w:hAnsi="Times New Roman" w:cs="Times New Roman"/>
+          <w:b/>
+          <w:bCs/>
+          <w:color w:val="000000"/>
+          <w:sz w:val="26"/>
+          <w:szCs w:val="26"/>
+          <w:highlight w:val="yellow"/>
+          <w:lang w:val="vi-VN"/>
+        </w:rPr>
+      </w:pPr>
+      <w:r>
+        <w:rPr>
+          <w:rFonts w:ascii="Times New Roman" w:eastAsia="Times New Roman" w:hAnsi="Times New Roman" w:cs="Times New Roman"/>
+          <w:b/>
+          <w:bCs/>
+          <w:color w:val="000000"/>
+          <w:sz w:val="26"/>
+          <w:szCs w:val="26"/>
+          <w:highlight w:val="yellow"/>
+          <w:lang w:val="vi-VN"/>
+        </w:rPr>
+        <w:lastRenderedPageBreak/>
         <w:t>Phần 1: Các actor + các chức năng chính của hệ thống</w:t>
       </w:r>
     </w:p>
@@ -10609,6 +10745,7 @@
   <w:style w:type="character" w:default="1" w:styleId="DefaultParagraphFont">
     <w:name w:val="Default Paragraph Font"/>
     <w:uiPriority w:val="1"/>
+    <w:semiHidden/>
     <w:unhideWhenUsed/>
   </w:style>
   <w:style w:type="table" w:default="1" w:styleId="TableNormal">

</xml_diff>